<commit_message>
feat(financial-math): add 27/08 & 28/08 lecture notes and align example numbering with sections
</commit_message>
<xml_diff>
--- a/Financial Mathematics/notes.docx
+++ b/Financial Mathematics/notes.docx
@@ -8009,6 +8009,3714 @@
         <w:t xml:space="preserve">table as given below </w:t>
       </w:r>
     </w:p>
+    <w:p>
+      <w:pPr>
+        <w:tabs>
+          <w:tab w:val="left" w:pos="1080"/>
+          <w:tab w:val="left" w:pos="2160"/>
+          <w:tab w:val="left" w:pos="2880"/>
+          <w:tab w:val="left" w:pos="3600"/>
+          <w:tab w:val="left" w:pos="4320"/>
+          <w:tab w:val="left" w:pos="5040"/>
+          <w:tab w:val="left" w:pos="5760"/>
+          <w:tab w:val="left" w:pos="6480"/>
+          <w:tab w:val="right" w:pos="9026"/>
+        </w:tabs>
+        <w:rPr>
+          <w:rFonts w:eastAsiaTheme="minorEastAsia"/>
+        </w:rPr>
+      </w:pPr>
+    </w:p>
+    <w:p>
+      <w:pPr>
+        <w:tabs>
+          <w:tab w:val="left" w:pos="1080"/>
+          <w:tab w:val="left" w:pos="2160"/>
+          <w:tab w:val="left" w:pos="2880"/>
+          <w:tab w:val="left" w:pos="3600"/>
+          <w:tab w:val="left" w:pos="4320"/>
+          <w:tab w:val="left" w:pos="5040"/>
+          <w:tab w:val="left" w:pos="5760"/>
+          <w:tab w:val="left" w:pos="6480"/>
+          <w:tab w:val="right" w:pos="9026"/>
+        </w:tabs>
+        <w:rPr>
+          <w:rFonts w:eastAsiaTheme="minorEastAsia"/>
+        </w:rPr>
+      </w:pPr>
+      <w:r>
+        <w:rPr>
+          <w:rFonts w:eastAsiaTheme="minorEastAsia"/>
+        </w:rPr>
+        <w:t>27/08/2026</w:t>
+      </w:r>
+    </w:p>
+    <w:p>
+      <w:pPr>
+        <w:tabs>
+          <w:tab w:val="left" w:pos="1080"/>
+          <w:tab w:val="left" w:pos="2160"/>
+          <w:tab w:val="left" w:pos="2880"/>
+          <w:tab w:val="left" w:pos="3600"/>
+          <w:tab w:val="left" w:pos="4320"/>
+          <w:tab w:val="left" w:pos="5040"/>
+          <w:tab w:val="left" w:pos="5760"/>
+          <w:tab w:val="left" w:pos="6480"/>
+          <w:tab w:val="right" w:pos="9026"/>
+        </w:tabs>
+        <w:rPr>
+          <w:rFonts w:eastAsiaTheme="minorEastAsia"/>
+        </w:rPr>
+      </w:pPr>
+    </w:p>
+    <w:p>
+      <w:pPr>
+        <w:tabs>
+          <w:tab w:val="left" w:pos="1080"/>
+          <w:tab w:val="left" w:pos="2160"/>
+          <w:tab w:val="left" w:pos="2880"/>
+          <w:tab w:val="left" w:pos="3600"/>
+          <w:tab w:val="left" w:pos="4320"/>
+          <w:tab w:val="left" w:pos="5040"/>
+          <w:tab w:val="left" w:pos="5760"/>
+          <w:tab w:val="left" w:pos="6480"/>
+          <w:tab w:val="right" w:pos="9026"/>
+        </w:tabs>
+        <w:rPr>
+          <w:rFonts w:eastAsiaTheme="minorEastAsia"/>
+        </w:rPr>
+      </w:pPr>
+      <w:r>
+        <w:rPr>
+          <w:rFonts w:eastAsiaTheme="minorEastAsia"/>
+        </w:rPr>
+        <w:t>COMPOUND VALUE OF ANNUITY</w:t>
+      </w:r>
+    </w:p>
+    <w:p>
+      <w:pPr>
+        <w:tabs>
+          <w:tab w:val="left" w:pos="1080"/>
+          <w:tab w:val="left" w:pos="2160"/>
+          <w:tab w:val="left" w:pos="2880"/>
+          <w:tab w:val="left" w:pos="3600"/>
+          <w:tab w:val="left" w:pos="4320"/>
+          <w:tab w:val="left" w:pos="5040"/>
+          <w:tab w:val="left" w:pos="5760"/>
+          <w:tab w:val="left" w:pos="6480"/>
+          <w:tab w:val="right" w:pos="9026"/>
+        </w:tabs>
+        <w:rPr>
+          <w:rFonts w:eastAsiaTheme="minorEastAsia"/>
+        </w:rPr>
+      </w:pPr>
+    </w:p>
+    <w:p>
+      <w:pPr>
+        <w:pStyle w:val="ListParagraph"/>
+        <w:numPr>
+          <w:ilvl w:val="0"/>
+          <w:numId w:val="26"/>
+        </w:numPr>
+        <w:tabs>
+          <w:tab w:val="left" w:pos="1080"/>
+          <w:tab w:val="left" w:pos="2160"/>
+          <w:tab w:val="left" w:pos="2880"/>
+          <w:tab w:val="left" w:pos="3600"/>
+          <w:tab w:val="left" w:pos="4320"/>
+          <w:tab w:val="left" w:pos="5040"/>
+          <w:tab w:val="left" w:pos="5760"/>
+          <w:tab w:val="left" w:pos="6480"/>
+          <w:tab w:val="right" w:pos="9026"/>
+        </w:tabs>
+        <w:rPr>
+          <w:rFonts w:eastAsiaTheme="minorEastAsia"/>
+        </w:rPr>
+      </w:pPr>
+      <w:r>
+        <w:rPr>
+          <w:rFonts w:eastAsiaTheme="minorEastAsia"/>
+        </w:rPr>
+        <w:t xml:space="preserve">Calculate the maturity value annuity if Rs. 20,000 is paid annually for 7 years at 12% compounded annually </w:t>
+      </w:r>
+    </w:p>
+    <w:p>
+      <w:pPr>
+        <w:pStyle w:val="ListParagraph"/>
+        <w:tabs>
+          <w:tab w:val="left" w:pos="1080"/>
+          <w:tab w:val="left" w:pos="2160"/>
+          <w:tab w:val="left" w:pos="2880"/>
+          <w:tab w:val="left" w:pos="3600"/>
+          <w:tab w:val="left" w:pos="4320"/>
+          <w:tab w:val="left" w:pos="5040"/>
+          <w:tab w:val="left" w:pos="5760"/>
+          <w:tab w:val="left" w:pos="6480"/>
+          <w:tab w:val="right" w:pos="9026"/>
+        </w:tabs>
+        <w:rPr>
+          <w:rFonts w:eastAsiaTheme="minorEastAsia"/>
+        </w:rPr>
+      </w:pPr>
+    </w:p>
+    <w:p>
+      <w:pPr>
+        <w:pStyle w:val="ListParagraph"/>
+        <w:tabs>
+          <w:tab w:val="left" w:pos="1080"/>
+          <w:tab w:val="left" w:pos="2160"/>
+          <w:tab w:val="left" w:pos="2880"/>
+          <w:tab w:val="left" w:pos="3600"/>
+          <w:tab w:val="left" w:pos="4320"/>
+          <w:tab w:val="left" w:pos="5040"/>
+          <w:tab w:val="left" w:pos="5760"/>
+          <w:tab w:val="left" w:pos="6480"/>
+          <w:tab w:val="right" w:pos="9026"/>
+        </w:tabs>
+        <w:rPr>
+          <w:rFonts w:eastAsiaTheme="minorEastAsia"/>
+        </w:rPr>
+      </w:pPr>
+      <w:r>
+        <w:rPr>
+          <w:rFonts w:eastAsiaTheme="minorEastAsia"/>
+        </w:rPr>
+        <w:t>Ans:</w:t>
+      </w:r>
+    </w:p>
+    <w:p>
+      <w:pPr>
+        <w:pStyle w:val="ListParagraph"/>
+        <w:tabs>
+          <w:tab w:val="left" w:pos="1080"/>
+          <w:tab w:val="left" w:pos="2160"/>
+          <w:tab w:val="left" w:pos="2880"/>
+          <w:tab w:val="left" w:pos="3600"/>
+          <w:tab w:val="left" w:pos="4320"/>
+          <w:tab w:val="left" w:pos="5040"/>
+          <w:tab w:val="left" w:pos="5760"/>
+          <w:tab w:val="left" w:pos="6480"/>
+          <w:tab w:val="right" w:pos="9026"/>
+        </w:tabs>
+        <w:rPr>
+          <w:rFonts w:eastAsiaTheme="minorEastAsia"/>
+        </w:rPr>
+      </w:pPr>
+    </w:p>
+    <w:p>
+      <w:pPr>
+        <w:pStyle w:val="ListParagraph"/>
+        <w:tabs>
+          <w:tab w:val="left" w:pos="1080"/>
+          <w:tab w:val="left" w:pos="2160"/>
+          <w:tab w:val="left" w:pos="2880"/>
+          <w:tab w:val="left" w:pos="3600"/>
+          <w:tab w:val="left" w:pos="4320"/>
+          <w:tab w:val="left" w:pos="5040"/>
+          <w:tab w:val="left" w:pos="5760"/>
+          <w:tab w:val="left" w:pos="6480"/>
+          <w:tab w:val="right" w:pos="9026"/>
+        </w:tabs>
+        <w:rPr>
+          <w:rFonts w:eastAsiaTheme="minorEastAsia"/>
+        </w:rPr>
+      </w:pPr>
+      <w:r>
+        <w:rPr>
+          <w:rFonts w:eastAsiaTheme="minorEastAsia"/>
+        </w:rPr>
+        <w:t xml:space="preserve">Maturity value of  </w:t>
+      </w:r>
+    </w:p>
+    <w:p>
+      <w:pPr>
+        <w:pStyle w:val="ListParagraph"/>
+        <w:tabs>
+          <w:tab w:val="left" w:pos="1080"/>
+          <w:tab w:val="left" w:pos="2160"/>
+          <w:tab w:val="left" w:pos="2880"/>
+          <w:tab w:val="left" w:pos="3600"/>
+          <w:tab w:val="left" w:pos="4320"/>
+          <w:tab w:val="left" w:pos="5040"/>
+          <w:tab w:val="left" w:pos="5760"/>
+          <w:tab w:val="left" w:pos="6480"/>
+          <w:tab w:val="right" w:pos="9026"/>
+        </w:tabs>
+        <w:rPr>
+          <w:rFonts w:eastAsiaTheme="minorEastAsia"/>
+        </w:rPr>
+      </w:pPr>
+      <w:r>
+        <w:rPr>
+          <w:rFonts w:eastAsiaTheme="minorEastAsia"/>
+        </w:rPr>
+        <w:t xml:space="preserve">= </w:t>
+      </w:r>
+      <m:oMath>
+        <m:r>
+          <w:rPr>
+            <w:rFonts w:ascii="Cambria Math" w:eastAsiaTheme="minorEastAsia" w:hAnsi="Cambria Math"/>
+          </w:rPr>
+          <m:t>20000×</m:t>
+        </m:r>
+        <m:d>
+          <m:dPr>
+            <m:ctrlPr>
+              <w:rPr>
+                <w:rFonts w:ascii="Cambria Math" w:eastAsiaTheme="minorEastAsia" w:hAnsi="Cambria Math"/>
+                <w:i/>
+              </w:rPr>
+            </m:ctrlPr>
+          </m:dPr>
+          <m:e>
+            <m:f>
+              <m:fPr>
+                <m:ctrlPr>
+                  <w:rPr>
+                    <w:rFonts w:ascii="Cambria Math" w:eastAsiaTheme="minorEastAsia" w:hAnsi="Cambria Math"/>
+                    <w:i/>
+                  </w:rPr>
+                </m:ctrlPr>
+              </m:fPr>
+              <m:num>
+                <m:sSup>
+                  <m:sSupPr>
+                    <m:ctrlPr>
+                      <w:rPr>
+                        <w:rFonts w:ascii="Cambria Math" w:eastAsiaTheme="minorEastAsia" w:hAnsi="Cambria Math"/>
+                        <w:i/>
+                      </w:rPr>
+                    </m:ctrlPr>
+                  </m:sSupPr>
+                  <m:e>
+                    <m:d>
+                      <m:dPr>
+                        <m:ctrlPr>
+                          <w:rPr>
+                            <w:rFonts w:ascii="Cambria Math" w:eastAsiaTheme="minorEastAsia" w:hAnsi="Cambria Math"/>
+                            <w:i/>
+                          </w:rPr>
+                        </m:ctrlPr>
+                      </m:dPr>
+                      <m:e>
+                        <m:r>
+                          <w:rPr>
+                            <w:rFonts w:ascii="Cambria Math" w:eastAsiaTheme="minorEastAsia" w:hAnsi="Cambria Math"/>
+                          </w:rPr>
+                          <m:t>1+0.12</m:t>
+                        </m:r>
+                      </m:e>
+                    </m:d>
+                  </m:e>
+                  <m:sup>
+                    <m:r>
+                      <w:rPr>
+                        <w:rFonts w:ascii="Cambria Math" w:eastAsiaTheme="minorEastAsia" w:hAnsi="Cambria Math"/>
+                      </w:rPr>
+                      <m:t>7</m:t>
+                    </m:r>
+                  </m:sup>
+                </m:sSup>
+              </m:num>
+              <m:den>
+                <m:r>
+                  <w:rPr>
+                    <w:rFonts w:ascii="Cambria Math" w:eastAsiaTheme="minorEastAsia" w:hAnsi="Cambria Math"/>
+                  </w:rPr>
+                  <m:t>0.12</m:t>
+                </m:r>
+              </m:den>
+            </m:f>
+            <m:r>
+              <w:rPr>
+                <w:rFonts w:ascii="Cambria Math" w:eastAsiaTheme="minorEastAsia" w:hAnsi="Cambria Math"/>
+              </w:rPr>
+              <m:t>-1</m:t>
+            </m:r>
+          </m:e>
+        </m:d>
+      </m:oMath>
+    </w:p>
+    <w:p>
+      <w:pPr>
+        <w:pStyle w:val="ListParagraph"/>
+        <w:tabs>
+          <w:tab w:val="left" w:pos="1080"/>
+          <w:tab w:val="left" w:pos="2160"/>
+          <w:tab w:val="left" w:pos="2880"/>
+          <w:tab w:val="left" w:pos="3600"/>
+          <w:tab w:val="left" w:pos="4320"/>
+          <w:tab w:val="left" w:pos="5040"/>
+          <w:tab w:val="left" w:pos="5760"/>
+          <w:tab w:val="left" w:pos="6480"/>
+          <w:tab w:val="right" w:pos="9026"/>
+        </w:tabs>
+        <w:rPr>
+          <w:rFonts w:eastAsiaTheme="minorEastAsia"/>
+        </w:rPr>
+      </w:pPr>
+      <w:r>
+        <w:rPr>
+          <w:rFonts w:eastAsiaTheme="minorEastAsia"/>
+        </w:rPr>
+        <w:t xml:space="preserve">= </w:t>
+      </w:r>
+      <m:oMath>
+        <m:r>
+          <w:rPr>
+            <w:rFonts w:ascii="Cambria Math" w:eastAsiaTheme="minorEastAsia" w:hAnsi="Cambria Math"/>
+          </w:rPr>
+          <m:t>201800</m:t>
+        </m:r>
+      </m:oMath>
+    </w:p>
+    <w:p>
+      <w:pPr>
+        <w:pStyle w:val="ListParagraph"/>
+        <w:tabs>
+          <w:tab w:val="left" w:pos="1080"/>
+          <w:tab w:val="left" w:pos="2160"/>
+          <w:tab w:val="left" w:pos="2880"/>
+          <w:tab w:val="left" w:pos="3600"/>
+          <w:tab w:val="left" w:pos="4320"/>
+          <w:tab w:val="left" w:pos="5040"/>
+          <w:tab w:val="left" w:pos="5760"/>
+          <w:tab w:val="left" w:pos="6480"/>
+          <w:tab w:val="right" w:pos="9026"/>
+        </w:tabs>
+        <w:rPr>
+          <w:rFonts w:eastAsiaTheme="minorEastAsia"/>
+        </w:rPr>
+      </w:pPr>
+    </w:p>
+    <w:p>
+      <w:pPr>
+        <w:pStyle w:val="ListParagraph"/>
+        <w:tabs>
+          <w:tab w:val="left" w:pos="1080"/>
+          <w:tab w:val="left" w:pos="2160"/>
+          <w:tab w:val="left" w:pos="2880"/>
+          <w:tab w:val="left" w:pos="3600"/>
+          <w:tab w:val="left" w:pos="4320"/>
+          <w:tab w:val="left" w:pos="5040"/>
+          <w:tab w:val="left" w:pos="5760"/>
+          <w:tab w:val="left" w:pos="6480"/>
+          <w:tab w:val="right" w:pos="9026"/>
+        </w:tabs>
+        <w:rPr>
+          <w:rFonts w:eastAsiaTheme="minorEastAsia"/>
+        </w:rPr>
+      </w:pPr>
+    </w:p>
+    <w:p>
+      <w:pPr>
+        <w:pStyle w:val="ListParagraph"/>
+        <w:numPr>
+          <w:ilvl w:val="0"/>
+          <w:numId w:val="26"/>
+        </w:numPr>
+        <w:tabs>
+          <w:tab w:val="left" w:pos="1080"/>
+          <w:tab w:val="left" w:pos="2160"/>
+          <w:tab w:val="left" w:pos="2880"/>
+          <w:tab w:val="left" w:pos="3600"/>
+          <w:tab w:val="left" w:pos="4320"/>
+          <w:tab w:val="left" w:pos="5040"/>
+          <w:tab w:val="left" w:pos="5760"/>
+          <w:tab w:val="left" w:pos="6480"/>
+          <w:tab w:val="right" w:pos="9026"/>
+        </w:tabs>
+        <w:rPr>
+          <w:rFonts w:eastAsiaTheme="minorEastAsia"/>
+        </w:rPr>
+      </w:pPr>
+      <w:r>
+        <w:rPr>
+          <w:rFonts w:eastAsiaTheme="minorEastAsia"/>
+        </w:rPr>
+        <w:t xml:space="preserve">Bhuvanesh pays a monthly </w:t>
+      </w:r>
+      <w:proofErr w:type="spellStart"/>
+      <w:r>
+        <w:rPr>
+          <w:rFonts w:eastAsiaTheme="minorEastAsia"/>
+        </w:rPr>
+        <w:t>installment</w:t>
+      </w:r>
+      <w:proofErr w:type="spellEnd"/>
+      <w:r>
+        <w:rPr>
+          <w:rFonts w:eastAsiaTheme="minorEastAsia"/>
+        </w:rPr>
+        <w:t xml:space="preserve"> of rs2000 towards a recurring deposit with a financier. The rate of interest is 6% per annum compounded monthly. What is the maturity value of this recurring deposit after 10 months </w:t>
+      </w:r>
+    </w:p>
+    <w:p>
+      <w:pPr>
+        <w:pStyle w:val="ListParagraph"/>
+        <w:tabs>
+          <w:tab w:val="left" w:pos="1080"/>
+          <w:tab w:val="left" w:pos="2160"/>
+          <w:tab w:val="left" w:pos="2880"/>
+          <w:tab w:val="left" w:pos="3600"/>
+          <w:tab w:val="left" w:pos="4320"/>
+          <w:tab w:val="left" w:pos="5040"/>
+          <w:tab w:val="left" w:pos="5760"/>
+          <w:tab w:val="left" w:pos="6480"/>
+          <w:tab w:val="right" w:pos="9026"/>
+        </w:tabs>
+        <w:rPr>
+          <w:rFonts w:eastAsiaTheme="minorEastAsia"/>
+        </w:rPr>
+      </w:pPr>
+    </w:p>
+    <w:p>
+      <w:pPr>
+        <w:pStyle w:val="ListParagraph"/>
+        <w:tabs>
+          <w:tab w:val="left" w:pos="1080"/>
+          <w:tab w:val="left" w:pos="2160"/>
+          <w:tab w:val="left" w:pos="2880"/>
+          <w:tab w:val="left" w:pos="3600"/>
+          <w:tab w:val="left" w:pos="4320"/>
+          <w:tab w:val="left" w:pos="5040"/>
+          <w:tab w:val="left" w:pos="5760"/>
+          <w:tab w:val="left" w:pos="6480"/>
+          <w:tab w:val="right" w:pos="9026"/>
+        </w:tabs>
+        <w:rPr>
+          <w:rFonts w:eastAsiaTheme="minorEastAsia"/>
+        </w:rPr>
+      </w:pPr>
+      <w:r>
+        <w:rPr>
+          <w:rFonts w:eastAsiaTheme="minorEastAsia"/>
+        </w:rPr>
+        <w:t>Ans:</w:t>
+      </w:r>
+    </w:p>
+    <w:p>
+      <w:pPr>
+        <w:pStyle w:val="ListParagraph"/>
+        <w:tabs>
+          <w:tab w:val="left" w:pos="1080"/>
+          <w:tab w:val="left" w:pos="2160"/>
+          <w:tab w:val="left" w:pos="2880"/>
+          <w:tab w:val="left" w:pos="3600"/>
+          <w:tab w:val="left" w:pos="4320"/>
+          <w:tab w:val="left" w:pos="5040"/>
+          <w:tab w:val="left" w:pos="5760"/>
+          <w:tab w:val="left" w:pos="6480"/>
+          <w:tab w:val="right" w:pos="9026"/>
+        </w:tabs>
+        <w:rPr>
+          <w:rFonts w:eastAsiaTheme="minorEastAsia"/>
+        </w:rPr>
+      </w:pPr>
+    </w:p>
+    <w:p>
+      <w:pPr>
+        <w:pStyle w:val="ListParagraph"/>
+        <w:tabs>
+          <w:tab w:val="left" w:pos="1080"/>
+          <w:tab w:val="left" w:pos="2160"/>
+          <w:tab w:val="left" w:pos="2880"/>
+          <w:tab w:val="left" w:pos="3600"/>
+          <w:tab w:val="left" w:pos="4320"/>
+          <w:tab w:val="left" w:pos="5040"/>
+          <w:tab w:val="left" w:pos="5760"/>
+          <w:tab w:val="left" w:pos="6480"/>
+          <w:tab w:val="right" w:pos="9026"/>
+        </w:tabs>
+        <w:rPr>
+          <w:rFonts w:eastAsiaTheme="minorEastAsia"/>
+        </w:rPr>
+      </w:pPr>
+      <w:r>
+        <w:rPr>
+          <w:rFonts w:eastAsiaTheme="minorEastAsia"/>
+        </w:rPr>
+        <w:lastRenderedPageBreak/>
+        <w:t>maturity value of</w:t>
+      </w:r>
+    </w:p>
+    <w:p>
+      <w:pPr>
+        <w:pStyle w:val="ListParagraph"/>
+        <w:tabs>
+          <w:tab w:val="left" w:pos="1080"/>
+          <w:tab w:val="left" w:pos="2160"/>
+          <w:tab w:val="left" w:pos="2880"/>
+          <w:tab w:val="left" w:pos="3600"/>
+          <w:tab w:val="left" w:pos="4320"/>
+          <w:tab w:val="left" w:pos="5040"/>
+          <w:tab w:val="left" w:pos="5760"/>
+          <w:tab w:val="left" w:pos="6480"/>
+          <w:tab w:val="right" w:pos="9026"/>
+        </w:tabs>
+        <w:rPr>
+          <w:rFonts w:eastAsiaTheme="minorEastAsia"/>
+        </w:rPr>
+      </w:pPr>
+      <w:r>
+        <w:rPr>
+          <w:rFonts w:eastAsiaTheme="minorEastAsia"/>
+        </w:rPr>
+        <w:t xml:space="preserve">= </w:t>
+      </w:r>
+      <m:oMath>
+        <m:r>
+          <w:rPr>
+            <w:rFonts w:ascii="Cambria Math" w:eastAsiaTheme="minorEastAsia" w:hAnsi="Cambria Math"/>
+          </w:rPr>
+          <m:t>2000×</m:t>
+        </m:r>
+        <m:d>
+          <m:dPr>
+            <m:ctrlPr>
+              <w:rPr>
+                <w:rFonts w:ascii="Cambria Math" w:eastAsiaTheme="minorEastAsia" w:hAnsi="Cambria Math"/>
+                <w:i/>
+              </w:rPr>
+            </m:ctrlPr>
+          </m:dPr>
+          <m:e>
+            <m:f>
+              <m:fPr>
+                <m:ctrlPr>
+                  <w:rPr>
+                    <w:rFonts w:ascii="Cambria Math" w:eastAsiaTheme="minorEastAsia" w:hAnsi="Cambria Math"/>
+                    <w:i/>
+                  </w:rPr>
+                </m:ctrlPr>
+              </m:fPr>
+              <m:num>
+                <m:sSup>
+                  <m:sSupPr>
+                    <m:ctrlPr>
+                      <w:rPr>
+                        <w:rFonts w:ascii="Cambria Math" w:eastAsiaTheme="minorEastAsia" w:hAnsi="Cambria Math"/>
+                        <w:i/>
+                      </w:rPr>
+                    </m:ctrlPr>
+                  </m:sSupPr>
+                  <m:e>
+                    <m:d>
+                      <m:dPr>
+                        <m:ctrlPr>
+                          <w:rPr>
+                            <w:rFonts w:ascii="Cambria Math" w:eastAsiaTheme="minorEastAsia" w:hAnsi="Cambria Math"/>
+                            <w:i/>
+                          </w:rPr>
+                        </m:ctrlPr>
+                      </m:dPr>
+                      <m:e>
+                        <m:r>
+                          <w:rPr>
+                            <w:rFonts w:ascii="Cambria Math" w:eastAsiaTheme="minorEastAsia" w:hAnsi="Cambria Math"/>
+                          </w:rPr>
+                          <m:t>1+0.005</m:t>
+                        </m:r>
+                      </m:e>
+                    </m:d>
+                  </m:e>
+                  <m:sup>
+                    <m:r>
+                      <w:rPr>
+                        <w:rFonts w:ascii="Cambria Math" w:eastAsiaTheme="minorEastAsia" w:hAnsi="Cambria Math"/>
+                      </w:rPr>
+                      <m:t>10</m:t>
+                    </m:r>
+                  </m:sup>
+                </m:sSup>
+              </m:num>
+              <m:den>
+                <m:r>
+                  <w:rPr>
+                    <w:rFonts w:ascii="Cambria Math" w:eastAsiaTheme="minorEastAsia" w:hAnsi="Cambria Math"/>
+                  </w:rPr>
+                  <m:t>0.005</m:t>
+                </m:r>
+              </m:den>
+            </m:f>
+            <m:r>
+              <w:rPr>
+                <w:rFonts w:ascii="Cambria Math" w:eastAsiaTheme="minorEastAsia" w:hAnsi="Cambria Math"/>
+              </w:rPr>
+              <m:t>-1</m:t>
+            </m:r>
+          </m:e>
+        </m:d>
+      </m:oMath>
+    </w:p>
+    <w:p>
+      <w:pPr>
+        <w:pStyle w:val="ListParagraph"/>
+        <w:tabs>
+          <w:tab w:val="left" w:pos="1080"/>
+          <w:tab w:val="left" w:pos="2160"/>
+          <w:tab w:val="left" w:pos="2880"/>
+          <w:tab w:val="left" w:pos="3600"/>
+          <w:tab w:val="left" w:pos="4320"/>
+          <w:tab w:val="left" w:pos="5040"/>
+          <w:tab w:val="left" w:pos="5760"/>
+          <w:tab w:val="left" w:pos="6480"/>
+          <w:tab w:val="right" w:pos="9026"/>
+        </w:tabs>
+        <w:rPr>
+          <w:rFonts w:eastAsiaTheme="minorEastAsia"/>
+        </w:rPr>
+      </w:pPr>
+      <w:r>
+        <w:rPr>
+          <w:rFonts w:eastAsiaTheme="minorEastAsia"/>
+        </w:rPr>
+        <w:t xml:space="preserve">= </w:t>
+      </w:r>
+      <m:oMath>
+        <m:r>
+          <w:rPr>
+            <w:rFonts w:ascii="Cambria Math" w:eastAsiaTheme="minorEastAsia" w:hAnsi="Cambria Math"/>
+          </w:rPr>
+          <m:t>20440</m:t>
+        </m:r>
+      </m:oMath>
+    </w:p>
+    <w:p>
+      <w:pPr>
+        <w:pStyle w:val="ListParagraph"/>
+        <w:tabs>
+          <w:tab w:val="left" w:pos="1080"/>
+          <w:tab w:val="left" w:pos="2160"/>
+          <w:tab w:val="left" w:pos="2880"/>
+          <w:tab w:val="left" w:pos="3600"/>
+          <w:tab w:val="left" w:pos="4320"/>
+          <w:tab w:val="left" w:pos="5040"/>
+          <w:tab w:val="left" w:pos="5760"/>
+          <w:tab w:val="left" w:pos="6480"/>
+          <w:tab w:val="right" w:pos="9026"/>
+        </w:tabs>
+        <w:rPr>
+          <w:rFonts w:eastAsiaTheme="minorEastAsia"/>
+        </w:rPr>
+      </w:pPr>
+      <w:r>
+        <w:rPr>
+          <w:rFonts w:eastAsiaTheme="minorEastAsia"/>
+        </w:rPr>
+        <w:t xml:space="preserve"> </w:t>
+      </w:r>
+    </w:p>
+    <w:p>
+      <w:pPr>
+        <w:pStyle w:val="ListParagraph"/>
+        <w:tabs>
+          <w:tab w:val="left" w:pos="1080"/>
+          <w:tab w:val="left" w:pos="2160"/>
+          <w:tab w:val="left" w:pos="2880"/>
+          <w:tab w:val="left" w:pos="3600"/>
+          <w:tab w:val="left" w:pos="4320"/>
+          <w:tab w:val="left" w:pos="5040"/>
+          <w:tab w:val="left" w:pos="5760"/>
+          <w:tab w:val="left" w:pos="6480"/>
+          <w:tab w:val="right" w:pos="9026"/>
+        </w:tabs>
+        <w:rPr>
+          <w:rFonts w:eastAsiaTheme="minorEastAsia"/>
+        </w:rPr>
+      </w:pPr>
+    </w:p>
+    <w:p>
+      <w:pPr>
+        <w:tabs>
+          <w:tab w:val="left" w:pos="1080"/>
+          <w:tab w:val="left" w:pos="2160"/>
+          <w:tab w:val="left" w:pos="2880"/>
+          <w:tab w:val="left" w:pos="3600"/>
+          <w:tab w:val="left" w:pos="4320"/>
+          <w:tab w:val="left" w:pos="5040"/>
+          <w:tab w:val="left" w:pos="5760"/>
+          <w:tab w:val="left" w:pos="6480"/>
+          <w:tab w:val="right" w:pos="9026"/>
+        </w:tabs>
+        <w:rPr>
+          <w:rFonts w:eastAsiaTheme="minorEastAsia"/>
+        </w:rPr>
+      </w:pPr>
+      <w:r>
+        <w:rPr>
+          <w:rFonts w:eastAsiaTheme="minorEastAsia"/>
+        </w:rPr>
+        <w:t>TIME VALUE OF MONEY</w:t>
+      </w:r>
+    </w:p>
+    <w:p>
+      <w:pPr>
+        <w:tabs>
+          <w:tab w:val="left" w:pos="1080"/>
+          <w:tab w:val="left" w:pos="2160"/>
+          <w:tab w:val="left" w:pos="2880"/>
+          <w:tab w:val="left" w:pos="3600"/>
+          <w:tab w:val="left" w:pos="4320"/>
+          <w:tab w:val="left" w:pos="5040"/>
+          <w:tab w:val="left" w:pos="5760"/>
+          <w:tab w:val="left" w:pos="6480"/>
+          <w:tab w:val="right" w:pos="9026"/>
+        </w:tabs>
+        <w:rPr>
+          <w:rFonts w:eastAsiaTheme="minorEastAsia"/>
+        </w:rPr>
+      </w:pPr>
+    </w:p>
+    <w:p>
+      <w:pPr>
+        <w:pStyle w:val="ListParagraph"/>
+        <w:numPr>
+          <w:ilvl w:val="0"/>
+          <w:numId w:val="27"/>
+        </w:numPr>
+        <w:tabs>
+          <w:tab w:val="left" w:pos="1080"/>
+          <w:tab w:val="left" w:pos="2160"/>
+          <w:tab w:val="left" w:pos="2880"/>
+          <w:tab w:val="left" w:pos="3600"/>
+          <w:tab w:val="left" w:pos="4320"/>
+          <w:tab w:val="left" w:pos="5040"/>
+          <w:tab w:val="left" w:pos="5760"/>
+          <w:tab w:val="left" w:pos="6480"/>
+          <w:tab w:val="right" w:pos="9026"/>
+        </w:tabs>
+        <w:rPr>
+          <w:rFonts w:eastAsiaTheme="minorEastAsia"/>
+        </w:rPr>
+      </w:pPr>
+      <w:r>
+        <w:rPr>
+          <w:rFonts w:eastAsiaTheme="minorEastAsia"/>
+        </w:rPr>
+        <w:t>Present value of Rs 10,000 receivable after 4 years and the rate of interest at 12%. The PV factor in the PV table (12% column and 4 year row) is 0.635.</w:t>
+      </w:r>
+    </w:p>
+    <w:p>
+      <w:pPr>
+        <w:pStyle w:val="ListParagraph"/>
+        <w:tabs>
+          <w:tab w:val="left" w:pos="1080"/>
+          <w:tab w:val="left" w:pos="2160"/>
+          <w:tab w:val="left" w:pos="2880"/>
+          <w:tab w:val="left" w:pos="3600"/>
+          <w:tab w:val="left" w:pos="4320"/>
+          <w:tab w:val="left" w:pos="5040"/>
+          <w:tab w:val="left" w:pos="5760"/>
+          <w:tab w:val="left" w:pos="6480"/>
+          <w:tab w:val="right" w:pos="9026"/>
+        </w:tabs>
+        <w:rPr>
+          <w:rFonts w:eastAsiaTheme="minorEastAsia"/>
+        </w:rPr>
+      </w:pPr>
+    </w:p>
+    <w:p>
+      <w:pPr>
+        <w:pStyle w:val="ListParagraph"/>
+        <w:tabs>
+          <w:tab w:val="left" w:pos="1080"/>
+          <w:tab w:val="left" w:pos="2160"/>
+          <w:tab w:val="left" w:pos="2880"/>
+          <w:tab w:val="left" w:pos="3600"/>
+          <w:tab w:val="left" w:pos="4320"/>
+          <w:tab w:val="left" w:pos="5040"/>
+          <w:tab w:val="left" w:pos="5760"/>
+          <w:tab w:val="left" w:pos="6480"/>
+          <w:tab w:val="right" w:pos="9026"/>
+        </w:tabs>
+        <w:rPr>
+          <w:rFonts w:eastAsiaTheme="minorEastAsia"/>
+        </w:rPr>
+      </w:pPr>
+      <w:r>
+        <w:rPr>
+          <w:rFonts w:eastAsiaTheme="minorEastAsia"/>
+        </w:rPr>
+        <w:t>Ans:</w:t>
+      </w:r>
+    </w:p>
+    <w:p>
+      <w:pPr>
+        <w:pStyle w:val="ListParagraph"/>
+        <w:tabs>
+          <w:tab w:val="left" w:pos="1080"/>
+          <w:tab w:val="left" w:pos="2160"/>
+          <w:tab w:val="left" w:pos="2880"/>
+          <w:tab w:val="left" w:pos="3600"/>
+          <w:tab w:val="left" w:pos="4320"/>
+          <w:tab w:val="left" w:pos="5040"/>
+          <w:tab w:val="left" w:pos="5760"/>
+          <w:tab w:val="left" w:pos="6480"/>
+          <w:tab w:val="right" w:pos="9026"/>
+        </w:tabs>
+        <w:rPr>
+          <w:rFonts w:eastAsiaTheme="minorEastAsia"/>
+        </w:rPr>
+      </w:pPr>
+    </w:p>
+    <w:p>
+      <w:pPr>
+        <w:pStyle w:val="ListParagraph"/>
+        <w:tabs>
+          <w:tab w:val="left" w:pos="1080"/>
+          <w:tab w:val="left" w:pos="2160"/>
+          <w:tab w:val="left" w:pos="2880"/>
+          <w:tab w:val="left" w:pos="3600"/>
+          <w:tab w:val="left" w:pos="4320"/>
+          <w:tab w:val="left" w:pos="5040"/>
+          <w:tab w:val="left" w:pos="5760"/>
+          <w:tab w:val="left" w:pos="6480"/>
+          <w:tab w:val="right" w:pos="9026"/>
+        </w:tabs>
+        <w:rPr>
+          <w:rFonts w:eastAsiaTheme="minorEastAsia"/>
+        </w:rPr>
+      </w:pPr>
+      <w:r>
+        <w:rPr>
+          <w:rFonts w:eastAsiaTheme="minorEastAsia"/>
+        </w:rPr>
+        <w:t>PV =</w:t>
+      </w:r>
+      <w:r>
+        <w:rPr>
+          <w:rFonts w:eastAsiaTheme="minorEastAsia"/>
+        </w:rPr>
+        <w:t xml:space="preserve"> </w:t>
+      </w:r>
+      <m:oMath>
+        <m:r>
+          <w:rPr>
+            <w:rFonts w:ascii="Cambria Math" w:eastAsiaTheme="minorEastAsia" w:hAnsi="Cambria Math"/>
+          </w:rPr>
+          <m:t xml:space="preserve">FV × </m:t>
+        </m:r>
+        <m:f>
+          <m:fPr>
+            <m:ctrlPr>
+              <w:rPr>
+                <w:rFonts w:ascii="Cambria Math" w:eastAsiaTheme="minorEastAsia" w:hAnsi="Cambria Math"/>
+                <w:i/>
+              </w:rPr>
+            </m:ctrlPr>
+          </m:fPr>
+          <m:num>
+            <m:r>
+              <w:rPr>
+                <w:rFonts w:ascii="Cambria Math" w:eastAsiaTheme="minorEastAsia" w:hAnsi="Cambria Math"/>
+              </w:rPr>
+              <m:t>1</m:t>
+            </m:r>
+          </m:num>
+          <m:den>
+            <m:sSup>
+              <m:sSupPr>
+                <m:ctrlPr>
+                  <w:rPr>
+                    <w:rFonts w:ascii="Cambria Math" w:eastAsiaTheme="minorEastAsia" w:hAnsi="Cambria Math"/>
+                    <w:i/>
+                  </w:rPr>
+                </m:ctrlPr>
+              </m:sSupPr>
+              <m:e>
+                <m:d>
+                  <m:dPr>
+                    <m:ctrlPr>
+                      <w:rPr>
+                        <w:rFonts w:ascii="Cambria Math" w:eastAsiaTheme="minorEastAsia" w:hAnsi="Cambria Math"/>
+                        <w:i/>
+                      </w:rPr>
+                    </m:ctrlPr>
+                  </m:dPr>
+                  <m:e>
+                    <m:r>
+                      <w:rPr>
+                        <w:rFonts w:ascii="Cambria Math" w:eastAsiaTheme="minorEastAsia" w:hAnsi="Cambria Math"/>
+                      </w:rPr>
+                      <m:t>1+R</m:t>
+                    </m:r>
+                  </m:e>
+                </m:d>
+              </m:e>
+              <m:sup>
+                <m:r>
+                  <w:rPr>
+                    <w:rFonts w:ascii="Cambria Math" w:eastAsiaTheme="minorEastAsia" w:hAnsi="Cambria Math"/>
+                  </w:rPr>
+                  <m:t>n</m:t>
+                </m:r>
+              </m:sup>
+            </m:sSup>
+          </m:den>
+        </m:f>
+      </m:oMath>
+    </w:p>
+    <w:p>
+      <w:pPr>
+        <w:pStyle w:val="ListParagraph"/>
+        <w:tabs>
+          <w:tab w:val="left" w:pos="1080"/>
+          <w:tab w:val="left" w:pos="2160"/>
+          <w:tab w:val="left" w:pos="2880"/>
+          <w:tab w:val="left" w:pos="3600"/>
+          <w:tab w:val="left" w:pos="4320"/>
+          <w:tab w:val="left" w:pos="5040"/>
+          <w:tab w:val="left" w:pos="5760"/>
+          <w:tab w:val="left" w:pos="6480"/>
+          <w:tab w:val="right" w:pos="9026"/>
+        </w:tabs>
+        <w:rPr>
+          <w:rFonts w:eastAsiaTheme="minorEastAsia"/>
+        </w:rPr>
+      </w:pPr>
+      <w:r>
+        <w:rPr>
+          <w:rFonts w:eastAsiaTheme="minorEastAsia"/>
+        </w:rPr>
+        <w:t xml:space="preserve">PV = </w:t>
+      </w:r>
+      <m:oMath>
+        <m:r>
+          <w:rPr>
+            <w:rFonts w:ascii="Cambria Math" w:eastAsiaTheme="minorEastAsia" w:hAnsi="Cambria Math"/>
+          </w:rPr>
+          <m:t xml:space="preserve">10000 × </m:t>
+        </m:r>
+        <m:f>
+          <m:fPr>
+            <m:ctrlPr>
+              <w:rPr>
+                <w:rFonts w:ascii="Cambria Math" w:eastAsiaTheme="minorEastAsia" w:hAnsi="Cambria Math"/>
+                <w:i/>
+              </w:rPr>
+            </m:ctrlPr>
+          </m:fPr>
+          <m:num>
+            <m:r>
+              <w:rPr>
+                <w:rFonts w:ascii="Cambria Math" w:eastAsiaTheme="minorEastAsia" w:hAnsi="Cambria Math"/>
+              </w:rPr>
+              <m:t>1</m:t>
+            </m:r>
+          </m:num>
+          <m:den>
+            <m:sSup>
+              <m:sSupPr>
+                <m:ctrlPr>
+                  <w:rPr>
+                    <w:rFonts w:ascii="Cambria Math" w:eastAsiaTheme="minorEastAsia" w:hAnsi="Cambria Math"/>
+                    <w:i/>
+                  </w:rPr>
+                </m:ctrlPr>
+              </m:sSupPr>
+              <m:e>
+                <m:d>
+                  <m:dPr>
+                    <m:ctrlPr>
+                      <w:rPr>
+                        <w:rFonts w:ascii="Cambria Math" w:eastAsiaTheme="minorEastAsia" w:hAnsi="Cambria Math"/>
+                        <w:i/>
+                      </w:rPr>
+                    </m:ctrlPr>
+                  </m:dPr>
+                  <m:e>
+                    <m:r>
+                      <w:rPr>
+                        <w:rFonts w:ascii="Cambria Math" w:eastAsiaTheme="minorEastAsia" w:hAnsi="Cambria Math"/>
+                      </w:rPr>
+                      <m:t>1+0.12</m:t>
+                    </m:r>
+                  </m:e>
+                </m:d>
+              </m:e>
+              <m:sup>
+                <m:r>
+                  <w:rPr>
+                    <w:rFonts w:ascii="Cambria Math" w:eastAsiaTheme="minorEastAsia" w:hAnsi="Cambria Math"/>
+                  </w:rPr>
+                  <m:t>4</m:t>
+                </m:r>
+              </m:sup>
+            </m:sSup>
+          </m:den>
+        </m:f>
+      </m:oMath>
+    </w:p>
+    <w:p>
+      <w:pPr>
+        <w:pStyle w:val="ListParagraph"/>
+        <w:tabs>
+          <w:tab w:val="left" w:pos="1080"/>
+          <w:tab w:val="left" w:pos="2160"/>
+          <w:tab w:val="left" w:pos="2880"/>
+          <w:tab w:val="left" w:pos="3600"/>
+          <w:tab w:val="left" w:pos="4320"/>
+          <w:tab w:val="left" w:pos="5040"/>
+          <w:tab w:val="left" w:pos="5760"/>
+          <w:tab w:val="left" w:pos="6480"/>
+          <w:tab w:val="right" w:pos="9026"/>
+        </w:tabs>
+        <w:rPr>
+          <w:rFonts w:eastAsiaTheme="minorEastAsia"/>
+        </w:rPr>
+      </w:pPr>
+      <w:r>
+        <w:rPr>
+          <w:rFonts w:eastAsiaTheme="minorEastAsia"/>
+        </w:rPr>
+        <w:t xml:space="preserve">PV = </w:t>
+      </w:r>
+      <m:oMath>
+        <m:r>
+          <w:rPr>
+            <w:rFonts w:ascii="Cambria Math" w:eastAsiaTheme="minorEastAsia" w:hAnsi="Cambria Math"/>
+          </w:rPr>
+          <m:t>6350</m:t>
+        </m:r>
+      </m:oMath>
+    </w:p>
+    <w:p>
+      <w:pPr>
+        <w:pStyle w:val="ListParagraph"/>
+        <w:tabs>
+          <w:tab w:val="left" w:pos="1080"/>
+          <w:tab w:val="left" w:pos="2160"/>
+          <w:tab w:val="left" w:pos="2880"/>
+          <w:tab w:val="left" w:pos="3600"/>
+          <w:tab w:val="left" w:pos="4320"/>
+          <w:tab w:val="left" w:pos="5040"/>
+          <w:tab w:val="left" w:pos="5760"/>
+          <w:tab w:val="left" w:pos="6480"/>
+          <w:tab w:val="right" w:pos="9026"/>
+        </w:tabs>
+        <w:rPr>
+          <w:rFonts w:eastAsiaTheme="minorEastAsia"/>
+        </w:rPr>
+      </w:pPr>
+    </w:p>
+    <w:p>
+      <w:pPr>
+        <w:pStyle w:val="ListParagraph"/>
+        <w:numPr>
+          <w:ilvl w:val="0"/>
+          <w:numId w:val="27"/>
+        </w:numPr>
+        <w:tabs>
+          <w:tab w:val="left" w:pos="1080"/>
+          <w:tab w:val="left" w:pos="2160"/>
+          <w:tab w:val="left" w:pos="2880"/>
+          <w:tab w:val="left" w:pos="3600"/>
+          <w:tab w:val="left" w:pos="4320"/>
+          <w:tab w:val="left" w:pos="5040"/>
+          <w:tab w:val="left" w:pos="5760"/>
+          <w:tab w:val="left" w:pos="6480"/>
+          <w:tab w:val="right" w:pos="9026"/>
+        </w:tabs>
+        <w:rPr>
+          <w:rFonts w:eastAsiaTheme="minorEastAsia"/>
+        </w:rPr>
+      </w:pPr>
+      <w:r>
+        <w:rPr>
+          <w:rFonts w:eastAsiaTheme="minorEastAsia"/>
+        </w:rPr>
+        <w:t>Calculate present value factors at 12% per annum for a period of 5 years</w:t>
+      </w:r>
+    </w:p>
+    <w:p>
+      <w:pPr>
+        <w:pStyle w:val="ListParagraph"/>
+        <w:tabs>
+          <w:tab w:val="left" w:pos="1080"/>
+          <w:tab w:val="left" w:pos="2160"/>
+          <w:tab w:val="left" w:pos="2880"/>
+          <w:tab w:val="left" w:pos="3600"/>
+          <w:tab w:val="left" w:pos="4320"/>
+          <w:tab w:val="left" w:pos="5040"/>
+          <w:tab w:val="left" w:pos="5760"/>
+          <w:tab w:val="left" w:pos="6480"/>
+          <w:tab w:val="right" w:pos="9026"/>
+        </w:tabs>
+        <w:rPr>
+          <w:rFonts w:eastAsiaTheme="minorEastAsia"/>
+        </w:rPr>
+      </w:pPr>
+    </w:p>
+    <w:p>
+      <w:pPr>
+        <w:pStyle w:val="ListParagraph"/>
+        <w:tabs>
+          <w:tab w:val="left" w:pos="1080"/>
+          <w:tab w:val="left" w:pos="2160"/>
+          <w:tab w:val="left" w:pos="2880"/>
+          <w:tab w:val="left" w:pos="3600"/>
+          <w:tab w:val="left" w:pos="4320"/>
+          <w:tab w:val="left" w:pos="5040"/>
+          <w:tab w:val="left" w:pos="5760"/>
+          <w:tab w:val="left" w:pos="6480"/>
+          <w:tab w:val="right" w:pos="9026"/>
+        </w:tabs>
+        <w:rPr>
+          <w:rFonts w:eastAsiaTheme="minorEastAsia"/>
+        </w:rPr>
+      </w:pPr>
+      <w:r>
+        <w:rPr>
+          <w:rFonts w:eastAsiaTheme="minorEastAsia"/>
+        </w:rPr>
+        <w:t>Ans:</w:t>
+      </w:r>
+    </w:p>
+    <w:tbl>
+      <w:tblPr>
+        <w:tblW w:w="0" w:type="auto"/>
+        <w:tblCellSpacing w:w="15" w:type="dxa"/>
+        <w:tblCellMar>
+          <w:top w:w="15" w:type="dxa"/>
+          <w:left w:w="15" w:type="dxa"/>
+          <w:bottom w:w="15" w:type="dxa"/>
+          <w:right w:w="15" w:type="dxa"/>
+        </w:tblCellMar>
+        <w:tblLook w:val="04A0" w:firstRow="1" w:lastRow="0" w:firstColumn="1" w:lastColumn="0" w:noHBand="0" w:noVBand="1"/>
+      </w:tblPr>
+      <w:tblGrid>
+        <w:gridCol w:w="1602"/>
+        <w:gridCol w:w="2054"/>
+        <w:gridCol w:w="3044"/>
+      </w:tblGrid>
+      <w:tr>
+        <w:trPr>
+          <w:tblHeader/>
+          <w:tblCellSpacing w:w="15" w:type="dxa"/>
+        </w:trPr>
+        <w:tc>
+          <w:tcPr>
+            <w:tcW w:w="0" w:type="auto"/>
+            <w:vAlign w:val="center"/>
+            <w:hideMark/>
+          </w:tcPr>
+          <w:p>
+            <w:pPr>
+              <w:pStyle w:val="ListParagraph"/>
+              <w:tabs>
+                <w:tab w:val="left" w:pos="1080"/>
+                <w:tab w:val="left" w:pos="2160"/>
+                <w:tab w:val="left" w:pos="2880"/>
+                <w:tab w:val="left" w:pos="3600"/>
+                <w:tab w:val="left" w:pos="4320"/>
+                <w:tab w:val="left" w:pos="5040"/>
+                <w:tab w:val="left" w:pos="5760"/>
+                <w:tab w:val="left" w:pos="6480"/>
+                <w:tab w:val="right" w:pos="9026"/>
+              </w:tabs>
+              <w:rPr>
+                <w:rFonts w:eastAsiaTheme="minorEastAsia"/>
+                <w:b/>
+                <w:bCs/>
+              </w:rPr>
+            </w:pPr>
+            <w:r>
+              <w:rPr>
+                <w:rFonts w:eastAsiaTheme="minorEastAsia"/>
+                <w:b/>
+                <w:bCs/>
+              </w:rPr>
+              <w:t>Year (n)</w:t>
+            </w:r>
+          </w:p>
+        </w:tc>
+        <w:tc>
+          <w:tcPr>
+            <w:tcW w:w="0" w:type="auto"/>
+            <w:vAlign w:val="center"/>
+            <w:hideMark/>
+          </w:tcPr>
+          <w:p>
+            <w:pPr>
+              <w:pStyle w:val="ListParagraph"/>
+              <w:tabs>
+                <w:tab w:val="left" w:pos="1080"/>
+                <w:tab w:val="left" w:pos="2160"/>
+                <w:tab w:val="left" w:pos="2880"/>
+                <w:tab w:val="left" w:pos="3600"/>
+                <w:tab w:val="left" w:pos="4320"/>
+                <w:tab w:val="left" w:pos="5040"/>
+                <w:tab w:val="left" w:pos="5760"/>
+                <w:tab w:val="left" w:pos="6480"/>
+                <w:tab w:val="right" w:pos="9026"/>
+              </w:tabs>
+              <w:rPr>
+                <w:rFonts w:eastAsiaTheme="minorEastAsia"/>
+                <w:b/>
+                <w:bCs/>
+              </w:rPr>
+            </w:pPr>
+            <w:r>
+              <w:rPr>
+                <w:rFonts w:eastAsiaTheme="minorEastAsia"/>
+                <w:b/>
+                <w:bCs/>
+              </w:rPr>
+              <w:t>Calculation</w:t>
+            </w:r>
+          </w:p>
+        </w:tc>
+        <w:tc>
+          <w:tcPr>
+            <w:tcW w:w="0" w:type="auto"/>
+            <w:vAlign w:val="center"/>
+            <w:hideMark/>
+          </w:tcPr>
+          <w:p>
+            <w:pPr>
+              <w:pStyle w:val="ListParagraph"/>
+              <w:tabs>
+                <w:tab w:val="left" w:pos="1080"/>
+                <w:tab w:val="left" w:pos="2160"/>
+                <w:tab w:val="left" w:pos="2880"/>
+                <w:tab w:val="left" w:pos="3600"/>
+                <w:tab w:val="left" w:pos="4320"/>
+                <w:tab w:val="left" w:pos="5040"/>
+                <w:tab w:val="left" w:pos="5760"/>
+                <w:tab w:val="left" w:pos="6480"/>
+                <w:tab w:val="right" w:pos="9026"/>
+              </w:tabs>
+              <w:rPr>
+                <w:rFonts w:eastAsiaTheme="minorEastAsia"/>
+                <w:b/>
+                <w:bCs/>
+              </w:rPr>
+            </w:pPr>
+            <w:r>
+              <w:rPr>
+                <w:rFonts w:eastAsiaTheme="minorEastAsia"/>
+                <w:b/>
+                <w:bCs/>
+              </w:rPr>
+              <w:t>Present Value Factor</w:t>
+            </w:r>
+          </w:p>
+        </w:tc>
+      </w:tr>
+      <w:tr>
+        <w:trPr>
+          <w:tblCellSpacing w:w="15" w:type="dxa"/>
+        </w:trPr>
+        <w:tc>
+          <w:tcPr>
+            <w:tcW w:w="0" w:type="auto"/>
+            <w:vAlign w:val="center"/>
+            <w:hideMark/>
+          </w:tcPr>
+          <w:p>
+            <w:pPr>
+              <w:pStyle w:val="ListParagraph"/>
+              <w:tabs>
+                <w:tab w:val="left" w:pos="1080"/>
+                <w:tab w:val="left" w:pos="2160"/>
+                <w:tab w:val="left" w:pos="2880"/>
+                <w:tab w:val="left" w:pos="3600"/>
+                <w:tab w:val="left" w:pos="4320"/>
+                <w:tab w:val="left" w:pos="5040"/>
+                <w:tab w:val="left" w:pos="5760"/>
+                <w:tab w:val="left" w:pos="6480"/>
+                <w:tab w:val="right" w:pos="9026"/>
+              </w:tabs>
+              <w:rPr>
+                <w:rFonts w:eastAsiaTheme="minorEastAsia"/>
+              </w:rPr>
+            </w:pPr>
+            <w:r>
+              <w:rPr>
+                <w:rFonts w:eastAsiaTheme="minorEastAsia"/>
+              </w:rPr>
+              <w:t>1</w:t>
+            </w:r>
+          </w:p>
+        </w:tc>
+        <w:tc>
+          <w:tcPr>
+            <w:tcW w:w="0" w:type="auto"/>
+            <w:vAlign w:val="center"/>
+            <w:hideMark/>
+          </w:tcPr>
+          <w:p>
+            <w:pPr>
+              <w:pStyle w:val="ListParagraph"/>
+              <w:tabs>
+                <w:tab w:val="left" w:pos="1080"/>
+                <w:tab w:val="left" w:pos="2160"/>
+                <w:tab w:val="left" w:pos="2880"/>
+                <w:tab w:val="left" w:pos="3600"/>
+                <w:tab w:val="left" w:pos="4320"/>
+                <w:tab w:val="left" w:pos="5040"/>
+                <w:tab w:val="left" w:pos="5760"/>
+                <w:tab w:val="left" w:pos="6480"/>
+                <w:tab w:val="right" w:pos="9026"/>
+              </w:tabs>
+              <w:rPr>
+                <w:rFonts w:eastAsiaTheme="minorEastAsia"/>
+              </w:rPr>
+            </w:pPr>
+            <m:oMathPara>
+              <m:oMath>
+                <m:r>
+                  <w:rPr>
+                    <w:rFonts w:ascii="Cambria Math" w:eastAsiaTheme="minorEastAsia" w:hAnsi="Cambria Math"/>
+                  </w:rPr>
+                  <m:t>1/</m:t>
+                </m:r>
+                <m:sSup>
+                  <m:sSupPr>
+                    <m:ctrlPr>
+                      <w:rPr>
+                        <w:rFonts w:ascii="Cambria Math" w:eastAsiaTheme="minorEastAsia" w:hAnsi="Cambria Math"/>
+                      </w:rPr>
+                    </m:ctrlPr>
+                  </m:sSupPr>
+                  <m:e>
+                    <m:d>
+                      <m:dPr>
+                        <m:ctrlPr>
+                          <w:rPr>
+                            <w:rFonts w:ascii="Cambria Math" w:eastAsiaTheme="minorEastAsia" w:hAnsi="Cambria Math"/>
+                          </w:rPr>
+                        </m:ctrlPr>
+                      </m:dPr>
+                      <m:e>
+                        <m:r>
+                          <w:rPr>
+                            <w:rFonts w:ascii="Cambria Math" w:eastAsiaTheme="minorEastAsia" w:hAnsi="Cambria Math"/>
+                          </w:rPr>
+                          <m:t>1.12</m:t>
+                        </m:r>
+                      </m:e>
+                    </m:d>
+                  </m:e>
+                  <m:sup>
+                    <m:r>
+                      <w:rPr>
+                        <w:rFonts w:ascii="Cambria Math" w:eastAsiaTheme="minorEastAsia" w:hAnsi="Cambria Math"/>
+                      </w:rPr>
+                      <m:t>1</m:t>
+                    </m:r>
+                  </m:sup>
+                </m:sSup>
+              </m:oMath>
+            </m:oMathPara>
+          </w:p>
+        </w:tc>
+        <w:tc>
+          <w:tcPr>
+            <w:tcW w:w="0" w:type="auto"/>
+            <w:vAlign w:val="center"/>
+            <w:hideMark/>
+          </w:tcPr>
+          <w:p>
+            <w:pPr>
+              <w:pStyle w:val="ListParagraph"/>
+              <w:tabs>
+                <w:tab w:val="left" w:pos="1080"/>
+                <w:tab w:val="left" w:pos="2160"/>
+                <w:tab w:val="left" w:pos="2880"/>
+                <w:tab w:val="left" w:pos="3600"/>
+                <w:tab w:val="left" w:pos="4320"/>
+                <w:tab w:val="left" w:pos="5040"/>
+                <w:tab w:val="left" w:pos="5760"/>
+                <w:tab w:val="left" w:pos="6480"/>
+                <w:tab w:val="right" w:pos="9026"/>
+              </w:tabs>
+              <w:rPr>
+                <w:rFonts w:eastAsiaTheme="minorEastAsia"/>
+              </w:rPr>
+            </w:pPr>
+            <w:r>
+              <w:rPr>
+                <w:rFonts w:eastAsiaTheme="minorEastAsia"/>
+                <w:b/>
+                <w:bCs/>
+              </w:rPr>
+              <w:t>0.8929</w:t>
+            </w:r>
+          </w:p>
+        </w:tc>
+      </w:tr>
+      <w:tr>
+        <w:trPr>
+          <w:tblCellSpacing w:w="15" w:type="dxa"/>
+        </w:trPr>
+        <w:tc>
+          <w:tcPr>
+            <w:tcW w:w="0" w:type="auto"/>
+            <w:vAlign w:val="center"/>
+            <w:hideMark/>
+          </w:tcPr>
+          <w:p>
+            <w:pPr>
+              <w:pStyle w:val="ListParagraph"/>
+              <w:tabs>
+                <w:tab w:val="left" w:pos="1080"/>
+                <w:tab w:val="left" w:pos="2160"/>
+                <w:tab w:val="left" w:pos="2880"/>
+                <w:tab w:val="left" w:pos="3600"/>
+                <w:tab w:val="left" w:pos="4320"/>
+                <w:tab w:val="left" w:pos="5040"/>
+                <w:tab w:val="left" w:pos="5760"/>
+                <w:tab w:val="left" w:pos="6480"/>
+                <w:tab w:val="right" w:pos="9026"/>
+              </w:tabs>
+              <w:rPr>
+                <w:rFonts w:eastAsiaTheme="minorEastAsia"/>
+              </w:rPr>
+            </w:pPr>
+            <w:r>
+              <w:rPr>
+                <w:rFonts w:eastAsiaTheme="minorEastAsia"/>
+              </w:rPr>
+              <w:t>2</w:t>
+            </w:r>
+          </w:p>
+        </w:tc>
+        <w:tc>
+          <w:tcPr>
+            <w:tcW w:w="0" w:type="auto"/>
+            <w:vAlign w:val="center"/>
+            <w:hideMark/>
+          </w:tcPr>
+          <w:p>
+            <w:pPr>
+              <w:pStyle w:val="ListParagraph"/>
+              <w:tabs>
+                <w:tab w:val="left" w:pos="1080"/>
+                <w:tab w:val="left" w:pos="2160"/>
+                <w:tab w:val="left" w:pos="2880"/>
+                <w:tab w:val="left" w:pos="3600"/>
+                <w:tab w:val="left" w:pos="4320"/>
+                <w:tab w:val="left" w:pos="5040"/>
+                <w:tab w:val="left" w:pos="5760"/>
+                <w:tab w:val="left" w:pos="6480"/>
+                <w:tab w:val="right" w:pos="9026"/>
+              </w:tabs>
+              <w:rPr>
+                <w:rFonts w:eastAsiaTheme="minorEastAsia"/>
+              </w:rPr>
+            </w:pPr>
+            <m:oMathPara>
+              <m:oMath>
+                <m:r>
+                  <w:rPr>
+                    <w:rFonts w:ascii="Cambria Math" w:eastAsiaTheme="minorEastAsia" w:hAnsi="Cambria Math"/>
+                  </w:rPr>
+                  <m:t>1/</m:t>
+                </m:r>
+                <m:sSup>
+                  <m:sSupPr>
+                    <m:ctrlPr>
+                      <w:rPr>
+                        <w:rFonts w:ascii="Cambria Math" w:eastAsiaTheme="minorEastAsia" w:hAnsi="Cambria Math"/>
+                      </w:rPr>
+                    </m:ctrlPr>
+                  </m:sSupPr>
+                  <m:e>
+                    <m:d>
+                      <m:dPr>
+                        <m:ctrlPr>
+                          <w:rPr>
+                            <w:rFonts w:ascii="Cambria Math" w:eastAsiaTheme="minorEastAsia" w:hAnsi="Cambria Math"/>
+                          </w:rPr>
+                        </m:ctrlPr>
+                      </m:dPr>
+                      <m:e>
+                        <m:r>
+                          <w:rPr>
+                            <w:rFonts w:ascii="Cambria Math" w:eastAsiaTheme="minorEastAsia" w:hAnsi="Cambria Math"/>
+                          </w:rPr>
+                          <m:t>1.12</m:t>
+                        </m:r>
+                      </m:e>
+                    </m:d>
+                  </m:e>
+                  <m:sup>
+                    <m:r>
+                      <w:rPr>
+                        <w:rFonts w:ascii="Cambria Math" w:eastAsiaTheme="minorEastAsia" w:hAnsi="Cambria Math"/>
+                      </w:rPr>
+                      <m:t>2</m:t>
+                    </m:r>
+                  </m:sup>
+                </m:sSup>
+              </m:oMath>
+            </m:oMathPara>
+          </w:p>
+        </w:tc>
+        <w:tc>
+          <w:tcPr>
+            <w:tcW w:w="0" w:type="auto"/>
+            <w:vAlign w:val="center"/>
+            <w:hideMark/>
+          </w:tcPr>
+          <w:p>
+            <w:pPr>
+              <w:pStyle w:val="ListParagraph"/>
+              <w:tabs>
+                <w:tab w:val="left" w:pos="1080"/>
+                <w:tab w:val="left" w:pos="2160"/>
+                <w:tab w:val="left" w:pos="2880"/>
+                <w:tab w:val="left" w:pos="3600"/>
+                <w:tab w:val="left" w:pos="4320"/>
+                <w:tab w:val="left" w:pos="5040"/>
+                <w:tab w:val="left" w:pos="5760"/>
+                <w:tab w:val="left" w:pos="6480"/>
+                <w:tab w:val="right" w:pos="9026"/>
+              </w:tabs>
+              <w:rPr>
+                <w:rFonts w:eastAsiaTheme="minorEastAsia"/>
+              </w:rPr>
+            </w:pPr>
+            <w:r>
+              <w:rPr>
+                <w:rFonts w:eastAsiaTheme="minorEastAsia"/>
+                <w:b/>
+                <w:bCs/>
+              </w:rPr>
+              <w:t>0.7972</w:t>
+            </w:r>
+          </w:p>
+        </w:tc>
+      </w:tr>
+      <w:tr>
+        <w:trPr>
+          <w:tblCellSpacing w:w="15" w:type="dxa"/>
+        </w:trPr>
+        <w:tc>
+          <w:tcPr>
+            <w:tcW w:w="0" w:type="auto"/>
+            <w:vAlign w:val="center"/>
+            <w:hideMark/>
+          </w:tcPr>
+          <w:p>
+            <w:pPr>
+              <w:pStyle w:val="ListParagraph"/>
+              <w:tabs>
+                <w:tab w:val="left" w:pos="1080"/>
+                <w:tab w:val="left" w:pos="2160"/>
+                <w:tab w:val="left" w:pos="2880"/>
+                <w:tab w:val="left" w:pos="3600"/>
+                <w:tab w:val="left" w:pos="4320"/>
+                <w:tab w:val="left" w:pos="5040"/>
+                <w:tab w:val="left" w:pos="5760"/>
+                <w:tab w:val="left" w:pos="6480"/>
+                <w:tab w:val="right" w:pos="9026"/>
+              </w:tabs>
+              <w:rPr>
+                <w:rFonts w:eastAsiaTheme="minorEastAsia"/>
+              </w:rPr>
+            </w:pPr>
+            <w:r>
+              <w:rPr>
+                <w:rFonts w:eastAsiaTheme="minorEastAsia"/>
+              </w:rPr>
+              <w:t>3</w:t>
+            </w:r>
+          </w:p>
+        </w:tc>
+        <w:tc>
+          <w:tcPr>
+            <w:tcW w:w="0" w:type="auto"/>
+            <w:vAlign w:val="center"/>
+            <w:hideMark/>
+          </w:tcPr>
+          <w:p>
+            <w:pPr>
+              <w:pStyle w:val="ListParagraph"/>
+              <w:tabs>
+                <w:tab w:val="left" w:pos="1080"/>
+                <w:tab w:val="left" w:pos="2160"/>
+                <w:tab w:val="left" w:pos="2880"/>
+                <w:tab w:val="left" w:pos="3600"/>
+                <w:tab w:val="left" w:pos="4320"/>
+                <w:tab w:val="left" w:pos="5040"/>
+                <w:tab w:val="left" w:pos="5760"/>
+                <w:tab w:val="left" w:pos="6480"/>
+                <w:tab w:val="right" w:pos="9026"/>
+              </w:tabs>
+              <w:rPr>
+                <w:rFonts w:eastAsiaTheme="minorEastAsia"/>
+              </w:rPr>
+            </w:pPr>
+            <m:oMathPara>
+              <m:oMath>
+                <m:r>
+                  <w:rPr>
+                    <w:rFonts w:ascii="Cambria Math" w:eastAsiaTheme="minorEastAsia" w:hAnsi="Cambria Math"/>
+                  </w:rPr>
+                  <m:t>1/</m:t>
+                </m:r>
+                <m:sSup>
+                  <m:sSupPr>
+                    <m:ctrlPr>
+                      <w:rPr>
+                        <w:rFonts w:ascii="Cambria Math" w:eastAsiaTheme="minorEastAsia" w:hAnsi="Cambria Math"/>
+                      </w:rPr>
+                    </m:ctrlPr>
+                  </m:sSupPr>
+                  <m:e>
+                    <m:d>
+                      <m:dPr>
+                        <m:ctrlPr>
+                          <w:rPr>
+                            <w:rFonts w:ascii="Cambria Math" w:eastAsiaTheme="minorEastAsia" w:hAnsi="Cambria Math"/>
+                          </w:rPr>
+                        </m:ctrlPr>
+                      </m:dPr>
+                      <m:e>
+                        <m:r>
+                          <w:rPr>
+                            <w:rFonts w:ascii="Cambria Math" w:eastAsiaTheme="minorEastAsia" w:hAnsi="Cambria Math"/>
+                          </w:rPr>
+                          <m:t>1.12</m:t>
+                        </m:r>
+                      </m:e>
+                    </m:d>
+                  </m:e>
+                  <m:sup>
+                    <m:r>
+                      <w:rPr>
+                        <w:rFonts w:ascii="Cambria Math" w:eastAsiaTheme="minorEastAsia" w:hAnsi="Cambria Math"/>
+                      </w:rPr>
+                      <m:t>3</m:t>
+                    </m:r>
+                  </m:sup>
+                </m:sSup>
+              </m:oMath>
+            </m:oMathPara>
+          </w:p>
+        </w:tc>
+        <w:tc>
+          <w:tcPr>
+            <w:tcW w:w="0" w:type="auto"/>
+            <w:vAlign w:val="center"/>
+            <w:hideMark/>
+          </w:tcPr>
+          <w:p>
+            <w:pPr>
+              <w:pStyle w:val="ListParagraph"/>
+              <w:tabs>
+                <w:tab w:val="left" w:pos="1080"/>
+                <w:tab w:val="left" w:pos="2160"/>
+                <w:tab w:val="left" w:pos="2880"/>
+                <w:tab w:val="left" w:pos="3600"/>
+                <w:tab w:val="left" w:pos="4320"/>
+                <w:tab w:val="left" w:pos="5040"/>
+                <w:tab w:val="left" w:pos="5760"/>
+                <w:tab w:val="left" w:pos="6480"/>
+                <w:tab w:val="right" w:pos="9026"/>
+              </w:tabs>
+              <w:rPr>
+                <w:rFonts w:eastAsiaTheme="minorEastAsia"/>
+              </w:rPr>
+            </w:pPr>
+            <w:r>
+              <w:rPr>
+                <w:rFonts w:eastAsiaTheme="minorEastAsia"/>
+                <w:b/>
+                <w:bCs/>
+              </w:rPr>
+              <w:t>0.7118</w:t>
+            </w:r>
+          </w:p>
+        </w:tc>
+      </w:tr>
+      <w:tr>
+        <w:trPr>
+          <w:tblCellSpacing w:w="15" w:type="dxa"/>
+        </w:trPr>
+        <w:tc>
+          <w:tcPr>
+            <w:tcW w:w="0" w:type="auto"/>
+            <w:vAlign w:val="center"/>
+            <w:hideMark/>
+          </w:tcPr>
+          <w:p>
+            <w:pPr>
+              <w:pStyle w:val="ListParagraph"/>
+              <w:tabs>
+                <w:tab w:val="left" w:pos="1080"/>
+                <w:tab w:val="left" w:pos="2160"/>
+                <w:tab w:val="left" w:pos="2880"/>
+                <w:tab w:val="left" w:pos="3600"/>
+                <w:tab w:val="left" w:pos="4320"/>
+                <w:tab w:val="left" w:pos="5040"/>
+                <w:tab w:val="left" w:pos="5760"/>
+                <w:tab w:val="left" w:pos="6480"/>
+                <w:tab w:val="right" w:pos="9026"/>
+              </w:tabs>
+              <w:rPr>
+                <w:rFonts w:eastAsiaTheme="minorEastAsia"/>
+              </w:rPr>
+            </w:pPr>
+            <w:r>
+              <w:rPr>
+                <w:rFonts w:eastAsiaTheme="minorEastAsia"/>
+              </w:rPr>
+              <w:t>4</w:t>
+            </w:r>
+          </w:p>
+        </w:tc>
+        <w:tc>
+          <w:tcPr>
+            <w:tcW w:w="0" w:type="auto"/>
+            <w:vAlign w:val="center"/>
+            <w:hideMark/>
+          </w:tcPr>
+          <w:p>
+            <w:pPr>
+              <w:pStyle w:val="ListParagraph"/>
+              <w:tabs>
+                <w:tab w:val="left" w:pos="1080"/>
+                <w:tab w:val="left" w:pos="2160"/>
+                <w:tab w:val="left" w:pos="2880"/>
+                <w:tab w:val="left" w:pos="3600"/>
+                <w:tab w:val="left" w:pos="4320"/>
+                <w:tab w:val="left" w:pos="5040"/>
+                <w:tab w:val="left" w:pos="5760"/>
+                <w:tab w:val="left" w:pos="6480"/>
+                <w:tab w:val="right" w:pos="9026"/>
+              </w:tabs>
+              <w:rPr>
+                <w:rFonts w:eastAsiaTheme="minorEastAsia"/>
+              </w:rPr>
+            </w:pPr>
+            <m:oMathPara>
+              <m:oMath>
+                <m:r>
+                  <w:rPr>
+                    <w:rFonts w:ascii="Cambria Math" w:eastAsiaTheme="minorEastAsia" w:hAnsi="Cambria Math"/>
+                  </w:rPr>
+                  <m:t>1/</m:t>
+                </m:r>
+                <m:sSup>
+                  <m:sSupPr>
+                    <m:ctrlPr>
+                      <w:rPr>
+                        <w:rFonts w:ascii="Cambria Math" w:eastAsiaTheme="minorEastAsia" w:hAnsi="Cambria Math"/>
+                      </w:rPr>
+                    </m:ctrlPr>
+                  </m:sSupPr>
+                  <m:e>
+                    <m:d>
+                      <m:dPr>
+                        <m:ctrlPr>
+                          <w:rPr>
+                            <w:rFonts w:ascii="Cambria Math" w:eastAsiaTheme="minorEastAsia" w:hAnsi="Cambria Math"/>
+                          </w:rPr>
+                        </m:ctrlPr>
+                      </m:dPr>
+                      <m:e>
+                        <m:r>
+                          <w:rPr>
+                            <w:rFonts w:ascii="Cambria Math" w:eastAsiaTheme="minorEastAsia" w:hAnsi="Cambria Math"/>
+                          </w:rPr>
+                          <m:t>1.12</m:t>
+                        </m:r>
+                      </m:e>
+                    </m:d>
+                  </m:e>
+                  <m:sup>
+                    <m:r>
+                      <w:rPr>
+                        <w:rFonts w:ascii="Cambria Math" w:eastAsiaTheme="minorEastAsia" w:hAnsi="Cambria Math"/>
+                      </w:rPr>
+                      <m:t>4</m:t>
+                    </m:r>
+                  </m:sup>
+                </m:sSup>
+              </m:oMath>
+            </m:oMathPara>
+          </w:p>
+        </w:tc>
+        <w:tc>
+          <w:tcPr>
+            <w:tcW w:w="0" w:type="auto"/>
+            <w:vAlign w:val="center"/>
+            <w:hideMark/>
+          </w:tcPr>
+          <w:p>
+            <w:pPr>
+              <w:pStyle w:val="ListParagraph"/>
+              <w:tabs>
+                <w:tab w:val="left" w:pos="1080"/>
+                <w:tab w:val="left" w:pos="2160"/>
+                <w:tab w:val="left" w:pos="2880"/>
+                <w:tab w:val="left" w:pos="3600"/>
+                <w:tab w:val="left" w:pos="4320"/>
+                <w:tab w:val="left" w:pos="5040"/>
+                <w:tab w:val="left" w:pos="5760"/>
+                <w:tab w:val="left" w:pos="6480"/>
+                <w:tab w:val="right" w:pos="9026"/>
+              </w:tabs>
+              <w:rPr>
+                <w:rFonts w:eastAsiaTheme="minorEastAsia"/>
+              </w:rPr>
+            </w:pPr>
+            <w:r>
+              <w:rPr>
+                <w:rFonts w:eastAsiaTheme="minorEastAsia"/>
+                <w:b/>
+                <w:bCs/>
+              </w:rPr>
+              <w:t>0.6355</w:t>
+            </w:r>
+          </w:p>
+        </w:tc>
+      </w:tr>
+      <w:tr>
+        <w:trPr>
+          <w:tblCellSpacing w:w="15" w:type="dxa"/>
+        </w:trPr>
+        <w:tc>
+          <w:tcPr>
+            <w:tcW w:w="0" w:type="auto"/>
+            <w:vAlign w:val="center"/>
+            <w:hideMark/>
+          </w:tcPr>
+          <w:p>
+            <w:pPr>
+              <w:pStyle w:val="ListParagraph"/>
+              <w:tabs>
+                <w:tab w:val="left" w:pos="1080"/>
+                <w:tab w:val="left" w:pos="2160"/>
+                <w:tab w:val="left" w:pos="2880"/>
+                <w:tab w:val="left" w:pos="3600"/>
+                <w:tab w:val="left" w:pos="4320"/>
+                <w:tab w:val="left" w:pos="5040"/>
+                <w:tab w:val="left" w:pos="5760"/>
+                <w:tab w:val="left" w:pos="6480"/>
+                <w:tab w:val="right" w:pos="9026"/>
+              </w:tabs>
+              <w:rPr>
+                <w:rFonts w:eastAsiaTheme="minorEastAsia"/>
+              </w:rPr>
+            </w:pPr>
+            <w:r>
+              <w:rPr>
+                <w:rFonts w:eastAsiaTheme="minorEastAsia"/>
+              </w:rPr>
+              <w:t>5</w:t>
+            </w:r>
+          </w:p>
+        </w:tc>
+        <w:tc>
+          <w:tcPr>
+            <w:tcW w:w="0" w:type="auto"/>
+            <w:vAlign w:val="center"/>
+            <w:hideMark/>
+          </w:tcPr>
+          <w:p>
+            <w:pPr>
+              <w:pStyle w:val="ListParagraph"/>
+              <w:tabs>
+                <w:tab w:val="left" w:pos="1080"/>
+                <w:tab w:val="left" w:pos="2160"/>
+                <w:tab w:val="left" w:pos="2880"/>
+                <w:tab w:val="left" w:pos="3600"/>
+                <w:tab w:val="left" w:pos="4320"/>
+                <w:tab w:val="left" w:pos="5040"/>
+                <w:tab w:val="left" w:pos="5760"/>
+                <w:tab w:val="left" w:pos="6480"/>
+                <w:tab w:val="right" w:pos="9026"/>
+              </w:tabs>
+              <w:rPr>
+                <w:rFonts w:eastAsiaTheme="minorEastAsia"/>
+              </w:rPr>
+            </w:pPr>
+            <m:oMathPara>
+              <m:oMath>
+                <m:r>
+                  <w:rPr>
+                    <w:rFonts w:ascii="Cambria Math" w:eastAsiaTheme="minorEastAsia" w:hAnsi="Cambria Math"/>
+                  </w:rPr>
+                  <m:t>1/</m:t>
+                </m:r>
+                <m:sSup>
+                  <m:sSupPr>
+                    <m:ctrlPr>
+                      <w:rPr>
+                        <w:rFonts w:ascii="Cambria Math" w:eastAsiaTheme="minorEastAsia" w:hAnsi="Cambria Math"/>
+                      </w:rPr>
+                    </m:ctrlPr>
+                  </m:sSupPr>
+                  <m:e>
+                    <m:d>
+                      <m:dPr>
+                        <m:ctrlPr>
+                          <w:rPr>
+                            <w:rFonts w:ascii="Cambria Math" w:eastAsiaTheme="minorEastAsia" w:hAnsi="Cambria Math"/>
+                          </w:rPr>
+                        </m:ctrlPr>
+                      </m:dPr>
+                      <m:e>
+                        <m:r>
+                          <w:rPr>
+                            <w:rFonts w:ascii="Cambria Math" w:eastAsiaTheme="minorEastAsia" w:hAnsi="Cambria Math"/>
+                          </w:rPr>
+                          <m:t>1.12</m:t>
+                        </m:r>
+                      </m:e>
+                    </m:d>
+                  </m:e>
+                  <m:sup>
+                    <m:r>
+                      <w:rPr>
+                        <w:rFonts w:ascii="Cambria Math" w:eastAsiaTheme="minorEastAsia" w:hAnsi="Cambria Math"/>
+                      </w:rPr>
+                      <m:t>5</m:t>
+                    </m:r>
+                  </m:sup>
+                </m:sSup>
+              </m:oMath>
+            </m:oMathPara>
+          </w:p>
+        </w:tc>
+        <w:tc>
+          <w:tcPr>
+            <w:tcW w:w="0" w:type="auto"/>
+            <w:vAlign w:val="center"/>
+            <w:hideMark/>
+          </w:tcPr>
+          <w:p>
+            <w:pPr>
+              <w:pStyle w:val="ListParagraph"/>
+              <w:tabs>
+                <w:tab w:val="left" w:pos="1080"/>
+                <w:tab w:val="left" w:pos="2160"/>
+                <w:tab w:val="left" w:pos="2880"/>
+                <w:tab w:val="left" w:pos="3600"/>
+                <w:tab w:val="left" w:pos="4320"/>
+                <w:tab w:val="left" w:pos="5040"/>
+                <w:tab w:val="left" w:pos="5760"/>
+                <w:tab w:val="left" w:pos="6480"/>
+                <w:tab w:val="right" w:pos="9026"/>
+              </w:tabs>
+              <w:rPr>
+                <w:rFonts w:eastAsiaTheme="minorEastAsia"/>
+              </w:rPr>
+            </w:pPr>
+            <w:r>
+              <w:rPr>
+                <w:rFonts w:eastAsiaTheme="minorEastAsia"/>
+                <w:b/>
+                <w:bCs/>
+              </w:rPr>
+              <w:t>0.5674</w:t>
+            </w:r>
+          </w:p>
+        </w:tc>
+      </w:tr>
+    </w:tbl>
+    <w:p>
+      <w:pPr>
+        <w:pStyle w:val="ListParagraph"/>
+        <w:numPr>
+          <w:ilvl w:val="0"/>
+          <w:numId w:val="30"/>
+        </w:numPr>
+        <w:rPr>
+          <w:lang w:val="en-US"/>
+        </w:rPr>
+      </w:pPr>
+      <w:r>
+        <w:rPr>
+          <w:lang w:val="en-US"/>
+        </w:rPr>
+        <w:t>The expected cash inflows are as follows</w:t>
+      </w:r>
+      <w:r>
+        <w:rPr>
+          <w:lang w:val="en-US"/>
+        </w:rPr>
+        <w:t>:</w:t>
+      </w:r>
+    </w:p>
+    <w:p>
+      <w:pPr>
+        <w:pStyle w:val="ListParagraph"/>
+        <w:rPr>
+          <w:lang w:val="en-US"/>
+        </w:rPr>
+      </w:pPr>
+      <w:r>
+        <w:rPr>
+          <w:noProof/>
+          <w:lang w:val="en-US"/>
+        </w:rPr>
+        <w:drawing>
+          <wp:inline distT="0" distB="0" distL="0" distR="0" wp14:anchorId="33D3B819" wp14:editId="5C4A67EE">
+            <wp:extent cx="2777490" cy="387985"/>
+            <wp:effectExtent l="0" t="0" r="3810" b="0"/>
+            <wp:docPr id="1733348985" name="Picture 1"/>
+            <wp:cNvGraphicFramePr>
+              <a:graphicFrameLocks xmlns:a="http://schemas.openxmlformats.org/drawingml/2006/main" noChangeAspect="1"/>
+            </wp:cNvGraphicFramePr>
+            <a:graphic xmlns:a="http://schemas.openxmlformats.org/drawingml/2006/main">
+              <a:graphicData uri="http://schemas.openxmlformats.org/drawingml/2006/picture">
+                <pic:pic xmlns:pic="http://schemas.openxmlformats.org/drawingml/2006/picture">
+                  <pic:nvPicPr>
+                    <pic:cNvPr id="0" name="Picture 1"/>
+                    <pic:cNvPicPr>
+                      <a:picLocks noChangeAspect="1" noChangeArrowheads="1"/>
+                    </pic:cNvPicPr>
+                  </pic:nvPicPr>
+                  <pic:blipFill>
+                    <a:blip r:embed="rId6">
+                      <a:extLst>
+                        <a:ext uri="{28A0092B-C50C-407E-A947-70E740481C1C}">
+                          <a14:useLocalDpi xmlns:a14="http://schemas.microsoft.com/office/drawing/2010/main" val="0"/>
+                        </a:ext>
+                      </a:extLst>
+                    </a:blip>
+                    <a:srcRect/>
+                    <a:stretch>
+                      <a:fillRect/>
+                    </a:stretch>
+                  </pic:blipFill>
+                  <pic:spPr bwMode="auto">
+                    <a:xfrm>
+                      <a:off x="0" y="0"/>
+                      <a:ext cx="2777490" cy="387985"/>
+                    </a:xfrm>
+                    <a:prstGeom prst="rect">
+                      <a:avLst/>
+                    </a:prstGeom>
+                    <a:noFill/>
+                    <a:ln>
+                      <a:noFill/>
+                    </a:ln>
+                  </pic:spPr>
+                </pic:pic>
+              </a:graphicData>
+            </a:graphic>
+          </wp:inline>
+        </w:drawing>
+      </w:r>
+    </w:p>
+    <w:p>
+      <w:pPr>
+        <w:pStyle w:val="ListParagraph"/>
+        <w:rPr>
+          <w:lang w:val="en-US"/>
+        </w:rPr>
+      </w:pPr>
+      <w:r>
+        <w:rPr>
+          <w:lang w:val="en-US"/>
+        </w:rPr>
+        <w:t xml:space="preserve">Discount rate is 16% find out the cash inflows using the present value table </w:t>
+      </w:r>
+    </w:p>
+    <w:p>
+      <w:pPr>
+        <w:pStyle w:val="ListParagraph"/>
+        <w:rPr>
+          <w:lang w:val="en-US"/>
+        </w:rPr>
+      </w:pPr>
+    </w:p>
+    <w:p>
+      <w:pPr>
+        <w:pStyle w:val="ListParagraph"/>
+        <w:rPr>
+          <w:lang w:val="en-US"/>
+        </w:rPr>
+      </w:pPr>
+      <w:r>
+        <w:rPr>
+          <w:lang w:val="en-US"/>
+        </w:rPr>
+        <w:t>Ans:</w:t>
+      </w:r>
+    </w:p>
+    <w:p>
+      <w:pPr>
+        <w:pStyle w:val="ListParagraph"/>
+        <w:rPr>
+          <w:lang w:val="en-US"/>
+        </w:rPr>
+      </w:pPr>
+    </w:p>
+    <w:p>
+      <w:pPr>
+        <w:pStyle w:val="ListParagraph"/>
+        <w:rPr>
+          <w:lang w:val="en-US"/>
+        </w:rPr>
+      </w:pPr>
+      <w:r>
+        <w:rPr>
+          <w:noProof/>
+          <w:lang w:val="en-US"/>
+        </w:rPr>
+        <w:lastRenderedPageBreak/>
+        <w:drawing>
+          <wp:inline distT="0" distB="0" distL="0" distR="0" wp14:anchorId="2D81EEED" wp14:editId="6CB7CF4A">
+            <wp:extent cx="2889885" cy="1345565"/>
+            <wp:effectExtent l="0" t="0" r="5715" b="6985"/>
+            <wp:docPr id="928493644" name="Picture 2"/>
+            <wp:cNvGraphicFramePr>
+              <a:graphicFrameLocks xmlns:a="http://schemas.openxmlformats.org/drawingml/2006/main" noChangeAspect="1"/>
+            </wp:cNvGraphicFramePr>
+            <a:graphic xmlns:a="http://schemas.openxmlformats.org/drawingml/2006/main">
+              <a:graphicData uri="http://schemas.openxmlformats.org/drawingml/2006/picture">
+                <pic:pic xmlns:pic="http://schemas.openxmlformats.org/drawingml/2006/picture">
+                  <pic:nvPicPr>
+                    <pic:cNvPr id="0" name="Picture 2"/>
+                    <pic:cNvPicPr>
+                      <a:picLocks noChangeAspect="1" noChangeArrowheads="1"/>
+                    </pic:cNvPicPr>
+                  </pic:nvPicPr>
+                  <pic:blipFill>
+                    <a:blip r:embed="rId7">
+                      <a:extLst>
+                        <a:ext uri="{28A0092B-C50C-407E-A947-70E740481C1C}">
+                          <a14:useLocalDpi xmlns:a14="http://schemas.microsoft.com/office/drawing/2010/main" val="0"/>
+                        </a:ext>
+                      </a:extLst>
+                    </a:blip>
+                    <a:srcRect/>
+                    <a:stretch>
+                      <a:fillRect/>
+                    </a:stretch>
+                  </pic:blipFill>
+                  <pic:spPr bwMode="auto">
+                    <a:xfrm>
+                      <a:off x="0" y="0"/>
+                      <a:ext cx="2889885" cy="1345565"/>
+                    </a:xfrm>
+                    <a:prstGeom prst="rect">
+                      <a:avLst/>
+                    </a:prstGeom>
+                    <a:noFill/>
+                    <a:ln>
+                      <a:noFill/>
+                    </a:ln>
+                  </pic:spPr>
+                </pic:pic>
+              </a:graphicData>
+            </a:graphic>
+          </wp:inline>
+        </w:drawing>
+      </w:r>
+    </w:p>
+    <w:p>
+      <w:pPr>
+        <w:rPr>
+          <w:lang w:val="en-US"/>
+        </w:rPr>
+      </w:pPr>
+    </w:p>
+    <w:p>
+      <w:pPr>
+        <w:rPr>
+          <w:lang w:val="en-US"/>
+        </w:rPr>
+      </w:pPr>
+      <w:r>
+        <w:rPr>
+          <w:lang w:val="en-US"/>
+        </w:rPr>
+        <w:t>PRESENT VALUE OF ANNUITY</w:t>
+      </w:r>
+    </w:p>
+    <w:p>
+      <w:pPr>
+        <w:pStyle w:val="ListParagraph"/>
+        <w:numPr>
+          <w:ilvl w:val="0"/>
+          <w:numId w:val="31"/>
+        </w:numPr>
+        <w:rPr>
+          <w:lang w:val="en-US"/>
+        </w:rPr>
+      </w:pPr>
+      <w:r>
+        <w:rPr>
+          <w:lang w:val="en-US"/>
+        </w:rPr>
+        <w:t>Raja has entered into an agreement that will fetch him Rs. 60000 per annum for next 4 years. He want to know the present value for the future cash inflows at 20% discount rate</w:t>
+      </w:r>
+    </w:p>
+    <w:p>
+      <w:pPr>
+        <w:pStyle w:val="ListParagraph"/>
+        <w:rPr>
+          <w:lang w:val="en-US"/>
+        </w:rPr>
+      </w:pPr>
+    </w:p>
+    <w:p>
+      <w:pPr>
+        <w:pStyle w:val="ListParagraph"/>
+        <w:rPr>
+          <w:lang w:val="en-US"/>
+        </w:rPr>
+      </w:pPr>
+      <w:r>
+        <w:rPr>
+          <w:lang w:val="en-US"/>
+        </w:rPr>
+        <w:t>Ans</w:t>
+      </w:r>
+    </w:p>
+    <w:p>
+      <w:pPr>
+        <w:pStyle w:val="ListParagraph"/>
+        <w:rPr>
+          <w:lang w:val="en-US"/>
+        </w:rPr>
+      </w:pPr>
+    </w:p>
+    <w:p>
+      <w:pPr>
+        <w:pStyle w:val="ListParagraph"/>
+        <w:rPr>
+          <w:lang w:val="en-US"/>
+        </w:rPr>
+      </w:pPr>
+      <m:oMath>
+        <m:r>
+          <w:rPr>
+            <w:rFonts w:ascii="Cambria Math" w:hAnsi="Cambria Math"/>
+            <w:lang w:val="en-US"/>
+          </w:rPr>
+          <m:t>PV of annuity = Cash inflows ×</m:t>
+        </m:r>
+        <m:r>
+          <w:rPr>
+            <w:rFonts w:ascii="Cambria Math" w:eastAsiaTheme="minorEastAsia" w:hAnsi="Cambria Math"/>
+            <w:lang w:val="en-US"/>
+          </w:rPr>
+          <m:t xml:space="preserve"> </m:t>
+        </m:r>
+        <m:f>
+          <m:fPr>
+            <m:ctrlPr>
+              <w:rPr>
+                <w:rFonts w:ascii="Cambria Math" w:eastAsiaTheme="minorEastAsia" w:hAnsi="Cambria Math"/>
+                <w:i/>
+                <w:lang w:val="en-US"/>
+              </w:rPr>
+            </m:ctrlPr>
+          </m:fPr>
+          <m:num>
+            <m:r>
+              <w:rPr>
+                <w:rFonts w:ascii="Cambria Math" w:eastAsiaTheme="minorEastAsia" w:hAnsi="Cambria Math"/>
+                <w:lang w:val="en-US"/>
+              </w:rPr>
+              <m:t>1</m:t>
+            </m:r>
+          </m:num>
+          <m:den>
+            <m:sSup>
+              <m:sSupPr>
+                <m:ctrlPr>
+                  <w:rPr>
+                    <w:rFonts w:ascii="Cambria Math" w:eastAsiaTheme="minorEastAsia" w:hAnsi="Cambria Math"/>
+                    <w:i/>
+                    <w:lang w:val="en-US"/>
+                  </w:rPr>
+                </m:ctrlPr>
+              </m:sSupPr>
+              <m:e>
+                <m:d>
+                  <m:dPr>
+                    <m:ctrlPr>
+                      <w:rPr>
+                        <w:rFonts w:ascii="Cambria Math" w:eastAsiaTheme="minorEastAsia" w:hAnsi="Cambria Math"/>
+                        <w:i/>
+                        <w:lang w:val="en-US"/>
+                      </w:rPr>
+                    </m:ctrlPr>
+                  </m:dPr>
+                  <m:e>
+                    <m:r>
+                      <w:rPr>
+                        <w:rFonts w:ascii="Cambria Math" w:eastAsiaTheme="minorEastAsia" w:hAnsi="Cambria Math"/>
+                        <w:lang w:val="en-US"/>
+                      </w:rPr>
+                      <m:t>1+R</m:t>
+                    </m:r>
+                  </m:e>
+                </m:d>
+              </m:e>
+              <m:sup>
+                <m:r>
+                  <w:rPr>
+                    <w:rFonts w:ascii="Cambria Math" w:eastAsiaTheme="minorEastAsia" w:hAnsi="Cambria Math"/>
+                    <w:lang w:val="en-US"/>
+                  </w:rPr>
+                  <m:t>n</m:t>
+                </m:r>
+              </m:sup>
+            </m:sSup>
+          </m:den>
+        </m:f>
+      </m:oMath>
+      <w:r>
+        <w:rPr>
+          <w:rFonts w:eastAsiaTheme="minorEastAsia"/>
+          <w:lang w:val="en-US"/>
+        </w:rPr>
+        <w:t xml:space="preserve"> </w:t>
+      </w:r>
+      <w:r>
+        <w:rPr>
+          <w:lang w:val="en-US"/>
+        </w:rPr>
+        <w:t xml:space="preserve"> </w:t>
+      </w:r>
+    </w:p>
+    <w:p>
+      <w:pPr>
+        <w:pStyle w:val="ListParagraph"/>
+        <w:rPr>
+          <w:lang w:val="en-US"/>
+        </w:rPr>
+      </w:pPr>
+    </w:p>
+    <w:tbl>
+      <w:tblPr>
+        <w:tblW w:w="0" w:type="auto"/>
+        <w:tblCellSpacing w:w="15" w:type="dxa"/>
+        <w:tblCellMar>
+          <w:top w:w="15" w:type="dxa"/>
+          <w:left w:w="15" w:type="dxa"/>
+          <w:bottom w:w="15" w:type="dxa"/>
+          <w:right w:w="15" w:type="dxa"/>
+        </w:tblCellMar>
+        <w:tblLook w:val="04A0" w:firstRow="1" w:lastRow="0" w:firstColumn="1" w:lastColumn="0" w:noHBand="0" w:noVBand="1"/>
+      </w:tblPr>
+      <w:tblGrid>
+        <w:gridCol w:w="1274"/>
+        <w:gridCol w:w="2391"/>
+        <w:gridCol w:w="2591"/>
+        <w:gridCol w:w="2614"/>
+      </w:tblGrid>
+      <w:tr>
+        <w:trPr>
+          <w:tblHeader/>
+          <w:tblCellSpacing w:w="15" w:type="dxa"/>
+        </w:trPr>
+        <w:tc>
+          <w:tcPr>
+            <w:tcW w:w="0" w:type="auto"/>
+            <w:vAlign w:val="center"/>
+            <w:hideMark/>
+          </w:tcPr>
+          <w:p>
+            <w:pPr>
+              <w:pStyle w:val="ListParagraph"/>
+              <w:rPr>
+                <w:b/>
+                <w:bCs/>
+              </w:rPr>
+            </w:pPr>
+            <w:r>
+              <w:rPr>
+                <w:b/>
+                <w:bCs/>
+              </w:rPr>
+              <w:t>Year</w:t>
+            </w:r>
+          </w:p>
+        </w:tc>
+        <w:tc>
+          <w:tcPr>
+            <w:tcW w:w="0" w:type="auto"/>
+            <w:vAlign w:val="center"/>
+            <w:hideMark/>
+          </w:tcPr>
+          <w:p>
+            <w:pPr>
+              <w:pStyle w:val="ListParagraph"/>
+              <w:rPr>
+                <w:b/>
+                <w:bCs/>
+              </w:rPr>
+            </w:pPr>
+            <w:r>
+              <w:rPr>
+                <w:b/>
+                <w:bCs/>
+              </w:rPr>
+              <w:t>Cash Inflow (₹)</w:t>
+            </w:r>
+          </w:p>
+        </w:tc>
+        <w:tc>
+          <w:tcPr>
+            <w:tcW w:w="0" w:type="auto"/>
+            <w:vAlign w:val="center"/>
+            <w:hideMark/>
+          </w:tcPr>
+          <w:p>
+            <w:pPr>
+              <w:pStyle w:val="ListParagraph"/>
+              <w:rPr>
+                <w:b/>
+                <w:bCs/>
+              </w:rPr>
+            </w:pPr>
+            <w:r>
+              <w:rPr>
+                <w:b/>
+                <w:bCs/>
+              </w:rPr>
+              <w:t>PV Factor at 20%</w:t>
+            </w:r>
+          </w:p>
+        </w:tc>
+        <w:tc>
+          <w:tcPr>
+            <w:tcW w:w="0" w:type="auto"/>
+            <w:vAlign w:val="center"/>
+            <w:hideMark/>
+          </w:tcPr>
+          <w:p>
+            <w:pPr>
+              <w:pStyle w:val="ListParagraph"/>
+              <w:rPr>
+                <w:b/>
+                <w:bCs/>
+              </w:rPr>
+            </w:pPr>
+            <w:r>
+              <w:rPr>
+                <w:b/>
+                <w:bCs/>
+              </w:rPr>
+              <w:t>Present Value (₹)</w:t>
+            </w:r>
+          </w:p>
+        </w:tc>
+      </w:tr>
+      <w:tr>
+        <w:trPr>
+          <w:tblCellSpacing w:w="15" w:type="dxa"/>
+        </w:trPr>
+        <w:tc>
+          <w:tcPr>
+            <w:tcW w:w="0" w:type="auto"/>
+            <w:vAlign w:val="center"/>
+            <w:hideMark/>
+          </w:tcPr>
+          <w:p>
+            <w:pPr>
+              <w:pStyle w:val="ListParagraph"/>
+            </w:pPr>
+            <w:r>
+              <w:t>1</w:t>
+            </w:r>
+          </w:p>
+        </w:tc>
+        <w:tc>
+          <w:tcPr>
+            <w:tcW w:w="0" w:type="auto"/>
+            <w:vAlign w:val="center"/>
+            <w:hideMark/>
+          </w:tcPr>
+          <w:p>
+            <w:pPr>
+              <w:pStyle w:val="ListParagraph"/>
+            </w:pPr>
+            <w:r>
+              <w:t>60,000</w:t>
+            </w:r>
+          </w:p>
+        </w:tc>
+        <w:tc>
+          <w:tcPr>
+            <w:tcW w:w="0" w:type="auto"/>
+            <w:vAlign w:val="center"/>
+            <w:hideMark/>
+          </w:tcPr>
+          <w:p>
+            <w:pPr>
+              <w:pStyle w:val="ListParagraph"/>
+            </w:pPr>
+            <m:oMathPara>
+              <m:oMath>
+                <m:r>
+                  <w:rPr>
+                    <w:rFonts w:ascii="Cambria Math" w:hAnsi="Cambria Math"/>
+                  </w:rPr>
+                  <m:t>1/</m:t>
+                </m:r>
+                <m:sSup>
+                  <m:sSupPr>
+                    <m:ctrlPr>
+                      <w:rPr>
+                        <w:rFonts w:ascii="Cambria Math" w:hAnsi="Cambria Math"/>
+                      </w:rPr>
+                    </m:ctrlPr>
+                  </m:sSupPr>
+                  <m:e>
+                    <m:d>
+                      <m:dPr>
+                        <m:ctrlPr>
+                          <w:rPr>
+                            <w:rFonts w:ascii="Cambria Math" w:hAnsi="Cambria Math"/>
+                          </w:rPr>
+                        </m:ctrlPr>
+                      </m:dPr>
+                      <m:e>
+                        <m:r>
+                          <w:rPr>
+                            <w:rFonts w:ascii="Cambria Math" w:hAnsi="Cambria Math"/>
+                          </w:rPr>
+                          <m:t>1.20</m:t>
+                        </m:r>
+                      </m:e>
+                    </m:d>
+                  </m:e>
+                  <m:sup>
+                    <m:r>
+                      <w:rPr>
+                        <w:rFonts w:ascii="Cambria Math" w:hAnsi="Cambria Math"/>
+                      </w:rPr>
+                      <m:t>1</m:t>
+                    </m:r>
+                  </m:sup>
+                </m:sSup>
+                <m:r>
+                  <w:rPr>
+                    <w:rFonts w:ascii="Cambria Math" w:hAnsi="Cambria Math"/>
+                  </w:rPr>
+                  <m:t>=0.8333</m:t>
+                </m:r>
+              </m:oMath>
+            </m:oMathPara>
+          </w:p>
+        </w:tc>
+        <w:tc>
+          <w:tcPr>
+            <w:tcW w:w="0" w:type="auto"/>
+            <w:vAlign w:val="center"/>
+            <w:hideMark/>
+          </w:tcPr>
+          <w:p>
+            <w:pPr>
+              <w:pStyle w:val="ListParagraph"/>
+            </w:pPr>
+            <w:r>
+              <w:t>50,000</w:t>
+            </w:r>
+          </w:p>
+        </w:tc>
+      </w:tr>
+      <w:tr>
+        <w:trPr>
+          <w:tblCellSpacing w:w="15" w:type="dxa"/>
+        </w:trPr>
+        <w:tc>
+          <w:tcPr>
+            <w:tcW w:w="0" w:type="auto"/>
+            <w:vAlign w:val="center"/>
+            <w:hideMark/>
+          </w:tcPr>
+          <w:p>
+            <w:pPr>
+              <w:pStyle w:val="ListParagraph"/>
+            </w:pPr>
+            <w:r>
+              <w:t>2</w:t>
+            </w:r>
+          </w:p>
+        </w:tc>
+        <w:tc>
+          <w:tcPr>
+            <w:tcW w:w="0" w:type="auto"/>
+            <w:vAlign w:val="center"/>
+            <w:hideMark/>
+          </w:tcPr>
+          <w:p>
+            <w:pPr>
+              <w:pStyle w:val="ListParagraph"/>
+            </w:pPr>
+            <w:r>
+              <w:t>60,000</w:t>
+            </w:r>
+          </w:p>
+        </w:tc>
+        <w:tc>
+          <w:tcPr>
+            <w:tcW w:w="0" w:type="auto"/>
+            <w:vAlign w:val="center"/>
+            <w:hideMark/>
+          </w:tcPr>
+          <w:p>
+            <w:pPr>
+              <w:pStyle w:val="ListParagraph"/>
+            </w:pPr>
+            <m:oMathPara>
+              <m:oMath>
+                <m:r>
+                  <w:rPr>
+                    <w:rFonts w:ascii="Cambria Math" w:hAnsi="Cambria Math"/>
+                  </w:rPr>
+                  <m:t>1/</m:t>
+                </m:r>
+                <m:sSup>
+                  <m:sSupPr>
+                    <m:ctrlPr>
+                      <w:rPr>
+                        <w:rFonts w:ascii="Cambria Math" w:hAnsi="Cambria Math"/>
+                      </w:rPr>
+                    </m:ctrlPr>
+                  </m:sSupPr>
+                  <m:e>
+                    <m:d>
+                      <m:dPr>
+                        <m:ctrlPr>
+                          <w:rPr>
+                            <w:rFonts w:ascii="Cambria Math" w:hAnsi="Cambria Math"/>
+                          </w:rPr>
+                        </m:ctrlPr>
+                      </m:dPr>
+                      <m:e>
+                        <m:r>
+                          <w:rPr>
+                            <w:rFonts w:ascii="Cambria Math" w:hAnsi="Cambria Math"/>
+                          </w:rPr>
+                          <m:t>1.20</m:t>
+                        </m:r>
+                      </m:e>
+                    </m:d>
+                  </m:e>
+                  <m:sup>
+                    <m:r>
+                      <w:rPr>
+                        <w:rFonts w:ascii="Cambria Math" w:hAnsi="Cambria Math"/>
+                      </w:rPr>
+                      <m:t>2</m:t>
+                    </m:r>
+                  </m:sup>
+                </m:sSup>
+                <m:r>
+                  <w:rPr>
+                    <w:rFonts w:ascii="Cambria Math" w:hAnsi="Cambria Math"/>
+                  </w:rPr>
+                  <m:t>=0.6944</m:t>
+                </m:r>
+              </m:oMath>
+            </m:oMathPara>
+          </w:p>
+        </w:tc>
+        <w:tc>
+          <w:tcPr>
+            <w:tcW w:w="0" w:type="auto"/>
+            <w:vAlign w:val="center"/>
+            <w:hideMark/>
+          </w:tcPr>
+          <w:p>
+            <w:pPr>
+              <w:pStyle w:val="ListParagraph"/>
+            </w:pPr>
+            <w:r>
+              <w:t>41,666.67</w:t>
+            </w:r>
+          </w:p>
+        </w:tc>
+      </w:tr>
+      <w:tr>
+        <w:trPr>
+          <w:tblCellSpacing w:w="15" w:type="dxa"/>
+        </w:trPr>
+        <w:tc>
+          <w:tcPr>
+            <w:tcW w:w="0" w:type="auto"/>
+            <w:vAlign w:val="center"/>
+            <w:hideMark/>
+          </w:tcPr>
+          <w:p>
+            <w:pPr>
+              <w:pStyle w:val="ListParagraph"/>
+            </w:pPr>
+            <w:r>
+              <w:t>3</w:t>
+            </w:r>
+          </w:p>
+        </w:tc>
+        <w:tc>
+          <w:tcPr>
+            <w:tcW w:w="0" w:type="auto"/>
+            <w:vAlign w:val="center"/>
+            <w:hideMark/>
+          </w:tcPr>
+          <w:p>
+            <w:pPr>
+              <w:pStyle w:val="ListParagraph"/>
+            </w:pPr>
+            <w:r>
+              <w:t>60,000</w:t>
+            </w:r>
+          </w:p>
+        </w:tc>
+        <w:tc>
+          <w:tcPr>
+            <w:tcW w:w="0" w:type="auto"/>
+            <w:vAlign w:val="center"/>
+            <w:hideMark/>
+          </w:tcPr>
+          <w:p>
+            <w:pPr>
+              <w:pStyle w:val="ListParagraph"/>
+            </w:pPr>
+            <m:oMathPara>
+              <m:oMath>
+                <m:r>
+                  <w:rPr>
+                    <w:rFonts w:ascii="Cambria Math" w:hAnsi="Cambria Math"/>
+                  </w:rPr>
+                  <m:t>1/</m:t>
+                </m:r>
+                <m:sSup>
+                  <m:sSupPr>
+                    <m:ctrlPr>
+                      <w:rPr>
+                        <w:rFonts w:ascii="Cambria Math" w:hAnsi="Cambria Math"/>
+                      </w:rPr>
+                    </m:ctrlPr>
+                  </m:sSupPr>
+                  <m:e>
+                    <m:d>
+                      <m:dPr>
+                        <m:ctrlPr>
+                          <w:rPr>
+                            <w:rFonts w:ascii="Cambria Math" w:hAnsi="Cambria Math"/>
+                          </w:rPr>
+                        </m:ctrlPr>
+                      </m:dPr>
+                      <m:e>
+                        <m:r>
+                          <w:rPr>
+                            <w:rFonts w:ascii="Cambria Math" w:hAnsi="Cambria Math"/>
+                          </w:rPr>
+                          <m:t>1.20</m:t>
+                        </m:r>
+                      </m:e>
+                    </m:d>
+                  </m:e>
+                  <m:sup>
+                    <m:r>
+                      <w:rPr>
+                        <w:rFonts w:ascii="Cambria Math" w:hAnsi="Cambria Math"/>
+                      </w:rPr>
+                      <m:t>3</m:t>
+                    </m:r>
+                  </m:sup>
+                </m:sSup>
+                <m:r>
+                  <w:rPr>
+                    <w:rFonts w:ascii="Cambria Math" w:hAnsi="Cambria Math"/>
+                  </w:rPr>
+                  <m:t>=0.5787</m:t>
+                </m:r>
+              </m:oMath>
+            </m:oMathPara>
+          </w:p>
+        </w:tc>
+        <w:tc>
+          <w:tcPr>
+            <w:tcW w:w="0" w:type="auto"/>
+            <w:vAlign w:val="center"/>
+            <w:hideMark/>
+          </w:tcPr>
+          <w:p>
+            <w:pPr>
+              <w:pStyle w:val="ListParagraph"/>
+            </w:pPr>
+            <w:r>
+              <w:t>34,722.22</w:t>
+            </w:r>
+          </w:p>
+        </w:tc>
+      </w:tr>
+      <w:tr>
+        <w:trPr>
+          <w:tblCellSpacing w:w="15" w:type="dxa"/>
+        </w:trPr>
+        <w:tc>
+          <w:tcPr>
+            <w:tcW w:w="0" w:type="auto"/>
+            <w:vAlign w:val="center"/>
+            <w:hideMark/>
+          </w:tcPr>
+          <w:p>
+            <w:pPr>
+              <w:pStyle w:val="ListParagraph"/>
+            </w:pPr>
+            <w:r>
+              <w:t>4</w:t>
+            </w:r>
+          </w:p>
+        </w:tc>
+        <w:tc>
+          <w:tcPr>
+            <w:tcW w:w="0" w:type="auto"/>
+            <w:vAlign w:val="center"/>
+            <w:hideMark/>
+          </w:tcPr>
+          <w:p>
+            <w:pPr>
+              <w:pStyle w:val="ListParagraph"/>
+            </w:pPr>
+            <w:r>
+              <w:t>60,000</w:t>
+            </w:r>
+          </w:p>
+        </w:tc>
+        <w:tc>
+          <w:tcPr>
+            <w:tcW w:w="0" w:type="auto"/>
+            <w:vAlign w:val="center"/>
+            <w:hideMark/>
+          </w:tcPr>
+          <w:p>
+            <w:pPr>
+              <w:pStyle w:val="ListParagraph"/>
+            </w:pPr>
+            <m:oMathPara>
+              <m:oMath>
+                <m:r>
+                  <w:rPr>
+                    <w:rFonts w:ascii="Cambria Math" w:hAnsi="Cambria Math"/>
+                  </w:rPr>
+                  <m:t>1/</m:t>
+                </m:r>
+                <m:sSup>
+                  <m:sSupPr>
+                    <m:ctrlPr>
+                      <w:rPr>
+                        <w:rFonts w:ascii="Cambria Math" w:hAnsi="Cambria Math"/>
+                      </w:rPr>
+                    </m:ctrlPr>
+                  </m:sSupPr>
+                  <m:e>
+                    <m:d>
+                      <m:dPr>
+                        <m:ctrlPr>
+                          <w:rPr>
+                            <w:rFonts w:ascii="Cambria Math" w:hAnsi="Cambria Math"/>
+                          </w:rPr>
+                        </m:ctrlPr>
+                      </m:dPr>
+                      <m:e>
+                        <m:r>
+                          <w:rPr>
+                            <w:rFonts w:ascii="Cambria Math" w:hAnsi="Cambria Math"/>
+                          </w:rPr>
+                          <m:t>1.20</m:t>
+                        </m:r>
+                      </m:e>
+                    </m:d>
+                  </m:e>
+                  <m:sup>
+                    <m:r>
+                      <w:rPr>
+                        <w:rFonts w:ascii="Cambria Math" w:hAnsi="Cambria Math"/>
+                      </w:rPr>
+                      <m:t>4</m:t>
+                    </m:r>
+                  </m:sup>
+                </m:sSup>
+                <m:r>
+                  <w:rPr>
+                    <w:rFonts w:ascii="Cambria Math" w:hAnsi="Cambria Math"/>
+                  </w:rPr>
+                  <m:t>=0.4823</m:t>
+                </m:r>
+              </m:oMath>
+            </m:oMathPara>
+          </w:p>
+        </w:tc>
+        <w:tc>
+          <w:tcPr>
+            <w:tcW w:w="0" w:type="auto"/>
+            <w:vAlign w:val="center"/>
+            <w:hideMark/>
+          </w:tcPr>
+          <w:p>
+            <w:pPr>
+              <w:pStyle w:val="ListParagraph"/>
+            </w:pPr>
+            <w:r>
+              <w:t>28,935.19</w:t>
+            </w:r>
+          </w:p>
+        </w:tc>
+      </w:tr>
+    </w:tbl>
+    <w:p>
+      <w:pPr>
+        <w:pStyle w:val="ListParagraph"/>
+        <w:rPr>
+          <w:lang w:val="en-US"/>
+        </w:rPr>
+      </w:pPr>
+    </w:p>
+    <w:p>
+      <w:pPr>
+        <w:pStyle w:val="ListParagraph"/>
+        <w:rPr>
+          <w:rFonts w:eastAsiaTheme="minorEastAsia"/>
+        </w:rPr>
+      </w:pPr>
+      <w:r>
+        <w:rPr>
+          <w:lang w:val="en-US"/>
+        </w:rPr>
+        <w:t xml:space="preserve">Present value = </w:t>
+      </w:r>
+      <m:oMath>
+        <m:r>
+          <w:rPr>
+            <w:rFonts w:ascii="Cambria Math" w:hAnsi="Cambria Math"/>
+          </w:rPr>
+          <m:t>155324.08</m:t>
+        </m:r>
+      </m:oMath>
+    </w:p>
+    <w:p>
+      <w:pPr>
+        <w:pStyle w:val="ListParagraph"/>
+        <w:rPr>
+          <w:rFonts w:eastAsiaTheme="minorEastAsia"/>
+          <w:lang w:val="en-US"/>
+        </w:rPr>
+      </w:pPr>
+    </w:p>
+    <w:p>
+      <w:pPr>
+        <w:pStyle w:val="ListParagraph"/>
+        <w:rPr>
+          <w:rFonts w:eastAsiaTheme="minorEastAsia"/>
+          <w:lang w:val="en-US"/>
+        </w:rPr>
+      </w:pPr>
+      <w:r>
+        <w:rPr>
+          <w:rFonts w:eastAsiaTheme="minorEastAsia"/>
+          <w:lang w:val="en-US"/>
+        </w:rPr>
+        <w:t>Alternatively, present value annuity can be found out by using the present value annuity table</w:t>
+      </w:r>
+    </w:p>
+    <w:p>
+      <w:pPr>
+        <w:pStyle w:val="ListParagraph"/>
+        <w:rPr>
+          <w:rFonts w:eastAsiaTheme="minorEastAsia"/>
+          <w:lang w:val="en-US"/>
+        </w:rPr>
+      </w:pPr>
+    </w:p>
+    <w:p>
+      <w:pPr>
+        <w:pStyle w:val="ListParagraph"/>
+        <w:rPr>
+          <w:rFonts w:eastAsiaTheme="minorEastAsia"/>
+          <w:lang w:val="en-US"/>
+        </w:rPr>
+      </w:pPr>
+      <w:r>
+        <w:rPr>
+          <w:rFonts w:eastAsiaTheme="minorEastAsia"/>
+          <w:lang w:val="en-US"/>
+        </w:rPr>
+        <w:t>Present value of annuity of Rs. 1 for 4 years at 20% = 2.589</w:t>
+      </w:r>
+    </w:p>
+    <w:p>
+      <w:pPr>
+        <w:pStyle w:val="ListParagraph"/>
+        <w:rPr>
+          <w:rFonts w:eastAsiaTheme="minorEastAsia"/>
+          <w:lang w:val="en-US"/>
+        </w:rPr>
+      </w:pPr>
+      <w:r>
+        <w:rPr>
+          <w:rFonts w:eastAsiaTheme="minorEastAsia"/>
+          <w:lang w:val="en-US"/>
+        </w:rPr>
+        <w:t>Present value of annuity of Rs. 60,000 = 60000 * 2.589 = 155340</w:t>
+      </w:r>
+    </w:p>
+    <w:p>
+      <w:pPr>
+        <w:pStyle w:val="ListParagraph"/>
+        <w:rPr>
+          <w:rFonts w:eastAsiaTheme="minorEastAsia"/>
+          <w:lang w:val="en-US"/>
+        </w:rPr>
+      </w:pPr>
+    </w:p>
+    <w:p>
+      <w:pPr>
+        <w:pStyle w:val="ListParagraph"/>
+        <w:rPr>
+          <w:rFonts w:eastAsiaTheme="minorEastAsia"/>
+          <w:lang w:val="en-US"/>
+        </w:rPr>
+      </w:pPr>
+    </w:p>
+    <w:p>
+      <w:pPr>
+        <w:pStyle w:val="ListParagraph"/>
+        <w:rPr>
+          <w:rFonts w:eastAsiaTheme="minorEastAsia"/>
+          <w:lang w:val="en-US"/>
+        </w:rPr>
+      </w:pPr>
+    </w:p>
+    <w:p>
+      <w:pPr>
+        <w:pStyle w:val="ListParagraph"/>
+        <w:rPr>
+          <w:rFonts w:eastAsiaTheme="minorEastAsia"/>
+          <w:lang w:val="en-US"/>
+        </w:rPr>
+      </w:pPr>
+    </w:p>
+    <w:p>
+      <w:pPr>
+        <w:pStyle w:val="ListParagraph"/>
+        <w:rPr>
+          <w:rFonts w:eastAsiaTheme="minorEastAsia"/>
+          <w:lang w:val="en-US"/>
+        </w:rPr>
+      </w:pPr>
+      <w:r>
+        <w:rPr>
+          <w:rFonts w:eastAsiaTheme="minorEastAsia"/>
+          <w:lang w:val="en-US"/>
+        </w:rPr>
+        <w:lastRenderedPageBreak/>
+        <w:t>28-08-2026</w:t>
+      </w:r>
+    </w:p>
+    <w:p>
+      <w:pPr>
+        <w:pStyle w:val="ListParagraph"/>
+        <w:rPr>
+          <w:rFonts w:eastAsiaTheme="minorEastAsia"/>
+          <w:lang w:val="en-US"/>
+        </w:rPr>
+      </w:pPr>
+    </w:p>
+    <w:p>
+      <w:pPr>
+        <w:pStyle w:val="ListParagraph"/>
+        <w:numPr>
+          <w:ilvl w:val="0"/>
+          <w:numId w:val="32"/>
+        </w:numPr>
+        <w:rPr>
+          <w:rFonts w:eastAsiaTheme="minorEastAsia"/>
+          <w:lang w:val="en-US"/>
+        </w:rPr>
+      </w:pPr>
+      <w:r>
+        <w:rPr>
+          <w:rFonts w:eastAsiaTheme="minorEastAsia"/>
+          <w:lang w:val="en-US"/>
+        </w:rPr>
+        <w:t xml:space="preserve">Mr. </w:t>
+      </w:r>
+      <w:proofErr w:type="spellStart"/>
+      <w:r>
+        <w:rPr>
+          <w:rFonts w:eastAsiaTheme="minorEastAsia"/>
+          <w:lang w:val="en-US"/>
+        </w:rPr>
+        <w:t>Thanay</w:t>
+      </w:r>
+      <w:proofErr w:type="spellEnd"/>
+      <w:r>
+        <w:rPr>
+          <w:rFonts w:eastAsiaTheme="minorEastAsia"/>
+          <w:lang w:val="en-US"/>
+        </w:rPr>
+        <w:t xml:space="preserve"> expects to receive Rs. 20,000 at the beginning of each year for 4 years. Calculate the present value of the annuity due assuming an interest of 9%</w:t>
+      </w:r>
+    </w:p>
+    <w:p>
+      <w:pPr>
+        <w:pStyle w:val="ListParagraph"/>
+        <w:rPr>
+          <w:rFonts w:eastAsiaTheme="minorEastAsia"/>
+          <w:lang w:val="en-US"/>
+        </w:rPr>
+      </w:pPr>
+    </w:p>
+    <w:p>
+      <w:pPr>
+        <w:pStyle w:val="ListParagraph"/>
+        <w:rPr>
+          <w:rFonts w:eastAsiaTheme="minorEastAsia"/>
+          <w:lang w:val="en-US"/>
+        </w:rPr>
+      </w:pPr>
+      <w:r>
+        <w:rPr>
+          <w:rFonts w:eastAsiaTheme="minorEastAsia"/>
+          <w:lang w:val="en-US"/>
+        </w:rPr>
+        <w:t>Ans:</w:t>
+      </w:r>
+    </w:p>
+    <w:p>
+      <w:pPr>
+        <w:pStyle w:val="ListParagraph"/>
+        <w:rPr>
+          <w:rFonts w:eastAsiaTheme="minorEastAsia"/>
+          <w:lang w:val="en-US"/>
+        </w:rPr>
+      </w:pPr>
+    </w:p>
+    <w:p>
+      <w:pPr>
+        <w:pStyle w:val="ListParagraph"/>
+        <w:rPr>
+          <w:rFonts w:eastAsiaTheme="minorEastAsia"/>
+          <w:lang w:val="en-US"/>
+        </w:rPr>
+      </w:pPr>
+      <w:r>
+        <w:rPr>
+          <w:rFonts w:eastAsiaTheme="minorEastAsia"/>
+          <w:lang w:val="en-US"/>
+        </w:rPr>
+        <w:t xml:space="preserve">Present value of Rs </w:t>
+      </w:r>
+    </w:p>
+    <w:p>
+      <w:pPr>
+        <w:pStyle w:val="ListParagraph"/>
+        <w:rPr>
+          <w:lang w:val="en-US"/>
+        </w:rPr>
+      </w:pPr>
+    </w:p>
+    <w:p>
+      <w:pPr>
+        <w:pStyle w:val="ListParagraph"/>
+        <w:rPr>
+          <w:lang w:val="en-US"/>
+        </w:rPr>
+      </w:pPr>
+      <w:r>
+        <w:rPr>
+          <w:noProof/>
+          <w:lang w:val="en-US"/>
+        </w:rPr>
+        <w:drawing>
+          <wp:inline distT="0" distB="0" distL="0" distR="0" wp14:anchorId="0FC6C8F1" wp14:editId="4E44B6E3">
+            <wp:extent cx="4933950" cy="1056640"/>
+            <wp:effectExtent l="0" t="0" r="0" b="0"/>
+            <wp:docPr id="1812322469" name="Picture 1"/>
+            <wp:cNvGraphicFramePr>
+              <a:graphicFrameLocks xmlns:a="http://schemas.openxmlformats.org/drawingml/2006/main" noChangeAspect="1"/>
+            </wp:cNvGraphicFramePr>
+            <a:graphic xmlns:a="http://schemas.openxmlformats.org/drawingml/2006/main">
+              <a:graphicData uri="http://schemas.openxmlformats.org/drawingml/2006/picture">
+                <pic:pic xmlns:pic="http://schemas.openxmlformats.org/drawingml/2006/picture">
+                  <pic:nvPicPr>
+                    <pic:cNvPr id="0" name="Picture 1"/>
+                    <pic:cNvPicPr>
+                      <a:picLocks noChangeAspect="1" noChangeArrowheads="1"/>
+                    </pic:cNvPicPr>
+                  </pic:nvPicPr>
+                  <pic:blipFill>
+                    <a:blip r:embed="rId8">
+                      <a:extLst>
+                        <a:ext uri="{28A0092B-C50C-407E-A947-70E740481C1C}">
+                          <a14:useLocalDpi xmlns:a14="http://schemas.microsoft.com/office/drawing/2010/main" val="0"/>
+                        </a:ext>
+                      </a:extLst>
+                    </a:blip>
+                    <a:srcRect/>
+                    <a:stretch>
+                      <a:fillRect/>
+                    </a:stretch>
+                  </pic:blipFill>
+                  <pic:spPr bwMode="auto">
+                    <a:xfrm>
+                      <a:off x="0" y="0"/>
+                      <a:ext cx="4933950" cy="1056640"/>
+                    </a:xfrm>
+                    <a:prstGeom prst="rect">
+                      <a:avLst/>
+                    </a:prstGeom>
+                    <a:noFill/>
+                    <a:ln>
+                      <a:noFill/>
+                    </a:ln>
+                  </pic:spPr>
+                </pic:pic>
+              </a:graphicData>
+            </a:graphic>
+          </wp:inline>
+        </w:drawing>
+      </w:r>
+    </w:p>
+    <w:p>
+      <w:pPr>
+        <w:pStyle w:val="ListParagraph"/>
+      </w:pPr>
+      <w:r>
+        <w:t>sum all the present values:</w:t>
+      </w:r>
+    </w:p>
+    <w:p>
+      <w:pPr>
+        <w:pStyle w:val="ListParagraph"/>
+        <w:rPr>
+          <w:lang w:val="en-US"/>
+        </w:rPr>
+      </w:pPr>
+      <m:oMathPara>
+        <m:oMath>
+          <m:r>
+            <w:rPr>
+              <w:rFonts w:ascii="Cambria Math" w:hAnsi="Cambria Math"/>
+            </w:rPr>
+            <m:t>PV=20,000+18,348.62+16,833.60+15,443.67</m:t>
+          </m:r>
+          <m:r>
+            <w:rPr>
+              <w:i/>
+            </w:rPr>
+            <w:br/>
+          </m:r>
+        </m:oMath>
+        <m:oMath>
+          <m:r>
+            <w:rPr>
+              <w:rFonts w:ascii="Cambria Math" w:hAnsi="Cambria Math"/>
+            </w:rPr>
+            <m:t>PV=Rs.70,625.89</m:t>
+          </m:r>
+          <m:r>
+            <w:rPr>
+              <w:i/>
+            </w:rPr>
+            <w:br/>
+          </m:r>
+        </m:oMath>
+      </m:oMathPara>
+    </w:p>
+    <w:p>
+      <w:pPr>
+        <w:pStyle w:val="ListParagraph"/>
+        <w:rPr>
+          <w:lang w:val="en-US"/>
+        </w:rPr>
+      </w:pPr>
+    </w:p>
+    <w:p>
+      <w:pPr>
+        <w:pStyle w:val="ListParagraph"/>
+        <w:rPr>
+          <w:lang w:val="en-US"/>
+        </w:rPr>
+      </w:pPr>
+      <w:r>
+        <w:rPr>
+          <w:lang w:val="en-US"/>
+        </w:rPr>
+        <w:t>Alternatively</w:t>
+      </w:r>
+    </w:p>
+    <w:p>
+      <w:pPr>
+        <w:pStyle w:val="ListParagraph"/>
+        <w:rPr>
+          <w:lang w:val="en-US"/>
+        </w:rPr>
+      </w:pPr>
+      <w:r>
+        <w:rPr>
+          <w:b/>
+          <w:bCs/>
+        </w:rPr>
+        <w:t xml:space="preserve"> </w:t>
+      </w:r>
+    </w:p>
+    <w:p>
+      <w:pPr>
+        <w:pStyle w:val="ListParagraph"/>
+        <w:rPr>
+          <w:rFonts w:eastAsiaTheme="minorEastAsia"/>
+          <w:i/>
+        </w:rPr>
+      </w:pPr>
+      <m:oMathPara>
+        <m:oMath>
+          <m:r>
+            <w:rPr>
+              <w:rFonts w:ascii="Cambria Math" w:hAnsi="Cambria Math"/>
+            </w:rPr>
+            <m:t>PV=20,000×</m:t>
+          </m:r>
+          <m:d>
+            <m:dPr>
+              <m:begChr m:val="["/>
+              <m:endChr m:val="]"/>
+              <m:ctrlPr>
+                <w:rPr>
+                  <w:rFonts w:ascii="Cambria Math" w:hAnsi="Cambria Math"/>
+                </w:rPr>
+              </m:ctrlPr>
+            </m:dPr>
+            <m:e>
+              <m:f>
+                <m:fPr>
+                  <m:ctrlPr>
+                    <w:rPr>
+                      <w:rFonts w:ascii="Cambria Math" w:hAnsi="Cambria Math"/>
+                    </w:rPr>
+                  </m:ctrlPr>
+                </m:fPr>
+                <m:num>
+                  <m:r>
+                    <w:rPr>
+                      <w:rFonts w:ascii="Cambria Math" w:hAnsi="Cambria Math"/>
+                    </w:rPr>
+                    <m:t>1-</m:t>
+                  </m:r>
+                  <m:sSup>
+                    <m:sSupPr>
+                      <m:ctrlPr>
+                        <w:rPr>
+                          <w:rFonts w:ascii="Cambria Math" w:hAnsi="Cambria Math"/>
+                        </w:rPr>
+                      </m:ctrlPr>
+                    </m:sSupPr>
+                    <m:e>
+                      <m:d>
+                        <m:dPr>
+                          <m:ctrlPr>
+                            <w:rPr>
+                              <w:rFonts w:ascii="Cambria Math" w:hAnsi="Cambria Math"/>
+                            </w:rPr>
+                          </m:ctrlPr>
+                        </m:dPr>
+                        <m:e>
+                          <m:r>
+                            <w:rPr>
+                              <w:rFonts w:ascii="Cambria Math" w:hAnsi="Cambria Math"/>
+                            </w:rPr>
+                            <m:t>1.09</m:t>
+                          </m:r>
+                        </m:e>
+                      </m:d>
+                    </m:e>
+                    <m:sup>
+                      <m:r>
+                        <w:rPr>
+                          <w:rFonts w:ascii="Cambria Math" w:hAnsi="Cambria Math"/>
+                        </w:rPr>
+                        <m:t>-4</m:t>
+                      </m:r>
+                    </m:sup>
+                  </m:sSup>
+                </m:num>
+                <m:den>
+                  <m:r>
+                    <w:rPr>
+                      <w:rFonts w:ascii="Cambria Math" w:hAnsi="Cambria Math"/>
+                    </w:rPr>
+                    <m:t>0.09</m:t>
+                  </m:r>
+                </m:den>
+              </m:f>
+            </m:e>
+          </m:d>
+          <m:r>
+            <w:rPr>
+              <w:rFonts w:ascii="Cambria Math" w:hAnsi="Cambria Math"/>
+            </w:rPr>
+            <m:t>×1.09</m:t>
+          </m:r>
+        </m:oMath>
+      </m:oMathPara>
+    </w:p>
+    <w:p>
+      <w:pPr>
+        <w:pStyle w:val="ListParagraph"/>
+        <w:rPr>
+          <w:i/>
+        </w:rPr>
+      </w:pPr>
+    </w:p>
+    <w:p>
+      <w:pPr>
+        <w:pStyle w:val="ListParagraph"/>
+        <w:rPr>
+          <w:rFonts w:eastAsiaTheme="minorEastAsia"/>
+          <w:i/>
+        </w:rPr>
+      </w:pPr>
+      <m:oMathPara>
+        <m:oMath>
+          <m:r>
+            <w:rPr>
+              <w:rFonts w:ascii="Cambria Math" w:hAnsi="Cambria Math"/>
+            </w:rPr>
+            <m:t>PV = 70626</m:t>
+          </m:r>
+        </m:oMath>
+      </m:oMathPara>
+    </w:p>
+    <w:p>
+      <w:pPr>
+        <w:rPr>
+          <w:lang w:val="en-US"/>
+        </w:rPr>
+      </w:pPr>
+      <w:r>
+        <w:rPr>
+          <w:lang w:val="en-US"/>
+        </w:rPr>
+        <w:t xml:space="preserve">PRESENT VALUE OF GROWING ANNUITY </w:t>
+      </w:r>
+    </w:p>
+    <w:p>
+      <w:pPr>
+        <w:rPr>
+          <w:lang w:val="en-US"/>
+        </w:rPr>
+      </w:pPr>
+    </w:p>
+    <w:p>
+      <w:pPr>
+        <w:pStyle w:val="ListParagraph"/>
+        <w:numPr>
+          <w:ilvl w:val="0"/>
+          <w:numId w:val="33"/>
+        </w:numPr>
+        <w:rPr>
+          <w:lang w:val="en-US"/>
+        </w:rPr>
+      </w:pPr>
+      <w:r>
+        <w:rPr>
+          <w:lang w:val="en-US"/>
+        </w:rPr>
+        <w:t xml:space="preserve">Mr. Deva has rented out a shop for 4 years at an annual rent of Rs. 12,000. The tenant has agreed to the condition. The rent will increase by 10% by every year. If the required rate of interest is 8%, find out the present value of the expected series of rent </w:t>
+      </w:r>
+    </w:p>
+    <w:p>
+      <w:pPr>
+        <w:pStyle w:val="ListParagraph"/>
+        <w:rPr>
+          <w:lang w:val="en-US"/>
+        </w:rPr>
+      </w:pPr>
+    </w:p>
+    <w:p>
+      <w:pPr>
+        <w:pStyle w:val="ListParagraph"/>
+        <w:rPr>
+          <w:lang w:val="en-US"/>
+        </w:rPr>
+      </w:pPr>
+      <w:r>
+        <w:rPr>
+          <w:lang w:val="en-US"/>
+        </w:rPr>
+        <w:t>Ans:</w:t>
+      </w:r>
+    </w:p>
+    <w:p>
+      <w:pPr>
+        <w:pStyle w:val="ListParagraph"/>
+        <w:rPr>
+          <w:lang w:val="en-US"/>
+        </w:rPr>
+      </w:pPr>
+    </w:p>
+    <w:p>
+      <w:pPr>
+        <w:pStyle w:val="ListParagraph"/>
+        <w:rPr>
+          <w:lang w:val="en-US"/>
+        </w:rPr>
+      </w:pPr>
+      <w:r>
+        <w:rPr>
+          <w:noProof/>
+          <w:lang w:val="en-US"/>
+        </w:rPr>
+        <w:drawing>
+          <wp:inline distT="0" distB="0" distL="0" distR="0" wp14:anchorId="5D77E43B" wp14:editId="442BDE64">
+            <wp:extent cx="1656715" cy="962025"/>
+            <wp:effectExtent l="0" t="0" r="635" b="9525"/>
+            <wp:docPr id="268251162" name="Picture 2"/>
+            <wp:cNvGraphicFramePr>
+              <a:graphicFrameLocks xmlns:a="http://schemas.openxmlformats.org/drawingml/2006/main" noChangeAspect="1"/>
+            </wp:cNvGraphicFramePr>
+            <a:graphic xmlns:a="http://schemas.openxmlformats.org/drawingml/2006/main">
+              <a:graphicData uri="http://schemas.openxmlformats.org/drawingml/2006/picture">
+                <pic:pic xmlns:pic="http://schemas.openxmlformats.org/drawingml/2006/picture">
+                  <pic:nvPicPr>
+                    <pic:cNvPr id="0" name="Picture 2"/>
+                    <pic:cNvPicPr>
+                      <a:picLocks noChangeAspect="1" noChangeArrowheads="1"/>
+                    </pic:cNvPicPr>
+                  </pic:nvPicPr>
+                  <pic:blipFill>
+                    <a:blip r:embed="rId9">
+                      <a:extLst>
+                        <a:ext uri="{28A0092B-C50C-407E-A947-70E740481C1C}">
+                          <a14:useLocalDpi xmlns:a14="http://schemas.microsoft.com/office/drawing/2010/main" val="0"/>
+                        </a:ext>
+                      </a:extLst>
+                    </a:blip>
+                    <a:srcRect/>
+                    <a:stretch>
+                      <a:fillRect/>
+                    </a:stretch>
+                  </pic:blipFill>
+                  <pic:spPr bwMode="auto">
+                    <a:xfrm>
+                      <a:off x="0" y="0"/>
+                      <a:ext cx="1656715" cy="962025"/>
+                    </a:xfrm>
+                    <a:prstGeom prst="rect">
+                      <a:avLst/>
+                    </a:prstGeom>
+                    <a:noFill/>
+                    <a:ln>
+                      <a:noFill/>
+                    </a:ln>
+                  </pic:spPr>
+                </pic:pic>
+              </a:graphicData>
+            </a:graphic>
+          </wp:inline>
+        </w:drawing>
+      </w:r>
+    </w:p>
+    <w:p>
+      <w:pPr>
+        <w:pStyle w:val="ListParagraph"/>
+        <w:rPr>
+          <w:lang w:val="en-US"/>
+        </w:rPr>
+      </w:pPr>
+    </w:p>
+    <w:p>
+      <w:pPr>
+        <w:pStyle w:val="ListParagraph"/>
+        <w:rPr>
+          <w:lang w:val="en-US"/>
+        </w:rPr>
+      </w:pPr>
+      <w:r>
+        <w:rPr>
+          <w:noProof/>
+          <w:lang w:val="en-US"/>
+        </w:rPr>
+        <w:lastRenderedPageBreak/>
+        <w:drawing>
+          <wp:inline distT="0" distB="0" distL="0" distR="0" wp14:anchorId="67557805" wp14:editId="60421060">
+            <wp:extent cx="2998470" cy="1169670"/>
+            <wp:effectExtent l="0" t="0" r="0" b="0"/>
+            <wp:docPr id="901507667" name="Picture 4"/>
+            <wp:cNvGraphicFramePr>
+              <a:graphicFrameLocks xmlns:a="http://schemas.openxmlformats.org/drawingml/2006/main" noChangeAspect="1"/>
+            </wp:cNvGraphicFramePr>
+            <a:graphic xmlns:a="http://schemas.openxmlformats.org/drawingml/2006/main">
+              <a:graphicData uri="http://schemas.openxmlformats.org/drawingml/2006/picture">
+                <pic:pic xmlns:pic="http://schemas.openxmlformats.org/drawingml/2006/picture">
+                  <pic:nvPicPr>
+                    <pic:cNvPr id="0" name="Picture 4"/>
+                    <pic:cNvPicPr>
+                      <a:picLocks noChangeAspect="1" noChangeArrowheads="1"/>
+                    </pic:cNvPicPr>
+                  </pic:nvPicPr>
+                  <pic:blipFill>
+                    <a:blip r:embed="rId10">
+                      <a:extLst>
+                        <a:ext uri="{28A0092B-C50C-407E-A947-70E740481C1C}">
+                          <a14:useLocalDpi xmlns:a14="http://schemas.microsoft.com/office/drawing/2010/main" val="0"/>
+                        </a:ext>
+                      </a:extLst>
+                    </a:blip>
+                    <a:srcRect/>
+                    <a:stretch>
+                      <a:fillRect/>
+                    </a:stretch>
+                  </pic:blipFill>
+                  <pic:spPr bwMode="auto">
+                    <a:xfrm>
+                      <a:off x="0" y="0"/>
+                      <a:ext cx="2998470" cy="1169670"/>
+                    </a:xfrm>
+                    <a:prstGeom prst="rect">
+                      <a:avLst/>
+                    </a:prstGeom>
+                    <a:noFill/>
+                    <a:ln>
+                      <a:noFill/>
+                    </a:ln>
+                  </pic:spPr>
+                </pic:pic>
+              </a:graphicData>
+            </a:graphic>
+          </wp:inline>
+        </w:drawing>
+      </w:r>
+      <w:r>
+        <w:rPr>
+          <w:lang w:val="en-US"/>
+        </w:rPr>
+        <w:t xml:space="preserve"> </w:t>
+      </w:r>
+      <w:r>
+        <w:rPr>
+          <w:lang w:val="en-US"/>
+        </w:rPr>
+        <w:t xml:space="preserve"> </w:t>
+      </w:r>
+    </w:p>
+    <w:p>
+      <w:pPr>
+        <w:tabs>
+          <w:tab w:val="left" w:pos="1080"/>
+          <w:tab w:val="left" w:pos="2160"/>
+          <w:tab w:val="left" w:pos="2880"/>
+          <w:tab w:val="left" w:pos="3600"/>
+          <w:tab w:val="left" w:pos="4320"/>
+          <w:tab w:val="left" w:pos="5040"/>
+          <w:tab w:val="left" w:pos="5760"/>
+          <w:tab w:val="left" w:pos="6480"/>
+          <w:tab w:val="right" w:pos="9026"/>
+        </w:tabs>
+        <w:rPr>
+          <w:rFonts w:eastAsiaTheme="minorEastAsia"/>
+        </w:rPr>
+      </w:pPr>
+    </w:p>
     <w:sectPr>
       <w:pgSz w:w="11906" w:h="16838"/>
       <w:pgMar w:top="1440" w:right="1440" w:bottom="1440" w:left="1440" w:header="708" w:footer="708" w:gutter="0"/>
@@ -8406,6 +12114,356 @@
     </w:lvl>
   </w:abstractNum>
   <w:abstractNum w:abstractNumId="3" w15:restartNumberingAfterBreak="0">
+    <w:nsid w:val="07D93636"/>
+    <w:multiLevelType w:val="hybridMultilevel"/>
+    <w:tmpl w:val="1DB65154"/>
+    <w:lvl w:ilvl="0" w:tplc="FFFFFFFF">
+      <w:start w:val="1"/>
+      <w:numFmt w:val="decimal"/>
+      <w:lvlText w:val="%1."/>
+      <w:lvlJc w:val="left"/>
+      <w:pPr>
+        <w:ind w:left="720" w:hanging="360"/>
+      </w:pPr>
+    </w:lvl>
+    <w:lvl w:ilvl="1" w:tplc="FFFFFFFF" w:tentative="1">
+      <w:start w:val="1"/>
+      <w:numFmt w:val="lowerLetter"/>
+      <w:lvlText w:val="%2."/>
+      <w:lvlJc w:val="left"/>
+      <w:pPr>
+        <w:ind w:left="1440" w:hanging="360"/>
+      </w:pPr>
+    </w:lvl>
+    <w:lvl w:ilvl="2" w:tplc="FFFFFFFF" w:tentative="1">
+      <w:start w:val="1"/>
+      <w:numFmt w:val="lowerRoman"/>
+      <w:lvlText w:val="%3."/>
+      <w:lvlJc w:val="right"/>
+      <w:pPr>
+        <w:ind w:left="2160" w:hanging="180"/>
+      </w:pPr>
+    </w:lvl>
+    <w:lvl w:ilvl="3" w:tplc="FFFFFFFF" w:tentative="1">
+      <w:start w:val="1"/>
+      <w:numFmt w:val="decimal"/>
+      <w:lvlText w:val="%4."/>
+      <w:lvlJc w:val="left"/>
+      <w:pPr>
+        <w:ind w:left="2880" w:hanging="360"/>
+      </w:pPr>
+    </w:lvl>
+    <w:lvl w:ilvl="4" w:tplc="FFFFFFFF" w:tentative="1">
+      <w:start w:val="1"/>
+      <w:numFmt w:val="lowerLetter"/>
+      <w:lvlText w:val="%5."/>
+      <w:lvlJc w:val="left"/>
+      <w:pPr>
+        <w:ind w:left="3600" w:hanging="360"/>
+      </w:pPr>
+    </w:lvl>
+    <w:lvl w:ilvl="5" w:tplc="FFFFFFFF" w:tentative="1">
+      <w:start w:val="1"/>
+      <w:numFmt w:val="lowerRoman"/>
+      <w:lvlText w:val="%6."/>
+      <w:lvlJc w:val="right"/>
+      <w:pPr>
+        <w:ind w:left="4320" w:hanging="180"/>
+      </w:pPr>
+    </w:lvl>
+    <w:lvl w:ilvl="6" w:tplc="FFFFFFFF" w:tentative="1">
+      <w:start w:val="1"/>
+      <w:numFmt w:val="decimal"/>
+      <w:lvlText w:val="%7."/>
+      <w:lvlJc w:val="left"/>
+      <w:pPr>
+        <w:ind w:left="5040" w:hanging="360"/>
+      </w:pPr>
+    </w:lvl>
+    <w:lvl w:ilvl="7" w:tplc="FFFFFFFF" w:tentative="1">
+      <w:start w:val="1"/>
+      <w:numFmt w:val="lowerLetter"/>
+      <w:lvlText w:val="%8."/>
+      <w:lvlJc w:val="left"/>
+      <w:pPr>
+        <w:ind w:left="5760" w:hanging="360"/>
+      </w:pPr>
+    </w:lvl>
+    <w:lvl w:ilvl="8" w:tplc="FFFFFFFF" w:tentative="1">
+      <w:start w:val="1"/>
+      <w:numFmt w:val="lowerRoman"/>
+      <w:lvlText w:val="%9."/>
+      <w:lvlJc w:val="right"/>
+      <w:pPr>
+        <w:ind w:left="6480" w:hanging="180"/>
+      </w:pPr>
+    </w:lvl>
+  </w:abstractNum>
+  <w:abstractNum w:abstractNumId="4" w15:restartNumberingAfterBreak="0">
+    <w:nsid w:val="16821C01"/>
+    <w:multiLevelType w:val="hybridMultilevel"/>
+    <w:tmpl w:val="74C2BB6A"/>
+    <w:lvl w:ilvl="0" w:tplc="1BF4CFFA">
+      <w:start w:val="1"/>
+      <w:numFmt w:val="decimal"/>
+      <w:lvlText w:val="%1."/>
+      <w:lvlJc w:val="left"/>
+      <w:pPr>
+        <w:ind w:left="720" w:hanging="360"/>
+      </w:pPr>
+    </w:lvl>
+    <w:lvl w:ilvl="1" w:tplc="FFFFFFFF" w:tentative="1">
+      <w:start w:val="1"/>
+      <w:numFmt w:val="lowerLetter"/>
+      <w:lvlText w:val="%2."/>
+      <w:lvlJc w:val="left"/>
+      <w:pPr>
+        <w:ind w:left="1440" w:hanging="360"/>
+      </w:pPr>
+    </w:lvl>
+    <w:lvl w:ilvl="2" w:tplc="FFFFFFFF" w:tentative="1">
+      <w:start w:val="1"/>
+      <w:numFmt w:val="lowerRoman"/>
+      <w:lvlText w:val="%3."/>
+      <w:lvlJc w:val="right"/>
+      <w:pPr>
+        <w:ind w:left="2160" w:hanging="180"/>
+      </w:pPr>
+    </w:lvl>
+    <w:lvl w:ilvl="3" w:tplc="FFFFFFFF" w:tentative="1">
+      <w:start w:val="1"/>
+      <w:numFmt w:val="decimal"/>
+      <w:lvlText w:val="%4."/>
+      <w:lvlJc w:val="left"/>
+      <w:pPr>
+        <w:ind w:left="2880" w:hanging="360"/>
+      </w:pPr>
+    </w:lvl>
+    <w:lvl w:ilvl="4" w:tplc="FFFFFFFF" w:tentative="1">
+      <w:start w:val="1"/>
+      <w:numFmt w:val="lowerLetter"/>
+      <w:lvlText w:val="%5."/>
+      <w:lvlJc w:val="left"/>
+      <w:pPr>
+        <w:ind w:left="3600" w:hanging="360"/>
+      </w:pPr>
+    </w:lvl>
+    <w:lvl w:ilvl="5" w:tplc="FFFFFFFF" w:tentative="1">
+      <w:start w:val="1"/>
+      <w:numFmt w:val="lowerRoman"/>
+      <w:lvlText w:val="%6."/>
+      <w:lvlJc w:val="right"/>
+      <w:pPr>
+        <w:ind w:left="4320" w:hanging="180"/>
+      </w:pPr>
+    </w:lvl>
+    <w:lvl w:ilvl="6" w:tplc="FFFFFFFF" w:tentative="1">
+      <w:start w:val="1"/>
+      <w:numFmt w:val="decimal"/>
+      <w:lvlText w:val="%7."/>
+      <w:lvlJc w:val="left"/>
+      <w:pPr>
+        <w:ind w:left="5040" w:hanging="360"/>
+      </w:pPr>
+    </w:lvl>
+    <w:lvl w:ilvl="7" w:tplc="FFFFFFFF" w:tentative="1">
+      <w:start w:val="1"/>
+      <w:numFmt w:val="lowerLetter"/>
+      <w:lvlText w:val="%8."/>
+      <w:lvlJc w:val="left"/>
+      <w:pPr>
+        <w:ind w:left="5760" w:hanging="360"/>
+      </w:pPr>
+    </w:lvl>
+    <w:lvl w:ilvl="8" w:tplc="FFFFFFFF" w:tentative="1">
+      <w:start w:val="1"/>
+      <w:numFmt w:val="lowerRoman"/>
+      <w:lvlText w:val="%9."/>
+      <w:lvlJc w:val="right"/>
+      <w:pPr>
+        <w:ind w:left="6480" w:hanging="180"/>
+      </w:pPr>
+    </w:lvl>
+  </w:abstractNum>
+  <w:abstractNum w:abstractNumId="5" w15:restartNumberingAfterBreak="0">
+    <w:nsid w:val="1F552A06"/>
+    <w:multiLevelType w:val="hybridMultilevel"/>
+    <w:tmpl w:val="B5F29EA4"/>
+    <w:lvl w:ilvl="0" w:tplc="C9E632FC">
+      <w:start w:val="2"/>
+      <w:numFmt w:val="decimal"/>
+      <w:lvlText w:val="%1."/>
+      <w:lvlJc w:val="left"/>
+      <w:pPr>
+        <w:ind w:left="720" w:hanging="360"/>
+      </w:pPr>
+      <w:rPr>
+        <w:rFonts w:hint="default"/>
+      </w:rPr>
+    </w:lvl>
+    <w:lvl w:ilvl="1" w:tplc="40090019" w:tentative="1">
+      <w:start w:val="1"/>
+      <w:numFmt w:val="lowerLetter"/>
+      <w:lvlText w:val="%2."/>
+      <w:lvlJc w:val="left"/>
+      <w:pPr>
+        <w:ind w:left="1440" w:hanging="360"/>
+      </w:pPr>
+    </w:lvl>
+    <w:lvl w:ilvl="2" w:tplc="4009001B" w:tentative="1">
+      <w:start w:val="1"/>
+      <w:numFmt w:val="lowerRoman"/>
+      <w:lvlText w:val="%3."/>
+      <w:lvlJc w:val="right"/>
+      <w:pPr>
+        <w:ind w:left="2160" w:hanging="180"/>
+      </w:pPr>
+    </w:lvl>
+    <w:lvl w:ilvl="3" w:tplc="4009000F" w:tentative="1">
+      <w:start w:val="1"/>
+      <w:numFmt w:val="decimal"/>
+      <w:lvlText w:val="%4."/>
+      <w:lvlJc w:val="left"/>
+      <w:pPr>
+        <w:ind w:left="2880" w:hanging="360"/>
+      </w:pPr>
+    </w:lvl>
+    <w:lvl w:ilvl="4" w:tplc="40090019" w:tentative="1">
+      <w:start w:val="1"/>
+      <w:numFmt w:val="lowerLetter"/>
+      <w:lvlText w:val="%5."/>
+      <w:lvlJc w:val="left"/>
+      <w:pPr>
+        <w:ind w:left="3600" w:hanging="360"/>
+      </w:pPr>
+    </w:lvl>
+    <w:lvl w:ilvl="5" w:tplc="4009001B" w:tentative="1">
+      <w:start w:val="1"/>
+      <w:numFmt w:val="lowerRoman"/>
+      <w:lvlText w:val="%6."/>
+      <w:lvlJc w:val="right"/>
+      <w:pPr>
+        <w:ind w:left="4320" w:hanging="180"/>
+      </w:pPr>
+    </w:lvl>
+    <w:lvl w:ilvl="6" w:tplc="4009000F" w:tentative="1">
+      <w:start w:val="1"/>
+      <w:numFmt w:val="decimal"/>
+      <w:lvlText w:val="%7."/>
+      <w:lvlJc w:val="left"/>
+      <w:pPr>
+        <w:ind w:left="5040" w:hanging="360"/>
+      </w:pPr>
+    </w:lvl>
+    <w:lvl w:ilvl="7" w:tplc="40090019" w:tentative="1">
+      <w:start w:val="1"/>
+      <w:numFmt w:val="lowerLetter"/>
+      <w:lvlText w:val="%8."/>
+      <w:lvlJc w:val="left"/>
+      <w:pPr>
+        <w:ind w:left="5760" w:hanging="360"/>
+      </w:pPr>
+    </w:lvl>
+    <w:lvl w:ilvl="8" w:tplc="4009001B" w:tentative="1">
+      <w:start w:val="1"/>
+      <w:numFmt w:val="lowerRoman"/>
+      <w:lvlText w:val="%9."/>
+      <w:lvlJc w:val="right"/>
+      <w:pPr>
+        <w:ind w:left="6480" w:hanging="180"/>
+      </w:pPr>
+    </w:lvl>
+  </w:abstractNum>
+  <w:abstractNum w:abstractNumId="6" w15:restartNumberingAfterBreak="0">
+    <w:nsid w:val="1F6519B0"/>
+    <w:multiLevelType w:val="hybridMultilevel"/>
+    <w:tmpl w:val="C026FB9A"/>
+    <w:lvl w:ilvl="0" w:tplc="0C9AE9B2">
+      <w:start w:val="1"/>
+      <w:numFmt w:val="decimal"/>
+      <w:lvlText w:val="%1."/>
+      <w:lvlJc w:val="left"/>
+      <w:pPr>
+        <w:ind w:left="720" w:hanging="360"/>
+      </w:pPr>
+      <w:rPr>
+        <w:rFonts w:hint="default"/>
+      </w:rPr>
+    </w:lvl>
+    <w:lvl w:ilvl="1" w:tplc="40090019" w:tentative="1">
+      <w:start w:val="1"/>
+      <w:numFmt w:val="lowerLetter"/>
+      <w:lvlText w:val="%2."/>
+      <w:lvlJc w:val="left"/>
+      <w:pPr>
+        <w:ind w:left="1440" w:hanging="360"/>
+      </w:pPr>
+    </w:lvl>
+    <w:lvl w:ilvl="2" w:tplc="4009001B" w:tentative="1">
+      <w:start w:val="1"/>
+      <w:numFmt w:val="lowerRoman"/>
+      <w:lvlText w:val="%3."/>
+      <w:lvlJc w:val="right"/>
+      <w:pPr>
+        <w:ind w:left="2160" w:hanging="180"/>
+      </w:pPr>
+    </w:lvl>
+    <w:lvl w:ilvl="3" w:tplc="4009000F" w:tentative="1">
+      <w:start w:val="1"/>
+      <w:numFmt w:val="decimal"/>
+      <w:lvlText w:val="%4."/>
+      <w:lvlJc w:val="left"/>
+      <w:pPr>
+        <w:ind w:left="2880" w:hanging="360"/>
+      </w:pPr>
+    </w:lvl>
+    <w:lvl w:ilvl="4" w:tplc="40090019" w:tentative="1">
+      <w:start w:val="1"/>
+      <w:numFmt w:val="lowerLetter"/>
+      <w:lvlText w:val="%5."/>
+      <w:lvlJc w:val="left"/>
+      <w:pPr>
+        <w:ind w:left="3600" w:hanging="360"/>
+      </w:pPr>
+    </w:lvl>
+    <w:lvl w:ilvl="5" w:tplc="4009001B" w:tentative="1">
+      <w:start w:val="1"/>
+      <w:numFmt w:val="lowerRoman"/>
+      <w:lvlText w:val="%6."/>
+      <w:lvlJc w:val="right"/>
+      <w:pPr>
+        <w:ind w:left="4320" w:hanging="180"/>
+      </w:pPr>
+    </w:lvl>
+    <w:lvl w:ilvl="6" w:tplc="4009000F" w:tentative="1">
+      <w:start w:val="1"/>
+      <w:numFmt w:val="decimal"/>
+      <w:lvlText w:val="%7."/>
+      <w:lvlJc w:val="left"/>
+      <w:pPr>
+        <w:ind w:left="5040" w:hanging="360"/>
+      </w:pPr>
+    </w:lvl>
+    <w:lvl w:ilvl="7" w:tplc="40090019" w:tentative="1">
+      <w:start w:val="1"/>
+      <w:numFmt w:val="lowerLetter"/>
+      <w:lvlText w:val="%8."/>
+      <w:lvlJc w:val="left"/>
+      <w:pPr>
+        <w:ind w:left="5760" w:hanging="360"/>
+      </w:pPr>
+    </w:lvl>
+    <w:lvl w:ilvl="8" w:tplc="4009001B" w:tentative="1">
+      <w:start w:val="1"/>
+      <w:numFmt w:val="lowerRoman"/>
+      <w:lvlText w:val="%9."/>
+      <w:lvlJc w:val="right"/>
+      <w:pPr>
+        <w:ind w:left="6480" w:hanging="180"/>
+      </w:pPr>
+    </w:lvl>
+  </w:abstractNum>
+  <w:abstractNum w:abstractNumId="7" w15:restartNumberingAfterBreak="0">
     <w:nsid w:val="1FF35255"/>
     <w:multiLevelType w:val="hybridMultilevel"/>
     <w:tmpl w:val="0F8E2182"/>
@@ -8491,7 +12549,7 @@
       </w:pPr>
     </w:lvl>
   </w:abstractNum>
-  <w:abstractNum w:abstractNumId="4" w15:restartNumberingAfterBreak="0">
+  <w:abstractNum w:abstractNumId="8" w15:restartNumberingAfterBreak="0">
     <w:nsid w:val="224D289E"/>
     <w:multiLevelType w:val="hybridMultilevel"/>
     <w:tmpl w:val="DFE2845A"/>
@@ -8577,7 +12635,7 @@
       </w:pPr>
     </w:lvl>
   </w:abstractNum>
-  <w:abstractNum w:abstractNumId="5" w15:restartNumberingAfterBreak="0">
+  <w:abstractNum w:abstractNumId="9" w15:restartNumberingAfterBreak="0">
     <w:nsid w:val="226E0771"/>
     <w:multiLevelType w:val="hybridMultilevel"/>
     <w:tmpl w:val="34785FDC"/>
@@ -8666,7 +12724,7 @@
       </w:pPr>
     </w:lvl>
   </w:abstractNum>
-  <w:abstractNum w:abstractNumId="6" w15:restartNumberingAfterBreak="0">
+  <w:abstractNum w:abstractNumId="10" w15:restartNumberingAfterBreak="0">
     <w:nsid w:val="25FE49C2"/>
     <w:multiLevelType w:val="multilevel"/>
     <w:tmpl w:val="B0183B58"/>
@@ -8815,7 +12873,7 @@
       </w:rPr>
     </w:lvl>
   </w:abstractNum>
-  <w:abstractNum w:abstractNumId="7" w15:restartNumberingAfterBreak="0">
+  <w:abstractNum w:abstractNumId="11" w15:restartNumberingAfterBreak="0">
     <w:nsid w:val="277F6A7C"/>
     <w:multiLevelType w:val="hybridMultilevel"/>
     <w:tmpl w:val="A85C6510"/>
@@ -8904,7 +12962,93 @@
       </w:pPr>
     </w:lvl>
   </w:abstractNum>
-  <w:abstractNum w:abstractNumId="8" w15:restartNumberingAfterBreak="0">
+  <w:abstractNum w:abstractNumId="12" w15:restartNumberingAfterBreak="0">
+    <w:nsid w:val="2E69236A"/>
+    <w:multiLevelType w:val="hybridMultilevel"/>
+    <w:tmpl w:val="5B2E57F4"/>
+    <w:lvl w:ilvl="0" w:tplc="FFFFFFFF">
+      <w:start w:val="1"/>
+      <w:numFmt w:val="decimal"/>
+      <w:lvlText w:val="%1."/>
+      <w:lvlJc w:val="left"/>
+      <w:pPr>
+        <w:ind w:left="720" w:hanging="360"/>
+      </w:pPr>
+    </w:lvl>
+    <w:lvl w:ilvl="1" w:tplc="FFFFFFFF" w:tentative="1">
+      <w:start w:val="1"/>
+      <w:numFmt w:val="lowerLetter"/>
+      <w:lvlText w:val="%2."/>
+      <w:lvlJc w:val="left"/>
+      <w:pPr>
+        <w:ind w:left="1440" w:hanging="360"/>
+      </w:pPr>
+    </w:lvl>
+    <w:lvl w:ilvl="2" w:tplc="FFFFFFFF" w:tentative="1">
+      <w:start w:val="1"/>
+      <w:numFmt w:val="lowerRoman"/>
+      <w:lvlText w:val="%3."/>
+      <w:lvlJc w:val="right"/>
+      <w:pPr>
+        <w:ind w:left="2160" w:hanging="180"/>
+      </w:pPr>
+    </w:lvl>
+    <w:lvl w:ilvl="3" w:tplc="FFFFFFFF" w:tentative="1">
+      <w:start w:val="1"/>
+      <w:numFmt w:val="decimal"/>
+      <w:lvlText w:val="%4."/>
+      <w:lvlJc w:val="left"/>
+      <w:pPr>
+        <w:ind w:left="2880" w:hanging="360"/>
+      </w:pPr>
+    </w:lvl>
+    <w:lvl w:ilvl="4" w:tplc="FFFFFFFF" w:tentative="1">
+      <w:start w:val="1"/>
+      <w:numFmt w:val="lowerLetter"/>
+      <w:lvlText w:val="%5."/>
+      <w:lvlJc w:val="left"/>
+      <w:pPr>
+        <w:ind w:left="3600" w:hanging="360"/>
+      </w:pPr>
+    </w:lvl>
+    <w:lvl w:ilvl="5" w:tplc="FFFFFFFF" w:tentative="1">
+      <w:start w:val="1"/>
+      <w:numFmt w:val="lowerRoman"/>
+      <w:lvlText w:val="%6."/>
+      <w:lvlJc w:val="right"/>
+      <w:pPr>
+        <w:ind w:left="4320" w:hanging="180"/>
+      </w:pPr>
+    </w:lvl>
+    <w:lvl w:ilvl="6" w:tplc="FFFFFFFF" w:tentative="1">
+      <w:start w:val="1"/>
+      <w:numFmt w:val="decimal"/>
+      <w:lvlText w:val="%7."/>
+      <w:lvlJc w:val="left"/>
+      <w:pPr>
+        <w:ind w:left="5040" w:hanging="360"/>
+      </w:pPr>
+    </w:lvl>
+    <w:lvl w:ilvl="7" w:tplc="FFFFFFFF" w:tentative="1">
+      <w:start w:val="1"/>
+      <w:numFmt w:val="lowerLetter"/>
+      <w:lvlText w:val="%8."/>
+      <w:lvlJc w:val="left"/>
+      <w:pPr>
+        <w:ind w:left="5760" w:hanging="360"/>
+      </w:pPr>
+    </w:lvl>
+    <w:lvl w:ilvl="8" w:tplc="FFFFFFFF" w:tentative="1">
+      <w:start w:val="1"/>
+      <w:numFmt w:val="lowerRoman"/>
+      <w:lvlText w:val="%9."/>
+      <w:lvlJc w:val="right"/>
+      <w:pPr>
+        <w:ind w:left="6480" w:hanging="180"/>
+      </w:pPr>
+    </w:lvl>
+  </w:abstractNum>
+  <w:abstractNum w:abstractNumId="13" w15:restartNumberingAfterBreak="0">
     <w:nsid w:val="2F9B1447"/>
     <w:multiLevelType w:val="hybridMultilevel"/>
     <w:tmpl w:val="1D4EAFF8"/>
@@ -8990,7 +13134,7 @@
       </w:pPr>
     </w:lvl>
   </w:abstractNum>
-  <w:abstractNum w:abstractNumId="9" w15:restartNumberingAfterBreak="0">
+  <w:abstractNum w:abstractNumId="14" w15:restartNumberingAfterBreak="0">
     <w:nsid w:val="35D57A2E"/>
     <w:multiLevelType w:val="hybridMultilevel"/>
     <w:tmpl w:val="0FF6CBF2"/>
@@ -9079,7 +13223,93 @@
       </w:pPr>
     </w:lvl>
   </w:abstractNum>
-  <w:abstractNum w:abstractNumId="10" w15:restartNumberingAfterBreak="0">
+  <w:abstractNum w:abstractNumId="15" w15:restartNumberingAfterBreak="0">
+    <w:nsid w:val="39662EC6"/>
+    <w:multiLevelType w:val="hybridMultilevel"/>
+    <w:tmpl w:val="59464B7A"/>
+    <w:lvl w:ilvl="0" w:tplc="4009000F">
+      <w:start w:val="1"/>
+      <w:numFmt w:val="decimal"/>
+      <w:lvlText w:val="%1."/>
+      <w:lvlJc w:val="left"/>
+      <w:pPr>
+        <w:ind w:left="720" w:hanging="360"/>
+      </w:pPr>
+    </w:lvl>
+    <w:lvl w:ilvl="1" w:tplc="40090019" w:tentative="1">
+      <w:start w:val="1"/>
+      <w:numFmt w:val="lowerLetter"/>
+      <w:lvlText w:val="%2."/>
+      <w:lvlJc w:val="left"/>
+      <w:pPr>
+        <w:ind w:left="1440" w:hanging="360"/>
+      </w:pPr>
+    </w:lvl>
+    <w:lvl w:ilvl="2" w:tplc="4009001B" w:tentative="1">
+      <w:start w:val="1"/>
+      <w:numFmt w:val="lowerRoman"/>
+      <w:lvlText w:val="%3."/>
+      <w:lvlJc w:val="right"/>
+      <w:pPr>
+        <w:ind w:left="2160" w:hanging="180"/>
+      </w:pPr>
+    </w:lvl>
+    <w:lvl w:ilvl="3" w:tplc="4009000F" w:tentative="1">
+      <w:start w:val="1"/>
+      <w:numFmt w:val="decimal"/>
+      <w:lvlText w:val="%4."/>
+      <w:lvlJc w:val="left"/>
+      <w:pPr>
+        <w:ind w:left="2880" w:hanging="360"/>
+      </w:pPr>
+    </w:lvl>
+    <w:lvl w:ilvl="4" w:tplc="40090019" w:tentative="1">
+      <w:start w:val="1"/>
+      <w:numFmt w:val="lowerLetter"/>
+      <w:lvlText w:val="%5."/>
+      <w:lvlJc w:val="left"/>
+      <w:pPr>
+        <w:ind w:left="3600" w:hanging="360"/>
+      </w:pPr>
+    </w:lvl>
+    <w:lvl w:ilvl="5" w:tplc="4009001B" w:tentative="1">
+      <w:start w:val="1"/>
+      <w:numFmt w:val="lowerRoman"/>
+      <w:lvlText w:val="%6."/>
+      <w:lvlJc w:val="right"/>
+      <w:pPr>
+        <w:ind w:left="4320" w:hanging="180"/>
+      </w:pPr>
+    </w:lvl>
+    <w:lvl w:ilvl="6" w:tplc="4009000F" w:tentative="1">
+      <w:start w:val="1"/>
+      <w:numFmt w:val="decimal"/>
+      <w:lvlText w:val="%7."/>
+      <w:lvlJc w:val="left"/>
+      <w:pPr>
+        <w:ind w:left="5040" w:hanging="360"/>
+      </w:pPr>
+    </w:lvl>
+    <w:lvl w:ilvl="7" w:tplc="40090019" w:tentative="1">
+      <w:start w:val="1"/>
+      <w:numFmt w:val="lowerLetter"/>
+      <w:lvlText w:val="%8."/>
+      <w:lvlJc w:val="left"/>
+      <w:pPr>
+        <w:ind w:left="5760" w:hanging="360"/>
+      </w:pPr>
+    </w:lvl>
+    <w:lvl w:ilvl="8" w:tplc="4009001B" w:tentative="1">
+      <w:start w:val="1"/>
+      <w:numFmt w:val="lowerRoman"/>
+      <w:lvlText w:val="%9."/>
+      <w:lvlJc w:val="right"/>
+      <w:pPr>
+        <w:ind w:left="6480" w:hanging="180"/>
+      </w:pPr>
+    </w:lvl>
+  </w:abstractNum>
+  <w:abstractNum w:abstractNumId="16" w15:restartNumberingAfterBreak="0">
     <w:nsid w:val="3CCA4F56"/>
     <w:multiLevelType w:val="hybridMultilevel"/>
     <w:tmpl w:val="BBD09A80"/>
@@ -9165,7 +13395,7 @@
       </w:pPr>
     </w:lvl>
   </w:abstractNum>
-  <w:abstractNum w:abstractNumId="11" w15:restartNumberingAfterBreak="0">
+  <w:abstractNum w:abstractNumId="17" w15:restartNumberingAfterBreak="0">
     <w:nsid w:val="41621598"/>
     <w:multiLevelType w:val="hybridMultilevel"/>
     <w:tmpl w:val="2E644174"/>
@@ -9254,7 +13484,7 @@
       </w:pPr>
     </w:lvl>
   </w:abstractNum>
-  <w:abstractNum w:abstractNumId="12" w15:restartNumberingAfterBreak="0">
+  <w:abstractNum w:abstractNumId="18" w15:restartNumberingAfterBreak="0">
     <w:nsid w:val="421F5061"/>
     <w:multiLevelType w:val="hybridMultilevel"/>
     <w:tmpl w:val="C55E3D5E"/>
@@ -9367,7 +13597,7 @@
       </w:rPr>
     </w:lvl>
   </w:abstractNum>
-  <w:abstractNum w:abstractNumId="13" w15:restartNumberingAfterBreak="0">
+  <w:abstractNum w:abstractNumId="19" w15:restartNumberingAfterBreak="0">
     <w:nsid w:val="579956AE"/>
     <w:multiLevelType w:val="hybridMultilevel"/>
     <w:tmpl w:val="152C998C"/>
@@ -9456,7 +13686,7 @@
       </w:pPr>
     </w:lvl>
   </w:abstractNum>
-  <w:abstractNum w:abstractNumId="14" w15:restartNumberingAfterBreak="0">
+  <w:abstractNum w:abstractNumId="20" w15:restartNumberingAfterBreak="0">
     <w:nsid w:val="5AAF4307"/>
     <w:multiLevelType w:val="hybridMultilevel"/>
     <w:tmpl w:val="27147B98"/>
@@ -9542,7 +13772,7 @@
       </w:pPr>
     </w:lvl>
   </w:abstractNum>
-  <w:abstractNum w:abstractNumId="15" w15:restartNumberingAfterBreak="0">
+  <w:abstractNum w:abstractNumId="21" w15:restartNumberingAfterBreak="0">
     <w:nsid w:val="5B0B6E70"/>
     <w:multiLevelType w:val="hybridMultilevel"/>
     <w:tmpl w:val="639E1D92"/>
@@ -9628,7 +13858,93 @@
       </w:pPr>
     </w:lvl>
   </w:abstractNum>
-  <w:abstractNum w:abstractNumId="16" w15:restartNumberingAfterBreak="0">
+  <w:abstractNum w:abstractNumId="22" w15:restartNumberingAfterBreak="0">
+    <w:nsid w:val="5B5059D4"/>
+    <w:multiLevelType w:val="hybridMultilevel"/>
+    <w:tmpl w:val="C9E88492"/>
+    <w:lvl w:ilvl="0" w:tplc="4009000F">
+      <w:start w:val="1"/>
+      <w:numFmt w:val="decimal"/>
+      <w:lvlText w:val="%1."/>
+      <w:lvlJc w:val="left"/>
+      <w:pPr>
+        <w:ind w:left="720" w:hanging="360"/>
+      </w:pPr>
+    </w:lvl>
+    <w:lvl w:ilvl="1" w:tplc="40090019" w:tentative="1">
+      <w:start w:val="1"/>
+      <w:numFmt w:val="lowerLetter"/>
+      <w:lvlText w:val="%2."/>
+      <w:lvlJc w:val="left"/>
+      <w:pPr>
+        <w:ind w:left="1440" w:hanging="360"/>
+      </w:pPr>
+    </w:lvl>
+    <w:lvl w:ilvl="2" w:tplc="4009001B" w:tentative="1">
+      <w:start w:val="1"/>
+      <w:numFmt w:val="lowerRoman"/>
+      <w:lvlText w:val="%3."/>
+      <w:lvlJc w:val="right"/>
+      <w:pPr>
+        <w:ind w:left="2160" w:hanging="180"/>
+      </w:pPr>
+    </w:lvl>
+    <w:lvl w:ilvl="3" w:tplc="4009000F" w:tentative="1">
+      <w:start w:val="1"/>
+      <w:numFmt w:val="decimal"/>
+      <w:lvlText w:val="%4."/>
+      <w:lvlJc w:val="left"/>
+      <w:pPr>
+        <w:ind w:left="2880" w:hanging="360"/>
+      </w:pPr>
+    </w:lvl>
+    <w:lvl w:ilvl="4" w:tplc="40090019" w:tentative="1">
+      <w:start w:val="1"/>
+      <w:numFmt w:val="lowerLetter"/>
+      <w:lvlText w:val="%5."/>
+      <w:lvlJc w:val="left"/>
+      <w:pPr>
+        <w:ind w:left="3600" w:hanging="360"/>
+      </w:pPr>
+    </w:lvl>
+    <w:lvl w:ilvl="5" w:tplc="4009001B" w:tentative="1">
+      <w:start w:val="1"/>
+      <w:numFmt w:val="lowerRoman"/>
+      <w:lvlText w:val="%6."/>
+      <w:lvlJc w:val="right"/>
+      <w:pPr>
+        <w:ind w:left="4320" w:hanging="180"/>
+      </w:pPr>
+    </w:lvl>
+    <w:lvl w:ilvl="6" w:tplc="4009000F" w:tentative="1">
+      <w:start w:val="1"/>
+      <w:numFmt w:val="decimal"/>
+      <w:lvlText w:val="%7."/>
+      <w:lvlJc w:val="left"/>
+      <w:pPr>
+        <w:ind w:left="5040" w:hanging="360"/>
+      </w:pPr>
+    </w:lvl>
+    <w:lvl w:ilvl="7" w:tplc="40090019" w:tentative="1">
+      <w:start w:val="1"/>
+      <w:numFmt w:val="lowerLetter"/>
+      <w:lvlText w:val="%8."/>
+      <w:lvlJc w:val="left"/>
+      <w:pPr>
+        <w:ind w:left="5760" w:hanging="360"/>
+      </w:pPr>
+    </w:lvl>
+    <w:lvl w:ilvl="8" w:tplc="4009001B" w:tentative="1">
+      <w:start w:val="1"/>
+      <w:numFmt w:val="lowerRoman"/>
+      <w:lvlText w:val="%9."/>
+      <w:lvlJc w:val="right"/>
+      <w:pPr>
+        <w:ind w:left="6480" w:hanging="180"/>
+      </w:pPr>
+    </w:lvl>
+  </w:abstractNum>
+  <w:abstractNum w:abstractNumId="23" w15:restartNumberingAfterBreak="0">
     <w:nsid w:val="5CF97DC3"/>
     <w:multiLevelType w:val="hybridMultilevel"/>
     <w:tmpl w:val="5B2C3BD8"/>
@@ -9714,10 +14030,10 @@
       </w:pPr>
     </w:lvl>
   </w:abstractNum>
-  <w:abstractNum w:abstractNumId="17" w15:restartNumberingAfterBreak="0">
+  <w:abstractNum w:abstractNumId="24" w15:restartNumberingAfterBreak="0">
     <w:nsid w:val="5ECF72A1"/>
     <w:multiLevelType w:val="hybridMultilevel"/>
-    <w:tmpl w:val="6564121E"/>
+    <w:tmpl w:val="1CF4107C"/>
     <w:lvl w:ilvl="0" w:tplc="4009000F">
       <w:start w:val="1"/>
       <w:numFmt w:val="decimal"/>
@@ -9800,7 +14116,7 @@
       </w:pPr>
     </w:lvl>
   </w:abstractNum>
-  <w:abstractNum w:abstractNumId="18" w15:restartNumberingAfterBreak="0">
+  <w:abstractNum w:abstractNumId="25" w15:restartNumberingAfterBreak="0">
     <w:nsid w:val="5FAD400A"/>
     <w:multiLevelType w:val="hybridMultilevel"/>
     <w:tmpl w:val="59F4717E"/>
@@ -9886,7 +14202,7 @@
       </w:pPr>
     </w:lvl>
   </w:abstractNum>
-  <w:abstractNum w:abstractNumId="19" w15:restartNumberingAfterBreak="0">
+  <w:abstractNum w:abstractNumId="26" w15:restartNumberingAfterBreak="0">
     <w:nsid w:val="630F0C4E"/>
     <w:multiLevelType w:val="hybridMultilevel"/>
     <w:tmpl w:val="5802DB30"/>
@@ -9978,7 +14294,7 @@
       </w:pPr>
     </w:lvl>
   </w:abstractNum>
-  <w:abstractNum w:abstractNumId="20" w15:restartNumberingAfterBreak="0">
+  <w:abstractNum w:abstractNumId="27" w15:restartNumberingAfterBreak="0">
     <w:nsid w:val="6409798E"/>
     <w:multiLevelType w:val="hybridMultilevel"/>
     <w:tmpl w:val="F942E5A6"/>
@@ -10064,7 +14380,7 @@
       </w:pPr>
     </w:lvl>
   </w:abstractNum>
-  <w:abstractNum w:abstractNumId="21" w15:restartNumberingAfterBreak="0">
+  <w:abstractNum w:abstractNumId="28" w15:restartNumberingAfterBreak="0">
     <w:nsid w:val="72EA5DBF"/>
     <w:multiLevelType w:val="hybridMultilevel"/>
     <w:tmpl w:val="671AAB8E"/>
@@ -10150,7 +14466,7 @@
       </w:pPr>
     </w:lvl>
   </w:abstractNum>
-  <w:abstractNum w:abstractNumId="22" w15:restartNumberingAfterBreak="0">
+  <w:abstractNum w:abstractNumId="29" w15:restartNumberingAfterBreak="0">
     <w:nsid w:val="754B7DA2"/>
     <w:multiLevelType w:val="hybridMultilevel"/>
     <w:tmpl w:val="09E87C36"/>
@@ -10236,7 +14552,7 @@
       </w:pPr>
     </w:lvl>
   </w:abstractNum>
-  <w:abstractNum w:abstractNumId="23" w15:restartNumberingAfterBreak="0">
+  <w:abstractNum w:abstractNumId="30" w15:restartNumberingAfterBreak="0">
     <w:nsid w:val="75BC0870"/>
     <w:multiLevelType w:val="hybridMultilevel"/>
     <w:tmpl w:val="C186C898"/>
@@ -10325,7 +14641,96 @@
       </w:pPr>
     </w:lvl>
   </w:abstractNum>
-  <w:abstractNum w:abstractNumId="24" w15:restartNumberingAfterBreak="0">
+  <w:abstractNum w:abstractNumId="31" w15:restartNumberingAfterBreak="0">
+    <w:nsid w:val="787D215D"/>
+    <w:multiLevelType w:val="hybridMultilevel"/>
+    <w:tmpl w:val="6E66E1B4"/>
+    <w:lvl w:ilvl="0" w:tplc="93A4665A">
+      <w:start w:val="3"/>
+      <w:numFmt w:val="decimal"/>
+      <w:lvlText w:val="%1."/>
+      <w:lvlJc w:val="left"/>
+      <w:pPr>
+        <w:ind w:left="720" w:hanging="360"/>
+      </w:pPr>
+      <w:rPr>
+        <w:rFonts w:hint="default"/>
+      </w:rPr>
+    </w:lvl>
+    <w:lvl w:ilvl="1" w:tplc="40090019" w:tentative="1">
+      <w:start w:val="1"/>
+      <w:numFmt w:val="lowerLetter"/>
+      <w:lvlText w:val="%2."/>
+      <w:lvlJc w:val="left"/>
+      <w:pPr>
+        <w:ind w:left="1440" w:hanging="360"/>
+      </w:pPr>
+    </w:lvl>
+    <w:lvl w:ilvl="2" w:tplc="4009001B" w:tentative="1">
+      <w:start w:val="1"/>
+      <w:numFmt w:val="lowerRoman"/>
+      <w:lvlText w:val="%3."/>
+      <w:lvlJc w:val="right"/>
+      <w:pPr>
+        <w:ind w:left="2160" w:hanging="180"/>
+      </w:pPr>
+    </w:lvl>
+    <w:lvl w:ilvl="3" w:tplc="4009000F" w:tentative="1">
+      <w:start w:val="1"/>
+      <w:numFmt w:val="decimal"/>
+      <w:lvlText w:val="%4."/>
+      <w:lvlJc w:val="left"/>
+      <w:pPr>
+        <w:ind w:left="2880" w:hanging="360"/>
+      </w:pPr>
+    </w:lvl>
+    <w:lvl w:ilvl="4" w:tplc="40090019" w:tentative="1">
+      <w:start w:val="1"/>
+      <w:numFmt w:val="lowerLetter"/>
+      <w:lvlText w:val="%5."/>
+      <w:lvlJc w:val="left"/>
+      <w:pPr>
+        <w:ind w:left="3600" w:hanging="360"/>
+      </w:pPr>
+    </w:lvl>
+    <w:lvl w:ilvl="5" w:tplc="4009001B" w:tentative="1">
+      <w:start w:val="1"/>
+      <w:numFmt w:val="lowerRoman"/>
+      <w:lvlText w:val="%6."/>
+      <w:lvlJc w:val="right"/>
+      <w:pPr>
+        <w:ind w:left="4320" w:hanging="180"/>
+      </w:pPr>
+    </w:lvl>
+    <w:lvl w:ilvl="6" w:tplc="4009000F" w:tentative="1">
+      <w:start w:val="1"/>
+      <w:numFmt w:val="decimal"/>
+      <w:lvlText w:val="%7."/>
+      <w:lvlJc w:val="left"/>
+      <w:pPr>
+        <w:ind w:left="5040" w:hanging="360"/>
+      </w:pPr>
+    </w:lvl>
+    <w:lvl w:ilvl="7" w:tplc="40090019" w:tentative="1">
+      <w:start w:val="1"/>
+      <w:numFmt w:val="lowerLetter"/>
+      <w:lvlText w:val="%8."/>
+      <w:lvlJc w:val="left"/>
+      <w:pPr>
+        <w:ind w:left="5760" w:hanging="360"/>
+      </w:pPr>
+    </w:lvl>
+    <w:lvl w:ilvl="8" w:tplc="4009001B" w:tentative="1">
+      <w:start w:val="1"/>
+      <w:numFmt w:val="lowerRoman"/>
+      <w:lvlText w:val="%9."/>
+      <w:lvlJc w:val="right"/>
+      <w:pPr>
+        <w:ind w:left="6480" w:hanging="180"/>
+      </w:pPr>
+    </w:lvl>
+  </w:abstractNum>
+  <w:abstractNum w:abstractNumId="32" w15:restartNumberingAfterBreak="0">
     <w:nsid w:val="7B8D34CF"/>
     <w:multiLevelType w:val="multilevel"/>
     <w:tmpl w:val="702834C8"/>
@@ -10475,79 +14880,103 @@
     </w:lvl>
   </w:abstractNum>
   <w:num w:numId="1" w16cid:durableId="738789515">
-    <w:abstractNumId w:val="14"/>
+    <w:abstractNumId w:val="20"/>
   </w:num>
   <w:num w:numId="2" w16cid:durableId="1235513339">
     <w:abstractNumId w:val="1"/>
   </w:num>
   <w:num w:numId="3" w16cid:durableId="288970933">
-    <w:abstractNumId w:val="17"/>
+    <w:abstractNumId w:val="24"/>
   </w:num>
   <w:num w:numId="4" w16cid:durableId="1934975148">
     <w:abstractNumId w:val="0"/>
   </w:num>
   <w:num w:numId="5" w16cid:durableId="284432453">
-    <w:abstractNumId w:val="6"/>
+    <w:abstractNumId w:val="10"/>
   </w:num>
   <w:num w:numId="6" w16cid:durableId="1475290958">
     <w:abstractNumId w:val="2"/>
   </w:num>
   <w:num w:numId="7" w16cid:durableId="674764127">
-    <w:abstractNumId w:val="24"/>
+    <w:abstractNumId w:val="32"/>
   </w:num>
   <w:num w:numId="8" w16cid:durableId="1366904678">
+    <w:abstractNumId w:val="18"/>
+  </w:num>
+  <w:num w:numId="9" w16cid:durableId="67462260">
+    <w:abstractNumId w:val="25"/>
+  </w:num>
+  <w:num w:numId="10" w16cid:durableId="364210400">
+    <w:abstractNumId w:val="13"/>
+  </w:num>
+  <w:num w:numId="11" w16cid:durableId="7296056">
+    <w:abstractNumId w:val="16"/>
+  </w:num>
+  <w:num w:numId="12" w16cid:durableId="1654406166">
+    <w:abstractNumId w:val="27"/>
+  </w:num>
+  <w:num w:numId="13" w16cid:durableId="1484928062">
+    <w:abstractNumId w:val="29"/>
+  </w:num>
+  <w:num w:numId="14" w16cid:durableId="504519595">
+    <w:abstractNumId w:val="21"/>
+  </w:num>
+  <w:num w:numId="15" w16cid:durableId="1046217917">
+    <w:abstractNumId w:val="7"/>
+  </w:num>
+  <w:num w:numId="16" w16cid:durableId="2125348581">
+    <w:abstractNumId w:val="8"/>
+  </w:num>
+  <w:num w:numId="17" w16cid:durableId="1482194571">
+    <w:abstractNumId w:val="23"/>
+  </w:num>
+  <w:num w:numId="18" w16cid:durableId="1378116358">
+    <w:abstractNumId w:val="14"/>
+  </w:num>
+  <w:num w:numId="19" w16cid:durableId="1622763665">
+    <w:abstractNumId w:val="19"/>
+  </w:num>
+  <w:num w:numId="20" w16cid:durableId="512308396">
+    <w:abstractNumId w:val="30"/>
+  </w:num>
+  <w:num w:numId="21" w16cid:durableId="1400396216">
+    <w:abstractNumId w:val="11"/>
+  </w:num>
+  <w:num w:numId="22" w16cid:durableId="1687050894">
+    <w:abstractNumId w:val="17"/>
+  </w:num>
+  <w:num w:numId="23" w16cid:durableId="958221247">
+    <w:abstractNumId w:val="9"/>
+  </w:num>
+  <w:num w:numId="24" w16cid:durableId="1303314634">
+    <w:abstractNumId w:val="26"/>
+  </w:num>
+  <w:num w:numId="25" w16cid:durableId="9142093">
+    <w:abstractNumId w:val="28"/>
+  </w:num>
+  <w:num w:numId="26" w16cid:durableId="1458911845">
     <w:abstractNumId w:val="12"/>
   </w:num>
-  <w:num w:numId="9" w16cid:durableId="67462260">
-    <w:abstractNumId w:val="18"/>
+  <w:num w:numId="27" w16cid:durableId="2118016731">
+    <w:abstractNumId w:val="4"/>
   </w:num>
-  <w:num w:numId="10" w16cid:durableId="364210400">
-    <w:abstractNumId w:val="8"/>
+  <w:num w:numId="28" w16cid:durableId="2138251279">
+    <w:abstractNumId w:val="3"/>
   </w:num>
-  <w:num w:numId="11" w16cid:durableId="7296056">
-    <w:abstractNumId w:val="10"/>
-  </w:num>
-  <w:num w:numId="12" w16cid:durableId="1654406166">
-    <w:abstractNumId w:val="20"/>
-  </w:num>
-  <w:num w:numId="13" w16cid:durableId="1484928062">
-    <w:abstractNumId w:val="22"/>
-  </w:num>
-  <w:num w:numId="14" w16cid:durableId="504519595">
+  <w:num w:numId="29" w16cid:durableId="2097509124">
     <w:abstractNumId w:val="15"/>
   </w:num>
-  <w:num w:numId="15" w16cid:durableId="1046217917">
-    <w:abstractNumId w:val="3"/>
+  <w:num w:numId="30" w16cid:durableId="2101440695">
+    <w:abstractNumId w:val="31"/>
   </w:num>
-  <w:num w:numId="16" w16cid:durableId="2125348581">
-    <w:abstractNumId w:val="4"/>
+  <w:num w:numId="31" w16cid:durableId="109252585">
+    <w:abstractNumId w:val="6"/>
   </w:num>
-  <w:num w:numId="17" w16cid:durableId="1482194571">
-    <w:abstractNumId w:val="16"/>
-  </w:num>
-  <w:num w:numId="18" w16cid:durableId="1378116358">
-    <w:abstractNumId w:val="9"/>
-  </w:num>
-  <w:num w:numId="19" w16cid:durableId="1622763665">
-    <w:abstractNumId w:val="13"/>
-  </w:num>
-  <w:num w:numId="20" w16cid:durableId="512308396">
-    <w:abstractNumId w:val="23"/>
-  </w:num>
-  <w:num w:numId="21" w16cid:durableId="1400396216">
-    <w:abstractNumId w:val="7"/>
-  </w:num>
-  <w:num w:numId="22" w16cid:durableId="1687050894">
-    <w:abstractNumId w:val="11"/>
-  </w:num>
-  <w:num w:numId="23" w16cid:durableId="958221247">
+  <w:num w:numId="32" w16cid:durableId="472599006">
     <w:abstractNumId w:val="5"/>
   </w:num>
-  <w:num w:numId="24" w16cid:durableId="1303314634">
-    <w:abstractNumId w:val="19"/>
-  </w:num>
-  <w:num w:numId="25" w16cid:durableId="9142093">
-    <w:abstractNumId w:val="21"/>
+  <w:num w:numId="33" w16cid:durableId="1115103356">
+    <w:abstractNumId w:val="22"/>
   </w:num>
 </w:numbering>
 </file>
@@ -11155,7 +15584,6 @@
   <w:style w:type="character" w:default="1" w:styleId="DefaultParagraphFont">
     <w:name w:val="Default Paragraph Font"/>
     <w:uiPriority w:val="1"/>
-    <w:semiHidden/>
     <w:unhideWhenUsed/>
   </w:style>
   <w:style w:type="table" w:default="1" w:styleId="TableNormal">

</xml_diff>

<commit_message>
feat(financial-math): add 31/08/2026 lecture notes (perpetuities & sinking fund) and update README
</commit_message>
<xml_diff>
--- a/Financial Mathematics/notes.docx
+++ b/Financial Mathematics/notes.docx
@@ -222,19 +222,11 @@
           <w:lang w:val="en-US"/>
         </w:rPr>
       </w:pPr>
-      <w:proofErr w:type="spellStart"/>
       <w:r>
         <w:rPr>
           <w:lang w:val="en-US"/>
         </w:rPr>
-        <w:t>ans</w:t>
-      </w:r>
-      <w:proofErr w:type="spellEnd"/>
-      <w:r>
-        <w:rPr>
-          <w:lang w:val="en-US"/>
-        </w:rPr>
-        <w:t>:</w:t>
+        <w:t>ans:</w:t>
       </w:r>
     </w:p>
     <w:p>
@@ -377,13 +369,8 @@
       <w:pPr>
         <w:pStyle w:val="ListParagraph"/>
       </w:pPr>
-      <w:proofErr w:type="spellStart"/>
-      <w:r>
-        <w:t>ans</w:t>
-      </w:r>
-      <w:proofErr w:type="spellEnd"/>
-      <w:r>
-        <w:t>:</w:t>
+      <w:r>
+        <w:t>ans:</w:t>
       </w:r>
     </w:p>
     <w:p>
@@ -539,13 +526,8 @@
       <w:pPr>
         <w:pStyle w:val="ListParagraph"/>
       </w:pPr>
-      <w:proofErr w:type="spellStart"/>
-      <w:r>
-        <w:t>ans</w:t>
-      </w:r>
-      <w:proofErr w:type="spellEnd"/>
-      <w:r>
-        <w:t>:</w:t>
+      <w:r>
+        <w:t>ans:</w:t>
       </w:r>
     </w:p>
     <w:p>
@@ -793,13 +775,8 @@
       <w:pPr>
         <w:pStyle w:val="ListParagraph"/>
       </w:pPr>
-      <w:proofErr w:type="spellStart"/>
-      <w:r>
-        <w:t>ans</w:t>
-      </w:r>
-      <w:proofErr w:type="spellEnd"/>
-      <w:r>
-        <w:t>:</w:t>
+      <w:r>
+        <w:t>ans:</w:t>
       </w:r>
     </w:p>
     <w:p>
@@ -6792,19 +6769,11 @@
           <w:rFonts w:eastAsiaTheme="minorEastAsia"/>
         </w:rPr>
       </w:pPr>
-      <w:proofErr w:type="spellStart"/>
-      <w:r>
-        <w:rPr>
-          <w:rFonts w:eastAsiaTheme="minorEastAsia"/>
-        </w:rPr>
-        <w:t>ans</w:t>
-      </w:r>
-      <w:proofErr w:type="spellEnd"/>
-      <w:r>
-        <w:rPr>
-          <w:rFonts w:eastAsiaTheme="minorEastAsia"/>
-        </w:rPr>
-        <w:t>:</w:t>
+      <w:r>
+        <w:rPr>
+          <w:rFonts w:eastAsiaTheme="minorEastAsia"/>
+        </w:rPr>
+        <w:t>ans:</w:t>
       </w:r>
     </w:p>
     <w:p>
@@ -8434,21 +8403,7 @@
         <w:rPr>
           <w:rFonts w:eastAsiaTheme="minorEastAsia"/>
         </w:rPr>
-        <w:t xml:space="preserve">Bhuvanesh pays a monthly </w:t>
-      </w:r>
-      <w:proofErr w:type="spellStart"/>
-      <w:r>
-        <w:rPr>
-          <w:rFonts w:eastAsiaTheme="minorEastAsia"/>
-        </w:rPr>
-        <w:t>installment</w:t>
-      </w:r>
-      <w:proofErr w:type="spellEnd"/>
-      <w:r>
-        <w:rPr>
-          <w:rFonts w:eastAsiaTheme="minorEastAsia"/>
-        </w:rPr>
-        <w:t xml:space="preserve"> of rs2000 towards a recurring deposit with a financier. The rate of interest is 6% per annum compounded monthly. What is the maturity value of this recurring deposit after 10 months </w:t>
+        <w:t xml:space="preserve">Bhuvanesh pays a monthly installment of rs2000 towards a recurring deposit with a financier. The rate of interest is 6% per annum compounded monthly. What is the maturity value of this recurring deposit after 10 months </w:t>
       </w:r>
     </w:p>
     <w:p>
@@ -11138,23 +11093,7 @@
           <w:rFonts w:eastAsiaTheme="minorEastAsia"/>
           <w:lang w:val="en-US"/>
         </w:rPr>
-        <w:t xml:space="preserve">Mr. </w:t>
-      </w:r>
-      <w:proofErr w:type="spellStart"/>
-      <w:r>
-        <w:rPr>
-          <w:rFonts w:eastAsiaTheme="minorEastAsia"/>
-          <w:lang w:val="en-US"/>
-        </w:rPr>
-        <w:t>Thanay</w:t>
-      </w:r>
-      <w:proofErr w:type="spellEnd"/>
-      <w:r>
-        <w:rPr>
-          <w:rFonts w:eastAsiaTheme="minorEastAsia"/>
-          <w:lang w:val="en-US"/>
-        </w:rPr>
-        <w:t xml:space="preserve"> expects to receive Rs. 20,000 at the beginning of each year for 4 years. Calculate the present value of the annuity due assuming an interest of 9%</w:t>
+        <w:t>Mr. Thanay expects to receive Rs. 20,000 at the beginning of each year for 4 years. Calculate the present value of the annuity due assuming an interest of 9%</w:t>
       </w:r>
     </w:p>
     <w:p>
@@ -11301,9 +11240,6 @@
             <m:t>PV=20,000+18,348.62+16,833.60+15,443.67</m:t>
           </m:r>
           <m:r>
-            <w:rPr>
-              <w:i/>
-            </w:rPr>
             <w:br/>
           </m:r>
         </m:oMath>
@@ -11315,9 +11251,6 @@
             <m:t>PV=Rs.70,625.89</m:t>
           </m:r>
           <m:r>
-            <w:rPr>
-              <w:i/>
-            </w:rPr>
             <w:br/>
           </m:r>
         </m:oMath>
@@ -11701,21 +11634,1088 @@
     </w:p>
     <w:p>
       <w:pPr>
-        <w:tabs>
-          <w:tab w:val="left" w:pos="1080"/>
-          <w:tab w:val="left" w:pos="2160"/>
-          <w:tab w:val="left" w:pos="2880"/>
-          <w:tab w:val="left" w:pos="3600"/>
-          <w:tab w:val="left" w:pos="4320"/>
-          <w:tab w:val="left" w:pos="5040"/>
-          <w:tab w:val="left" w:pos="5760"/>
-          <w:tab w:val="left" w:pos="6480"/>
-          <w:tab w:val="right" w:pos="9026"/>
-        </w:tabs>
-        <w:rPr>
-          <w:rFonts w:eastAsiaTheme="minorEastAsia"/>
-        </w:rPr>
-      </w:pPr>
+        <w:rPr>
+          <w:lang w:val="en-US"/>
+        </w:rPr>
+      </w:pPr>
+    </w:p>
+    <w:p>
+      <w:pPr>
+        <w:rPr>
+          <w:lang w:val="en-US"/>
+        </w:rPr>
+      </w:pPr>
+      <w:r>
+        <w:rPr>
+          <w:lang w:val="en-US"/>
+        </w:rPr>
+        <w:t>31/08/2026</w:t>
+      </w:r>
+    </w:p>
+    <w:p>
+      <w:pPr>
+        <w:rPr>
+          <w:lang w:val="en-US"/>
+        </w:rPr>
+      </w:pPr>
+    </w:p>
+    <w:p>
+      <w:pPr>
+        <w:rPr>
+          <w:lang w:val="en-US"/>
+        </w:rPr>
+      </w:pPr>
+      <w:r>
+        <w:rPr>
+          <w:lang w:val="en-US"/>
+        </w:rPr>
+        <w:t>II. DISCOUNTING OR PRESENT VALUE TECHNIQUE</w:t>
+      </w:r>
+    </w:p>
+    <w:p>
+      <w:pPr>
+        <w:rPr>
+          <w:lang w:val="en-US"/>
+        </w:rPr>
+      </w:pPr>
+    </w:p>
+    <w:p>
+      <w:pPr>
+        <w:rPr>
+          <w:lang w:val="en-US"/>
+        </w:rPr>
+      </w:pPr>
+      <w:r>
+        <w:rPr>
+          <w:lang w:val="en-US"/>
+        </w:rPr>
+        <w:t>PRESENT VALUE OF PERPETUITY</w:t>
+      </w:r>
+    </w:p>
+    <w:p>
+      <w:pPr>
+        <w:rPr>
+          <w:lang w:val="en-US"/>
+        </w:rPr>
+      </w:pPr>
+    </w:p>
+    <w:p>
+      <w:pPr>
+        <w:rPr>
+          <w:lang w:val="en-US"/>
+        </w:rPr>
+      </w:pPr>
+      <w:r>
+        <w:rPr>
+          <w:b/>
+          <w:bCs/>
+          <w:lang w:val="en-US"/>
+        </w:rPr>
+        <w:t>Present value of perpetuity:</w:t>
+      </w:r>
+      <w:r>
+        <w:rPr>
+          <w:b/>
+          <w:bCs/>
+          <w:lang w:val="en-US"/>
+        </w:rPr>
+        <w:t xml:space="preserve"> </w:t>
+      </w:r>
+      <w:r>
+        <w:rPr>
+          <w:lang w:val="en-US"/>
+        </w:rPr>
+        <w:t>perpetuity is an annuity that occurs indefinitely</w:t>
+      </w:r>
+    </w:p>
+    <w:p>
+      <w:pPr>
+        <w:rPr>
+          <w:rFonts w:eastAsiaTheme="minorEastAsia"/>
+        </w:rPr>
+      </w:pPr>
+      <m:oMathPara>
+        <m:oMath>
+          <m:r>
+            <w:rPr>
+              <w:rFonts w:ascii="Cambria Math" w:eastAsiaTheme="minorEastAsia" w:hAnsi="Cambria Math"/>
+            </w:rPr>
+            <m:t>PV of</m:t>
+          </m:r>
+          <m:r>
+            <w:rPr>
+              <w:rFonts w:ascii="Cambria Math" w:eastAsiaTheme="minorEastAsia" w:hAnsi="Cambria Math"/>
+            </w:rPr>
+            <m:t xml:space="preserve"> a constant perpetuity</m:t>
+          </m:r>
+          <m:r>
+            <w:rPr>
+              <w:rFonts w:ascii="Cambria Math" w:eastAsiaTheme="minorEastAsia" w:hAnsi="Cambria Math"/>
+            </w:rPr>
+            <m:t xml:space="preserve"> = </m:t>
+          </m:r>
+          <m:f>
+            <m:fPr>
+              <m:ctrlPr>
+                <w:rPr>
+                  <w:rFonts w:ascii="Cambria Math" w:eastAsiaTheme="minorEastAsia" w:hAnsi="Cambria Math"/>
+                  <w:i/>
+                </w:rPr>
+              </m:ctrlPr>
+            </m:fPr>
+            <m:num>
+              <m:r>
+                <w:rPr>
+                  <w:rFonts w:ascii="Cambria Math" w:eastAsiaTheme="minorEastAsia" w:hAnsi="Cambria Math"/>
+                </w:rPr>
+                <m:t>C</m:t>
+              </m:r>
+            </m:num>
+            <m:den>
+              <m:r>
+                <w:rPr>
+                  <w:rFonts w:ascii="Cambria Math" w:eastAsiaTheme="minorEastAsia" w:hAnsi="Cambria Math"/>
+                </w:rPr>
+                <m:t>R</m:t>
+              </m:r>
+            </m:den>
+          </m:f>
+        </m:oMath>
+      </m:oMathPara>
+    </w:p>
+    <w:p>
+      <w:pPr>
+        <w:rPr>
+          <w:rFonts w:eastAsiaTheme="minorEastAsia"/>
+        </w:rPr>
+      </w:pPr>
+      <m:oMathPara>
+        <m:oMath>
+          <m:r>
+            <w:rPr>
+              <w:rFonts w:ascii="Cambria Math" w:eastAsiaTheme="minorEastAsia" w:hAnsi="Cambria Math"/>
+            </w:rPr>
+            <m:t>C=Cashflow</m:t>
+          </m:r>
+        </m:oMath>
+      </m:oMathPara>
+    </w:p>
+    <w:p>
+      <w:pPr>
+        <w:rPr>
+          <w:rFonts w:eastAsiaTheme="minorEastAsia"/>
+        </w:rPr>
+      </w:pPr>
+      <m:oMathPara>
+        <m:oMath>
+          <m:r>
+            <w:rPr>
+              <w:rFonts w:ascii="Cambria Math" w:eastAsiaTheme="minorEastAsia" w:hAnsi="Cambria Math"/>
+            </w:rPr>
+            <m:t>R=rateofinterestperpaymentperiod</m:t>
+          </m:r>
+        </m:oMath>
+      </m:oMathPara>
+    </w:p>
+    <w:p>
+      <w:pPr>
+        <w:pStyle w:val="ListParagraph"/>
+        <w:numPr>
+          <w:ilvl w:val="0"/>
+          <w:numId w:val="34"/>
+        </w:numPr>
+        <w:rPr>
+          <w:rFonts w:eastAsiaTheme="minorEastAsia"/>
+        </w:rPr>
+      </w:pPr>
+      <w:r>
+        <w:rPr>
+          <w:rFonts w:eastAsiaTheme="minorEastAsia"/>
+        </w:rPr>
+        <w:t>A company has issued 10% preference shares of Rs. 100 each. What would be the market price of the preference share, if the rate of interest for the investor is 8%.</w:t>
+      </w:r>
+    </w:p>
+    <w:p>
+      <w:pPr>
+        <w:pStyle w:val="ListParagraph"/>
+        <w:rPr>
+          <w:rFonts w:eastAsiaTheme="minorEastAsia"/>
+        </w:rPr>
+      </w:pPr>
+    </w:p>
+    <w:p>
+      <w:pPr>
+        <w:pStyle w:val="ListParagraph"/>
+        <w:rPr>
+          <w:rFonts w:eastAsiaTheme="minorEastAsia"/>
+        </w:rPr>
+      </w:pPr>
+      <w:r>
+        <w:rPr>
+          <w:rFonts w:eastAsiaTheme="minorEastAsia"/>
+        </w:rPr>
+        <w:t>Ans:</w:t>
+      </w:r>
+    </w:p>
+    <w:p>
+      <w:pPr>
+        <w:pStyle w:val="ListParagraph"/>
+        <w:rPr>
+          <w:rFonts w:eastAsiaTheme="minorEastAsia"/>
+        </w:rPr>
+      </w:pPr>
+    </w:p>
+    <w:p>
+      <w:pPr>
+        <w:pStyle w:val="ListParagraph"/>
+        <w:rPr>
+          <w:rFonts w:eastAsiaTheme="minorEastAsia"/>
+        </w:rPr>
+      </w:pPr>
+      <m:oMathPara>
+        <m:oMath>
+          <m:r>
+            <w:rPr>
+              <w:rFonts w:ascii="Cambria Math" w:eastAsiaTheme="minorEastAsia" w:hAnsi="Cambria Math"/>
+            </w:rPr>
+            <m:t xml:space="preserve">PV of a constant perpetuity = </m:t>
+          </m:r>
+          <m:f>
+            <m:fPr>
+              <m:ctrlPr>
+                <w:rPr>
+                  <w:rFonts w:ascii="Cambria Math" w:eastAsiaTheme="minorEastAsia" w:hAnsi="Cambria Math"/>
+                  <w:i/>
+                </w:rPr>
+              </m:ctrlPr>
+            </m:fPr>
+            <m:num>
+              <m:r>
+                <w:rPr>
+                  <w:rFonts w:ascii="Cambria Math" w:eastAsiaTheme="minorEastAsia" w:hAnsi="Cambria Math"/>
+                </w:rPr>
+                <m:t>C</m:t>
+              </m:r>
+            </m:num>
+            <m:den>
+              <m:r>
+                <w:rPr>
+                  <w:rFonts w:ascii="Cambria Math" w:eastAsiaTheme="minorEastAsia" w:hAnsi="Cambria Math"/>
+                </w:rPr>
+                <m:t>R</m:t>
+              </m:r>
+            </m:den>
+          </m:f>
+        </m:oMath>
+      </m:oMathPara>
+    </w:p>
+    <w:p>
+      <w:pPr>
+        <w:pStyle w:val="ListParagraph"/>
+        <w:rPr>
+          <w:rFonts w:eastAsiaTheme="minorEastAsia"/>
+        </w:rPr>
+      </w:pPr>
+      <m:oMath>
+        <m:r>
+          <w:rPr>
+            <w:rFonts w:ascii="Cambria Math" w:eastAsiaTheme="minorEastAsia" w:hAnsi="Cambria Math"/>
+          </w:rPr>
+          <m:t>PVofa</m:t>
+        </m:r>
+        <m:r>
+          <w:rPr>
+            <w:rFonts w:ascii="Cambria Math" w:eastAsiaTheme="minorEastAsia" w:hAnsi="Cambria Math"/>
+          </w:rPr>
+          <m:t xml:space="preserve"> </m:t>
+        </m:r>
+        <m:r>
+          <w:rPr>
+            <w:rFonts w:ascii="Cambria Math" w:eastAsiaTheme="minorEastAsia" w:hAnsi="Cambria Math"/>
+          </w:rPr>
+          <m:t>constant</m:t>
+        </m:r>
+        <m:r>
+          <w:rPr>
+            <w:rFonts w:ascii="Cambria Math" w:eastAsiaTheme="minorEastAsia" w:hAnsi="Cambria Math"/>
+          </w:rPr>
+          <m:t xml:space="preserve"> </m:t>
+        </m:r>
+        <m:r>
+          <w:rPr>
+            <w:rFonts w:ascii="Cambria Math" w:eastAsiaTheme="minorEastAsia" w:hAnsi="Cambria Math"/>
+          </w:rPr>
+          <m:t>perpetuity=10/8</m:t>
+        </m:r>
+      </m:oMath>
+      <w:r>
+        <w:rPr>
+          <w:rFonts w:eastAsiaTheme="minorEastAsia"/>
+        </w:rPr>
+        <w:t>%</w:t>
+      </w:r>
+    </w:p>
+    <w:p>
+      <w:pPr>
+        <w:pStyle w:val="ListParagraph"/>
+        <w:rPr>
+          <w:rFonts w:eastAsiaTheme="minorEastAsia"/>
+        </w:rPr>
+      </w:pPr>
+      <m:oMathPara>
+        <m:oMath>
+          <m:r>
+            <w:rPr>
+              <w:rFonts w:ascii="Cambria Math" w:eastAsiaTheme="minorEastAsia" w:hAnsi="Cambria Math"/>
+            </w:rPr>
+            <m:t>=125</m:t>
+          </m:r>
+        </m:oMath>
+      </m:oMathPara>
+    </w:p>
+    <w:p>
+      <w:pPr>
+        <w:pStyle w:val="ListParagraph"/>
+        <w:rPr>
+          <w:rFonts w:eastAsiaTheme="minorEastAsia"/>
+        </w:rPr>
+      </w:pPr>
+    </w:p>
+    <w:p>
+      <w:pPr>
+        <w:pStyle w:val="ListParagraph"/>
+        <w:rPr>
+          <w:rFonts w:eastAsiaTheme="minorEastAsia"/>
+        </w:rPr>
+      </w:pPr>
+      <w:r>
+        <w:rPr>
+          <w:rFonts w:eastAsiaTheme="minorEastAsia"/>
+        </w:rPr>
+        <w:t>Conclusion: the investor will be ready to pay Rs 125 to purchase a preference share and earn a dividend of 10% on its face value</w:t>
+      </w:r>
+    </w:p>
+    <w:p>
+      <w:pPr>
+        <w:pStyle w:val="ListParagraph"/>
+        <w:rPr>
+          <w:rFonts w:eastAsiaTheme="minorEastAsia"/>
+        </w:rPr>
+      </w:pPr>
+    </w:p>
+    <w:p>
+      <w:pPr>
+        <w:pStyle w:val="ListParagraph"/>
+        <w:rPr>
+          <w:rFonts w:eastAsiaTheme="minorEastAsia"/>
+        </w:rPr>
+      </w:pPr>
+    </w:p>
+    <w:p>
+      <w:pPr>
+        <w:pStyle w:val="ListParagraph"/>
+        <w:rPr>
+          <w:rFonts w:eastAsiaTheme="minorEastAsia"/>
+        </w:rPr>
+      </w:pPr>
+      <w:r>
+        <w:rPr>
+          <w:rFonts w:eastAsiaTheme="minorEastAsia"/>
+        </w:rPr>
+        <w:t>PRESENT VALUE OF GROWING PERPETUITY</w:t>
+      </w:r>
+    </w:p>
+    <w:p>
+      <w:pPr>
+        <w:pStyle w:val="ListParagraph"/>
+        <w:rPr>
+          <w:rFonts w:eastAsiaTheme="minorEastAsia"/>
+        </w:rPr>
+      </w:pPr>
+    </w:p>
+    <w:p>
+      <w:pPr>
+        <w:pStyle w:val="ListParagraph"/>
+        <w:numPr>
+          <w:ilvl w:val="0"/>
+          <w:numId w:val="36"/>
+        </w:numPr>
+        <w:rPr>
+          <w:rFonts w:eastAsiaTheme="minorEastAsia"/>
+        </w:rPr>
+      </w:pPr>
+      <w:r>
+        <w:rPr>
+          <w:rFonts w:eastAsiaTheme="minorEastAsia"/>
+        </w:rPr>
+        <w:lastRenderedPageBreak/>
+        <w:t xml:space="preserve">A growing perpetuity is an infinite </w:t>
+      </w:r>
+      <w:r>
+        <w:rPr>
+          <w:rFonts w:eastAsiaTheme="minorEastAsia"/>
+        </w:rPr>
+        <w:t xml:space="preserve">series of periodic cashflows which grow at a constant rate per peiod </w:t>
+      </w:r>
+    </w:p>
+    <w:p>
+      <w:pPr>
+        <w:pStyle w:val="ListParagraph"/>
+        <w:ind w:left="1440"/>
+        <w:rPr>
+          <w:rFonts w:eastAsiaTheme="minorEastAsia"/>
+        </w:rPr>
+      </w:pPr>
+      <m:oMathPara>
+        <m:oMath>
+          <m:r>
+            <w:rPr>
+              <w:rFonts w:ascii="Cambria Math" w:eastAsiaTheme="minorEastAsia" w:hAnsi="Cambria Math"/>
+            </w:rPr>
+            <m:t xml:space="preserve">PV of a growing perpetuity = </m:t>
+          </m:r>
+          <m:f>
+            <m:fPr>
+              <m:ctrlPr>
+                <w:rPr>
+                  <w:rFonts w:ascii="Cambria Math" w:eastAsiaTheme="minorEastAsia" w:hAnsi="Cambria Math"/>
+                  <w:i/>
+                </w:rPr>
+              </m:ctrlPr>
+            </m:fPr>
+            <m:num>
+              <m:r>
+                <w:rPr>
+                  <w:rFonts w:ascii="Cambria Math" w:eastAsiaTheme="minorEastAsia" w:hAnsi="Cambria Math"/>
+                </w:rPr>
+                <m:t>C</m:t>
+              </m:r>
+            </m:num>
+            <m:den>
+              <m:r>
+                <w:rPr>
+                  <w:rFonts w:ascii="Cambria Math" w:eastAsiaTheme="minorEastAsia" w:hAnsi="Cambria Math"/>
+                </w:rPr>
+                <m:t>R-G</m:t>
+              </m:r>
+            </m:den>
+          </m:f>
+        </m:oMath>
+      </m:oMathPara>
+    </w:p>
+    <w:p>
+      <w:pPr>
+        <w:pStyle w:val="ListParagraph"/>
+        <w:ind w:left="1440"/>
+        <w:rPr>
+          <w:rFonts w:eastAsiaTheme="minorEastAsia"/>
+        </w:rPr>
+      </w:pPr>
+      <w:r>
+        <w:rPr>
+          <w:rFonts w:eastAsiaTheme="minorEastAsia"/>
+        </w:rPr>
+        <w:t xml:space="preserve">Where, </w:t>
+      </w:r>
+    </w:p>
+    <w:p>
+      <w:pPr>
+        <w:pStyle w:val="ListParagraph"/>
+        <w:ind w:left="1440"/>
+        <w:rPr>
+          <w:rFonts w:eastAsiaTheme="minorEastAsia"/>
+        </w:rPr>
+      </w:pPr>
+      <w:r>
+        <w:rPr>
+          <w:rFonts w:eastAsiaTheme="minorEastAsia"/>
+        </w:rPr>
+        <w:tab/>
+        <w:t>C = cashflow (ie interest, dividend per period)</w:t>
+      </w:r>
+    </w:p>
+    <w:p>
+      <w:pPr>
+        <w:pStyle w:val="ListParagraph"/>
+        <w:ind w:left="1440"/>
+        <w:rPr>
+          <w:rFonts w:eastAsiaTheme="minorEastAsia"/>
+        </w:rPr>
+      </w:pPr>
+      <w:r>
+        <w:rPr>
+          <w:rFonts w:eastAsiaTheme="minorEastAsia"/>
+        </w:rPr>
+        <w:tab/>
+        <w:t xml:space="preserve">R = interest rate per payment period </w:t>
+      </w:r>
+    </w:p>
+    <w:p>
+      <w:pPr>
+        <w:pStyle w:val="ListParagraph"/>
+        <w:ind w:left="1440"/>
+        <w:rPr>
+          <w:rFonts w:eastAsiaTheme="minorEastAsia"/>
+        </w:rPr>
+      </w:pPr>
+      <w:r>
+        <w:rPr>
+          <w:rFonts w:eastAsiaTheme="minorEastAsia"/>
+        </w:rPr>
+        <w:tab/>
+        <w:t xml:space="preserve">G = rate of growing is cash flow </w:t>
+      </w:r>
+    </w:p>
+    <w:p>
+      <w:pPr>
+        <w:pStyle w:val="ListParagraph"/>
+        <w:ind w:left="1440"/>
+        <w:rPr>
+          <w:rFonts w:eastAsiaTheme="minorEastAsia"/>
+        </w:rPr>
+      </w:pPr>
+      <w:r>
+        <w:rPr>
+          <w:rFonts w:eastAsiaTheme="minorEastAsia"/>
+        </w:rPr>
+        <w:t>Therefore, above formula can be used only if the rate of interest is more than rate of growth (R&gt;G)</w:t>
+      </w:r>
+    </w:p>
+    <w:p>
+      <w:pPr>
+        <w:pStyle w:val="ListParagraph"/>
+        <w:ind w:left="1440"/>
+        <w:rPr>
+          <w:rFonts w:eastAsiaTheme="minorEastAsia"/>
+        </w:rPr>
+      </w:pPr>
+    </w:p>
+    <w:p>
+      <w:pPr>
+        <w:pStyle w:val="ListParagraph"/>
+        <w:numPr>
+          <w:ilvl w:val="0"/>
+          <w:numId w:val="37"/>
+        </w:numPr>
+        <w:rPr>
+          <w:rFonts w:eastAsiaTheme="minorEastAsia"/>
+        </w:rPr>
+      </w:pPr>
+      <w:r>
+        <w:rPr>
+          <w:rFonts w:eastAsiaTheme="minorEastAsia"/>
+        </w:rPr>
+        <w:t>A company is expected to declare a dividend of Rs 4 at the end of 1</w:t>
+      </w:r>
+      <w:r>
+        <w:rPr>
+          <w:rFonts w:eastAsiaTheme="minorEastAsia"/>
+          <w:vertAlign w:val="superscript"/>
+        </w:rPr>
+        <w:t>st</w:t>
+      </w:r>
+      <w:r>
+        <w:rPr>
+          <w:rFonts w:eastAsiaTheme="minorEastAsia"/>
+        </w:rPr>
+        <w:t xml:space="preserve"> year from now and this dividend is expected to grow 5% every year. What is the present value of this stream of dividend if the rate of interest is 10%? The present value for this dividend stream (calculate). </w:t>
+      </w:r>
+    </w:p>
+    <w:p>
+      <w:pPr>
+        <w:pStyle w:val="ListParagraph"/>
+        <w:rPr>
+          <w:rFonts w:eastAsiaTheme="minorEastAsia"/>
+        </w:rPr>
+      </w:pPr>
+    </w:p>
+    <w:p>
+      <w:pPr>
+        <w:pStyle w:val="ListParagraph"/>
+        <w:rPr>
+          <w:rFonts w:eastAsiaTheme="minorEastAsia"/>
+        </w:rPr>
+      </w:pPr>
+      <w:r>
+        <w:rPr>
+          <w:rFonts w:eastAsiaTheme="minorEastAsia"/>
+        </w:rPr>
+        <w:t>Ans:</w:t>
+      </w:r>
+    </w:p>
+    <w:p>
+      <w:pPr>
+        <w:pStyle w:val="ListParagraph"/>
+        <w:rPr>
+          <w:rFonts w:eastAsiaTheme="minorEastAsia"/>
+        </w:rPr>
+      </w:pPr>
+    </w:p>
+    <w:p>
+      <w:pPr>
+        <w:pStyle w:val="ListParagraph"/>
+        <w:rPr>
+          <w:rFonts w:eastAsiaTheme="minorEastAsia"/>
+        </w:rPr>
+      </w:pPr>
+      <w:r>
+        <w:rPr>
+          <w:rFonts w:eastAsiaTheme="minorEastAsia"/>
+        </w:rPr>
+        <w:t xml:space="preserve">PV of a growing perpetuity = </w:t>
+      </w:r>
+      <m:oMath>
+        <m:r>
+          <w:rPr>
+            <w:rFonts w:ascii="Cambria Math" w:eastAsiaTheme="minorEastAsia" w:hAnsi="Cambria Math"/>
+          </w:rPr>
+          <m:t>4/10</m:t>
+        </m:r>
+        <m:r>
+          <w:rPr>
+            <w:rFonts w:ascii="Cambria Math" w:eastAsiaTheme="minorEastAsia" w:hAnsi="Cambria Math"/>
+          </w:rPr>
+          <m:t>%</m:t>
+        </m:r>
+        <m:r>
+          <w:rPr>
+            <w:rFonts w:ascii="Cambria Math" w:eastAsiaTheme="minorEastAsia" w:hAnsi="Cambria Math"/>
+          </w:rPr>
+          <m:t>-5</m:t>
+        </m:r>
+        <m:r>
+          <w:rPr>
+            <w:rFonts w:ascii="Cambria Math" w:eastAsiaTheme="minorEastAsia" w:hAnsi="Cambria Math"/>
+          </w:rPr>
+          <m:t>%</m:t>
+        </m:r>
+      </m:oMath>
+    </w:p>
+    <w:p>
+      <w:pPr>
+        <w:pStyle w:val="ListParagraph"/>
+        <w:rPr>
+          <w:rFonts w:eastAsiaTheme="minorEastAsia"/>
+        </w:rPr>
+      </w:pPr>
+      <w:r>
+        <w:rPr>
+          <w:rFonts w:eastAsiaTheme="minorEastAsia"/>
+        </w:rPr>
+        <w:t>=</w:t>
+      </w:r>
+      <m:oMath>
+        <m:r>
+          <w:rPr>
+            <w:rFonts w:ascii="Cambria Math" w:eastAsiaTheme="minorEastAsia" w:hAnsi="Cambria Math"/>
+          </w:rPr>
+          <m:t>Rs 80</m:t>
+        </m:r>
+      </m:oMath>
+    </w:p>
+    <w:p>
+      <w:pPr>
+        <w:pStyle w:val="ListParagraph"/>
+        <w:numPr>
+          <w:ilvl w:val="0"/>
+          <w:numId w:val="37"/>
+        </w:numPr>
+        <w:rPr>
+          <w:rFonts w:eastAsiaTheme="minorEastAsia"/>
+        </w:rPr>
+      </w:pPr>
+      <w:r>
+        <w:rPr>
+          <w:rFonts w:eastAsiaTheme="minorEastAsia"/>
+        </w:rPr>
+        <w:t>Let us assume that an investor expects a perpetual sum of Rs 500 annually from his investment. What is the present value of this perpetuity, if the interest rate is 10%?</w:t>
+      </w:r>
+    </w:p>
+    <w:p>
+      <w:pPr>
+        <w:pStyle w:val="ListParagraph"/>
+        <w:rPr>
+          <w:rFonts w:eastAsiaTheme="minorEastAsia"/>
+        </w:rPr>
+      </w:pPr>
+    </w:p>
+    <w:p>
+      <w:pPr>
+        <w:pStyle w:val="ListParagraph"/>
+        <w:rPr>
+          <w:rFonts w:eastAsiaTheme="minorEastAsia"/>
+        </w:rPr>
+      </w:pPr>
+      <w:r>
+        <w:rPr>
+          <w:rFonts w:eastAsiaTheme="minorEastAsia"/>
+        </w:rPr>
+        <w:t xml:space="preserve">PV of a growing perpetuity = </w:t>
+      </w:r>
+      <m:oMath>
+        <m:r>
+          <w:rPr>
+            <w:rFonts w:ascii="Cambria Math" w:eastAsiaTheme="minorEastAsia" w:hAnsi="Cambria Math"/>
+          </w:rPr>
+          <m:t>500/10</m:t>
+        </m:r>
+      </m:oMath>
+    </w:p>
+    <w:p>
+      <w:pPr>
+        <w:pStyle w:val="ListParagraph"/>
+        <w:rPr>
+          <w:rFonts w:eastAsiaTheme="minorEastAsia"/>
+        </w:rPr>
+      </w:pPr>
+      <w:r>
+        <w:rPr>
+          <w:rFonts w:eastAsiaTheme="minorEastAsia"/>
+        </w:rPr>
+        <w:t>=5000</w:t>
+      </w:r>
+    </w:p>
+    <w:p>
+      <w:pPr>
+        <w:rPr>
+          <w:rFonts w:eastAsiaTheme="minorEastAsia"/>
+        </w:rPr>
+      </w:pPr>
+    </w:p>
+    <w:p>
+      <w:pPr>
+        <w:rPr>
+          <w:rFonts w:eastAsiaTheme="minorEastAsia"/>
+        </w:rPr>
+      </w:pPr>
+      <w:r>
+        <w:rPr>
+          <w:rFonts w:eastAsiaTheme="minorEastAsia"/>
+        </w:rPr>
+        <w:t xml:space="preserve">SINKING FUND </w:t>
+      </w:r>
+    </w:p>
+    <w:p>
+      <w:pPr>
+        <w:rPr>
+          <w:rFonts w:eastAsiaTheme="minorEastAsia"/>
+        </w:rPr>
+      </w:pPr>
+    </w:p>
+    <w:p>
+      <w:pPr>
+        <w:pStyle w:val="ListParagraph"/>
+        <w:numPr>
+          <w:ilvl w:val="0"/>
+          <w:numId w:val="36"/>
+        </w:numPr>
+        <w:rPr>
+          <w:rFonts w:eastAsiaTheme="minorEastAsia"/>
+        </w:rPr>
+      </w:pPr>
+      <w:r>
+        <w:rPr>
+          <w:rFonts w:eastAsiaTheme="minorEastAsia"/>
+        </w:rPr>
+        <w:t xml:space="preserve">It is a fund created by investing a certain amount annually at a compound interest rate for a certain period, at the end of which such accumulated funds are used to discharge a known liability (debenture) or to replace a working asset </w:t>
+      </w:r>
+    </w:p>
+    <w:p>
+      <w:pPr>
+        <w:pStyle w:val="ListParagraph"/>
+        <w:numPr>
+          <w:ilvl w:val="0"/>
+          <w:numId w:val="38"/>
+        </w:numPr>
+        <w:rPr>
+          <w:rFonts w:eastAsiaTheme="minorEastAsia"/>
+        </w:rPr>
+      </w:pPr>
+      <w:r>
+        <w:rPr>
+          <w:rFonts w:eastAsiaTheme="minorEastAsia"/>
+        </w:rPr>
+        <w:t xml:space="preserve">An amount of Rs 200,000 is required at the end of 5 years from now to repay a debentures liability. What amount should be accumulated every year at 12% rate of interest, so that ultimately becomes RS 200,000 after 5 years </w:t>
+      </w:r>
+      <w:r>
+        <w:rPr>
+          <w:rFonts w:eastAsiaTheme="minorEastAsia"/>
+        </w:rPr>
+        <w:t xml:space="preserve"> </w:t>
+      </w:r>
+    </w:p>
+    <w:p>
+      <w:pPr>
+        <w:pStyle w:val="ListParagraph"/>
+        <w:rPr>
+          <w:rFonts w:eastAsiaTheme="minorEastAsia"/>
+        </w:rPr>
+      </w:pPr>
+    </w:p>
+    <w:p>
+      <w:pPr>
+        <w:pStyle w:val="ListParagraph"/>
+        <w:rPr>
+          <w:rFonts w:eastAsiaTheme="minorEastAsia"/>
+        </w:rPr>
+      </w:pPr>
+      <w:r>
+        <w:rPr>
+          <w:rFonts w:eastAsiaTheme="minorEastAsia"/>
+        </w:rPr>
+        <w:t>Ans:</w:t>
+      </w:r>
+    </w:p>
+    <w:p>
+      <w:pPr>
+        <w:pStyle w:val="ListParagraph"/>
+        <w:rPr>
+          <w:rFonts w:eastAsiaTheme="minorEastAsia"/>
+        </w:rPr>
+      </w:pPr>
+    </w:p>
+    <w:p>
+      <w:pPr>
+        <w:pStyle w:val="ListParagraph"/>
+        <w:rPr>
+          <w:rFonts w:eastAsiaTheme="minorEastAsia"/>
+        </w:rPr>
+      </w:pPr>
+      <w:r>
+        <w:rPr>
+          <w:rFonts w:eastAsiaTheme="minorEastAsia"/>
+        </w:rPr>
+        <w:lastRenderedPageBreak/>
+        <w:t>The annual accumulation</w:t>
+      </w:r>
+    </w:p>
+    <w:p>
+      <w:pPr>
+        <w:pStyle w:val="ListParagraph"/>
+        <w:rPr>
+          <w:rFonts w:eastAsiaTheme="minorEastAsia"/>
+        </w:rPr>
+      </w:pPr>
+    </w:p>
+    <w:p>
+      <w:pPr>
+        <w:pStyle w:val="ListParagraph"/>
+        <w:rPr>
+          <w:rFonts w:eastAsiaTheme="minorEastAsia"/>
+        </w:rPr>
+      </w:pPr>
+      <w:r>
+        <w:rPr>
+          <w:rFonts w:eastAsiaTheme="minorEastAsia"/>
+        </w:rPr>
+        <w:t xml:space="preserve">Future value = </w:t>
+      </w:r>
+      <m:oMath>
+        <m:r>
+          <w:rPr>
+            <w:rFonts w:ascii="Cambria Math" w:eastAsiaTheme="minorEastAsia" w:hAnsi="Cambria Math"/>
+          </w:rPr>
+          <m:t>S.F Instalment ×</m:t>
+        </m:r>
+        <m:d>
+          <m:dPr>
+            <m:begChr m:val="["/>
+            <m:endChr m:val="]"/>
+            <m:ctrlPr>
+              <w:rPr>
+                <w:rFonts w:ascii="Cambria Math" w:eastAsiaTheme="minorEastAsia" w:hAnsi="Cambria Math"/>
+                <w:i/>
+              </w:rPr>
+            </m:ctrlPr>
+          </m:dPr>
+          <m:e>
+            <m:f>
+              <m:fPr>
+                <m:ctrlPr>
+                  <w:rPr>
+                    <w:rFonts w:ascii="Cambria Math" w:eastAsiaTheme="minorEastAsia" w:hAnsi="Cambria Math"/>
+                    <w:i/>
+                  </w:rPr>
+                </m:ctrlPr>
+              </m:fPr>
+              <m:num>
+                <m:sSup>
+                  <m:sSupPr>
+                    <m:ctrlPr>
+                      <w:rPr>
+                        <w:rFonts w:ascii="Cambria Math" w:eastAsiaTheme="minorEastAsia" w:hAnsi="Cambria Math"/>
+                        <w:i/>
+                      </w:rPr>
+                    </m:ctrlPr>
+                  </m:sSupPr>
+                  <m:e>
+                    <m:d>
+                      <m:dPr>
+                        <m:ctrlPr>
+                          <w:rPr>
+                            <w:rFonts w:ascii="Cambria Math" w:eastAsiaTheme="minorEastAsia" w:hAnsi="Cambria Math"/>
+                            <w:i/>
+                          </w:rPr>
+                        </m:ctrlPr>
+                      </m:dPr>
+                      <m:e>
+                        <m:r>
+                          <w:rPr>
+                            <w:rFonts w:ascii="Cambria Math" w:eastAsiaTheme="minorEastAsia" w:hAnsi="Cambria Math"/>
+                          </w:rPr>
+                          <m:t>1+R</m:t>
+                        </m:r>
+                      </m:e>
+                    </m:d>
+                  </m:e>
+                  <m:sup>
+                    <m:r>
+                      <w:rPr>
+                        <w:rFonts w:ascii="Cambria Math" w:eastAsiaTheme="minorEastAsia" w:hAnsi="Cambria Math"/>
+                      </w:rPr>
+                      <m:t>n</m:t>
+                    </m:r>
+                  </m:sup>
+                </m:sSup>
+                <m:r>
+                  <w:rPr>
+                    <w:rFonts w:ascii="Cambria Math" w:eastAsiaTheme="minorEastAsia" w:hAnsi="Cambria Math"/>
+                  </w:rPr>
+                  <m:t>-1</m:t>
+                </m:r>
+              </m:num>
+              <m:den>
+                <m:r>
+                  <w:rPr>
+                    <w:rFonts w:ascii="Cambria Math" w:eastAsiaTheme="minorEastAsia" w:hAnsi="Cambria Math"/>
+                  </w:rPr>
+                  <m:t>R</m:t>
+                </m:r>
+              </m:den>
+            </m:f>
+          </m:e>
+        </m:d>
+      </m:oMath>
+    </w:p>
+    <w:p>
+      <w:pPr>
+        <w:pStyle w:val="ListParagraph"/>
+        <w:rPr>
+          <w:rFonts w:eastAsiaTheme="minorEastAsia"/>
+        </w:rPr>
+      </w:pPr>
+      <w:r>
+        <w:rPr>
+          <w:rFonts w:eastAsiaTheme="minorEastAsia"/>
+        </w:rPr>
+        <w:t xml:space="preserve">200000 = </w:t>
+      </w:r>
+      <m:oMath>
+        <m:r>
+          <w:rPr>
+            <w:rFonts w:ascii="Cambria Math" w:eastAsiaTheme="minorEastAsia" w:hAnsi="Cambria Math"/>
+          </w:rPr>
+          <m:t>S.F Instalment ×</m:t>
+        </m:r>
+        <m:d>
+          <m:dPr>
+            <m:begChr m:val="["/>
+            <m:endChr m:val="]"/>
+            <m:ctrlPr>
+              <w:rPr>
+                <w:rFonts w:ascii="Cambria Math" w:eastAsiaTheme="minorEastAsia" w:hAnsi="Cambria Math"/>
+                <w:i/>
+              </w:rPr>
+            </m:ctrlPr>
+          </m:dPr>
+          <m:e>
+            <m:f>
+              <m:fPr>
+                <m:ctrlPr>
+                  <w:rPr>
+                    <w:rFonts w:ascii="Cambria Math" w:eastAsiaTheme="minorEastAsia" w:hAnsi="Cambria Math"/>
+                    <w:i/>
+                  </w:rPr>
+                </m:ctrlPr>
+              </m:fPr>
+              <m:num>
+                <m:sSup>
+                  <m:sSupPr>
+                    <m:ctrlPr>
+                      <w:rPr>
+                        <w:rFonts w:ascii="Cambria Math" w:eastAsiaTheme="minorEastAsia" w:hAnsi="Cambria Math"/>
+                        <w:i/>
+                      </w:rPr>
+                    </m:ctrlPr>
+                  </m:sSupPr>
+                  <m:e>
+                    <m:d>
+                      <m:dPr>
+                        <m:ctrlPr>
+                          <w:rPr>
+                            <w:rFonts w:ascii="Cambria Math" w:eastAsiaTheme="minorEastAsia" w:hAnsi="Cambria Math"/>
+                            <w:i/>
+                          </w:rPr>
+                        </m:ctrlPr>
+                      </m:dPr>
+                      <m:e>
+                        <m:r>
+                          <w:rPr>
+                            <w:rFonts w:ascii="Cambria Math" w:eastAsiaTheme="minorEastAsia" w:hAnsi="Cambria Math"/>
+                          </w:rPr>
+                          <m:t>1+</m:t>
+                        </m:r>
+                        <m:r>
+                          <w:rPr>
+                            <w:rFonts w:ascii="Cambria Math" w:eastAsiaTheme="minorEastAsia" w:hAnsi="Cambria Math"/>
+                          </w:rPr>
+                          <m:t>0.12</m:t>
+                        </m:r>
+                      </m:e>
+                    </m:d>
+                  </m:e>
+                  <m:sup>
+                    <m:r>
+                      <w:rPr>
+                        <w:rFonts w:ascii="Cambria Math" w:eastAsiaTheme="minorEastAsia" w:hAnsi="Cambria Math"/>
+                      </w:rPr>
+                      <m:t>5</m:t>
+                    </m:r>
+                  </m:sup>
+                </m:sSup>
+                <m:r>
+                  <w:rPr>
+                    <w:rFonts w:ascii="Cambria Math" w:eastAsiaTheme="minorEastAsia" w:hAnsi="Cambria Math"/>
+                  </w:rPr>
+                  <m:t>-1</m:t>
+                </m:r>
+              </m:num>
+              <m:den>
+                <m:r>
+                  <w:rPr>
+                    <w:rFonts w:ascii="Cambria Math" w:eastAsiaTheme="minorEastAsia" w:hAnsi="Cambria Math"/>
+                  </w:rPr>
+                  <m:t>0.12</m:t>
+                </m:r>
+              </m:den>
+            </m:f>
+          </m:e>
+        </m:d>
+      </m:oMath>
+    </w:p>
+    <w:p>
+      <w:pPr>
+        <w:pStyle w:val="ListParagraph"/>
+        <w:rPr>
+          <w:rFonts w:eastAsiaTheme="minorEastAsia"/>
+        </w:rPr>
+      </w:pPr>
+      <w:r>
+        <w:rPr>
+          <w:rFonts w:eastAsiaTheme="minorEastAsia"/>
+        </w:rPr>
+        <w:t xml:space="preserve">SF instalment = 31481.946 </w:t>
+      </w:r>
     </w:p>
     <w:sectPr>
       <w:pgSz w:w="11906" w:h="16838"/>
@@ -12874,6 +13874,92 @@
     </w:lvl>
   </w:abstractNum>
   <w:abstractNum w:abstractNumId="11" w15:restartNumberingAfterBreak="0">
+    <w:nsid w:val="270E03D6"/>
+    <w:multiLevelType w:val="hybridMultilevel"/>
+    <w:tmpl w:val="21482B92"/>
+    <w:lvl w:ilvl="0" w:tplc="FFFFFFFF">
+      <w:start w:val="1"/>
+      <w:numFmt w:val="decimal"/>
+      <w:lvlText w:val="%1."/>
+      <w:lvlJc w:val="left"/>
+      <w:pPr>
+        <w:ind w:left="720" w:hanging="360"/>
+      </w:pPr>
+    </w:lvl>
+    <w:lvl w:ilvl="1" w:tplc="FFFFFFFF" w:tentative="1">
+      <w:start w:val="1"/>
+      <w:numFmt w:val="lowerLetter"/>
+      <w:lvlText w:val="%2."/>
+      <w:lvlJc w:val="left"/>
+      <w:pPr>
+        <w:ind w:left="1440" w:hanging="360"/>
+      </w:pPr>
+    </w:lvl>
+    <w:lvl w:ilvl="2" w:tplc="FFFFFFFF" w:tentative="1">
+      <w:start w:val="1"/>
+      <w:numFmt w:val="lowerRoman"/>
+      <w:lvlText w:val="%3."/>
+      <w:lvlJc w:val="right"/>
+      <w:pPr>
+        <w:ind w:left="2160" w:hanging="180"/>
+      </w:pPr>
+    </w:lvl>
+    <w:lvl w:ilvl="3" w:tplc="FFFFFFFF" w:tentative="1">
+      <w:start w:val="1"/>
+      <w:numFmt w:val="decimal"/>
+      <w:lvlText w:val="%4."/>
+      <w:lvlJc w:val="left"/>
+      <w:pPr>
+        <w:ind w:left="2880" w:hanging="360"/>
+      </w:pPr>
+    </w:lvl>
+    <w:lvl w:ilvl="4" w:tplc="FFFFFFFF" w:tentative="1">
+      <w:start w:val="1"/>
+      <w:numFmt w:val="lowerLetter"/>
+      <w:lvlText w:val="%5."/>
+      <w:lvlJc w:val="left"/>
+      <w:pPr>
+        <w:ind w:left="3600" w:hanging="360"/>
+      </w:pPr>
+    </w:lvl>
+    <w:lvl w:ilvl="5" w:tplc="FFFFFFFF" w:tentative="1">
+      <w:start w:val="1"/>
+      <w:numFmt w:val="lowerRoman"/>
+      <w:lvlText w:val="%6."/>
+      <w:lvlJc w:val="right"/>
+      <w:pPr>
+        <w:ind w:left="4320" w:hanging="180"/>
+      </w:pPr>
+    </w:lvl>
+    <w:lvl w:ilvl="6" w:tplc="FFFFFFFF" w:tentative="1">
+      <w:start w:val="1"/>
+      <w:numFmt w:val="decimal"/>
+      <w:lvlText w:val="%7."/>
+      <w:lvlJc w:val="left"/>
+      <w:pPr>
+        <w:ind w:left="5040" w:hanging="360"/>
+      </w:pPr>
+    </w:lvl>
+    <w:lvl w:ilvl="7" w:tplc="FFFFFFFF" w:tentative="1">
+      <w:start w:val="1"/>
+      <w:numFmt w:val="lowerLetter"/>
+      <w:lvlText w:val="%8."/>
+      <w:lvlJc w:val="left"/>
+      <w:pPr>
+        <w:ind w:left="5760" w:hanging="360"/>
+      </w:pPr>
+    </w:lvl>
+    <w:lvl w:ilvl="8" w:tplc="FFFFFFFF" w:tentative="1">
+      <w:start w:val="1"/>
+      <w:numFmt w:val="lowerRoman"/>
+      <w:lvlText w:val="%9."/>
+      <w:lvlJc w:val="right"/>
+      <w:pPr>
+        <w:ind w:left="6480" w:hanging="180"/>
+      </w:pPr>
+    </w:lvl>
+  </w:abstractNum>
+  <w:abstractNum w:abstractNumId="12" w15:restartNumberingAfterBreak="0">
     <w:nsid w:val="277F6A7C"/>
     <w:multiLevelType w:val="hybridMultilevel"/>
     <w:tmpl w:val="A85C6510"/>
@@ -12962,7 +14048,93 @@
       </w:pPr>
     </w:lvl>
   </w:abstractNum>
-  <w:abstractNum w:abstractNumId="12" w15:restartNumberingAfterBreak="0">
+  <w:abstractNum w:abstractNumId="13" w15:restartNumberingAfterBreak="0">
+    <w:nsid w:val="2B866818"/>
+    <w:multiLevelType w:val="hybridMultilevel"/>
+    <w:tmpl w:val="21482B92"/>
+    <w:lvl w:ilvl="0" w:tplc="FFFFFFFF">
+      <w:start w:val="1"/>
+      <w:numFmt w:val="decimal"/>
+      <w:lvlText w:val="%1."/>
+      <w:lvlJc w:val="left"/>
+      <w:pPr>
+        <w:ind w:left="720" w:hanging="360"/>
+      </w:pPr>
+    </w:lvl>
+    <w:lvl w:ilvl="1" w:tplc="FFFFFFFF" w:tentative="1">
+      <w:start w:val="1"/>
+      <w:numFmt w:val="lowerLetter"/>
+      <w:lvlText w:val="%2."/>
+      <w:lvlJc w:val="left"/>
+      <w:pPr>
+        <w:ind w:left="1440" w:hanging="360"/>
+      </w:pPr>
+    </w:lvl>
+    <w:lvl w:ilvl="2" w:tplc="FFFFFFFF" w:tentative="1">
+      <w:start w:val="1"/>
+      <w:numFmt w:val="lowerRoman"/>
+      <w:lvlText w:val="%3."/>
+      <w:lvlJc w:val="right"/>
+      <w:pPr>
+        <w:ind w:left="2160" w:hanging="180"/>
+      </w:pPr>
+    </w:lvl>
+    <w:lvl w:ilvl="3" w:tplc="FFFFFFFF" w:tentative="1">
+      <w:start w:val="1"/>
+      <w:numFmt w:val="decimal"/>
+      <w:lvlText w:val="%4."/>
+      <w:lvlJc w:val="left"/>
+      <w:pPr>
+        <w:ind w:left="2880" w:hanging="360"/>
+      </w:pPr>
+    </w:lvl>
+    <w:lvl w:ilvl="4" w:tplc="FFFFFFFF" w:tentative="1">
+      <w:start w:val="1"/>
+      <w:numFmt w:val="lowerLetter"/>
+      <w:lvlText w:val="%5."/>
+      <w:lvlJc w:val="left"/>
+      <w:pPr>
+        <w:ind w:left="3600" w:hanging="360"/>
+      </w:pPr>
+    </w:lvl>
+    <w:lvl w:ilvl="5" w:tplc="FFFFFFFF" w:tentative="1">
+      <w:start w:val="1"/>
+      <w:numFmt w:val="lowerRoman"/>
+      <w:lvlText w:val="%6."/>
+      <w:lvlJc w:val="right"/>
+      <w:pPr>
+        <w:ind w:left="4320" w:hanging="180"/>
+      </w:pPr>
+    </w:lvl>
+    <w:lvl w:ilvl="6" w:tplc="FFFFFFFF" w:tentative="1">
+      <w:start w:val="1"/>
+      <w:numFmt w:val="decimal"/>
+      <w:lvlText w:val="%7."/>
+      <w:lvlJc w:val="left"/>
+      <w:pPr>
+        <w:ind w:left="5040" w:hanging="360"/>
+      </w:pPr>
+    </w:lvl>
+    <w:lvl w:ilvl="7" w:tplc="FFFFFFFF" w:tentative="1">
+      <w:start w:val="1"/>
+      <w:numFmt w:val="lowerLetter"/>
+      <w:lvlText w:val="%8."/>
+      <w:lvlJc w:val="left"/>
+      <w:pPr>
+        <w:ind w:left="5760" w:hanging="360"/>
+      </w:pPr>
+    </w:lvl>
+    <w:lvl w:ilvl="8" w:tplc="FFFFFFFF" w:tentative="1">
+      <w:start w:val="1"/>
+      <w:numFmt w:val="lowerRoman"/>
+      <w:lvlText w:val="%9."/>
+      <w:lvlJc w:val="right"/>
+      <w:pPr>
+        <w:ind w:left="6480" w:hanging="180"/>
+      </w:pPr>
+    </w:lvl>
+  </w:abstractNum>
+  <w:abstractNum w:abstractNumId="14" w15:restartNumberingAfterBreak="0">
     <w:nsid w:val="2E69236A"/>
     <w:multiLevelType w:val="hybridMultilevel"/>
     <w:tmpl w:val="5B2E57F4"/>
@@ -13048,7 +14220,7 @@
       </w:pPr>
     </w:lvl>
   </w:abstractNum>
-  <w:abstractNum w:abstractNumId="13" w15:restartNumberingAfterBreak="0">
+  <w:abstractNum w:abstractNumId="15" w15:restartNumberingAfterBreak="0">
     <w:nsid w:val="2F9B1447"/>
     <w:multiLevelType w:val="hybridMultilevel"/>
     <w:tmpl w:val="1D4EAFF8"/>
@@ -13134,7 +14306,120 @@
       </w:pPr>
     </w:lvl>
   </w:abstractNum>
-  <w:abstractNum w:abstractNumId="14" w15:restartNumberingAfterBreak="0">
+  <w:abstractNum w:abstractNumId="16" w15:restartNumberingAfterBreak="0">
+    <w:nsid w:val="342643EF"/>
+    <w:multiLevelType w:val="hybridMultilevel"/>
+    <w:tmpl w:val="8542C96C"/>
+    <w:lvl w:ilvl="0" w:tplc="40090001">
+      <w:start w:val="1"/>
+      <w:numFmt w:val="bullet"/>
+      <w:lvlText w:val=""/>
+      <w:lvlJc w:val="left"/>
+      <w:pPr>
+        <w:ind w:left="1440" w:hanging="360"/>
+      </w:pPr>
+      <w:rPr>
+        <w:rFonts w:ascii="Symbol" w:hAnsi="Symbol" w:hint="default"/>
+      </w:rPr>
+    </w:lvl>
+    <w:lvl w:ilvl="1" w:tplc="40090003" w:tentative="1">
+      <w:start w:val="1"/>
+      <w:numFmt w:val="bullet"/>
+      <w:lvlText w:val="o"/>
+      <w:lvlJc w:val="left"/>
+      <w:pPr>
+        <w:ind w:left="2160" w:hanging="360"/>
+      </w:pPr>
+      <w:rPr>
+        <w:rFonts w:ascii="Courier New" w:hAnsi="Courier New" w:cs="Courier New" w:hint="default"/>
+      </w:rPr>
+    </w:lvl>
+    <w:lvl w:ilvl="2" w:tplc="40090005" w:tentative="1">
+      <w:start w:val="1"/>
+      <w:numFmt w:val="bullet"/>
+      <w:lvlText w:val=""/>
+      <w:lvlJc w:val="left"/>
+      <w:pPr>
+        <w:ind w:left="2880" w:hanging="360"/>
+      </w:pPr>
+      <w:rPr>
+        <w:rFonts w:ascii="Wingdings" w:hAnsi="Wingdings" w:hint="default"/>
+      </w:rPr>
+    </w:lvl>
+    <w:lvl w:ilvl="3" w:tplc="40090001" w:tentative="1">
+      <w:start w:val="1"/>
+      <w:numFmt w:val="bullet"/>
+      <w:lvlText w:val=""/>
+      <w:lvlJc w:val="left"/>
+      <w:pPr>
+        <w:ind w:left="3600" w:hanging="360"/>
+      </w:pPr>
+      <w:rPr>
+        <w:rFonts w:ascii="Symbol" w:hAnsi="Symbol" w:hint="default"/>
+      </w:rPr>
+    </w:lvl>
+    <w:lvl w:ilvl="4" w:tplc="40090003" w:tentative="1">
+      <w:start w:val="1"/>
+      <w:numFmt w:val="bullet"/>
+      <w:lvlText w:val="o"/>
+      <w:lvlJc w:val="left"/>
+      <w:pPr>
+        <w:ind w:left="4320" w:hanging="360"/>
+      </w:pPr>
+      <w:rPr>
+        <w:rFonts w:ascii="Courier New" w:hAnsi="Courier New" w:cs="Courier New" w:hint="default"/>
+      </w:rPr>
+    </w:lvl>
+    <w:lvl w:ilvl="5" w:tplc="40090005" w:tentative="1">
+      <w:start w:val="1"/>
+      <w:numFmt w:val="bullet"/>
+      <w:lvlText w:val=""/>
+      <w:lvlJc w:val="left"/>
+      <w:pPr>
+        <w:ind w:left="5040" w:hanging="360"/>
+      </w:pPr>
+      <w:rPr>
+        <w:rFonts w:ascii="Wingdings" w:hAnsi="Wingdings" w:hint="default"/>
+      </w:rPr>
+    </w:lvl>
+    <w:lvl w:ilvl="6" w:tplc="40090001" w:tentative="1">
+      <w:start w:val="1"/>
+      <w:numFmt w:val="bullet"/>
+      <w:lvlText w:val=""/>
+      <w:lvlJc w:val="left"/>
+      <w:pPr>
+        <w:ind w:left="5760" w:hanging="360"/>
+      </w:pPr>
+      <w:rPr>
+        <w:rFonts w:ascii="Symbol" w:hAnsi="Symbol" w:hint="default"/>
+      </w:rPr>
+    </w:lvl>
+    <w:lvl w:ilvl="7" w:tplc="40090003" w:tentative="1">
+      <w:start w:val="1"/>
+      <w:numFmt w:val="bullet"/>
+      <w:lvlText w:val="o"/>
+      <w:lvlJc w:val="left"/>
+      <w:pPr>
+        <w:ind w:left="6480" w:hanging="360"/>
+      </w:pPr>
+      <w:rPr>
+        <w:rFonts w:ascii="Courier New" w:hAnsi="Courier New" w:cs="Courier New" w:hint="default"/>
+      </w:rPr>
+    </w:lvl>
+    <w:lvl w:ilvl="8" w:tplc="40090005" w:tentative="1">
+      <w:start w:val="1"/>
+      <w:numFmt w:val="bullet"/>
+      <w:lvlText w:val=""/>
+      <w:lvlJc w:val="left"/>
+      <w:pPr>
+        <w:ind w:left="7200" w:hanging="360"/>
+      </w:pPr>
+      <w:rPr>
+        <w:rFonts w:ascii="Wingdings" w:hAnsi="Wingdings" w:hint="default"/>
+      </w:rPr>
+    </w:lvl>
+  </w:abstractNum>
+  <w:abstractNum w:abstractNumId="17" w15:restartNumberingAfterBreak="0">
     <w:nsid w:val="35D57A2E"/>
     <w:multiLevelType w:val="hybridMultilevel"/>
     <w:tmpl w:val="0FF6CBF2"/>
@@ -13223,7 +14508,7 @@
       </w:pPr>
     </w:lvl>
   </w:abstractNum>
-  <w:abstractNum w:abstractNumId="15" w15:restartNumberingAfterBreak="0">
+  <w:abstractNum w:abstractNumId="18" w15:restartNumberingAfterBreak="0">
     <w:nsid w:val="39662EC6"/>
     <w:multiLevelType w:val="hybridMultilevel"/>
     <w:tmpl w:val="59464B7A"/>
@@ -13309,7 +14594,7 @@
       </w:pPr>
     </w:lvl>
   </w:abstractNum>
-  <w:abstractNum w:abstractNumId="16" w15:restartNumberingAfterBreak="0">
+  <w:abstractNum w:abstractNumId="19" w15:restartNumberingAfterBreak="0">
     <w:nsid w:val="3CCA4F56"/>
     <w:multiLevelType w:val="hybridMultilevel"/>
     <w:tmpl w:val="BBD09A80"/>
@@ -13395,7 +14680,7 @@
       </w:pPr>
     </w:lvl>
   </w:abstractNum>
-  <w:abstractNum w:abstractNumId="17" w15:restartNumberingAfterBreak="0">
+  <w:abstractNum w:abstractNumId="20" w15:restartNumberingAfterBreak="0">
     <w:nsid w:val="41621598"/>
     <w:multiLevelType w:val="hybridMultilevel"/>
     <w:tmpl w:val="2E644174"/>
@@ -13484,7 +14769,7 @@
       </w:pPr>
     </w:lvl>
   </w:abstractNum>
-  <w:abstractNum w:abstractNumId="18" w15:restartNumberingAfterBreak="0">
+  <w:abstractNum w:abstractNumId="21" w15:restartNumberingAfterBreak="0">
     <w:nsid w:val="421F5061"/>
     <w:multiLevelType w:val="hybridMultilevel"/>
     <w:tmpl w:val="C55E3D5E"/>
@@ -13597,7 +14882,7 @@
       </w:rPr>
     </w:lvl>
   </w:abstractNum>
-  <w:abstractNum w:abstractNumId="19" w15:restartNumberingAfterBreak="0">
+  <w:abstractNum w:abstractNumId="22" w15:restartNumberingAfterBreak="0">
     <w:nsid w:val="579956AE"/>
     <w:multiLevelType w:val="hybridMultilevel"/>
     <w:tmpl w:val="152C998C"/>
@@ -13686,7 +14971,7 @@
       </w:pPr>
     </w:lvl>
   </w:abstractNum>
-  <w:abstractNum w:abstractNumId="20" w15:restartNumberingAfterBreak="0">
+  <w:abstractNum w:abstractNumId="23" w15:restartNumberingAfterBreak="0">
     <w:nsid w:val="5AAF4307"/>
     <w:multiLevelType w:val="hybridMultilevel"/>
     <w:tmpl w:val="27147B98"/>
@@ -13772,7 +15057,7 @@
       </w:pPr>
     </w:lvl>
   </w:abstractNum>
-  <w:abstractNum w:abstractNumId="21" w15:restartNumberingAfterBreak="0">
+  <w:abstractNum w:abstractNumId="24" w15:restartNumberingAfterBreak="0">
     <w:nsid w:val="5B0B6E70"/>
     <w:multiLevelType w:val="hybridMultilevel"/>
     <w:tmpl w:val="639E1D92"/>
@@ -13858,10 +15143,10 @@
       </w:pPr>
     </w:lvl>
   </w:abstractNum>
-  <w:abstractNum w:abstractNumId="22" w15:restartNumberingAfterBreak="0">
+  <w:abstractNum w:abstractNumId="25" w15:restartNumberingAfterBreak="0">
     <w:nsid w:val="5B5059D4"/>
     <w:multiLevelType w:val="hybridMultilevel"/>
-    <w:tmpl w:val="C9E88492"/>
+    <w:tmpl w:val="4D400CB4"/>
     <w:lvl w:ilvl="0" w:tplc="4009000F">
       <w:start w:val="1"/>
       <w:numFmt w:val="decimal"/>
@@ -13944,7 +15229,7 @@
       </w:pPr>
     </w:lvl>
   </w:abstractNum>
-  <w:abstractNum w:abstractNumId="23" w15:restartNumberingAfterBreak="0">
+  <w:abstractNum w:abstractNumId="26" w15:restartNumberingAfterBreak="0">
     <w:nsid w:val="5CF97DC3"/>
     <w:multiLevelType w:val="hybridMultilevel"/>
     <w:tmpl w:val="5B2C3BD8"/>
@@ -14030,7 +15315,7 @@
       </w:pPr>
     </w:lvl>
   </w:abstractNum>
-  <w:abstractNum w:abstractNumId="24" w15:restartNumberingAfterBreak="0">
+  <w:abstractNum w:abstractNumId="27" w15:restartNumberingAfterBreak="0">
     <w:nsid w:val="5ECF72A1"/>
     <w:multiLevelType w:val="hybridMultilevel"/>
     <w:tmpl w:val="1CF4107C"/>
@@ -14116,7 +15401,93 @@
       </w:pPr>
     </w:lvl>
   </w:abstractNum>
-  <w:abstractNum w:abstractNumId="25" w15:restartNumberingAfterBreak="0">
+  <w:abstractNum w:abstractNumId="28" w15:restartNumberingAfterBreak="0">
+    <w:nsid w:val="5F5F17AC"/>
+    <w:multiLevelType w:val="hybridMultilevel"/>
+    <w:tmpl w:val="27485FD2"/>
+    <w:lvl w:ilvl="0" w:tplc="FFFFFFFF">
+      <w:start w:val="1"/>
+      <w:numFmt w:val="decimal"/>
+      <w:lvlText w:val="%1."/>
+      <w:lvlJc w:val="left"/>
+      <w:pPr>
+        <w:ind w:left="720" w:hanging="360"/>
+      </w:pPr>
+    </w:lvl>
+    <w:lvl w:ilvl="1" w:tplc="FFFFFFFF" w:tentative="1">
+      <w:start w:val="1"/>
+      <w:numFmt w:val="lowerLetter"/>
+      <w:lvlText w:val="%2."/>
+      <w:lvlJc w:val="left"/>
+      <w:pPr>
+        <w:ind w:left="1440" w:hanging="360"/>
+      </w:pPr>
+    </w:lvl>
+    <w:lvl w:ilvl="2" w:tplc="FFFFFFFF" w:tentative="1">
+      <w:start w:val="1"/>
+      <w:numFmt w:val="lowerRoman"/>
+      <w:lvlText w:val="%3."/>
+      <w:lvlJc w:val="right"/>
+      <w:pPr>
+        <w:ind w:left="2160" w:hanging="180"/>
+      </w:pPr>
+    </w:lvl>
+    <w:lvl w:ilvl="3" w:tplc="FFFFFFFF" w:tentative="1">
+      <w:start w:val="1"/>
+      <w:numFmt w:val="decimal"/>
+      <w:lvlText w:val="%4."/>
+      <w:lvlJc w:val="left"/>
+      <w:pPr>
+        <w:ind w:left="2880" w:hanging="360"/>
+      </w:pPr>
+    </w:lvl>
+    <w:lvl w:ilvl="4" w:tplc="FFFFFFFF" w:tentative="1">
+      <w:start w:val="1"/>
+      <w:numFmt w:val="lowerLetter"/>
+      <w:lvlText w:val="%5."/>
+      <w:lvlJc w:val="left"/>
+      <w:pPr>
+        <w:ind w:left="3600" w:hanging="360"/>
+      </w:pPr>
+    </w:lvl>
+    <w:lvl w:ilvl="5" w:tplc="FFFFFFFF" w:tentative="1">
+      <w:start w:val="1"/>
+      <w:numFmt w:val="lowerRoman"/>
+      <w:lvlText w:val="%6."/>
+      <w:lvlJc w:val="right"/>
+      <w:pPr>
+        <w:ind w:left="4320" w:hanging="180"/>
+      </w:pPr>
+    </w:lvl>
+    <w:lvl w:ilvl="6" w:tplc="FFFFFFFF" w:tentative="1">
+      <w:start w:val="1"/>
+      <w:numFmt w:val="decimal"/>
+      <w:lvlText w:val="%7."/>
+      <w:lvlJc w:val="left"/>
+      <w:pPr>
+        <w:ind w:left="5040" w:hanging="360"/>
+      </w:pPr>
+    </w:lvl>
+    <w:lvl w:ilvl="7" w:tplc="FFFFFFFF" w:tentative="1">
+      <w:start w:val="1"/>
+      <w:numFmt w:val="lowerLetter"/>
+      <w:lvlText w:val="%8."/>
+      <w:lvlJc w:val="left"/>
+      <w:pPr>
+        <w:ind w:left="5760" w:hanging="360"/>
+      </w:pPr>
+    </w:lvl>
+    <w:lvl w:ilvl="8" w:tplc="FFFFFFFF" w:tentative="1">
+      <w:start w:val="1"/>
+      <w:numFmt w:val="lowerRoman"/>
+      <w:lvlText w:val="%9."/>
+      <w:lvlJc w:val="right"/>
+      <w:pPr>
+        <w:ind w:left="6480" w:hanging="180"/>
+      </w:pPr>
+    </w:lvl>
+  </w:abstractNum>
+  <w:abstractNum w:abstractNumId="29" w15:restartNumberingAfterBreak="0">
     <w:nsid w:val="5FAD400A"/>
     <w:multiLevelType w:val="hybridMultilevel"/>
     <w:tmpl w:val="59F4717E"/>
@@ -14202,7 +15573,7 @@
       </w:pPr>
     </w:lvl>
   </w:abstractNum>
-  <w:abstractNum w:abstractNumId="26" w15:restartNumberingAfterBreak="0">
+  <w:abstractNum w:abstractNumId="30" w15:restartNumberingAfterBreak="0">
     <w:nsid w:val="630F0C4E"/>
     <w:multiLevelType w:val="hybridMultilevel"/>
     <w:tmpl w:val="5802DB30"/>
@@ -14294,7 +15665,7 @@
       </w:pPr>
     </w:lvl>
   </w:abstractNum>
-  <w:abstractNum w:abstractNumId="27" w15:restartNumberingAfterBreak="0">
+  <w:abstractNum w:abstractNumId="31" w15:restartNumberingAfterBreak="0">
     <w:nsid w:val="6409798E"/>
     <w:multiLevelType w:val="hybridMultilevel"/>
     <w:tmpl w:val="F942E5A6"/>
@@ -14380,7 +15751,93 @@
       </w:pPr>
     </w:lvl>
   </w:abstractNum>
-  <w:abstractNum w:abstractNumId="28" w15:restartNumberingAfterBreak="0">
+  <w:abstractNum w:abstractNumId="32" w15:restartNumberingAfterBreak="0">
+    <w:nsid w:val="6A825466"/>
+    <w:multiLevelType w:val="hybridMultilevel"/>
+    <w:tmpl w:val="D4123C9C"/>
+    <w:lvl w:ilvl="0" w:tplc="FFFFFFFF">
+      <w:start w:val="1"/>
+      <w:numFmt w:val="decimal"/>
+      <w:lvlText w:val="%1."/>
+      <w:lvlJc w:val="left"/>
+      <w:pPr>
+        <w:ind w:left="720" w:hanging="360"/>
+      </w:pPr>
+    </w:lvl>
+    <w:lvl w:ilvl="1" w:tplc="FFFFFFFF" w:tentative="1">
+      <w:start w:val="1"/>
+      <w:numFmt w:val="lowerLetter"/>
+      <w:lvlText w:val="%2."/>
+      <w:lvlJc w:val="left"/>
+      <w:pPr>
+        <w:ind w:left="1440" w:hanging="360"/>
+      </w:pPr>
+    </w:lvl>
+    <w:lvl w:ilvl="2" w:tplc="FFFFFFFF" w:tentative="1">
+      <w:start w:val="1"/>
+      <w:numFmt w:val="lowerRoman"/>
+      <w:lvlText w:val="%3."/>
+      <w:lvlJc w:val="right"/>
+      <w:pPr>
+        <w:ind w:left="2160" w:hanging="180"/>
+      </w:pPr>
+    </w:lvl>
+    <w:lvl w:ilvl="3" w:tplc="FFFFFFFF" w:tentative="1">
+      <w:start w:val="1"/>
+      <w:numFmt w:val="decimal"/>
+      <w:lvlText w:val="%4."/>
+      <w:lvlJc w:val="left"/>
+      <w:pPr>
+        <w:ind w:left="2880" w:hanging="360"/>
+      </w:pPr>
+    </w:lvl>
+    <w:lvl w:ilvl="4" w:tplc="FFFFFFFF" w:tentative="1">
+      <w:start w:val="1"/>
+      <w:numFmt w:val="lowerLetter"/>
+      <w:lvlText w:val="%5."/>
+      <w:lvlJc w:val="left"/>
+      <w:pPr>
+        <w:ind w:left="3600" w:hanging="360"/>
+      </w:pPr>
+    </w:lvl>
+    <w:lvl w:ilvl="5" w:tplc="FFFFFFFF" w:tentative="1">
+      <w:start w:val="1"/>
+      <w:numFmt w:val="lowerRoman"/>
+      <w:lvlText w:val="%6."/>
+      <w:lvlJc w:val="right"/>
+      <w:pPr>
+        <w:ind w:left="4320" w:hanging="180"/>
+      </w:pPr>
+    </w:lvl>
+    <w:lvl w:ilvl="6" w:tplc="FFFFFFFF" w:tentative="1">
+      <w:start w:val="1"/>
+      <w:numFmt w:val="decimal"/>
+      <w:lvlText w:val="%7."/>
+      <w:lvlJc w:val="left"/>
+      <w:pPr>
+        <w:ind w:left="5040" w:hanging="360"/>
+      </w:pPr>
+    </w:lvl>
+    <w:lvl w:ilvl="7" w:tplc="FFFFFFFF" w:tentative="1">
+      <w:start w:val="1"/>
+      <w:numFmt w:val="lowerLetter"/>
+      <w:lvlText w:val="%8."/>
+      <w:lvlJc w:val="left"/>
+      <w:pPr>
+        <w:ind w:left="5760" w:hanging="360"/>
+      </w:pPr>
+    </w:lvl>
+    <w:lvl w:ilvl="8" w:tplc="FFFFFFFF" w:tentative="1">
+      <w:start w:val="1"/>
+      <w:numFmt w:val="lowerRoman"/>
+      <w:lvlText w:val="%9."/>
+      <w:lvlJc w:val="right"/>
+      <w:pPr>
+        <w:ind w:left="6480" w:hanging="180"/>
+      </w:pPr>
+    </w:lvl>
+  </w:abstractNum>
+  <w:abstractNum w:abstractNumId="33" w15:restartNumberingAfterBreak="0">
     <w:nsid w:val="72EA5DBF"/>
     <w:multiLevelType w:val="hybridMultilevel"/>
     <w:tmpl w:val="671AAB8E"/>
@@ -14466,7 +15923,7 @@
       </w:pPr>
     </w:lvl>
   </w:abstractNum>
-  <w:abstractNum w:abstractNumId="29" w15:restartNumberingAfterBreak="0">
+  <w:abstractNum w:abstractNumId="34" w15:restartNumberingAfterBreak="0">
     <w:nsid w:val="754B7DA2"/>
     <w:multiLevelType w:val="hybridMultilevel"/>
     <w:tmpl w:val="09E87C36"/>
@@ -14552,7 +16009,7 @@
       </w:pPr>
     </w:lvl>
   </w:abstractNum>
-  <w:abstractNum w:abstractNumId="30" w15:restartNumberingAfterBreak="0">
+  <w:abstractNum w:abstractNumId="35" w15:restartNumberingAfterBreak="0">
     <w:nsid w:val="75BC0870"/>
     <w:multiLevelType w:val="hybridMultilevel"/>
     <w:tmpl w:val="C186C898"/>
@@ -14641,7 +16098,7 @@
       </w:pPr>
     </w:lvl>
   </w:abstractNum>
-  <w:abstractNum w:abstractNumId="31" w15:restartNumberingAfterBreak="0">
+  <w:abstractNum w:abstractNumId="36" w15:restartNumberingAfterBreak="0">
     <w:nsid w:val="787D215D"/>
     <w:multiLevelType w:val="hybridMultilevel"/>
     <w:tmpl w:val="6E66E1B4"/>
@@ -14730,7 +16187,7 @@
       </w:pPr>
     </w:lvl>
   </w:abstractNum>
-  <w:abstractNum w:abstractNumId="32" w15:restartNumberingAfterBreak="0">
+  <w:abstractNum w:abstractNumId="37" w15:restartNumberingAfterBreak="0">
     <w:nsid w:val="7B8D34CF"/>
     <w:multiLevelType w:val="multilevel"/>
     <w:tmpl w:val="702834C8"/>
@@ -14880,13 +16337,13 @@
     </w:lvl>
   </w:abstractNum>
   <w:num w:numId="1" w16cid:durableId="738789515">
-    <w:abstractNumId w:val="20"/>
+    <w:abstractNumId w:val="23"/>
   </w:num>
   <w:num w:numId="2" w16cid:durableId="1235513339">
     <w:abstractNumId w:val="1"/>
   </w:num>
   <w:num w:numId="3" w16cid:durableId="288970933">
-    <w:abstractNumId w:val="24"/>
+    <w:abstractNumId w:val="27"/>
   </w:num>
   <w:num w:numId="4" w16cid:durableId="1934975148">
     <w:abstractNumId w:val="0"/>
@@ -14898,28 +16355,28 @@
     <w:abstractNumId w:val="2"/>
   </w:num>
   <w:num w:numId="7" w16cid:durableId="674764127">
-    <w:abstractNumId w:val="32"/>
+    <w:abstractNumId w:val="37"/>
   </w:num>
   <w:num w:numId="8" w16cid:durableId="1366904678">
-    <w:abstractNumId w:val="18"/>
+    <w:abstractNumId w:val="21"/>
   </w:num>
   <w:num w:numId="9" w16cid:durableId="67462260">
-    <w:abstractNumId w:val="25"/>
+    <w:abstractNumId w:val="29"/>
   </w:num>
   <w:num w:numId="10" w16cid:durableId="364210400">
-    <w:abstractNumId w:val="13"/>
+    <w:abstractNumId w:val="15"/>
   </w:num>
   <w:num w:numId="11" w16cid:durableId="7296056">
-    <w:abstractNumId w:val="16"/>
+    <w:abstractNumId w:val="19"/>
   </w:num>
   <w:num w:numId="12" w16cid:durableId="1654406166">
-    <w:abstractNumId w:val="27"/>
+    <w:abstractNumId w:val="31"/>
   </w:num>
   <w:num w:numId="13" w16cid:durableId="1484928062">
-    <w:abstractNumId w:val="29"/>
+    <w:abstractNumId w:val="34"/>
   </w:num>
   <w:num w:numId="14" w16cid:durableId="504519595">
-    <w:abstractNumId w:val="21"/>
+    <w:abstractNumId w:val="24"/>
   </w:num>
   <w:num w:numId="15" w16cid:durableId="1046217917">
     <w:abstractNumId w:val="7"/>
@@ -14928,34 +16385,34 @@
     <w:abstractNumId w:val="8"/>
   </w:num>
   <w:num w:numId="17" w16cid:durableId="1482194571">
-    <w:abstractNumId w:val="23"/>
+    <w:abstractNumId w:val="26"/>
   </w:num>
   <w:num w:numId="18" w16cid:durableId="1378116358">
-    <w:abstractNumId w:val="14"/>
+    <w:abstractNumId w:val="17"/>
   </w:num>
   <w:num w:numId="19" w16cid:durableId="1622763665">
-    <w:abstractNumId w:val="19"/>
+    <w:abstractNumId w:val="22"/>
   </w:num>
   <w:num w:numId="20" w16cid:durableId="512308396">
-    <w:abstractNumId w:val="30"/>
+    <w:abstractNumId w:val="35"/>
   </w:num>
   <w:num w:numId="21" w16cid:durableId="1400396216">
-    <w:abstractNumId w:val="11"/>
+    <w:abstractNumId w:val="12"/>
   </w:num>
   <w:num w:numId="22" w16cid:durableId="1687050894">
-    <w:abstractNumId w:val="17"/>
+    <w:abstractNumId w:val="20"/>
   </w:num>
   <w:num w:numId="23" w16cid:durableId="958221247">
     <w:abstractNumId w:val="9"/>
   </w:num>
   <w:num w:numId="24" w16cid:durableId="1303314634">
-    <w:abstractNumId w:val="26"/>
+    <w:abstractNumId w:val="30"/>
   </w:num>
   <w:num w:numId="25" w16cid:durableId="9142093">
-    <w:abstractNumId w:val="28"/>
+    <w:abstractNumId w:val="33"/>
   </w:num>
   <w:num w:numId="26" w16cid:durableId="1458911845">
-    <w:abstractNumId w:val="12"/>
+    <w:abstractNumId w:val="14"/>
   </w:num>
   <w:num w:numId="27" w16cid:durableId="2118016731">
     <w:abstractNumId w:val="4"/>
@@ -14964,10 +16421,10 @@
     <w:abstractNumId w:val="3"/>
   </w:num>
   <w:num w:numId="29" w16cid:durableId="2097509124">
-    <w:abstractNumId w:val="15"/>
+    <w:abstractNumId w:val="18"/>
   </w:num>
   <w:num w:numId="30" w16cid:durableId="2101440695">
-    <w:abstractNumId w:val="31"/>
+    <w:abstractNumId w:val="36"/>
   </w:num>
   <w:num w:numId="31" w16cid:durableId="109252585">
     <w:abstractNumId w:val="6"/>
@@ -14976,7 +16433,22 @@
     <w:abstractNumId w:val="5"/>
   </w:num>
   <w:num w:numId="33" w16cid:durableId="1115103356">
-    <w:abstractNumId w:val="22"/>
+    <w:abstractNumId w:val="25"/>
+  </w:num>
+  <w:num w:numId="34" w16cid:durableId="220681117">
+    <w:abstractNumId w:val="32"/>
+  </w:num>
+  <w:num w:numId="35" w16cid:durableId="1176386353">
+    <w:abstractNumId w:val="28"/>
+  </w:num>
+  <w:num w:numId="36" w16cid:durableId="1049376175">
+    <w:abstractNumId w:val="16"/>
+  </w:num>
+  <w:num w:numId="37" w16cid:durableId="723523505">
+    <w:abstractNumId w:val="13"/>
+  </w:num>
+  <w:num w:numId="38" w16cid:durableId="1595165128">
+    <w:abstractNumId w:val="11"/>
   </w:num>
 </w:numbering>
 </file>

</xml_diff>

<commit_message>
feat: add 01/09 Financial Math sinking fund annuity due & GFM IMF/BOP lectures, update READMEs and ML assets
</commit_message>
<xml_diff>
--- a/Financial Mathematics/notes.docx
+++ b/Financial Mathematics/notes.docx
@@ -222,11 +222,19 @@
           <w:lang w:val="en-US"/>
         </w:rPr>
       </w:pPr>
+      <w:proofErr w:type="spellStart"/>
       <w:r>
         <w:rPr>
           <w:lang w:val="en-US"/>
         </w:rPr>
-        <w:t>ans:</w:t>
+        <w:t>ans</w:t>
+      </w:r>
+      <w:proofErr w:type="spellEnd"/>
+      <w:r>
+        <w:rPr>
+          <w:lang w:val="en-US"/>
+        </w:rPr>
+        <w:t>:</w:t>
       </w:r>
     </w:p>
     <w:p>
@@ -369,8 +377,13 @@
       <w:pPr>
         <w:pStyle w:val="ListParagraph"/>
       </w:pPr>
-      <w:r>
-        <w:t>ans:</w:t>
+      <w:proofErr w:type="spellStart"/>
+      <w:r>
+        <w:t>ans</w:t>
+      </w:r>
+      <w:proofErr w:type="spellEnd"/>
+      <w:r>
+        <w:t>:</w:t>
       </w:r>
     </w:p>
     <w:p>
@@ -526,8 +539,13 @@
       <w:pPr>
         <w:pStyle w:val="ListParagraph"/>
       </w:pPr>
-      <w:r>
-        <w:t>ans:</w:t>
+      <w:proofErr w:type="spellStart"/>
+      <w:r>
+        <w:t>ans</w:t>
+      </w:r>
+      <w:proofErr w:type="spellEnd"/>
+      <w:r>
+        <w:t>:</w:t>
       </w:r>
     </w:p>
     <w:p>
@@ -775,8 +793,13 @@
       <w:pPr>
         <w:pStyle w:val="ListParagraph"/>
       </w:pPr>
-      <w:r>
-        <w:t>ans:</w:t>
+      <w:proofErr w:type="spellStart"/>
+      <w:r>
+        <w:t>ans</w:t>
+      </w:r>
+      <w:proofErr w:type="spellEnd"/>
+      <w:r>
+        <w:t>:</w:t>
       </w:r>
     </w:p>
     <w:p>
@@ -2193,7 +2216,20 @@
           <w:rFonts w:eastAsiaTheme="minorEastAsia"/>
         </w:rPr>
         <w:tab/>
-        <w:t xml:space="preserve">Where, </w:t>
+      </w:r>
+      <w:proofErr w:type="gramStart"/>
+      <w:r>
+        <w:rPr>
+          <w:rFonts w:eastAsiaTheme="minorEastAsia"/>
+        </w:rPr>
+        <w:t>Where</w:t>
+      </w:r>
+      <w:proofErr w:type="gramEnd"/>
+      <w:r>
+        <w:rPr>
+          <w:rFonts w:eastAsiaTheme="minorEastAsia"/>
+        </w:rPr>
+        <w:t xml:space="preserve">, </w:t>
       </w:r>
     </w:p>
     <w:p>
@@ -2853,11 +2889,19 @@
           <w:rFonts w:eastAsiaTheme="minorEastAsia"/>
         </w:rPr>
       </w:pPr>
-      <w:r>
-        <w:rPr>
-          <w:rFonts w:eastAsiaTheme="minorEastAsia"/>
-        </w:rPr>
-        <w:t xml:space="preserve">Where, </w:t>
+      <w:proofErr w:type="gramStart"/>
+      <w:r>
+        <w:rPr>
+          <w:rFonts w:eastAsiaTheme="minorEastAsia"/>
+        </w:rPr>
+        <w:t>Where</w:t>
+      </w:r>
+      <w:proofErr w:type="gramEnd"/>
+      <w:r>
+        <w:rPr>
+          <w:rFonts w:eastAsiaTheme="minorEastAsia"/>
+        </w:rPr>
+        <w:t xml:space="preserve">, </w:t>
       </w:r>
     </w:p>
     <w:p>
@@ -3602,11 +3646,19 @@
           <w:rFonts w:eastAsiaTheme="minorEastAsia"/>
         </w:rPr>
       </w:pPr>
-      <w:r>
-        <w:rPr>
-          <w:rFonts w:eastAsiaTheme="minorEastAsia"/>
-        </w:rPr>
-        <w:t>Where,</w:t>
+      <w:proofErr w:type="gramStart"/>
+      <w:r>
+        <w:rPr>
+          <w:rFonts w:eastAsiaTheme="minorEastAsia"/>
+        </w:rPr>
+        <w:t>Where</w:t>
+      </w:r>
+      <w:proofErr w:type="gramEnd"/>
+      <w:r>
+        <w:rPr>
+          <w:rFonts w:eastAsiaTheme="minorEastAsia"/>
+        </w:rPr>
+        <w:t>,</w:t>
       </w:r>
     </w:p>
     <w:p>
@@ -3793,11 +3845,19 @@
           <w:rFonts w:eastAsiaTheme="minorEastAsia"/>
         </w:rPr>
       </w:pPr>
-      <w:r>
-        <w:rPr>
-          <w:rFonts w:eastAsiaTheme="minorEastAsia"/>
-        </w:rPr>
-        <w:t xml:space="preserve">Where, </w:t>
+      <w:proofErr w:type="gramStart"/>
+      <w:r>
+        <w:rPr>
+          <w:rFonts w:eastAsiaTheme="minorEastAsia"/>
+        </w:rPr>
+        <w:t>Where</w:t>
+      </w:r>
+      <w:proofErr w:type="gramEnd"/>
+      <w:r>
+        <w:rPr>
+          <w:rFonts w:eastAsiaTheme="minorEastAsia"/>
+        </w:rPr>
+        <w:t xml:space="preserve">, </w:t>
       </w:r>
     </w:p>
     <w:p>
@@ -4095,11 +4155,19 @@
           <w:rFonts w:eastAsiaTheme="minorEastAsia"/>
         </w:rPr>
       </w:pPr>
-      <w:r>
-        <w:rPr>
-          <w:rFonts w:eastAsiaTheme="minorEastAsia"/>
-        </w:rPr>
-        <w:t xml:space="preserve">Where, </w:t>
+      <w:proofErr w:type="gramStart"/>
+      <w:r>
+        <w:rPr>
+          <w:rFonts w:eastAsiaTheme="minorEastAsia"/>
+        </w:rPr>
+        <w:t>Where</w:t>
+      </w:r>
+      <w:proofErr w:type="gramEnd"/>
+      <w:r>
+        <w:rPr>
+          <w:rFonts w:eastAsiaTheme="minorEastAsia"/>
+        </w:rPr>
+        <w:t xml:space="preserve">, </w:t>
       </w:r>
     </w:p>
     <w:p>
@@ -6769,11 +6837,19 @@
           <w:rFonts w:eastAsiaTheme="minorEastAsia"/>
         </w:rPr>
       </w:pPr>
-      <w:r>
-        <w:rPr>
-          <w:rFonts w:eastAsiaTheme="minorEastAsia"/>
-        </w:rPr>
-        <w:t>ans:</w:t>
+      <w:proofErr w:type="spellStart"/>
+      <w:r>
+        <w:rPr>
+          <w:rFonts w:eastAsiaTheme="minorEastAsia"/>
+        </w:rPr>
+        <w:t>ans</w:t>
+      </w:r>
+      <w:proofErr w:type="spellEnd"/>
+      <w:r>
+        <w:rPr>
+          <w:rFonts w:eastAsiaTheme="minorEastAsia"/>
+        </w:rPr>
+        <w:t>:</w:t>
       </w:r>
     </w:p>
     <w:p>
@@ -8403,7 +8479,21 @@
         <w:rPr>
           <w:rFonts w:eastAsiaTheme="minorEastAsia"/>
         </w:rPr>
-        <w:t xml:space="preserve">Bhuvanesh pays a monthly installment of rs2000 towards a recurring deposit with a financier. The rate of interest is 6% per annum compounded monthly. What is the maturity value of this recurring deposit after 10 months </w:t>
+        <w:t xml:space="preserve">Bhuvanesh pays a monthly </w:t>
+      </w:r>
+      <w:proofErr w:type="spellStart"/>
+      <w:r>
+        <w:rPr>
+          <w:rFonts w:eastAsiaTheme="minorEastAsia"/>
+        </w:rPr>
+        <w:t>installment</w:t>
+      </w:r>
+      <w:proofErr w:type="spellEnd"/>
+      <w:r>
+        <w:rPr>
+          <w:rFonts w:eastAsiaTheme="minorEastAsia"/>
+        </w:rPr>
+        <w:t xml:space="preserve"> of rs2000 towards a recurring deposit with a financier. The rate of interest is 6% per annum compounded monthly. What is the maturity value of this recurring deposit after 10 months </w:t>
       </w:r>
     </w:p>
     <w:p>
@@ -8749,7 +8839,21 @@
         <w:rPr>
           <w:rFonts w:eastAsiaTheme="minorEastAsia"/>
         </w:rPr>
-        <w:t>Present value of Rs 10,000 receivable after 4 years and the rate of interest at 12%. The PV factor in the PV table (12% column and 4 year row) is 0.635.</w:t>
+        <w:t xml:space="preserve">Present value of Rs 10,000 receivable after 4 years and the rate of interest at 12%. The PV factor in the PV table (12% column and </w:t>
+      </w:r>
+      <w:proofErr w:type="gramStart"/>
+      <w:r>
+        <w:rPr>
+          <w:rFonts w:eastAsiaTheme="minorEastAsia"/>
+        </w:rPr>
+        <w:t>4 year</w:t>
+      </w:r>
+      <w:proofErr w:type="gramEnd"/>
+      <w:r>
+        <w:rPr>
+          <w:rFonts w:eastAsiaTheme="minorEastAsia"/>
+        </w:rPr>
+        <w:t xml:space="preserve"> row) is 0.635.</w:t>
       </w:r>
     </w:p>
     <w:p>
@@ -10203,7 +10307,21 @@
         <w:rPr>
           <w:lang w:val="en-US"/>
         </w:rPr>
-        <w:t>Raja has entered into an agreement that will fetch him Rs. 60000 per annum for next 4 years. He want to know the present value for the future cash inflows at 20% discount rate</w:t>
+        <w:t xml:space="preserve">Raja has entered into an agreement that will fetch him Rs. 60000 per annum for next 4 years. He </w:t>
+      </w:r>
+      <w:proofErr w:type="gramStart"/>
+      <w:r>
+        <w:rPr>
+          <w:lang w:val="en-US"/>
+        </w:rPr>
+        <w:t>want</w:t>
+      </w:r>
+      <w:proofErr w:type="gramEnd"/>
+      <w:r>
+        <w:rPr>
+          <w:lang w:val="en-US"/>
+        </w:rPr>
+        <w:t xml:space="preserve"> to know the present value for the future cash inflows at 20% discount rate</w:t>
       </w:r>
     </w:p>
     <w:p>
@@ -11093,7 +11211,23 @@
           <w:rFonts w:eastAsiaTheme="minorEastAsia"/>
           <w:lang w:val="en-US"/>
         </w:rPr>
-        <w:t>Mr. Thanay expects to receive Rs. 20,000 at the beginning of each year for 4 years. Calculate the present value of the annuity due assuming an interest of 9%</w:t>
+        <w:t xml:space="preserve">Mr. </w:t>
+      </w:r>
+      <w:proofErr w:type="spellStart"/>
+      <w:r>
+        <w:rPr>
+          <w:rFonts w:eastAsiaTheme="minorEastAsia"/>
+          <w:lang w:val="en-US"/>
+        </w:rPr>
+        <w:t>Thanay</w:t>
+      </w:r>
+      <w:proofErr w:type="spellEnd"/>
+      <w:r>
+        <w:rPr>
+          <w:rFonts w:eastAsiaTheme="minorEastAsia"/>
+          <w:lang w:val="en-US"/>
+        </w:rPr>
+        <w:t xml:space="preserve"> expects to receive Rs. 20,000 at the beginning of each year for 4 years. Calculate the present value of the annuity due assuming an interest of 9%</w:t>
       </w:r>
     </w:p>
     <w:p>
@@ -11240,6 +11374,9 @@
             <m:t>PV=20,000+18,348.62+16,833.60+15,443.67</m:t>
           </m:r>
           <m:r>
+            <m:rPr>
+              <m:sty m:val="p"/>
+            </m:rPr>
             <w:br/>
           </m:r>
         </m:oMath>
@@ -11251,6 +11388,9 @@
             <m:t>PV=Rs.70,625.89</m:t>
           </m:r>
           <m:r>
+            <m:rPr>
+              <m:sty m:val="p"/>
+            </m:rPr>
             <w:br/>
           </m:r>
         </m:oMath>
@@ -11740,19 +11880,7 @@
             <w:rPr>
               <w:rFonts w:ascii="Cambria Math" w:eastAsiaTheme="minorEastAsia" w:hAnsi="Cambria Math"/>
             </w:rPr>
-            <m:t>PV of</m:t>
-          </m:r>
-          <m:r>
-            <w:rPr>
-              <w:rFonts w:ascii="Cambria Math" w:eastAsiaTheme="minorEastAsia" w:hAnsi="Cambria Math"/>
-            </w:rPr>
-            <m:t xml:space="preserve"> a constant perpetuity</m:t>
-          </m:r>
-          <m:r>
-            <w:rPr>
-              <w:rFonts w:ascii="Cambria Math" w:eastAsiaTheme="minorEastAsia" w:hAnsi="Cambria Math"/>
-            </w:rPr>
-            <m:t xml:space="preserve"> = </m:t>
+            <m:t xml:space="preserve">PV of a constant perpetuity = </m:t>
           </m:r>
           <m:f>
             <m:fPr>
@@ -11921,31 +12049,7 @@
           <w:rPr>
             <w:rFonts w:ascii="Cambria Math" w:eastAsiaTheme="minorEastAsia" w:hAnsi="Cambria Math"/>
           </w:rPr>
-          <m:t>PVofa</m:t>
-        </m:r>
-        <m:r>
-          <w:rPr>
-            <w:rFonts w:ascii="Cambria Math" w:eastAsiaTheme="minorEastAsia" w:hAnsi="Cambria Math"/>
-          </w:rPr>
-          <m:t xml:space="preserve"> </m:t>
-        </m:r>
-        <m:r>
-          <w:rPr>
-            <w:rFonts w:ascii="Cambria Math" w:eastAsiaTheme="minorEastAsia" w:hAnsi="Cambria Math"/>
-          </w:rPr>
-          <m:t>constant</m:t>
-        </m:r>
-        <m:r>
-          <w:rPr>
-            <w:rFonts w:ascii="Cambria Math" w:eastAsiaTheme="minorEastAsia" w:hAnsi="Cambria Math"/>
-          </w:rPr>
-          <m:t xml:space="preserve"> </m:t>
-        </m:r>
-        <m:r>
-          <w:rPr>
-            <w:rFonts w:ascii="Cambria Math" w:eastAsiaTheme="minorEastAsia" w:hAnsi="Cambria Math"/>
-          </w:rPr>
-          <m:t>perpetuity=10/8</m:t>
+          <m:t>PVofa constant perpetuity=10/8</m:t>
         </m:r>
       </m:oMath>
       <w:r>
@@ -12055,7 +12159,21 @@
         <w:rPr>
           <w:rFonts w:eastAsiaTheme="minorEastAsia"/>
         </w:rPr>
-        <w:t xml:space="preserve">series of periodic cashflows which grow at a constant rate per peiod </w:t>
+        <w:t xml:space="preserve">series of periodic cashflows which grow at a constant rate per </w:t>
+      </w:r>
+      <w:proofErr w:type="spellStart"/>
+      <w:r>
+        <w:rPr>
+          <w:rFonts w:eastAsiaTheme="minorEastAsia"/>
+        </w:rPr>
+        <w:t>peiod</w:t>
+      </w:r>
+      <w:proofErr w:type="spellEnd"/>
+      <w:r>
+        <w:rPr>
+          <w:rFonts w:eastAsiaTheme="minorEastAsia"/>
+        </w:rPr>
+        <w:t xml:space="preserve"> </w:t>
       </w:r>
     </w:p>
     <w:p>
@@ -12111,11 +12229,19 @@
           <w:rFonts w:eastAsiaTheme="minorEastAsia"/>
         </w:rPr>
       </w:pPr>
-      <w:r>
-        <w:rPr>
-          <w:rFonts w:eastAsiaTheme="minorEastAsia"/>
-        </w:rPr>
-        <w:t xml:space="preserve">Where, </w:t>
+      <w:proofErr w:type="gramStart"/>
+      <w:r>
+        <w:rPr>
+          <w:rFonts w:eastAsiaTheme="minorEastAsia"/>
+        </w:rPr>
+        <w:t>Where</w:t>
+      </w:r>
+      <w:proofErr w:type="gramEnd"/>
+      <w:r>
+        <w:rPr>
+          <w:rFonts w:eastAsiaTheme="minorEastAsia"/>
+        </w:rPr>
+        <w:t xml:space="preserve">, </w:t>
       </w:r>
     </w:p>
     <w:p>
@@ -12131,7 +12257,21 @@
           <w:rFonts w:eastAsiaTheme="minorEastAsia"/>
         </w:rPr>
         <w:tab/>
-        <w:t>C = cashflow (ie interest, dividend per period)</w:t>
+        <w:t>C = cashflow (</w:t>
+      </w:r>
+      <w:proofErr w:type="spellStart"/>
+      <w:r>
+        <w:rPr>
+          <w:rFonts w:eastAsiaTheme="minorEastAsia"/>
+        </w:rPr>
+        <w:t>ie</w:t>
+      </w:r>
+      <w:proofErr w:type="spellEnd"/>
+      <w:r>
+        <w:rPr>
+          <w:rFonts w:eastAsiaTheme="minorEastAsia"/>
+        </w:rPr>
+        <w:t xml:space="preserve"> interest, dividend per period)</w:t>
       </w:r>
     </w:p>
     <w:p>
@@ -12269,25 +12409,7 @@
           <w:rPr>
             <w:rFonts w:ascii="Cambria Math" w:eastAsiaTheme="minorEastAsia" w:hAnsi="Cambria Math"/>
           </w:rPr>
-          <m:t>4/10</m:t>
-        </m:r>
-        <m:r>
-          <w:rPr>
-            <w:rFonts w:ascii="Cambria Math" w:eastAsiaTheme="minorEastAsia" w:hAnsi="Cambria Math"/>
-          </w:rPr>
-          <m:t>%</m:t>
-        </m:r>
-        <m:r>
-          <w:rPr>
-            <w:rFonts w:ascii="Cambria Math" w:eastAsiaTheme="minorEastAsia" w:hAnsi="Cambria Math"/>
-          </w:rPr>
-          <m:t>-5</m:t>
-        </m:r>
-        <m:r>
-          <w:rPr>
-            <w:rFonts w:ascii="Cambria Math" w:eastAsiaTheme="minorEastAsia" w:hAnsi="Cambria Math"/>
-          </w:rPr>
-          <m:t>%</m:t>
+          <m:t>4/10%-5%</m:t>
         </m:r>
       </m:oMath>
     </w:p>
@@ -12663,13 +12785,7 @@
                           <w:rPr>
                             <w:rFonts w:ascii="Cambria Math" w:eastAsiaTheme="minorEastAsia" w:hAnsi="Cambria Math"/>
                           </w:rPr>
-                          <m:t>1+</m:t>
-                        </m:r>
-                        <m:r>
-                          <w:rPr>
-                            <w:rFonts w:ascii="Cambria Math" w:eastAsiaTheme="minorEastAsia" w:hAnsi="Cambria Math"/>
-                          </w:rPr>
-                          <m:t>0.12</m:t>
+                          <m:t>1+0.12</m:t>
                         </m:r>
                       </m:e>
                     </m:d>
@@ -12717,6 +12833,784 @@
         <w:t xml:space="preserve">SF instalment = 31481.946 </w:t>
       </w:r>
     </w:p>
+    <w:p>
+      <w:pPr>
+        <w:pStyle w:val="ListParagraph"/>
+        <w:rPr>
+          <w:rFonts w:eastAsiaTheme="minorEastAsia"/>
+        </w:rPr>
+      </w:pPr>
+    </w:p>
+    <w:p>
+      <w:pPr>
+        <w:rPr>
+          <w:rFonts w:eastAsiaTheme="minorEastAsia"/>
+        </w:rPr>
+      </w:pPr>
+      <w:r>
+        <w:rPr>
+          <w:rFonts w:eastAsiaTheme="minorEastAsia"/>
+        </w:rPr>
+        <w:t>01/09/2026</w:t>
+      </w:r>
+    </w:p>
+    <w:p>
+      <w:pPr>
+        <w:rPr>
+          <w:rFonts w:eastAsiaTheme="minorEastAsia"/>
+        </w:rPr>
+      </w:pPr>
+    </w:p>
+    <w:p>
+      <w:pPr>
+        <w:pStyle w:val="ListParagraph"/>
+        <w:numPr>
+          <w:ilvl w:val="0"/>
+          <w:numId w:val="33"/>
+        </w:numPr>
+        <w:rPr>
+          <w:rFonts w:eastAsiaTheme="minorEastAsia"/>
+        </w:rPr>
+      </w:pPr>
+      <w:r>
+        <w:rPr>
+          <w:rFonts w:eastAsiaTheme="minorEastAsia"/>
+        </w:rPr>
+        <w:t xml:space="preserve">T limited is creating a sinking fund to redeem its debentures of Rs 4000000 issued on April 5 2008 and maturing on April 4 2020. The first annual payment to the fund will be made on April 5 2008. The company will make equal annual payment and expects that the fund will earn 14% per year. How much will be the amount of sinking fund payment. </w:t>
+      </w:r>
+    </w:p>
+    <w:p>
+      <w:pPr>
+        <w:pStyle w:val="ListParagraph"/>
+        <w:rPr>
+          <w:rFonts w:eastAsiaTheme="minorEastAsia"/>
+        </w:rPr>
+      </w:pPr>
+    </w:p>
+    <w:p>
+      <w:pPr>
+        <w:pStyle w:val="ListParagraph"/>
+        <w:rPr>
+          <w:rFonts w:eastAsiaTheme="minorEastAsia"/>
+        </w:rPr>
+      </w:pPr>
+      <w:r>
+        <w:rPr>
+          <w:rFonts w:eastAsiaTheme="minorEastAsia"/>
+        </w:rPr>
+        <w:t>Ans</w:t>
+      </w:r>
+    </w:p>
+    <w:p>
+      <w:pPr>
+        <w:pStyle w:val="ListParagraph"/>
+        <w:rPr>
+          <w:rFonts w:eastAsiaTheme="minorEastAsia"/>
+        </w:rPr>
+      </w:pPr>
+    </w:p>
+    <w:p>
+      <w:pPr>
+        <w:pStyle w:val="ListParagraph"/>
+        <w:rPr>
+          <w:rFonts w:eastAsiaTheme="minorEastAsia"/>
+        </w:rPr>
+      </w:pPr>
+      <w:r>
+        <w:rPr>
+          <w:rFonts w:eastAsiaTheme="minorEastAsia"/>
+        </w:rPr>
+        <w:t xml:space="preserve">Beginning of the year </w:t>
+      </w:r>
+    </w:p>
+    <w:p>
+      <w:pPr>
+        <w:pStyle w:val="ListParagraph"/>
+        <w:rPr>
+          <w:rFonts w:eastAsiaTheme="minorEastAsia"/>
+        </w:rPr>
+      </w:pPr>
+    </w:p>
+    <w:p>
+      <w:pPr>
+        <w:pStyle w:val="ListParagraph"/>
+        <w:rPr>
+          <w:rFonts w:eastAsiaTheme="minorEastAsia"/>
+        </w:rPr>
+      </w:pPr>
+      <m:oMathPara>
+        <m:oMath>
+          <m:r>
+            <w:rPr>
+              <w:rFonts w:ascii="Cambria Math" w:eastAsiaTheme="minorEastAsia" w:hAnsi="Cambria Math"/>
+            </w:rPr>
+            <m:t xml:space="preserve">SF instalment × </m:t>
+          </m:r>
+          <m:f>
+            <m:fPr>
+              <m:ctrlPr>
+                <w:rPr>
+                  <w:rFonts w:ascii="Cambria Math" w:eastAsiaTheme="minorEastAsia" w:hAnsi="Cambria Math"/>
+                  <w:i/>
+                </w:rPr>
+              </m:ctrlPr>
+            </m:fPr>
+            <m:num>
+              <m:d>
+                <m:dPr>
+                  <m:ctrlPr>
+                    <w:rPr>
+                      <w:rFonts w:ascii="Cambria Math" w:eastAsiaTheme="minorEastAsia" w:hAnsi="Cambria Math"/>
+                      <w:i/>
+                    </w:rPr>
+                  </m:ctrlPr>
+                </m:dPr>
+                <m:e>
+                  <m:sSup>
+                    <m:sSupPr>
+                      <m:ctrlPr>
+                        <w:rPr>
+                          <w:rFonts w:ascii="Cambria Math" w:eastAsiaTheme="minorEastAsia" w:hAnsi="Cambria Math"/>
+                          <w:i/>
+                        </w:rPr>
+                      </m:ctrlPr>
+                    </m:sSupPr>
+                    <m:e>
+                      <m:d>
+                        <m:dPr>
+                          <m:ctrlPr>
+                            <w:rPr>
+                              <w:rFonts w:ascii="Cambria Math" w:eastAsiaTheme="minorEastAsia" w:hAnsi="Cambria Math"/>
+                              <w:i/>
+                            </w:rPr>
+                          </m:ctrlPr>
+                        </m:dPr>
+                        <m:e>
+                          <m:r>
+                            <w:rPr>
+                              <w:rFonts w:ascii="Cambria Math" w:eastAsiaTheme="minorEastAsia" w:hAnsi="Cambria Math"/>
+                            </w:rPr>
+                            <m:t>1+R</m:t>
+                          </m:r>
+                        </m:e>
+                      </m:d>
+                    </m:e>
+                    <m:sup>
+                      <m:r>
+                        <w:rPr>
+                          <w:rFonts w:ascii="Cambria Math" w:eastAsiaTheme="minorEastAsia" w:hAnsi="Cambria Math"/>
+                        </w:rPr>
+                        <m:t>n</m:t>
+                      </m:r>
+                    </m:sup>
+                  </m:sSup>
+                  <m:r>
+                    <w:rPr>
+                      <w:rFonts w:ascii="Cambria Math" w:eastAsiaTheme="minorEastAsia" w:hAnsi="Cambria Math"/>
+                    </w:rPr>
+                    <m:t>-1</m:t>
+                  </m:r>
+                </m:e>
+              </m:d>
+            </m:num>
+            <m:den>
+              <m:r>
+                <w:rPr>
+                  <w:rFonts w:ascii="Cambria Math" w:eastAsiaTheme="minorEastAsia" w:hAnsi="Cambria Math"/>
+                </w:rPr>
+                <m:t>R</m:t>
+              </m:r>
+            </m:den>
+          </m:f>
+          <m:r>
+            <w:rPr>
+              <w:rFonts w:ascii="Cambria Math" w:eastAsiaTheme="minorEastAsia" w:hAnsi="Cambria Math"/>
+            </w:rPr>
+            <m:t>×</m:t>
+          </m:r>
+          <m:d>
+            <m:dPr>
+              <m:ctrlPr>
+                <w:rPr>
+                  <w:rFonts w:ascii="Cambria Math" w:eastAsiaTheme="minorEastAsia" w:hAnsi="Cambria Math"/>
+                  <w:i/>
+                </w:rPr>
+              </m:ctrlPr>
+            </m:dPr>
+            <m:e>
+              <m:r>
+                <w:rPr>
+                  <w:rFonts w:ascii="Cambria Math" w:eastAsiaTheme="minorEastAsia" w:hAnsi="Cambria Math"/>
+                </w:rPr>
+                <m:t>1+R</m:t>
+              </m:r>
+            </m:e>
+          </m:d>
+        </m:oMath>
+      </m:oMathPara>
+    </w:p>
+    <w:p>
+      <w:pPr>
+        <w:pStyle w:val="ListParagraph"/>
+        <w:rPr>
+          <w:rFonts w:eastAsiaTheme="minorEastAsia"/>
+        </w:rPr>
+      </w:pPr>
+      <w:r>
+        <w:rPr>
+          <w:rFonts w:eastAsiaTheme="minorEastAsia"/>
+          <w:b/>
+          <w:bCs/>
+        </w:rPr>
+        <w:t>Step 1:</w:t>
+      </w:r>
+      <w:r>
+        <w:rPr>
+          <w:rFonts w:eastAsiaTheme="minorEastAsia"/>
+        </w:rPr>
+        <w:t> Calculate </w:t>
+      </w:r>
+      <m:oMath>
+        <m:sSup>
+          <m:sSupPr>
+            <m:ctrlPr>
+              <w:rPr>
+                <w:rFonts w:ascii="Cambria Math" w:eastAsiaTheme="minorEastAsia" w:hAnsi="Cambria Math"/>
+              </w:rPr>
+            </m:ctrlPr>
+          </m:sSupPr>
+          <m:e>
+            <m:d>
+              <m:dPr>
+                <m:ctrlPr>
+                  <w:rPr>
+                    <w:rFonts w:ascii="Cambria Math" w:eastAsiaTheme="minorEastAsia" w:hAnsi="Cambria Math"/>
+                  </w:rPr>
+                </m:ctrlPr>
+              </m:dPr>
+              <m:e>
+                <m:r>
+                  <w:rPr>
+                    <w:rFonts w:ascii="Cambria Math" w:eastAsiaTheme="minorEastAsia" w:hAnsi="Cambria Math"/>
+                  </w:rPr>
+                  <m:t>1+R</m:t>
+                </m:r>
+              </m:e>
+            </m:d>
+          </m:e>
+          <m:sup>
+            <m:r>
+              <w:rPr>
+                <w:rFonts w:ascii="Cambria Math" w:eastAsiaTheme="minorEastAsia" w:hAnsi="Cambria Math"/>
+              </w:rPr>
+              <m:t>n</m:t>
+            </m:r>
+          </m:sup>
+        </m:sSup>
+      </m:oMath>
+    </w:p>
+    <w:p>
+      <w:pPr>
+        <w:pStyle w:val="ListParagraph"/>
+        <w:rPr>
+          <w:rFonts w:eastAsiaTheme="minorEastAsia"/>
+        </w:rPr>
+      </w:pPr>
+      <m:oMathPara>
+        <m:oMath>
+          <m:sSup>
+            <m:sSupPr>
+              <m:ctrlPr>
+                <w:rPr>
+                  <w:rFonts w:ascii="Cambria Math" w:eastAsiaTheme="minorEastAsia" w:hAnsi="Cambria Math"/>
+                </w:rPr>
+              </m:ctrlPr>
+            </m:sSupPr>
+            <m:e>
+              <m:d>
+                <m:dPr>
+                  <m:ctrlPr>
+                    <w:rPr>
+                      <w:rFonts w:ascii="Cambria Math" w:eastAsiaTheme="minorEastAsia" w:hAnsi="Cambria Math"/>
+                    </w:rPr>
+                  </m:ctrlPr>
+                </m:dPr>
+                <m:e>
+                  <m:r>
+                    <w:rPr>
+                      <w:rFonts w:ascii="Cambria Math" w:eastAsiaTheme="minorEastAsia" w:hAnsi="Cambria Math"/>
+                    </w:rPr>
+                    <m:t>1.14</m:t>
+                  </m:r>
+                </m:e>
+              </m:d>
+            </m:e>
+            <m:sup>
+              <m:r>
+                <w:rPr>
+                  <w:rFonts w:ascii="Cambria Math" w:eastAsiaTheme="minorEastAsia" w:hAnsi="Cambria Math"/>
+                </w:rPr>
+                <m:t>12</m:t>
+              </m:r>
+            </m:sup>
+          </m:sSup>
+          <m:r>
+            <w:rPr>
+              <w:rFonts w:ascii="Cambria Math" w:eastAsiaTheme="minorEastAsia" w:hAnsi="Cambria Math"/>
+            </w:rPr>
+            <m:t>=4.81790581</m:t>
+          </m:r>
+          <m:r>
+            <w:rPr>
+              <w:rFonts w:eastAsiaTheme="minorEastAsia"/>
+              <w:i/>
+            </w:rPr>
+            <w:br/>
+          </m:r>
+        </m:oMath>
+      </m:oMathPara>
+    </w:p>
+    <w:p>
+      <w:pPr>
+        <w:pStyle w:val="ListParagraph"/>
+        <w:rPr>
+          <w:rFonts w:eastAsiaTheme="minorEastAsia"/>
+        </w:rPr>
+      </w:pPr>
+      <w:r>
+        <w:rPr>
+          <w:rFonts w:eastAsiaTheme="minorEastAsia"/>
+          <w:b/>
+          <w:bCs/>
+        </w:rPr>
+        <w:t>Step 2:</w:t>
+      </w:r>
+      <w:r>
+        <w:rPr>
+          <w:rFonts w:eastAsiaTheme="minorEastAsia"/>
+        </w:rPr>
+        <w:t> Apply your formula step by step</w:t>
+      </w:r>
+    </w:p>
+    <w:p>
+      <w:pPr>
+        <w:pStyle w:val="ListParagraph"/>
+        <w:rPr>
+          <w:rFonts w:eastAsiaTheme="minorEastAsia"/>
+        </w:rPr>
+      </w:pPr>
+      <m:oMathPara>
+        <m:oMath>
+          <m:f>
+            <m:fPr>
+              <m:ctrlPr>
+                <w:rPr>
+                  <w:rFonts w:ascii="Cambria Math" w:eastAsiaTheme="minorEastAsia" w:hAnsi="Cambria Math"/>
+                </w:rPr>
+              </m:ctrlPr>
+            </m:fPr>
+            <m:num>
+              <m:sSup>
+                <m:sSupPr>
+                  <m:ctrlPr>
+                    <w:rPr>
+                      <w:rFonts w:ascii="Cambria Math" w:eastAsiaTheme="minorEastAsia" w:hAnsi="Cambria Math"/>
+                    </w:rPr>
+                  </m:ctrlPr>
+                </m:sSupPr>
+                <m:e>
+                  <m:d>
+                    <m:dPr>
+                      <m:ctrlPr>
+                        <w:rPr>
+                          <w:rFonts w:ascii="Cambria Math" w:eastAsiaTheme="minorEastAsia" w:hAnsi="Cambria Math"/>
+                        </w:rPr>
+                      </m:ctrlPr>
+                    </m:dPr>
+                    <m:e>
+                      <m:r>
+                        <w:rPr>
+                          <w:rFonts w:ascii="Cambria Math" w:eastAsiaTheme="minorEastAsia" w:hAnsi="Cambria Math"/>
+                        </w:rPr>
+                        <m:t>1.14</m:t>
+                      </m:r>
+                    </m:e>
+                  </m:d>
+                </m:e>
+                <m:sup>
+                  <m:r>
+                    <w:rPr>
+                      <w:rFonts w:ascii="Cambria Math" w:eastAsiaTheme="minorEastAsia" w:hAnsi="Cambria Math"/>
+                    </w:rPr>
+                    <m:t>12</m:t>
+                  </m:r>
+                </m:sup>
+              </m:sSup>
+              <m:r>
+                <w:rPr>
+                  <w:rFonts w:ascii="Cambria Math" w:eastAsiaTheme="minorEastAsia" w:hAnsi="Cambria Math"/>
+                </w:rPr>
+                <m:t>-1</m:t>
+              </m:r>
+            </m:num>
+            <m:den>
+              <m:r>
+                <w:rPr>
+                  <w:rFonts w:ascii="Cambria Math" w:eastAsiaTheme="minorEastAsia" w:hAnsi="Cambria Math"/>
+                </w:rPr>
+                <m:t>0.14</m:t>
+              </m:r>
+            </m:den>
+          </m:f>
+          <m:r>
+            <w:rPr>
+              <w:rFonts w:ascii="Cambria Math" w:eastAsiaTheme="minorEastAsia" w:hAnsi="Cambria Math"/>
+            </w:rPr>
+            <m:t>=</m:t>
+          </m:r>
+          <m:f>
+            <m:fPr>
+              <m:ctrlPr>
+                <w:rPr>
+                  <w:rFonts w:ascii="Cambria Math" w:eastAsiaTheme="minorEastAsia" w:hAnsi="Cambria Math"/>
+                </w:rPr>
+              </m:ctrlPr>
+            </m:fPr>
+            <m:num>
+              <m:r>
+                <w:rPr>
+                  <w:rFonts w:ascii="Cambria Math" w:eastAsiaTheme="minorEastAsia" w:hAnsi="Cambria Math"/>
+                </w:rPr>
+                <m:t>4.81790581-1</m:t>
+              </m:r>
+            </m:num>
+            <m:den>
+              <m:r>
+                <w:rPr>
+                  <w:rFonts w:ascii="Cambria Math" w:eastAsiaTheme="minorEastAsia" w:hAnsi="Cambria Math"/>
+                </w:rPr>
+                <m:t>0.14</m:t>
+              </m:r>
+            </m:den>
+          </m:f>
+          <m:r>
+            <w:rPr>
+              <w:rFonts w:eastAsiaTheme="minorEastAsia"/>
+            </w:rPr>
+            <w:br/>
+          </m:r>
+        </m:oMath>
+        <m:oMath>
+          <m:r>
+            <w:rPr>
+              <w:rFonts w:ascii="Cambria Math" w:eastAsiaTheme="minorEastAsia" w:hAnsi="Cambria Math"/>
+            </w:rPr>
+            <m:t>=</m:t>
+          </m:r>
+          <m:f>
+            <m:fPr>
+              <m:ctrlPr>
+                <w:rPr>
+                  <w:rFonts w:ascii="Cambria Math" w:eastAsiaTheme="minorEastAsia" w:hAnsi="Cambria Math"/>
+                </w:rPr>
+              </m:ctrlPr>
+            </m:fPr>
+            <m:num>
+              <m:r>
+                <w:rPr>
+                  <w:rFonts w:ascii="Cambria Math" w:eastAsiaTheme="minorEastAsia" w:hAnsi="Cambria Math"/>
+                </w:rPr>
+                <m:t>3.81790581</m:t>
+              </m:r>
+            </m:num>
+            <m:den>
+              <m:r>
+                <w:rPr>
+                  <w:rFonts w:ascii="Cambria Math" w:eastAsiaTheme="minorEastAsia" w:hAnsi="Cambria Math"/>
+                </w:rPr>
+                <m:t>0.14</m:t>
+              </m:r>
+            </m:den>
+          </m:f>
+          <m:r>
+            <w:rPr>
+              <w:rFonts w:ascii="Cambria Math" w:eastAsiaTheme="minorEastAsia" w:hAnsi="Cambria Math"/>
+            </w:rPr>
+            <m:t>=27.2707558</m:t>
+          </m:r>
+          <m:r>
+            <w:rPr>
+              <w:rFonts w:eastAsiaTheme="minorEastAsia"/>
+              <w:i/>
+            </w:rPr>
+            <w:br/>
+          </m:r>
+        </m:oMath>
+      </m:oMathPara>
+    </w:p>
+    <w:p>
+      <w:pPr>
+        <w:pStyle w:val="ListParagraph"/>
+        <w:rPr>
+          <w:rFonts w:eastAsiaTheme="minorEastAsia"/>
+        </w:rPr>
+      </w:pPr>
+      <w:r>
+        <w:rPr>
+          <w:rFonts w:eastAsiaTheme="minorEastAsia"/>
+        </w:rPr>
+        <w:t>Now multiply by </w:t>
+      </w:r>
+      <m:oMath>
+        <m:d>
+          <m:dPr>
+            <m:ctrlPr>
+              <w:rPr>
+                <w:rFonts w:ascii="Cambria Math" w:eastAsiaTheme="minorEastAsia" w:hAnsi="Cambria Math"/>
+              </w:rPr>
+            </m:ctrlPr>
+          </m:dPr>
+          <m:e>
+            <m:r>
+              <w:rPr>
+                <w:rFonts w:ascii="Cambria Math" w:eastAsiaTheme="minorEastAsia" w:hAnsi="Cambria Math"/>
+              </w:rPr>
+              <m:t>1+R</m:t>
+            </m:r>
+          </m:e>
+        </m:d>
+      </m:oMath>
+      <w:r>
+        <w:rPr>
+          <w:rFonts w:eastAsiaTheme="minorEastAsia"/>
+        </w:rPr>
+        <w:t> i.e. </w:t>
+      </w:r>
+      <m:oMath>
+        <m:r>
+          <w:rPr>
+            <w:rFonts w:ascii="Cambria Math" w:eastAsiaTheme="minorEastAsia" w:hAnsi="Cambria Math"/>
+          </w:rPr>
+          <m:t>1.14</m:t>
+        </m:r>
+      </m:oMath>
+      <w:r>
+        <w:rPr>
+          <w:rFonts w:eastAsiaTheme="minorEastAsia"/>
+        </w:rPr>
+        <w:t>:</w:t>
+      </w:r>
+    </w:p>
+    <w:p>
+      <w:pPr>
+        <w:pStyle w:val="ListParagraph"/>
+        <w:rPr>
+          <w:rFonts w:eastAsiaTheme="minorEastAsia"/>
+        </w:rPr>
+      </w:pPr>
+      <m:oMathPara>
+        <m:oMath>
+          <m:r>
+            <w:rPr>
+              <w:rFonts w:ascii="Cambria Math" w:eastAsiaTheme="minorEastAsia" w:hAnsi="Cambria Math"/>
+            </w:rPr>
+            <m:t>27.2707558×1.14=31.0886616</m:t>
+          </m:r>
+          <m:r>
+            <w:rPr>
+              <w:rFonts w:eastAsiaTheme="minorEastAsia"/>
+              <w:i/>
+            </w:rPr>
+            <w:br/>
+          </m:r>
+        </m:oMath>
+      </m:oMathPara>
+    </w:p>
+    <w:p>
+      <w:pPr>
+        <w:pStyle w:val="ListParagraph"/>
+        <w:rPr>
+          <w:rFonts w:eastAsiaTheme="minorEastAsia"/>
+        </w:rPr>
+      </w:pPr>
+      <w:proofErr w:type="gramStart"/>
+      <w:r>
+        <w:rPr>
+          <w:rFonts w:eastAsiaTheme="minorEastAsia"/>
+        </w:rPr>
+        <w:t>So</w:t>
+      </w:r>
+      <w:proofErr w:type="gramEnd"/>
+      <w:r>
+        <w:rPr>
+          <w:rFonts w:eastAsiaTheme="minorEastAsia"/>
+        </w:rPr>
+        <w:t xml:space="preserve"> the accumulation factor is </w:t>
+      </w:r>
+      <w:r>
+        <w:rPr>
+          <w:rFonts w:eastAsiaTheme="minorEastAsia"/>
+          <w:b/>
+          <w:bCs/>
+        </w:rPr>
+        <w:t>31.0886616</w:t>
+      </w:r>
+      <w:r>
+        <w:rPr>
+          <w:rFonts w:eastAsiaTheme="minorEastAsia"/>
+        </w:rPr>
+        <w:t>.</w:t>
+      </w:r>
+    </w:p>
+    <w:p>
+      <w:pPr>
+        <w:pStyle w:val="ListParagraph"/>
+        <w:rPr>
+          <w:rFonts w:eastAsiaTheme="minorEastAsia"/>
+        </w:rPr>
+      </w:pPr>
+      <w:r>
+        <w:rPr>
+          <w:rFonts w:eastAsiaTheme="minorEastAsia"/>
+          <w:b/>
+          <w:bCs/>
+        </w:rPr>
+        <w:t>Step 3:</w:t>
+      </w:r>
+      <w:r>
+        <w:rPr>
+          <w:rFonts w:eastAsiaTheme="minorEastAsia"/>
+        </w:rPr>
+        <w:t> Solve for Instalment</w:t>
+      </w:r>
+    </w:p>
+    <w:p>
+      <w:pPr>
+        <w:pStyle w:val="ListParagraph"/>
+        <w:rPr>
+          <w:rFonts w:eastAsiaTheme="minorEastAsia"/>
+        </w:rPr>
+      </w:pPr>
+      <m:oMathPara>
+        <m:oMath>
+          <m:r>
+            <w:rPr>
+              <w:rFonts w:ascii="Cambria Math" w:eastAsiaTheme="minorEastAsia" w:hAnsi="Cambria Math"/>
+            </w:rPr>
+            <m:t>40,00,000=</m:t>
+          </m:r>
+          <m:r>
+            <m:rPr>
+              <m:nor/>
+            </m:rPr>
+            <w:rPr>
+              <w:rFonts w:eastAsiaTheme="minorEastAsia"/>
+            </w:rPr>
+            <m:t>Instalment</m:t>
+          </m:r>
+          <m:r>
+            <w:rPr>
+              <w:rFonts w:ascii="Cambria Math" w:eastAsiaTheme="minorEastAsia" w:hAnsi="Cambria Math"/>
+            </w:rPr>
+            <m:t>×31.0886616</m:t>
+          </m:r>
+          <m:r>
+            <w:rPr>
+              <w:rFonts w:eastAsiaTheme="minorEastAsia"/>
+              <w:i/>
+            </w:rPr>
+            <w:br/>
+          </m:r>
+        </m:oMath>
+        <m:oMath>
+          <m:r>
+            <m:rPr>
+              <m:nor/>
+            </m:rPr>
+            <w:rPr>
+              <w:rFonts w:eastAsiaTheme="minorEastAsia"/>
+            </w:rPr>
+            <m:t>Instalment</m:t>
+          </m:r>
+          <m:r>
+            <w:rPr>
+              <w:rFonts w:ascii="Cambria Math" w:eastAsiaTheme="minorEastAsia" w:hAnsi="Cambria Math"/>
+            </w:rPr>
+            <m:t>=</m:t>
+          </m:r>
+          <m:f>
+            <m:fPr>
+              <m:ctrlPr>
+                <w:rPr>
+                  <w:rFonts w:ascii="Cambria Math" w:eastAsiaTheme="minorEastAsia" w:hAnsi="Cambria Math"/>
+                </w:rPr>
+              </m:ctrlPr>
+            </m:fPr>
+            <m:num>
+              <m:r>
+                <w:rPr>
+                  <w:rFonts w:ascii="Cambria Math" w:eastAsiaTheme="minorEastAsia" w:hAnsi="Cambria Math"/>
+                </w:rPr>
+                <m:t>40,00,000</m:t>
+              </m:r>
+            </m:num>
+            <m:den>
+              <m:r>
+                <w:rPr>
+                  <w:rFonts w:ascii="Cambria Math" w:eastAsiaTheme="minorEastAsia" w:hAnsi="Cambria Math"/>
+                </w:rPr>
+                <m:t>31.0886616</m:t>
+              </m:r>
+            </m:den>
+          </m:f>
+          <m:r>
+            <w:rPr>
+              <w:rFonts w:eastAsiaTheme="minorEastAsia"/>
+            </w:rPr>
+            <w:br/>
+          </m:r>
+        </m:oMath>
+        <m:oMath>
+          <m:r>
+            <m:rPr>
+              <m:nor/>
+            </m:rPr>
+            <w:rPr>
+              <w:rFonts w:eastAsiaTheme="minorEastAsia"/>
+            </w:rPr>
+            <m:t>Instalment</m:t>
+          </m:r>
+          <m:r>
+            <w:rPr>
+              <w:rFonts w:ascii="Cambria Math" w:eastAsiaTheme="minorEastAsia" w:hAnsi="Cambria Math"/>
+            </w:rPr>
+            <m:t>=</m:t>
+          </m:r>
+          <m:r>
+            <m:rPr>
+              <m:nor/>
+            </m:rPr>
+            <w:rPr>
+              <w:rFonts w:eastAsiaTheme="minorEastAsia"/>
+            </w:rPr>
+            <m:t>₹</m:t>
+          </m:r>
+          <m:r>
+            <w:rPr>
+              <w:rFonts w:ascii="Cambria Math" w:eastAsiaTheme="minorEastAsia" w:hAnsi="Cambria Math"/>
+            </w:rPr>
+            <m:t>1,28,664.31</m:t>
+          </m:r>
+          <m:r>
+            <w:rPr>
+              <w:rFonts w:eastAsiaTheme="minorEastAsia"/>
+              <w:i/>
+            </w:rPr>
+            <w:br/>
+          </m:r>
+        </m:oMath>
+      </m:oMathPara>
+    </w:p>
     <w:sectPr>
       <w:pgSz w:w="11906" w:h="16838"/>
       <w:pgMar w:top="1440" w:right="1440" w:bottom="1440" w:left="1440" w:header="708" w:footer="708" w:gutter="0"/>
@@ -15146,7 +16040,7 @@
   <w:abstractNum w:abstractNumId="25" w15:restartNumberingAfterBreak="0">
     <w:nsid w:val="5B5059D4"/>
     <w:multiLevelType w:val="hybridMultilevel"/>
-    <w:tmpl w:val="4D400CB4"/>
+    <w:tmpl w:val="6C4AB224"/>
     <w:lvl w:ilvl="0" w:tplc="4009000F">
       <w:start w:val="1"/>
       <w:numFmt w:val="decimal"/>

</xml_diff>

<commit_message>
feat(financial-math): add 03/09 Growth and Decay Curves with research-style greyscale TikZ plots and trading price impact notes
</commit_message>
<xml_diff>
--- a/Financial Mathematics/notes.docx
+++ b/Financial Mathematics/notes.docx
@@ -2216,20 +2216,7 @@
           <w:rFonts w:eastAsiaTheme="minorEastAsia"/>
         </w:rPr>
         <w:tab/>
-      </w:r>
-      <w:proofErr w:type="gramStart"/>
-      <w:r>
-        <w:rPr>
-          <w:rFonts w:eastAsiaTheme="minorEastAsia"/>
-        </w:rPr>
-        <w:t>Where</w:t>
-      </w:r>
-      <w:proofErr w:type="gramEnd"/>
-      <w:r>
-        <w:rPr>
-          <w:rFonts w:eastAsiaTheme="minorEastAsia"/>
-        </w:rPr>
-        <w:t xml:space="preserve">, </w:t>
+        <w:t xml:space="preserve">Where, </w:t>
       </w:r>
     </w:p>
     <w:p>
@@ -2889,19 +2876,11 @@
           <w:rFonts w:eastAsiaTheme="minorEastAsia"/>
         </w:rPr>
       </w:pPr>
-      <w:proofErr w:type="gramStart"/>
-      <w:r>
-        <w:rPr>
-          <w:rFonts w:eastAsiaTheme="minorEastAsia"/>
-        </w:rPr>
-        <w:t>Where</w:t>
-      </w:r>
-      <w:proofErr w:type="gramEnd"/>
-      <w:r>
-        <w:rPr>
-          <w:rFonts w:eastAsiaTheme="minorEastAsia"/>
-        </w:rPr>
-        <w:t xml:space="preserve">, </w:t>
+      <w:r>
+        <w:rPr>
+          <w:rFonts w:eastAsiaTheme="minorEastAsia"/>
+        </w:rPr>
+        <w:t xml:space="preserve">Where, </w:t>
       </w:r>
     </w:p>
     <w:p>
@@ -3646,19 +3625,11 @@
           <w:rFonts w:eastAsiaTheme="minorEastAsia"/>
         </w:rPr>
       </w:pPr>
-      <w:proofErr w:type="gramStart"/>
-      <w:r>
-        <w:rPr>
-          <w:rFonts w:eastAsiaTheme="minorEastAsia"/>
-        </w:rPr>
-        <w:t>Where</w:t>
-      </w:r>
-      <w:proofErr w:type="gramEnd"/>
-      <w:r>
-        <w:rPr>
-          <w:rFonts w:eastAsiaTheme="minorEastAsia"/>
-        </w:rPr>
-        <w:t>,</w:t>
+      <w:r>
+        <w:rPr>
+          <w:rFonts w:eastAsiaTheme="minorEastAsia"/>
+        </w:rPr>
+        <w:t>Where,</w:t>
       </w:r>
     </w:p>
     <w:p>
@@ -3845,19 +3816,11 @@
           <w:rFonts w:eastAsiaTheme="minorEastAsia"/>
         </w:rPr>
       </w:pPr>
-      <w:proofErr w:type="gramStart"/>
-      <w:r>
-        <w:rPr>
-          <w:rFonts w:eastAsiaTheme="minorEastAsia"/>
-        </w:rPr>
-        <w:t>Where</w:t>
-      </w:r>
-      <w:proofErr w:type="gramEnd"/>
-      <w:r>
-        <w:rPr>
-          <w:rFonts w:eastAsiaTheme="minorEastAsia"/>
-        </w:rPr>
-        <w:t xml:space="preserve">, </w:t>
+      <w:r>
+        <w:rPr>
+          <w:rFonts w:eastAsiaTheme="minorEastAsia"/>
+        </w:rPr>
+        <w:t xml:space="preserve">Where, </w:t>
       </w:r>
     </w:p>
     <w:p>
@@ -4155,19 +4118,11 @@
           <w:rFonts w:eastAsiaTheme="minorEastAsia"/>
         </w:rPr>
       </w:pPr>
-      <w:proofErr w:type="gramStart"/>
-      <w:r>
-        <w:rPr>
-          <w:rFonts w:eastAsiaTheme="minorEastAsia"/>
-        </w:rPr>
-        <w:t>Where</w:t>
-      </w:r>
-      <w:proofErr w:type="gramEnd"/>
-      <w:r>
-        <w:rPr>
-          <w:rFonts w:eastAsiaTheme="minorEastAsia"/>
-        </w:rPr>
-        <w:t xml:space="preserve">, </w:t>
+      <w:r>
+        <w:rPr>
+          <w:rFonts w:eastAsiaTheme="minorEastAsia"/>
+        </w:rPr>
+        <w:t xml:space="preserve">Where, </w:t>
       </w:r>
     </w:p>
     <w:p>
@@ -8839,21 +8794,7 @@
         <w:rPr>
           <w:rFonts w:eastAsiaTheme="minorEastAsia"/>
         </w:rPr>
-        <w:t xml:space="preserve">Present value of Rs 10,000 receivable after 4 years and the rate of interest at 12%. The PV factor in the PV table (12% column and </w:t>
-      </w:r>
-      <w:proofErr w:type="gramStart"/>
-      <w:r>
-        <w:rPr>
-          <w:rFonts w:eastAsiaTheme="minorEastAsia"/>
-        </w:rPr>
-        <w:t>4 year</w:t>
-      </w:r>
-      <w:proofErr w:type="gramEnd"/>
-      <w:r>
-        <w:rPr>
-          <w:rFonts w:eastAsiaTheme="minorEastAsia"/>
-        </w:rPr>
-        <w:t xml:space="preserve"> row) is 0.635.</w:t>
+        <w:t>Present value of Rs 10,000 receivable after 4 years and the rate of interest at 12%. The PV factor in the PV table (12% column and 4 year row) is 0.635.</w:t>
       </w:r>
     </w:p>
     <w:p>
@@ -10307,21 +10248,7 @@
         <w:rPr>
           <w:lang w:val="en-US"/>
         </w:rPr>
-        <w:t xml:space="preserve">Raja has entered into an agreement that will fetch him Rs. 60000 per annum for next 4 years. He </w:t>
-      </w:r>
-      <w:proofErr w:type="gramStart"/>
-      <w:r>
-        <w:rPr>
-          <w:lang w:val="en-US"/>
-        </w:rPr>
-        <w:t>want</w:t>
-      </w:r>
-      <w:proofErr w:type="gramEnd"/>
-      <w:r>
-        <w:rPr>
-          <w:lang w:val="en-US"/>
-        </w:rPr>
-        <w:t xml:space="preserve"> to know the present value for the future cash inflows at 20% discount rate</w:t>
+        <w:t>Raja has entered into an agreement that will fetch him Rs. 60000 per annum for next 4 years. He want to know the present value for the future cash inflows at 20% discount rate</w:t>
       </w:r>
     </w:p>
     <w:p>
@@ -12229,19 +12156,11 @@
           <w:rFonts w:eastAsiaTheme="minorEastAsia"/>
         </w:rPr>
       </w:pPr>
-      <w:proofErr w:type="gramStart"/>
-      <w:r>
-        <w:rPr>
-          <w:rFonts w:eastAsiaTheme="minorEastAsia"/>
-        </w:rPr>
-        <w:t>Where</w:t>
-      </w:r>
-      <w:proofErr w:type="gramEnd"/>
-      <w:r>
-        <w:rPr>
-          <w:rFonts w:eastAsiaTheme="minorEastAsia"/>
-        </w:rPr>
-        <w:t xml:space="preserve">, </w:t>
+      <w:r>
+        <w:rPr>
+          <w:rFonts w:eastAsiaTheme="minorEastAsia"/>
+        </w:rPr>
+        <w:t xml:space="preserve">Where, </w:t>
       </w:r>
     </w:p>
     <w:p>
@@ -13163,7 +13082,6 @@
           <m:r>
             <w:rPr>
               <w:rFonts w:eastAsiaTheme="minorEastAsia"/>
-              <w:i/>
             </w:rPr>
             <w:br/>
           </m:r>
@@ -13294,6 +13212,9 @@
             </m:den>
           </m:f>
           <m:r>
+            <m:rPr>
+              <m:sty m:val="p"/>
+            </m:rPr>
             <w:rPr>
               <w:rFonts w:eastAsiaTheme="minorEastAsia"/>
             </w:rPr>
@@ -13341,7 +13262,6 @@
           <m:r>
             <w:rPr>
               <w:rFonts w:eastAsiaTheme="minorEastAsia"/>
-              <w:i/>
             </w:rPr>
             <w:br/>
           </m:r>
@@ -13419,7 +13339,6 @@
           <m:r>
             <w:rPr>
               <w:rFonts w:eastAsiaTheme="minorEastAsia"/>
-              <w:i/>
             </w:rPr>
             <w:br/>
           </m:r>
@@ -13433,19 +13352,11 @@
           <w:rFonts w:eastAsiaTheme="minorEastAsia"/>
         </w:rPr>
       </w:pPr>
-      <w:proofErr w:type="gramStart"/>
-      <w:r>
-        <w:rPr>
-          <w:rFonts w:eastAsiaTheme="minorEastAsia"/>
-        </w:rPr>
-        <w:t>So</w:t>
-      </w:r>
-      <w:proofErr w:type="gramEnd"/>
-      <w:r>
-        <w:rPr>
-          <w:rFonts w:eastAsiaTheme="minorEastAsia"/>
-        </w:rPr>
-        <w:t xml:space="preserve"> the accumulation factor is </w:t>
+      <w:r>
+        <w:rPr>
+          <w:rFonts w:eastAsiaTheme="minorEastAsia"/>
+        </w:rPr>
+        <w:t>So the accumulation factor is </w:t>
       </w:r>
       <w:r>
         <w:rPr>
@@ -13517,7 +13428,6 @@
           <m:r>
             <w:rPr>
               <w:rFonts w:eastAsiaTheme="minorEastAsia"/>
-              <w:i/>
             </w:rPr>
             <w:br/>
           </m:r>
@@ -13564,6 +13474,9 @@
             </m:den>
           </m:f>
           <m:r>
+            <m:rPr>
+              <m:sty m:val="p"/>
+            </m:rPr>
             <w:rPr>
               <w:rFonts w:eastAsiaTheme="minorEastAsia"/>
             </w:rPr>
@@ -13604,12 +13517,213 @@
           <m:r>
             <w:rPr>
               <w:rFonts w:eastAsiaTheme="minorEastAsia"/>
-              <w:i/>
             </w:rPr>
             <w:br/>
           </m:r>
         </m:oMath>
       </m:oMathPara>
+    </w:p>
+    <w:p>
+      <w:pPr>
+        <w:rPr>
+          <w:rFonts w:eastAsiaTheme="minorEastAsia"/>
+        </w:rPr>
+      </w:pPr>
+    </w:p>
+    <w:p>
+      <w:pPr>
+        <w:rPr>
+          <w:rFonts w:eastAsiaTheme="minorEastAsia"/>
+        </w:rPr>
+      </w:pPr>
+      <w:r>
+        <w:rPr>
+          <w:rFonts w:eastAsiaTheme="minorEastAsia"/>
+        </w:rPr>
+        <w:t>03/09/2026</w:t>
+      </w:r>
+    </w:p>
+    <w:p>
+      <w:pPr>
+        <w:rPr>
+          <w:rFonts w:eastAsiaTheme="minorEastAsia"/>
+        </w:rPr>
+      </w:pPr>
+    </w:p>
+    <w:p>
+      <w:pPr>
+        <w:rPr>
+          <w:rFonts w:eastAsiaTheme="minorEastAsia"/>
+        </w:rPr>
+      </w:pPr>
+      <w:r>
+        <w:rPr>
+          <w:rFonts w:eastAsiaTheme="minorEastAsia"/>
+        </w:rPr>
+        <w:t>Growth and decay curve</w:t>
+      </w:r>
+    </w:p>
+    <w:p>
+      <w:pPr>
+        <w:rPr>
+          <w:rFonts w:eastAsiaTheme="minorEastAsia"/>
+        </w:rPr>
+      </w:pPr>
+      <w:r>
+        <w:drawing>
+          <wp:inline distT="0" distB="0" distL="0" distR="0" wp14:anchorId="5F6E554E" wp14:editId="3944E233">
+            <wp:extent cx="5731510" cy="2360930"/>
+            <wp:effectExtent l="0" t="0" r="2540" b="1270"/>
+            <wp:docPr id="1354357192" name="Picture 1"/>
+            <wp:cNvGraphicFramePr>
+              <a:graphicFrameLocks xmlns:a="http://schemas.openxmlformats.org/drawingml/2006/main" noChangeAspect="1"/>
+            </wp:cNvGraphicFramePr>
+            <a:graphic xmlns:a="http://schemas.openxmlformats.org/drawingml/2006/main">
+              <a:graphicData uri="http://schemas.openxmlformats.org/drawingml/2006/picture">
+                <pic:pic xmlns:pic="http://schemas.openxmlformats.org/drawingml/2006/picture">
+                  <pic:nvPicPr>
+                    <pic:cNvPr id="1354357192" name=""/>
+                    <pic:cNvPicPr/>
+                  </pic:nvPicPr>
+                  <pic:blipFill>
+                    <a:blip r:embed="rId11"/>
+                    <a:stretch>
+                      <a:fillRect/>
+                    </a:stretch>
+                  </pic:blipFill>
+                  <pic:spPr>
+                    <a:xfrm>
+                      <a:off x="0" y="0"/>
+                      <a:ext cx="5731510" cy="2360930"/>
+                    </a:xfrm>
+                    <a:prstGeom prst="rect">
+                      <a:avLst/>
+                    </a:prstGeom>
+                  </pic:spPr>
+                </pic:pic>
+              </a:graphicData>
+            </a:graphic>
+          </wp:inline>
+        </w:drawing>
+      </w:r>
+    </w:p>
+    <w:p>
+      <w:pPr>
+        <w:rPr>
+          <w:rFonts w:eastAsiaTheme="minorEastAsia"/>
+        </w:rPr>
+      </w:pPr>
+    </w:p>
+    <w:p>
+      <w:pPr>
+        <w:rPr>
+          <w:rFonts w:eastAsiaTheme="minorEastAsia"/>
+        </w:rPr>
+      </w:pPr>
+      <w:r>
+        <w:rPr>
+          <w:rFonts w:eastAsiaTheme="minorEastAsia"/>
+        </w:rPr>
+        <w:t>Decay: how a trade’s impact on price evolves overtime, time on the x-axis, price change on y-axis</w:t>
+      </w:r>
+    </w:p>
+    <w:p>
+      <w:pPr>
+        <w:rPr>
+          <w:rFonts w:eastAsiaTheme="minorEastAsia"/>
+        </w:rPr>
+      </w:pPr>
+    </w:p>
+    <w:p>
+      <w:pPr>
+        <w:rPr>
+          <w:rFonts w:eastAsiaTheme="minorEastAsia"/>
+        </w:rPr>
+      </w:pPr>
+      <w:r>
+        <w:rPr>
+          <w:rFonts w:eastAsiaTheme="minorEastAsia"/>
+        </w:rPr>
+        <w:t>Who uses decay curve? (large banks)</w:t>
+      </w:r>
+    </w:p>
+    <w:p>
+      <w:pPr>
+        <w:rPr>
+          <w:rFonts w:eastAsiaTheme="minorEastAsia"/>
+        </w:rPr>
+      </w:pPr>
+      <w:r>
+        <w:rPr>
+          <w:rFonts w:eastAsiaTheme="minorEastAsia"/>
+        </w:rPr>
+        <w:t>1. monitor trade impacts</w:t>
+      </w:r>
+    </w:p>
+    <w:p>
+      <w:pPr>
+        <w:rPr>
+          <w:rFonts w:eastAsiaTheme="minorEastAsia"/>
+        </w:rPr>
+      </w:pPr>
+      <w:r>
+        <w:rPr>
+          <w:rFonts w:eastAsiaTheme="minorEastAsia"/>
+        </w:rPr>
+        <w:t>2. detect toxic behaviour</w:t>
+      </w:r>
+    </w:p>
+    <w:p>
+      <w:pPr>
+        <w:rPr>
+          <w:rFonts w:eastAsiaTheme="minorEastAsia"/>
+        </w:rPr>
+      </w:pPr>
+    </w:p>
+    <w:p>
+      <w:pPr>
+        <w:rPr>
+          <w:rFonts w:eastAsiaTheme="minorEastAsia"/>
+        </w:rPr>
+      </w:pPr>
+      <w:r>
+        <w:rPr>
+          <w:rFonts w:eastAsiaTheme="minorEastAsia"/>
+        </w:rPr>
+        <w:t>Purpose</w:t>
+      </w:r>
+    </w:p>
+    <w:p>
+      <w:pPr>
+        <w:rPr>
+          <w:rFonts w:eastAsiaTheme="minorEastAsia"/>
+        </w:rPr>
+      </w:pPr>
+      <w:r>
+        <w:rPr>
+          <w:rFonts w:eastAsiaTheme="minorEastAsia"/>
+        </w:rPr>
+        <w:t>1. to understand the long-term impact of their trades</w:t>
+      </w:r>
+    </w:p>
+    <w:p>
+      <w:pPr>
+        <w:rPr>
+          <w:rFonts w:eastAsiaTheme="minorEastAsia"/>
+        </w:rPr>
+      </w:pPr>
+      <w:r>
+        <w:rPr>
+          <w:rFonts w:eastAsiaTheme="minorEastAsia"/>
+        </w:rPr>
+        <w:t xml:space="preserve">2. to ensure market stability </w:t>
+      </w:r>
+      <w:r>
+        <w:rPr>
+          <w:rFonts w:eastAsiaTheme="minorEastAsia"/>
+        </w:rPr>
+        <w:t xml:space="preserve"> </w:t>
+      </w:r>
     </w:p>
     <w:sectPr>
       <w:pgSz w:w="11906" w:h="16838"/>
@@ -17950,6 +18064,7 @@
   <w:style w:type="character" w:default="1" w:styleId="DefaultParagraphFont">
     <w:name w:val="Default Paragraph Font"/>
     <w:uiPriority w:val="1"/>
+    <w:semiHidden/>
     <w:unhideWhenUsed/>
   </w:style>
   <w:style w:type="table" w:default="1" w:styleId="TableNormal">

</xml_diff>

<commit_message>
Update notes for FM, GFM, and Time Series moving average
</commit_message>
<xml_diff>
--- a/Financial Mathematics/notes.docx
+++ b/Financial Mathematics/notes.docx
@@ -222,19 +222,11 @@
           <w:lang w:val="en-US"/>
         </w:rPr>
       </w:pPr>
-      <w:proofErr w:type="spellStart"/>
       <w:r>
         <w:rPr>
           <w:lang w:val="en-US"/>
         </w:rPr>
-        <w:t>ans</w:t>
-      </w:r>
-      <w:proofErr w:type="spellEnd"/>
-      <w:r>
-        <w:rPr>
-          <w:lang w:val="en-US"/>
-        </w:rPr>
-        <w:t>:</w:t>
+        <w:t>ans:</w:t>
       </w:r>
     </w:p>
     <w:p>
@@ -377,13 +369,8 @@
       <w:pPr>
         <w:pStyle w:val="ListParagraph"/>
       </w:pPr>
-      <w:proofErr w:type="spellStart"/>
-      <w:r>
-        <w:t>ans</w:t>
-      </w:r>
-      <w:proofErr w:type="spellEnd"/>
-      <w:r>
-        <w:t>:</w:t>
+      <w:r>
+        <w:t>ans:</w:t>
       </w:r>
     </w:p>
     <w:p>
@@ -539,13 +526,8 @@
       <w:pPr>
         <w:pStyle w:val="ListParagraph"/>
       </w:pPr>
-      <w:proofErr w:type="spellStart"/>
-      <w:r>
-        <w:t>ans</w:t>
-      </w:r>
-      <w:proofErr w:type="spellEnd"/>
-      <w:r>
-        <w:t>:</w:t>
+      <w:r>
+        <w:t>ans:</w:t>
       </w:r>
     </w:p>
     <w:p>
@@ -793,13 +775,8 @@
       <w:pPr>
         <w:pStyle w:val="ListParagraph"/>
       </w:pPr>
-      <w:proofErr w:type="spellStart"/>
-      <w:r>
-        <w:t>ans</w:t>
-      </w:r>
-      <w:proofErr w:type="spellEnd"/>
-      <w:r>
-        <w:t>:</w:t>
+      <w:r>
+        <w:t>ans:</w:t>
       </w:r>
     </w:p>
     <w:p>
@@ -6792,19 +6769,11 @@
           <w:rFonts w:eastAsiaTheme="minorEastAsia"/>
         </w:rPr>
       </w:pPr>
-      <w:proofErr w:type="spellStart"/>
-      <w:r>
-        <w:rPr>
-          <w:rFonts w:eastAsiaTheme="minorEastAsia"/>
-        </w:rPr>
-        <w:t>ans</w:t>
-      </w:r>
-      <w:proofErr w:type="spellEnd"/>
-      <w:r>
-        <w:rPr>
-          <w:rFonts w:eastAsiaTheme="minorEastAsia"/>
-        </w:rPr>
-        <w:t>:</w:t>
+      <w:r>
+        <w:rPr>
+          <w:rFonts w:eastAsiaTheme="minorEastAsia"/>
+        </w:rPr>
+        <w:t>ans:</w:t>
       </w:r>
     </w:p>
     <w:p>
@@ -8434,21 +8403,7 @@
         <w:rPr>
           <w:rFonts w:eastAsiaTheme="minorEastAsia"/>
         </w:rPr>
-        <w:t xml:space="preserve">Bhuvanesh pays a monthly </w:t>
-      </w:r>
-      <w:proofErr w:type="spellStart"/>
-      <w:r>
-        <w:rPr>
-          <w:rFonts w:eastAsiaTheme="minorEastAsia"/>
-        </w:rPr>
-        <w:t>installment</w:t>
-      </w:r>
-      <w:proofErr w:type="spellEnd"/>
-      <w:r>
-        <w:rPr>
-          <w:rFonts w:eastAsiaTheme="minorEastAsia"/>
-        </w:rPr>
-        <w:t xml:space="preserve"> of rs2000 towards a recurring deposit with a financier. The rate of interest is 6% per annum compounded monthly. What is the maturity value of this recurring deposit after 10 months </w:t>
+        <w:t xml:space="preserve">Bhuvanesh pays a monthly installment of rs2000 towards a recurring deposit with a financier. The rate of interest is 6% per annum compounded monthly. What is the maturity value of this recurring deposit after 10 months </w:t>
       </w:r>
     </w:p>
     <w:p>
@@ -11138,23 +11093,7 @@
           <w:rFonts w:eastAsiaTheme="minorEastAsia"/>
           <w:lang w:val="en-US"/>
         </w:rPr>
-        <w:t xml:space="preserve">Mr. </w:t>
-      </w:r>
-      <w:proofErr w:type="spellStart"/>
-      <w:r>
-        <w:rPr>
-          <w:rFonts w:eastAsiaTheme="minorEastAsia"/>
-          <w:lang w:val="en-US"/>
-        </w:rPr>
-        <w:t>Thanay</w:t>
-      </w:r>
-      <w:proofErr w:type="spellEnd"/>
-      <w:r>
-        <w:rPr>
-          <w:rFonts w:eastAsiaTheme="minorEastAsia"/>
-          <w:lang w:val="en-US"/>
-        </w:rPr>
-        <w:t xml:space="preserve"> expects to receive Rs. 20,000 at the beginning of each year for 4 years. Calculate the present value of the annuity due assuming an interest of 9%</w:t>
+        <w:t>Mr. Thanay expects to receive Rs. 20,000 at the beginning of each year for 4 years. Calculate the present value of the annuity due assuming an interest of 9%</w:t>
       </w:r>
     </w:p>
     <w:p>
@@ -12086,21 +12025,7 @@
         <w:rPr>
           <w:rFonts w:eastAsiaTheme="minorEastAsia"/>
         </w:rPr>
-        <w:t xml:space="preserve">series of periodic cashflows which grow at a constant rate per </w:t>
-      </w:r>
-      <w:proofErr w:type="spellStart"/>
-      <w:r>
-        <w:rPr>
-          <w:rFonts w:eastAsiaTheme="minorEastAsia"/>
-        </w:rPr>
-        <w:t>peiod</w:t>
-      </w:r>
-      <w:proofErr w:type="spellEnd"/>
-      <w:r>
-        <w:rPr>
-          <w:rFonts w:eastAsiaTheme="minorEastAsia"/>
-        </w:rPr>
-        <w:t xml:space="preserve"> </w:t>
+        <w:t xml:space="preserve">series of periodic cashflows which grow at a constant rate per peiod </w:t>
       </w:r>
     </w:p>
     <w:p>
@@ -12176,21 +12101,7 @@
           <w:rFonts w:eastAsiaTheme="minorEastAsia"/>
         </w:rPr>
         <w:tab/>
-        <w:t>C = cashflow (</w:t>
-      </w:r>
-      <w:proofErr w:type="spellStart"/>
-      <w:r>
-        <w:rPr>
-          <w:rFonts w:eastAsiaTheme="minorEastAsia"/>
-        </w:rPr>
-        <w:t>ie</w:t>
-      </w:r>
-      <w:proofErr w:type="spellEnd"/>
-      <w:r>
-        <w:rPr>
-          <w:rFonts w:eastAsiaTheme="minorEastAsia"/>
-        </w:rPr>
-        <w:t xml:space="preserve"> interest, dividend per period)</w:t>
+        <w:t>C = cashflow (ie interest, dividend per period)</w:t>
       </w:r>
     </w:p>
     <w:p>
@@ -13080,6 +12991,9 @@
             <m:t>=4.81790581</m:t>
           </m:r>
           <m:r>
+            <m:rPr>
+              <m:sty m:val="p"/>
+            </m:rPr>
             <w:rPr>
               <w:rFonts w:eastAsiaTheme="minorEastAsia"/>
             </w:rPr>
@@ -13260,6 +13174,9 @@
             <m:t>=27.2707558</m:t>
           </m:r>
           <m:r>
+            <m:rPr>
+              <m:sty m:val="p"/>
+            </m:rPr>
             <w:rPr>
               <w:rFonts w:eastAsiaTheme="minorEastAsia"/>
             </w:rPr>
@@ -13337,6 +13254,9 @@
             <m:t>27.2707558×1.14=31.0886616</m:t>
           </m:r>
           <m:r>
+            <m:rPr>
+              <m:sty m:val="p"/>
+            </m:rPr>
             <w:rPr>
               <w:rFonts w:eastAsiaTheme="minorEastAsia"/>
             </w:rPr>
@@ -13426,6 +13346,9 @@
             <m:t>×31.0886616</m:t>
           </m:r>
           <m:r>
+            <m:rPr>
+              <m:sty m:val="p"/>
+            </m:rPr>
             <w:rPr>
               <w:rFonts w:eastAsiaTheme="minorEastAsia"/>
             </w:rPr>
@@ -13515,6 +13438,9 @@
             <m:t>1,28,664.31</m:t>
           </m:r>
           <m:r>
+            <m:rPr>
+              <m:sty m:val="p"/>
+            </m:rPr>
             <w:rPr>
               <w:rFonts w:eastAsiaTheme="minorEastAsia"/>
             </w:rPr>
@@ -13570,6 +13496,9 @@
         </w:rPr>
       </w:pPr>
       <w:r>
+        <w:rPr>
+          <w:noProof/>
+        </w:rPr>
         <w:drawing>
           <wp:inline distT="0" distB="0" distL="0" distR="0" wp14:anchorId="5F6E554E" wp14:editId="3944E233">
             <wp:extent cx="5731510" cy="2360930"/>
@@ -13725,6 +13654,679 @@
         <w:t xml:space="preserve"> </w:t>
       </w:r>
     </w:p>
+    <w:p>
+      <w:pPr>
+        <w:rPr>
+          <w:rFonts w:eastAsiaTheme="minorEastAsia"/>
+        </w:rPr>
+      </w:pPr>
+    </w:p>
+    <w:p>
+      <w:pPr>
+        <w:rPr>
+          <w:rFonts w:eastAsiaTheme="minorEastAsia"/>
+        </w:rPr>
+      </w:pPr>
+    </w:p>
+    <w:p>
+      <w:pPr>
+        <w:rPr>
+          <w:rFonts w:eastAsiaTheme="minorEastAsia"/>
+        </w:rPr>
+      </w:pPr>
+    </w:p>
+    <w:p>
+      <w:pPr>
+        <w:rPr>
+          <w:rFonts w:eastAsiaTheme="minorEastAsia"/>
+        </w:rPr>
+      </w:pPr>
+    </w:p>
+    <w:p>
+      <w:pPr>
+        <w:rPr>
+          <w:rFonts w:eastAsiaTheme="minorEastAsia"/>
+        </w:rPr>
+      </w:pPr>
+    </w:p>
+    <w:p>
+      <w:pPr>
+        <w:rPr>
+          <w:rFonts w:eastAsiaTheme="minorEastAsia"/>
+        </w:rPr>
+      </w:pPr>
+      <w:r>
+        <w:rPr>
+          <w:rFonts w:eastAsiaTheme="minorEastAsia"/>
+        </w:rPr>
+        <w:lastRenderedPageBreak/>
+        <w:t>0</w:t>
+      </w:r>
+      <w:r>
+        <w:rPr>
+          <w:rFonts w:eastAsiaTheme="minorEastAsia"/>
+        </w:rPr>
+        <w:t>7</w:t>
+      </w:r>
+      <w:r>
+        <w:rPr>
+          <w:rFonts w:eastAsiaTheme="minorEastAsia"/>
+        </w:rPr>
+        <w:t>/09/2026</w:t>
+      </w:r>
+    </w:p>
+    <w:p>
+      <w:pPr>
+        <w:rPr>
+          <w:rFonts w:eastAsiaTheme="minorEastAsia"/>
+        </w:rPr>
+      </w:pPr>
+    </w:p>
+    <w:p>
+      <w:pPr>
+        <w:pStyle w:val="Heading1"/>
+        <w:rPr>
+          <w:rFonts w:eastAsiaTheme="minorEastAsia"/>
+        </w:rPr>
+      </w:pPr>
+      <w:r>
+        <w:rPr>
+          <w:rFonts w:eastAsiaTheme="minorEastAsia"/>
+        </w:rPr>
+        <w:t>Valuation</w:t>
+      </w:r>
+    </w:p>
+    <w:p/>
+    <w:p>
+      <w:r>
+        <w:t>Important concept</w:t>
+      </w:r>
+    </w:p>
+    <w:p>
+      <w:pPr>
+        <w:pStyle w:val="ListParagraph"/>
+        <w:numPr>
+          <w:ilvl w:val="0"/>
+          <w:numId w:val="39"/>
+        </w:numPr>
+      </w:pPr>
+      <w:r>
+        <w:t xml:space="preserve">Book value </w:t>
+      </w:r>
+    </w:p>
+    <w:p>
+      <w:pPr>
+        <w:pStyle w:val="ListParagraph"/>
+        <w:numPr>
+          <w:ilvl w:val="1"/>
+          <w:numId w:val="39"/>
+        </w:numPr>
+      </w:pPr>
+      <w:r>
+        <w:t>Value assets given in balance sheet</w:t>
+      </w:r>
+    </w:p>
+    <w:p>
+      <w:pPr>
+        <w:pStyle w:val="ListParagraph"/>
+        <w:numPr>
+          <w:ilvl w:val="0"/>
+          <w:numId w:val="39"/>
+        </w:numPr>
+      </w:pPr>
+      <w:r>
+        <w:t>Market value</w:t>
+      </w:r>
+    </w:p>
+    <w:p>
+      <w:pPr>
+        <w:pStyle w:val="ListParagraph"/>
+        <w:numPr>
+          <w:ilvl w:val="1"/>
+          <w:numId w:val="39"/>
+        </w:numPr>
+      </w:pPr>
+      <w:r>
+        <w:t xml:space="preserve">An asset is the price for the price can be sold </w:t>
+      </w:r>
+    </w:p>
+    <w:p>
+      <w:pPr>
+        <w:pStyle w:val="ListParagraph"/>
+        <w:numPr>
+          <w:ilvl w:val="0"/>
+          <w:numId w:val="39"/>
+        </w:numPr>
+      </w:pPr>
+      <w:r>
+        <w:t>Going concern value</w:t>
+      </w:r>
+    </w:p>
+    <w:p>
+      <w:pPr>
+        <w:pStyle w:val="ListParagraph"/>
+        <w:numPr>
+          <w:ilvl w:val="1"/>
+          <w:numId w:val="39"/>
+        </w:numPr>
+      </w:pPr>
+      <w:r>
+        <w:t xml:space="preserve">The value which a prospective buyer of a business is prepared to pay </w:t>
+      </w:r>
+    </w:p>
+    <w:p>
+      <w:pPr>
+        <w:pStyle w:val="ListParagraph"/>
+        <w:numPr>
+          <w:ilvl w:val="0"/>
+          <w:numId w:val="39"/>
+        </w:numPr>
+      </w:pPr>
+      <w:r>
+        <w:t>Liquidating value (break down value)</w:t>
+      </w:r>
+    </w:p>
+    <w:p>
+      <w:pPr>
+        <w:pStyle w:val="ListParagraph"/>
+        <w:numPr>
+          <w:ilvl w:val="1"/>
+          <w:numId w:val="39"/>
+        </w:numPr>
+      </w:pPr>
+      <w:r>
+        <w:t xml:space="preserve">Difference between realisable value of all assets </w:t>
+      </w:r>
+    </w:p>
+    <w:p>
+      <w:pPr>
+        <w:pStyle w:val="ListParagraph"/>
+        <w:numPr>
+          <w:ilvl w:val="1"/>
+          <w:numId w:val="39"/>
+        </w:numPr>
+      </w:pPr>
+      <w:r>
+        <w:t xml:space="preserve">And sum total of external liabilities </w:t>
+      </w:r>
+    </w:p>
+    <w:p>
+      <w:pPr>
+        <w:pStyle w:val="ListParagraph"/>
+        <w:numPr>
+          <w:ilvl w:val="0"/>
+          <w:numId w:val="39"/>
+        </w:numPr>
+      </w:pPr>
+      <w:r>
+        <w:t>Capitalised value</w:t>
+      </w:r>
+    </w:p>
+    <w:p>
+      <w:pPr>
+        <w:pStyle w:val="ListParagraph"/>
+        <w:numPr>
+          <w:ilvl w:val="1"/>
+          <w:numId w:val="39"/>
+        </w:numPr>
+      </w:pPr>
+      <w:r>
+        <w:t xml:space="preserve">A fixed assets means the sum of present value of cash flows from an asset discounted </w:t>
+      </w:r>
+    </w:p>
+    <w:p/>
+    <w:p>
+      <w:pPr>
+        <w:rPr>
+          <w:rFonts w:eastAsiaTheme="minorEastAsia"/>
+        </w:rPr>
+      </w:pPr>
+      <m:oMathPara>
+        <m:oMathParaPr>
+          <m:jc m:val="left"/>
+        </m:oMathParaPr>
+        <m:oMath>
+          <m:r>
+            <w:rPr>
+              <w:rFonts w:ascii="Cambria Math" w:hAnsi="Cambria Math"/>
+            </w:rPr>
+            <m:t>Liquidating value</m:t>
+          </m:r>
+        </m:oMath>
+      </m:oMathPara>
+    </w:p>
+    <w:p>
+      <w:pPr>
+        <w:rPr>
+          <w:rFonts w:eastAsiaTheme="minorEastAsia"/>
+        </w:rPr>
+      </w:pPr>
+      <m:oMathPara>
+        <m:oMathParaPr>
+          <m:jc m:val="left"/>
+        </m:oMathParaPr>
+        <m:oMath>
+          <m:r>
+            <w:rPr>
+              <w:rFonts w:ascii="Cambria Math" w:eastAsiaTheme="minorEastAsia" w:hAnsi="Cambria Math"/>
+            </w:rPr>
+            <m:t xml:space="preserve">= </m:t>
+          </m:r>
+          <m:f>
+            <m:fPr>
+              <m:ctrlPr>
+                <w:rPr>
+                  <w:rFonts w:ascii="Cambria Math" w:eastAsiaTheme="minorEastAsia" w:hAnsi="Cambria Math"/>
+                  <w:i/>
+                </w:rPr>
+              </m:ctrlPr>
+            </m:fPr>
+            <m:num>
+              <m:r>
+                <w:rPr>
+                  <w:rFonts w:ascii="Cambria Math" w:eastAsiaTheme="minorEastAsia" w:hAnsi="Cambria Math"/>
+                </w:rPr>
+                <m:t>breakdown value of assets + net fixed assets + current assets -current liabilities</m:t>
+              </m:r>
+            </m:num>
+            <m:den>
+              <m:r>
+                <w:rPr>
+                  <w:rFonts w:ascii="Cambria Math" w:eastAsiaTheme="minorEastAsia" w:hAnsi="Cambria Math"/>
+                </w:rPr>
+                <m:t>number of shares</m:t>
+              </m:r>
+            </m:den>
+          </m:f>
+          <m:r>
+            <w:rPr>
+              <w:rFonts w:ascii="Cambria Math" w:eastAsiaTheme="minorEastAsia" w:hAnsi="Cambria Math"/>
+            </w:rPr>
+            <m:t>.</m:t>
+          </m:r>
+        </m:oMath>
+      </m:oMathPara>
+    </w:p>
+    <w:p>
+      <w:pPr>
+        <w:rPr>
+          <w:rFonts w:eastAsiaTheme="minorEastAsia"/>
+        </w:rPr>
+      </w:pPr>
+    </w:p>
+    <w:p>
+      <w:pPr>
+        <w:rPr>
+          <w:rFonts w:eastAsiaTheme="minorEastAsia"/>
+        </w:rPr>
+      </w:pPr>
+      <w:r>
+        <w:rPr>
+          <w:rFonts w:eastAsiaTheme="minorEastAsia"/>
+        </w:rPr>
+        <w:t>Types of yield</w:t>
+      </w:r>
+    </w:p>
+    <w:p>
+      <w:pPr>
+        <w:pStyle w:val="ListParagraph"/>
+        <w:numPr>
+          <w:ilvl w:val="0"/>
+          <w:numId w:val="36"/>
+        </w:numPr>
+        <w:rPr>
+          <w:rFonts w:eastAsiaTheme="minorEastAsia"/>
+        </w:rPr>
+      </w:pPr>
+      <w:r>
+        <w:rPr>
+          <w:rFonts w:eastAsiaTheme="minorEastAsia"/>
+        </w:rPr>
+        <w:t xml:space="preserve">Market yield </w:t>
+      </w:r>
+    </w:p>
+    <w:p>
+      <w:pPr>
+        <w:pStyle w:val="ListParagraph"/>
+        <w:ind w:left="1440"/>
+        <w:rPr>
+          <w:rFonts w:eastAsiaTheme="minorEastAsia"/>
+        </w:rPr>
+      </w:pPr>
+      <w:r>
+        <w:rPr>
+          <w:rFonts w:eastAsiaTheme="minorEastAsia"/>
+        </w:rPr>
+        <w:t xml:space="preserve">Current yield = </w:t>
+      </w:r>
+      <m:oMath>
+        <m:f>
+          <m:fPr>
+            <m:ctrlPr>
+              <w:rPr>
+                <w:rFonts w:ascii="Cambria Math" w:eastAsiaTheme="minorEastAsia" w:hAnsi="Cambria Math"/>
+                <w:i/>
+              </w:rPr>
+            </m:ctrlPr>
+          </m:fPr>
+          <m:num>
+            <m:r>
+              <w:rPr>
+                <w:rFonts w:ascii="Cambria Math" w:eastAsiaTheme="minorEastAsia" w:hAnsi="Cambria Math"/>
+              </w:rPr>
+              <m:t>annual dividend</m:t>
+            </m:r>
+          </m:num>
+          <m:den>
+            <m:r>
+              <w:rPr>
+                <w:rFonts w:ascii="Cambria Math" w:eastAsiaTheme="minorEastAsia" w:hAnsi="Cambria Math"/>
+              </w:rPr>
+              <m:t>market price</m:t>
+            </m:r>
+          </m:den>
+        </m:f>
+      </m:oMath>
+    </w:p>
+    <w:p>
+      <w:pPr>
+        <w:rPr>
+          <w:rFonts w:eastAsiaTheme="minorEastAsia"/>
+        </w:rPr>
+      </w:pPr>
+      <w:r>
+        <w:rPr>
+          <w:rFonts w:eastAsiaTheme="minorEastAsia"/>
+        </w:rPr>
+        <w:t xml:space="preserve">1. If the 8% of preference share of ABC limited are sold for Rs. 64, the current yield is 12.5% </w:t>
+      </w:r>
+    </w:p>
+    <w:p>
+      <w:pPr>
+        <w:pStyle w:val="ListParagraph"/>
+        <w:numPr>
+          <w:ilvl w:val="0"/>
+          <w:numId w:val="36"/>
+        </w:numPr>
+        <w:rPr>
+          <w:rFonts w:eastAsiaTheme="minorEastAsia"/>
+        </w:rPr>
+      </w:pPr>
+      <w:r>
+        <w:rPr>
+          <w:rFonts w:eastAsiaTheme="minorEastAsia"/>
+        </w:rPr>
+        <w:t>Dividend yield</w:t>
+      </w:r>
+    </w:p>
+    <w:p>
+      <w:pPr>
+        <w:pStyle w:val="ListParagraph"/>
+        <w:ind w:left="1440"/>
+        <w:rPr>
+          <w:rFonts w:eastAsiaTheme="minorEastAsia"/>
+        </w:rPr>
+      </w:pPr>
+      <w:r>
+        <w:rPr>
+          <w:rFonts w:eastAsiaTheme="minorEastAsia"/>
+        </w:rPr>
+        <w:t xml:space="preserve">The annual amount paid to the share holders in proportion to the current price of the share </w:t>
+      </w:r>
+    </w:p>
+    <w:p>
+      <w:pPr>
+        <w:pStyle w:val="ListParagraph"/>
+        <w:ind w:left="1440"/>
+        <w:rPr>
+          <w:rFonts w:eastAsiaTheme="minorEastAsia"/>
+        </w:rPr>
+      </w:pPr>
+    </w:p>
+    <w:p>
+      <w:pPr>
+        <w:pStyle w:val="ListParagraph"/>
+        <w:ind w:left="1440"/>
+        <w:rPr>
+          <w:rFonts w:eastAsiaTheme="minorEastAsia"/>
+        </w:rPr>
+      </w:pPr>
+      <m:oMathPara>
+        <m:oMath>
+          <m:r>
+            <w:rPr>
+              <w:rFonts w:ascii="Cambria Math" w:eastAsiaTheme="minorEastAsia" w:hAnsi="Cambria Math"/>
+            </w:rPr>
+            <m:t xml:space="preserve">dY = </m:t>
+          </m:r>
+          <m:f>
+            <m:fPr>
+              <m:ctrlPr>
+                <w:rPr>
+                  <w:rFonts w:ascii="Cambria Math" w:eastAsiaTheme="minorEastAsia" w:hAnsi="Cambria Math"/>
+                  <w:i/>
+                </w:rPr>
+              </m:ctrlPr>
+            </m:fPr>
+            <m:num>
+              <m:r>
+                <w:rPr>
+                  <w:rFonts w:ascii="Cambria Math" w:eastAsiaTheme="minorEastAsia" w:hAnsi="Cambria Math"/>
+                </w:rPr>
+                <m:t>Dividend per share</m:t>
+              </m:r>
+            </m:num>
+            <m:den>
+              <m:r>
+                <w:rPr>
+                  <w:rFonts w:ascii="Cambria Math" w:eastAsiaTheme="minorEastAsia" w:hAnsi="Cambria Math"/>
+                </w:rPr>
+                <m:t>market price</m:t>
+              </m:r>
+            </m:den>
+          </m:f>
+        </m:oMath>
+      </m:oMathPara>
+    </w:p>
+    <w:p>
+      <w:pPr>
+        <w:pStyle w:val="ListParagraph"/>
+        <w:numPr>
+          <w:ilvl w:val="0"/>
+          <w:numId w:val="40"/>
+        </w:numPr>
+        <w:rPr>
+          <w:rFonts w:eastAsiaTheme="minorEastAsia"/>
+        </w:rPr>
+      </w:pPr>
+      <w:r>
+        <w:rPr>
+          <w:rFonts w:eastAsiaTheme="minorEastAsia"/>
+        </w:rPr>
+        <w:lastRenderedPageBreak/>
+        <w:t xml:space="preserve">The preference share of xyz ltd are selling for Rs. 50 per share and pays a dividend of Rs 3, what is your expected rate of return if you purchase the security at market price </w:t>
+      </w:r>
+    </w:p>
+    <w:p>
+      <w:pPr>
+        <w:pStyle w:val="ListParagraph"/>
+        <w:rPr>
+          <w:rFonts w:eastAsiaTheme="minorEastAsia"/>
+        </w:rPr>
+      </w:pPr>
+    </w:p>
+    <w:p>
+      <w:pPr>
+        <w:pStyle w:val="ListParagraph"/>
+        <w:rPr>
+          <w:rFonts w:eastAsiaTheme="minorEastAsia"/>
+        </w:rPr>
+      </w:pPr>
+      <w:r>
+        <w:rPr>
+          <w:rFonts w:eastAsiaTheme="minorEastAsia"/>
+        </w:rPr>
+        <w:t>Ans:</w:t>
+      </w:r>
+    </w:p>
+    <w:p>
+      <w:pPr>
+        <w:pStyle w:val="ListParagraph"/>
+        <w:rPr>
+          <w:rFonts w:eastAsiaTheme="minorEastAsia"/>
+        </w:rPr>
+      </w:pPr>
+    </w:p>
+    <w:p>
+      <w:pPr>
+        <w:pStyle w:val="ListParagraph"/>
+        <w:rPr>
+          <w:rFonts w:eastAsiaTheme="minorEastAsia"/>
+        </w:rPr>
+      </w:pPr>
+      <w:r>
+        <w:rPr>
+          <w:rFonts w:eastAsiaTheme="minorEastAsia"/>
+        </w:rPr>
+        <w:t>3/50 *100 = 6%</w:t>
+      </w:r>
+    </w:p>
+    <w:p>
+      <w:pPr>
+        <w:pStyle w:val="ListParagraph"/>
+        <w:rPr>
+          <w:rFonts w:eastAsiaTheme="minorEastAsia"/>
+        </w:rPr>
+      </w:pPr>
+    </w:p>
+    <w:p>
+      <w:pPr>
+        <w:pStyle w:val="ListParagraph"/>
+        <w:numPr>
+          <w:ilvl w:val="0"/>
+          <w:numId w:val="40"/>
+        </w:numPr>
+        <w:rPr>
+          <w:rFonts w:eastAsiaTheme="minorEastAsia"/>
+        </w:rPr>
+      </w:pPr>
+      <w:r>
+        <w:rPr>
+          <w:rFonts w:eastAsiaTheme="minorEastAsia"/>
+        </w:rPr>
+        <w:t xml:space="preserve">Bhuvenesh own 200 preference shares of PQR ltd. Which currently sells at Rs 40 per share and pays an annual of Rs 7 per share. What is the expected return or dividend yield </w:t>
+      </w:r>
+    </w:p>
+    <w:p>
+      <w:pPr>
+        <w:pStyle w:val="ListParagraph"/>
+        <w:rPr>
+          <w:rFonts w:eastAsiaTheme="minorEastAsia"/>
+        </w:rPr>
+      </w:pPr>
+      <w:r>
+        <w:rPr>
+          <w:rFonts w:eastAsiaTheme="minorEastAsia"/>
+        </w:rPr>
+        <w:t>Ans</w:t>
+      </w:r>
+    </w:p>
+    <w:p>
+      <w:pPr>
+        <w:pStyle w:val="ListParagraph"/>
+        <w:rPr>
+          <w:rFonts w:eastAsiaTheme="minorEastAsia"/>
+        </w:rPr>
+      </w:pPr>
+      <w:r>
+        <w:rPr>
+          <w:rFonts w:eastAsiaTheme="minorEastAsia"/>
+        </w:rPr>
+        <w:t>7/40 = 17.5%</w:t>
+      </w:r>
+    </w:p>
+    <w:p>
+      <w:pPr>
+        <w:pStyle w:val="ListParagraph"/>
+        <w:rPr>
+          <w:rFonts w:eastAsiaTheme="minorEastAsia"/>
+        </w:rPr>
+      </w:pPr>
+    </w:p>
+    <w:p>
+      <w:pPr>
+        <w:pStyle w:val="ListParagraph"/>
+        <w:numPr>
+          <w:ilvl w:val="0"/>
+          <w:numId w:val="40"/>
+        </w:numPr>
+        <w:rPr>
+          <w:rFonts w:eastAsiaTheme="minorEastAsia"/>
+        </w:rPr>
+      </w:pPr>
+      <w:r>
+        <w:rPr>
+          <w:rFonts w:eastAsiaTheme="minorEastAsia"/>
+        </w:rPr>
+        <w:t xml:space="preserve">If bhuvanesh requires a 12% return, given the current price should he sell or buy more preference share </w:t>
+      </w:r>
+    </w:p>
+    <w:p>
+      <w:pPr>
+        <w:pStyle w:val="ListParagraph"/>
+        <w:rPr>
+          <w:rFonts w:eastAsiaTheme="minorEastAsia"/>
+        </w:rPr>
+      </w:pPr>
+    </w:p>
+    <w:p>
+      <w:pPr>
+        <w:pStyle w:val="ListParagraph"/>
+        <w:rPr>
+          <w:rFonts w:eastAsiaTheme="minorEastAsia"/>
+        </w:rPr>
+      </w:pPr>
+      <w:r>
+        <w:rPr>
+          <w:rFonts w:eastAsiaTheme="minorEastAsia"/>
+        </w:rPr>
+        <w:t>7/40 * 100</w:t>
+      </w:r>
+    </w:p>
+    <w:p>
+      <w:pPr>
+        <w:pStyle w:val="ListParagraph"/>
+        <w:rPr>
+          <w:rFonts w:eastAsiaTheme="minorEastAsia"/>
+        </w:rPr>
+      </w:pPr>
+      <w:r>
+        <w:rPr>
+          <w:rFonts w:eastAsiaTheme="minorEastAsia"/>
+        </w:rPr>
+        <w:t>=17.5%</w:t>
+      </w:r>
+    </w:p>
+    <w:p>
+      <w:pPr>
+        <w:pStyle w:val="ListParagraph"/>
+        <w:rPr>
+          <w:rFonts w:eastAsiaTheme="minorEastAsia"/>
+        </w:rPr>
+      </w:pPr>
+      <w:r>
+        <w:rPr>
+          <w:rFonts w:eastAsiaTheme="minorEastAsia"/>
+        </w:rPr>
+        <w:t>The expected return is 17.5% which greateer that the required rate of return (12%) also the current market price Rs. 40, which is less thatn 58.33which shows the stock is undervalued so it is worth buying.</w:t>
+      </w:r>
+      <w:r>
+        <w:rPr>
+          <w:rFonts w:eastAsiaTheme="minorEastAsia"/>
+        </w:rPr>
+        <w:t xml:space="preserve"> </w:t>
+      </w:r>
+    </w:p>
     <w:sectPr>
       <w:pgSz w:w="11906" w:h="16838"/>
       <w:pgMar w:top="1440" w:right="1440" w:bottom="1440" w:left="1440" w:header="708" w:footer="708" w:gutter="0"/>
@@ -14122,6 +14724,92 @@
     </w:lvl>
   </w:abstractNum>
   <w:abstractNum w:abstractNumId="3" w15:restartNumberingAfterBreak="0">
+    <w:nsid w:val="07101095"/>
+    <w:multiLevelType w:val="hybridMultilevel"/>
+    <w:tmpl w:val="2F70241E"/>
+    <w:lvl w:ilvl="0" w:tplc="FFFFFFFF">
+      <w:start w:val="1"/>
+      <w:numFmt w:val="decimal"/>
+      <w:lvlText w:val="%1."/>
+      <w:lvlJc w:val="left"/>
+      <w:pPr>
+        <w:ind w:left="720" w:hanging="360"/>
+      </w:pPr>
+    </w:lvl>
+    <w:lvl w:ilvl="1" w:tplc="FFFFFFFF">
+      <w:start w:val="1"/>
+      <w:numFmt w:val="lowerLetter"/>
+      <w:lvlText w:val="%2."/>
+      <w:lvlJc w:val="left"/>
+      <w:pPr>
+        <w:ind w:left="1440" w:hanging="360"/>
+      </w:pPr>
+    </w:lvl>
+    <w:lvl w:ilvl="2" w:tplc="FFFFFFFF" w:tentative="1">
+      <w:start w:val="1"/>
+      <w:numFmt w:val="lowerRoman"/>
+      <w:lvlText w:val="%3."/>
+      <w:lvlJc w:val="right"/>
+      <w:pPr>
+        <w:ind w:left="2160" w:hanging="180"/>
+      </w:pPr>
+    </w:lvl>
+    <w:lvl w:ilvl="3" w:tplc="FFFFFFFF" w:tentative="1">
+      <w:start w:val="1"/>
+      <w:numFmt w:val="decimal"/>
+      <w:lvlText w:val="%4."/>
+      <w:lvlJc w:val="left"/>
+      <w:pPr>
+        <w:ind w:left="2880" w:hanging="360"/>
+      </w:pPr>
+    </w:lvl>
+    <w:lvl w:ilvl="4" w:tplc="FFFFFFFF" w:tentative="1">
+      <w:start w:val="1"/>
+      <w:numFmt w:val="lowerLetter"/>
+      <w:lvlText w:val="%5."/>
+      <w:lvlJc w:val="left"/>
+      <w:pPr>
+        <w:ind w:left="3600" w:hanging="360"/>
+      </w:pPr>
+    </w:lvl>
+    <w:lvl w:ilvl="5" w:tplc="FFFFFFFF" w:tentative="1">
+      <w:start w:val="1"/>
+      <w:numFmt w:val="lowerRoman"/>
+      <w:lvlText w:val="%6."/>
+      <w:lvlJc w:val="right"/>
+      <w:pPr>
+        <w:ind w:left="4320" w:hanging="180"/>
+      </w:pPr>
+    </w:lvl>
+    <w:lvl w:ilvl="6" w:tplc="FFFFFFFF" w:tentative="1">
+      <w:start w:val="1"/>
+      <w:numFmt w:val="decimal"/>
+      <w:lvlText w:val="%7."/>
+      <w:lvlJc w:val="left"/>
+      <w:pPr>
+        <w:ind w:left="5040" w:hanging="360"/>
+      </w:pPr>
+    </w:lvl>
+    <w:lvl w:ilvl="7" w:tplc="FFFFFFFF" w:tentative="1">
+      <w:start w:val="1"/>
+      <w:numFmt w:val="lowerLetter"/>
+      <w:lvlText w:val="%8."/>
+      <w:lvlJc w:val="left"/>
+      <w:pPr>
+        <w:ind w:left="5760" w:hanging="360"/>
+      </w:pPr>
+    </w:lvl>
+    <w:lvl w:ilvl="8" w:tplc="FFFFFFFF" w:tentative="1">
+      <w:start w:val="1"/>
+      <w:numFmt w:val="lowerRoman"/>
+      <w:lvlText w:val="%9."/>
+      <w:lvlJc w:val="right"/>
+      <w:pPr>
+        <w:ind w:left="6480" w:hanging="180"/>
+      </w:pPr>
+    </w:lvl>
+  </w:abstractNum>
+  <w:abstractNum w:abstractNumId="4" w15:restartNumberingAfterBreak="0">
     <w:nsid w:val="07D93636"/>
     <w:multiLevelType w:val="hybridMultilevel"/>
     <w:tmpl w:val="1DB65154"/>
@@ -14207,7 +14895,7 @@
       </w:pPr>
     </w:lvl>
   </w:abstractNum>
-  <w:abstractNum w:abstractNumId="4" w15:restartNumberingAfterBreak="0">
+  <w:abstractNum w:abstractNumId="5" w15:restartNumberingAfterBreak="0">
     <w:nsid w:val="16821C01"/>
     <w:multiLevelType w:val="hybridMultilevel"/>
     <w:tmpl w:val="74C2BB6A"/>
@@ -14293,7 +14981,7 @@
       </w:pPr>
     </w:lvl>
   </w:abstractNum>
-  <w:abstractNum w:abstractNumId="5" w15:restartNumberingAfterBreak="0">
+  <w:abstractNum w:abstractNumId="6" w15:restartNumberingAfterBreak="0">
     <w:nsid w:val="1F552A06"/>
     <w:multiLevelType w:val="hybridMultilevel"/>
     <w:tmpl w:val="B5F29EA4"/>
@@ -14382,7 +15070,7 @@
       </w:pPr>
     </w:lvl>
   </w:abstractNum>
-  <w:abstractNum w:abstractNumId="6" w15:restartNumberingAfterBreak="0">
+  <w:abstractNum w:abstractNumId="7" w15:restartNumberingAfterBreak="0">
     <w:nsid w:val="1F6519B0"/>
     <w:multiLevelType w:val="hybridMultilevel"/>
     <w:tmpl w:val="C026FB9A"/>
@@ -14471,7 +15159,7 @@
       </w:pPr>
     </w:lvl>
   </w:abstractNum>
-  <w:abstractNum w:abstractNumId="7" w15:restartNumberingAfterBreak="0">
+  <w:abstractNum w:abstractNumId="8" w15:restartNumberingAfterBreak="0">
     <w:nsid w:val="1FF35255"/>
     <w:multiLevelType w:val="hybridMultilevel"/>
     <w:tmpl w:val="0F8E2182"/>
@@ -14557,7 +15245,7 @@
       </w:pPr>
     </w:lvl>
   </w:abstractNum>
-  <w:abstractNum w:abstractNumId="8" w15:restartNumberingAfterBreak="0">
+  <w:abstractNum w:abstractNumId="9" w15:restartNumberingAfterBreak="0">
     <w:nsid w:val="224D289E"/>
     <w:multiLevelType w:val="hybridMultilevel"/>
     <w:tmpl w:val="DFE2845A"/>
@@ -14643,7 +15331,7 @@
       </w:pPr>
     </w:lvl>
   </w:abstractNum>
-  <w:abstractNum w:abstractNumId="9" w15:restartNumberingAfterBreak="0">
+  <w:abstractNum w:abstractNumId="10" w15:restartNumberingAfterBreak="0">
     <w:nsid w:val="226E0771"/>
     <w:multiLevelType w:val="hybridMultilevel"/>
     <w:tmpl w:val="34785FDC"/>
@@ -14732,7 +15420,7 @@
       </w:pPr>
     </w:lvl>
   </w:abstractNum>
-  <w:abstractNum w:abstractNumId="10" w15:restartNumberingAfterBreak="0">
+  <w:abstractNum w:abstractNumId="11" w15:restartNumberingAfterBreak="0">
     <w:nsid w:val="25FE49C2"/>
     <w:multiLevelType w:val="multilevel"/>
     <w:tmpl w:val="B0183B58"/>
@@ -14881,7 +15569,7 @@
       </w:rPr>
     </w:lvl>
   </w:abstractNum>
-  <w:abstractNum w:abstractNumId="11" w15:restartNumberingAfterBreak="0">
+  <w:abstractNum w:abstractNumId="12" w15:restartNumberingAfterBreak="0">
     <w:nsid w:val="270E03D6"/>
     <w:multiLevelType w:val="hybridMultilevel"/>
     <w:tmpl w:val="21482B92"/>
@@ -14967,7 +15655,7 @@
       </w:pPr>
     </w:lvl>
   </w:abstractNum>
-  <w:abstractNum w:abstractNumId="12" w15:restartNumberingAfterBreak="0">
+  <w:abstractNum w:abstractNumId="13" w15:restartNumberingAfterBreak="0">
     <w:nsid w:val="277F6A7C"/>
     <w:multiLevelType w:val="hybridMultilevel"/>
     <w:tmpl w:val="A85C6510"/>
@@ -15056,7 +15744,7 @@
       </w:pPr>
     </w:lvl>
   </w:abstractNum>
-  <w:abstractNum w:abstractNumId="13" w15:restartNumberingAfterBreak="0">
+  <w:abstractNum w:abstractNumId="14" w15:restartNumberingAfterBreak="0">
     <w:nsid w:val="2B866818"/>
     <w:multiLevelType w:val="hybridMultilevel"/>
     <w:tmpl w:val="21482B92"/>
@@ -15142,7 +15830,7 @@
       </w:pPr>
     </w:lvl>
   </w:abstractNum>
-  <w:abstractNum w:abstractNumId="14" w15:restartNumberingAfterBreak="0">
+  <w:abstractNum w:abstractNumId="15" w15:restartNumberingAfterBreak="0">
     <w:nsid w:val="2E69236A"/>
     <w:multiLevelType w:val="hybridMultilevel"/>
     <w:tmpl w:val="5B2E57F4"/>
@@ -15228,7 +15916,7 @@
       </w:pPr>
     </w:lvl>
   </w:abstractNum>
-  <w:abstractNum w:abstractNumId="15" w15:restartNumberingAfterBreak="0">
+  <w:abstractNum w:abstractNumId="16" w15:restartNumberingAfterBreak="0">
     <w:nsid w:val="2F9B1447"/>
     <w:multiLevelType w:val="hybridMultilevel"/>
     <w:tmpl w:val="1D4EAFF8"/>
@@ -15314,10 +16002,10 @@
       </w:pPr>
     </w:lvl>
   </w:abstractNum>
-  <w:abstractNum w:abstractNumId="16" w15:restartNumberingAfterBreak="0">
+  <w:abstractNum w:abstractNumId="17" w15:restartNumberingAfterBreak="0">
     <w:nsid w:val="342643EF"/>
     <w:multiLevelType w:val="hybridMultilevel"/>
-    <w:tmpl w:val="8542C96C"/>
+    <w:tmpl w:val="8D0EE88E"/>
     <w:lvl w:ilvl="0" w:tplc="40090001">
       <w:start w:val="1"/>
       <w:numFmt w:val="bullet"/>
@@ -15427,7 +16115,7 @@
       </w:rPr>
     </w:lvl>
   </w:abstractNum>
-  <w:abstractNum w:abstractNumId="17" w15:restartNumberingAfterBreak="0">
+  <w:abstractNum w:abstractNumId="18" w15:restartNumberingAfterBreak="0">
     <w:nsid w:val="35D57A2E"/>
     <w:multiLevelType w:val="hybridMultilevel"/>
     <w:tmpl w:val="0FF6CBF2"/>
@@ -15516,7 +16204,7 @@
       </w:pPr>
     </w:lvl>
   </w:abstractNum>
-  <w:abstractNum w:abstractNumId="18" w15:restartNumberingAfterBreak="0">
+  <w:abstractNum w:abstractNumId="19" w15:restartNumberingAfterBreak="0">
     <w:nsid w:val="39662EC6"/>
     <w:multiLevelType w:val="hybridMultilevel"/>
     <w:tmpl w:val="59464B7A"/>
@@ -15602,7 +16290,7 @@
       </w:pPr>
     </w:lvl>
   </w:abstractNum>
-  <w:abstractNum w:abstractNumId="19" w15:restartNumberingAfterBreak="0">
+  <w:abstractNum w:abstractNumId="20" w15:restartNumberingAfterBreak="0">
     <w:nsid w:val="3CCA4F56"/>
     <w:multiLevelType w:val="hybridMultilevel"/>
     <w:tmpl w:val="BBD09A80"/>
@@ -15688,7 +16376,93 @@
       </w:pPr>
     </w:lvl>
   </w:abstractNum>
-  <w:abstractNum w:abstractNumId="20" w15:restartNumberingAfterBreak="0">
+  <w:abstractNum w:abstractNumId="21" w15:restartNumberingAfterBreak="0">
+    <w:nsid w:val="3FA677EF"/>
+    <w:multiLevelType w:val="hybridMultilevel"/>
+    <w:tmpl w:val="F144535C"/>
+    <w:lvl w:ilvl="0" w:tplc="FFFFFFFF">
+      <w:start w:val="1"/>
+      <w:numFmt w:val="decimal"/>
+      <w:lvlText w:val="%1."/>
+      <w:lvlJc w:val="left"/>
+      <w:pPr>
+        <w:ind w:left="720" w:hanging="360"/>
+      </w:pPr>
+    </w:lvl>
+    <w:lvl w:ilvl="1" w:tplc="40090019" w:tentative="1">
+      <w:start w:val="1"/>
+      <w:numFmt w:val="lowerLetter"/>
+      <w:lvlText w:val="%2."/>
+      <w:lvlJc w:val="left"/>
+      <w:pPr>
+        <w:ind w:left="1440" w:hanging="360"/>
+      </w:pPr>
+    </w:lvl>
+    <w:lvl w:ilvl="2" w:tplc="4009001B" w:tentative="1">
+      <w:start w:val="1"/>
+      <w:numFmt w:val="lowerRoman"/>
+      <w:lvlText w:val="%3."/>
+      <w:lvlJc w:val="right"/>
+      <w:pPr>
+        <w:ind w:left="2160" w:hanging="180"/>
+      </w:pPr>
+    </w:lvl>
+    <w:lvl w:ilvl="3" w:tplc="4009000F" w:tentative="1">
+      <w:start w:val="1"/>
+      <w:numFmt w:val="decimal"/>
+      <w:lvlText w:val="%4."/>
+      <w:lvlJc w:val="left"/>
+      <w:pPr>
+        <w:ind w:left="2880" w:hanging="360"/>
+      </w:pPr>
+    </w:lvl>
+    <w:lvl w:ilvl="4" w:tplc="40090019" w:tentative="1">
+      <w:start w:val="1"/>
+      <w:numFmt w:val="lowerLetter"/>
+      <w:lvlText w:val="%5."/>
+      <w:lvlJc w:val="left"/>
+      <w:pPr>
+        <w:ind w:left="3600" w:hanging="360"/>
+      </w:pPr>
+    </w:lvl>
+    <w:lvl w:ilvl="5" w:tplc="4009001B" w:tentative="1">
+      <w:start w:val="1"/>
+      <w:numFmt w:val="lowerRoman"/>
+      <w:lvlText w:val="%6."/>
+      <w:lvlJc w:val="right"/>
+      <w:pPr>
+        <w:ind w:left="4320" w:hanging="180"/>
+      </w:pPr>
+    </w:lvl>
+    <w:lvl w:ilvl="6" w:tplc="4009000F" w:tentative="1">
+      <w:start w:val="1"/>
+      <w:numFmt w:val="decimal"/>
+      <w:lvlText w:val="%7."/>
+      <w:lvlJc w:val="left"/>
+      <w:pPr>
+        <w:ind w:left="5040" w:hanging="360"/>
+      </w:pPr>
+    </w:lvl>
+    <w:lvl w:ilvl="7" w:tplc="40090019" w:tentative="1">
+      <w:start w:val="1"/>
+      <w:numFmt w:val="lowerLetter"/>
+      <w:lvlText w:val="%8."/>
+      <w:lvlJc w:val="left"/>
+      <w:pPr>
+        <w:ind w:left="5760" w:hanging="360"/>
+      </w:pPr>
+    </w:lvl>
+    <w:lvl w:ilvl="8" w:tplc="4009001B" w:tentative="1">
+      <w:start w:val="1"/>
+      <w:numFmt w:val="lowerRoman"/>
+      <w:lvlText w:val="%9."/>
+      <w:lvlJc w:val="right"/>
+      <w:pPr>
+        <w:ind w:left="6480" w:hanging="180"/>
+      </w:pPr>
+    </w:lvl>
+  </w:abstractNum>
+  <w:abstractNum w:abstractNumId="22" w15:restartNumberingAfterBreak="0">
     <w:nsid w:val="41621598"/>
     <w:multiLevelType w:val="hybridMultilevel"/>
     <w:tmpl w:val="2E644174"/>
@@ -15777,7 +16551,7 @@
       </w:pPr>
     </w:lvl>
   </w:abstractNum>
-  <w:abstractNum w:abstractNumId="21" w15:restartNumberingAfterBreak="0">
+  <w:abstractNum w:abstractNumId="23" w15:restartNumberingAfterBreak="0">
     <w:nsid w:val="421F5061"/>
     <w:multiLevelType w:val="hybridMultilevel"/>
     <w:tmpl w:val="C55E3D5E"/>
@@ -15890,7 +16664,7 @@
       </w:rPr>
     </w:lvl>
   </w:abstractNum>
-  <w:abstractNum w:abstractNumId="22" w15:restartNumberingAfterBreak="0">
+  <w:abstractNum w:abstractNumId="24" w15:restartNumberingAfterBreak="0">
     <w:nsid w:val="579956AE"/>
     <w:multiLevelType w:val="hybridMultilevel"/>
     <w:tmpl w:val="152C998C"/>
@@ -15979,7 +16753,7 @@
       </w:pPr>
     </w:lvl>
   </w:abstractNum>
-  <w:abstractNum w:abstractNumId="23" w15:restartNumberingAfterBreak="0">
+  <w:abstractNum w:abstractNumId="25" w15:restartNumberingAfterBreak="0">
     <w:nsid w:val="5AAF4307"/>
     <w:multiLevelType w:val="hybridMultilevel"/>
     <w:tmpl w:val="27147B98"/>
@@ -16065,7 +16839,7 @@
       </w:pPr>
     </w:lvl>
   </w:abstractNum>
-  <w:abstractNum w:abstractNumId="24" w15:restartNumberingAfterBreak="0">
+  <w:abstractNum w:abstractNumId="26" w15:restartNumberingAfterBreak="0">
     <w:nsid w:val="5B0B6E70"/>
     <w:multiLevelType w:val="hybridMultilevel"/>
     <w:tmpl w:val="639E1D92"/>
@@ -16151,10 +16925,10 @@
       </w:pPr>
     </w:lvl>
   </w:abstractNum>
-  <w:abstractNum w:abstractNumId="25" w15:restartNumberingAfterBreak="0">
+  <w:abstractNum w:abstractNumId="27" w15:restartNumberingAfterBreak="0">
     <w:nsid w:val="5B5059D4"/>
     <w:multiLevelType w:val="hybridMultilevel"/>
-    <w:tmpl w:val="6C4AB224"/>
+    <w:tmpl w:val="2F70241E"/>
     <w:lvl w:ilvl="0" w:tplc="4009000F">
       <w:start w:val="1"/>
       <w:numFmt w:val="decimal"/>
@@ -16237,7 +17011,7 @@
       </w:pPr>
     </w:lvl>
   </w:abstractNum>
-  <w:abstractNum w:abstractNumId="26" w15:restartNumberingAfterBreak="0">
+  <w:abstractNum w:abstractNumId="28" w15:restartNumberingAfterBreak="0">
     <w:nsid w:val="5CF97DC3"/>
     <w:multiLevelType w:val="hybridMultilevel"/>
     <w:tmpl w:val="5B2C3BD8"/>
@@ -16323,7 +17097,7 @@
       </w:pPr>
     </w:lvl>
   </w:abstractNum>
-  <w:abstractNum w:abstractNumId="27" w15:restartNumberingAfterBreak="0">
+  <w:abstractNum w:abstractNumId="29" w15:restartNumberingAfterBreak="0">
     <w:nsid w:val="5ECF72A1"/>
     <w:multiLevelType w:val="hybridMultilevel"/>
     <w:tmpl w:val="1CF4107C"/>
@@ -16409,7 +17183,7 @@
       </w:pPr>
     </w:lvl>
   </w:abstractNum>
-  <w:abstractNum w:abstractNumId="28" w15:restartNumberingAfterBreak="0">
+  <w:abstractNum w:abstractNumId="30" w15:restartNumberingAfterBreak="0">
     <w:nsid w:val="5F5F17AC"/>
     <w:multiLevelType w:val="hybridMultilevel"/>
     <w:tmpl w:val="27485FD2"/>
@@ -16495,7 +17269,7 @@
       </w:pPr>
     </w:lvl>
   </w:abstractNum>
-  <w:abstractNum w:abstractNumId="29" w15:restartNumberingAfterBreak="0">
+  <w:abstractNum w:abstractNumId="31" w15:restartNumberingAfterBreak="0">
     <w:nsid w:val="5FAD400A"/>
     <w:multiLevelType w:val="hybridMultilevel"/>
     <w:tmpl w:val="59F4717E"/>
@@ -16581,7 +17355,7 @@
       </w:pPr>
     </w:lvl>
   </w:abstractNum>
-  <w:abstractNum w:abstractNumId="30" w15:restartNumberingAfterBreak="0">
+  <w:abstractNum w:abstractNumId="32" w15:restartNumberingAfterBreak="0">
     <w:nsid w:val="630F0C4E"/>
     <w:multiLevelType w:val="hybridMultilevel"/>
     <w:tmpl w:val="5802DB30"/>
@@ -16673,7 +17447,7 @@
       </w:pPr>
     </w:lvl>
   </w:abstractNum>
-  <w:abstractNum w:abstractNumId="31" w15:restartNumberingAfterBreak="0">
+  <w:abstractNum w:abstractNumId="33" w15:restartNumberingAfterBreak="0">
     <w:nsid w:val="6409798E"/>
     <w:multiLevelType w:val="hybridMultilevel"/>
     <w:tmpl w:val="F942E5A6"/>
@@ -16759,7 +17533,7 @@
       </w:pPr>
     </w:lvl>
   </w:abstractNum>
-  <w:abstractNum w:abstractNumId="32" w15:restartNumberingAfterBreak="0">
+  <w:abstractNum w:abstractNumId="34" w15:restartNumberingAfterBreak="0">
     <w:nsid w:val="6A825466"/>
     <w:multiLevelType w:val="hybridMultilevel"/>
     <w:tmpl w:val="D4123C9C"/>
@@ -16845,7 +17619,7 @@
       </w:pPr>
     </w:lvl>
   </w:abstractNum>
-  <w:abstractNum w:abstractNumId="33" w15:restartNumberingAfterBreak="0">
+  <w:abstractNum w:abstractNumId="35" w15:restartNumberingAfterBreak="0">
     <w:nsid w:val="72EA5DBF"/>
     <w:multiLevelType w:val="hybridMultilevel"/>
     <w:tmpl w:val="671AAB8E"/>
@@ -16931,7 +17705,7 @@
       </w:pPr>
     </w:lvl>
   </w:abstractNum>
-  <w:abstractNum w:abstractNumId="34" w15:restartNumberingAfterBreak="0">
+  <w:abstractNum w:abstractNumId="36" w15:restartNumberingAfterBreak="0">
     <w:nsid w:val="754B7DA2"/>
     <w:multiLevelType w:val="hybridMultilevel"/>
     <w:tmpl w:val="09E87C36"/>
@@ -17017,7 +17791,7 @@
       </w:pPr>
     </w:lvl>
   </w:abstractNum>
-  <w:abstractNum w:abstractNumId="35" w15:restartNumberingAfterBreak="0">
+  <w:abstractNum w:abstractNumId="37" w15:restartNumberingAfterBreak="0">
     <w:nsid w:val="75BC0870"/>
     <w:multiLevelType w:val="hybridMultilevel"/>
     <w:tmpl w:val="C186C898"/>
@@ -17106,7 +17880,7 @@
       </w:pPr>
     </w:lvl>
   </w:abstractNum>
-  <w:abstractNum w:abstractNumId="36" w15:restartNumberingAfterBreak="0">
+  <w:abstractNum w:abstractNumId="38" w15:restartNumberingAfterBreak="0">
     <w:nsid w:val="787D215D"/>
     <w:multiLevelType w:val="hybridMultilevel"/>
     <w:tmpl w:val="6E66E1B4"/>
@@ -17195,7 +17969,7 @@
       </w:pPr>
     </w:lvl>
   </w:abstractNum>
-  <w:abstractNum w:abstractNumId="37" w15:restartNumberingAfterBreak="0">
+  <w:abstractNum w:abstractNumId="39" w15:restartNumberingAfterBreak="0">
     <w:nsid w:val="7B8D34CF"/>
     <w:multiLevelType w:val="multilevel"/>
     <w:tmpl w:val="702834C8"/>
@@ -17345,118 +18119,124 @@
     </w:lvl>
   </w:abstractNum>
   <w:num w:numId="1" w16cid:durableId="738789515">
-    <w:abstractNumId w:val="23"/>
+    <w:abstractNumId w:val="25"/>
   </w:num>
   <w:num w:numId="2" w16cid:durableId="1235513339">
     <w:abstractNumId w:val="1"/>
   </w:num>
   <w:num w:numId="3" w16cid:durableId="288970933">
-    <w:abstractNumId w:val="27"/>
+    <w:abstractNumId w:val="29"/>
   </w:num>
   <w:num w:numId="4" w16cid:durableId="1934975148">
     <w:abstractNumId w:val="0"/>
   </w:num>
   <w:num w:numId="5" w16cid:durableId="284432453">
-    <w:abstractNumId w:val="10"/>
+    <w:abstractNumId w:val="11"/>
   </w:num>
   <w:num w:numId="6" w16cid:durableId="1475290958">
     <w:abstractNumId w:val="2"/>
   </w:num>
   <w:num w:numId="7" w16cid:durableId="674764127">
+    <w:abstractNumId w:val="39"/>
+  </w:num>
+  <w:num w:numId="8" w16cid:durableId="1366904678">
+    <w:abstractNumId w:val="23"/>
+  </w:num>
+  <w:num w:numId="9" w16cid:durableId="67462260">
+    <w:abstractNumId w:val="31"/>
+  </w:num>
+  <w:num w:numId="10" w16cid:durableId="364210400">
+    <w:abstractNumId w:val="16"/>
+  </w:num>
+  <w:num w:numId="11" w16cid:durableId="7296056">
+    <w:abstractNumId w:val="20"/>
+  </w:num>
+  <w:num w:numId="12" w16cid:durableId="1654406166">
+    <w:abstractNumId w:val="33"/>
+  </w:num>
+  <w:num w:numId="13" w16cid:durableId="1484928062">
+    <w:abstractNumId w:val="36"/>
+  </w:num>
+  <w:num w:numId="14" w16cid:durableId="504519595">
+    <w:abstractNumId w:val="26"/>
+  </w:num>
+  <w:num w:numId="15" w16cid:durableId="1046217917">
+    <w:abstractNumId w:val="8"/>
+  </w:num>
+  <w:num w:numId="16" w16cid:durableId="2125348581">
+    <w:abstractNumId w:val="9"/>
+  </w:num>
+  <w:num w:numId="17" w16cid:durableId="1482194571">
+    <w:abstractNumId w:val="28"/>
+  </w:num>
+  <w:num w:numId="18" w16cid:durableId="1378116358">
+    <w:abstractNumId w:val="18"/>
+  </w:num>
+  <w:num w:numId="19" w16cid:durableId="1622763665">
+    <w:abstractNumId w:val="24"/>
+  </w:num>
+  <w:num w:numId="20" w16cid:durableId="512308396">
     <w:abstractNumId w:val="37"/>
   </w:num>
-  <w:num w:numId="8" w16cid:durableId="1366904678">
-    <w:abstractNumId w:val="21"/>
+  <w:num w:numId="21" w16cid:durableId="1400396216">
+    <w:abstractNumId w:val="13"/>
   </w:num>
-  <w:num w:numId="9" w16cid:durableId="67462260">
-    <w:abstractNumId w:val="29"/>
+  <w:num w:numId="22" w16cid:durableId="1687050894">
+    <w:abstractNumId w:val="22"/>
   </w:num>
-  <w:num w:numId="10" w16cid:durableId="364210400">
+  <w:num w:numId="23" w16cid:durableId="958221247">
+    <w:abstractNumId w:val="10"/>
+  </w:num>
+  <w:num w:numId="24" w16cid:durableId="1303314634">
+    <w:abstractNumId w:val="32"/>
+  </w:num>
+  <w:num w:numId="25" w16cid:durableId="9142093">
+    <w:abstractNumId w:val="35"/>
+  </w:num>
+  <w:num w:numId="26" w16cid:durableId="1458911845">
     <w:abstractNumId w:val="15"/>
   </w:num>
-  <w:num w:numId="11" w16cid:durableId="7296056">
+  <w:num w:numId="27" w16cid:durableId="2118016731">
+    <w:abstractNumId w:val="5"/>
+  </w:num>
+  <w:num w:numId="28" w16cid:durableId="2138251279">
+    <w:abstractNumId w:val="4"/>
+  </w:num>
+  <w:num w:numId="29" w16cid:durableId="2097509124">
     <w:abstractNumId w:val="19"/>
   </w:num>
-  <w:num w:numId="12" w16cid:durableId="1654406166">
-    <w:abstractNumId w:val="31"/>
+  <w:num w:numId="30" w16cid:durableId="2101440695">
+    <w:abstractNumId w:val="38"/>
   </w:num>
-  <w:num w:numId="13" w16cid:durableId="1484928062">
+  <w:num w:numId="31" w16cid:durableId="109252585">
+    <w:abstractNumId w:val="7"/>
+  </w:num>
+  <w:num w:numId="32" w16cid:durableId="472599006">
+    <w:abstractNumId w:val="6"/>
+  </w:num>
+  <w:num w:numId="33" w16cid:durableId="1115103356">
+    <w:abstractNumId w:val="27"/>
+  </w:num>
+  <w:num w:numId="34" w16cid:durableId="220681117">
     <w:abstractNumId w:val="34"/>
   </w:num>
-  <w:num w:numId="14" w16cid:durableId="504519595">
-    <w:abstractNumId w:val="24"/>
+  <w:num w:numId="35" w16cid:durableId="1176386353">
+    <w:abstractNumId w:val="30"/>
   </w:num>
-  <w:num w:numId="15" w16cid:durableId="1046217917">
-    <w:abstractNumId w:val="7"/>
-  </w:num>
-  <w:num w:numId="16" w16cid:durableId="2125348581">
-    <w:abstractNumId w:val="8"/>
-  </w:num>
-  <w:num w:numId="17" w16cid:durableId="1482194571">
-    <w:abstractNumId w:val="26"/>
-  </w:num>
-  <w:num w:numId="18" w16cid:durableId="1378116358">
+  <w:num w:numId="36" w16cid:durableId="1049376175">
     <w:abstractNumId w:val="17"/>
   </w:num>
-  <w:num w:numId="19" w16cid:durableId="1622763665">
-    <w:abstractNumId w:val="22"/>
+  <w:num w:numId="37" w16cid:durableId="723523505">
+    <w:abstractNumId w:val="14"/>
   </w:num>
-  <w:num w:numId="20" w16cid:durableId="512308396">
-    <w:abstractNumId w:val="35"/>
-  </w:num>
-  <w:num w:numId="21" w16cid:durableId="1400396216">
+  <w:num w:numId="38" w16cid:durableId="1595165128">
     <w:abstractNumId w:val="12"/>
   </w:num>
-  <w:num w:numId="22" w16cid:durableId="1687050894">
-    <w:abstractNumId w:val="20"/>
-  </w:num>
-  <w:num w:numId="23" w16cid:durableId="958221247">
-    <w:abstractNumId w:val="9"/>
-  </w:num>
-  <w:num w:numId="24" w16cid:durableId="1303314634">
-    <w:abstractNumId w:val="30"/>
-  </w:num>
-  <w:num w:numId="25" w16cid:durableId="9142093">
-    <w:abstractNumId w:val="33"/>
-  </w:num>
-  <w:num w:numId="26" w16cid:durableId="1458911845">
-    <w:abstractNumId w:val="14"/>
-  </w:num>
-  <w:num w:numId="27" w16cid:durableId="2118016731">
-    <w:abstractNumId w:val="4"/>
-  </w:num>
-  <w:num w:numId="28" w16cid:durableId="2138251279">
+  <w:num w:numId="39" w16cid:durableId="1168903458">
     <w:abstractNumId w:val="3"/>
   </w:num>
-  <w:num w:numId="29" w16cid:durableId="2097509124">
-    <w:abstractNumId w:val="18"/>
-  </w:num>
-  <w:num w:numId="30" w16cid:durableId="2101440695">
-    <w:abstractNumId w:val="36"/>
-  </w:num>
-  <w:num w:numId="31" w16cid:durableId="109252585">
-    <w:abstractNumId w:val="6"/>
-  </w:num>
-  <w:num w:numId="32" w16cid:durableId="472599006">
-    <w:abstractNumId w:val="5"/>
-  </w:num>
-  <w:num w:numId="33" w16cid:durableId="1115103356">
-    <w:abstractNumId w:val="25"/>
-  </w:num>
-  <w:num w:numId="34" w16cid:durableId="220681117">
-    <w:abstractNumId w:val="32"/>
-  </w:num>
-  <w:num w:numId="35" w16cid:durableId="1176386353">
-    <w:abstractNumId w:val="28"/>
-  </w:num>
-  <w:num w:numId="36" w16cid:durableId="1049376175">
-    <w:abstractNumId w:val="16"/>
-  </w:num>
-  <w:num w:numId="37" w16cid:durableId="723523505">
-    <w:abstractNumId w:val="13"/>
-  </w:num>
-  <w:num w:numId="38" w16cid:durableId="1595165128">
-    <w:abstractNumId w:val="11"/>
+  <w:num w:numId="40" w16cid:durableId="611862714">
+    <w:abstractNumId w:val="21"/>
   </w:num>
 </w:numbering>
 </file>

</xml_diff>

<commit_message>
Update notes: 08-09-2026 14:35
</commit_message>
<xml_diff>
--- a/Financial Mathematics/notes.docx
+++ b/Financial Mathematics/notes.docx
@@ -14320,12 +14320,1382 @@
         </w:rPr>
         <w:t>The expected return is 17.5% which greateer that the required rate of return (12%) also the current market price Rs. 40, which is less thatn 58.33which shows the stock is undervalued so it is worth buying.</w:t>
       </w:r>
-      <w:r>
-        <w:rPr>
-          <w:rFonts w:eastAsiaTheme="minorEastAsia"/>
+    </w:p>
+    <w:p>
+      <w:pPr>
+        <w:rPr>
+          <w:rFonts w:eastAsiaTheme="minorEastAsia"/>
+        </w:rPr>
+      </w:pPr>
+    </w:p>
+    <w:p>
+      <w:pPr>
+        <w:rPr>
+          <w:rFonts w:eastAsiaTheme="minorEastAsia"/>
+        </w:rPr>
+      </w:pPr>
+    </w:p>
+    <w:p>
+      <w:pPr>
+        <w:rPr>
+          <w:rFonts w:eastAsiaTheme="minorEastAsia"/>
+        </w:rPr>
+      </w:pPr>
+      <w:r>
+        <w:rPr>
+          <w:rFonts w:eastAsiaTheme="minorEastAsia"/>
+        </w:rPr>
+        <w:t>08/09/2026</w:t>
+      </w:r>
+    </w:p>
+    <w:p>
+      <w:pPr>
+        <w:rPr>
+          <w:rFonts w:eastAsiaTheme="minorEastAsia"/>
+        </w:rPr>
+      </w:pPr>
+    </w:p>
+    <w:p>
+      <w:pPr>
+        <w:pStyle w:val="ListParagraph"/>
+        <w:numPr>
+          <w:ilvl w:val="0"/>
+          <w:numId w:val="36"/>
+        </w:numPr>
+        <w:rPr>
+          <w:rFonts w:eastAsiaTheme="minorEastAsia"/>
+        </w:rPr>
+      </w:pPr>
+      <w:r>
+        <w:rPr>
+          <w:rFonts w:eastAsiaTheme="minorEastAsia"/>
+        </w:rPr>
+        <w:t>Yield to Maturity (Redemption yield)</w:t>
+      </w:r>
+    </w:p>
+    <w:p>
+      <w:pPr>
+        <w:rPr>
+          <w:rFonts w:eastAsiaTheme="minorEastAsia"/>
+        </w:rPr>
+      </w:pPr>
+      <w:r>
+        <w:rPr>
+          <w:rFonts w:eastAsiaTheme="minorEastAsia"/>
+        </w:rPr>
+        <w:t>It includes:</w:t>
+      </w:r>
+    </w:p>
+    <w:p>
+      <w:pPr>
+        <w:pStyle w:val="ListParagraph"/>
+        <w:numPr>
+          <w:ilvl w:val="0"/>
+          <w:numId w:val="41"/>
+        </w:numPr>
+        <w:rPr>
+          <w:rFonts w:eastAsiaTheme="minorEastAsia"/>
+        </w:rPr>
+      </w:pPr>
+      <w:r>
+        <w:rPr>
+          <w:rFonts w:eastAsiaTheme="minorEastAsia"/>
+        </w:rPr>
+        <w:t xml:space="preserve">Payment of annual rate of dividend </w:t>
+      </w:r>
+    </w:p>
+    <w:p>
+      <w:pPr>
+        <w:pStyle w:val="ListParagraph"/>
+        <w:numPr>
+          <w:ilvl w:val="0"/>
+          <w:numId w:val="41"/>
+        </w:numPr>
+        <w:rPr>
+          <w:rFonts w:eastAsiaTheme="minorEastAsia"/>
+        </w:rPr>
+      </w:pPr>
+      <w:r>
+        <w:rPr>
+          <w:rFonts w:eastAsiaTheme="minorEastAsia"/>
+        </w:rPr>
+        <w:t>Average annual appreciation (both represents)</w:t>
+      </w:r>
+    </w:p>
+    <w:p>
+      <w:pPr>
+        <w:pStyle w:val="ListParagraph"/>
+        <w:rPr>
+          <w:rFonts w:eastAsiaTheme="minorEastAsia"/>
+        </w:rPr>
+      </w:pPr>
+      <w:r>
+        <w:rPr>
+          <w:rFonts w:eastAsiaTheme="minorEastAsia"/>
+        </w:rPr>
+        <w:t>Difference between the face value of a security and its purchase value</w:t>
+      </w:r>
+    </w:p>
+    <w:p>
+      <w:pPr>
+        <w:rPr>
+          <w:rFonts w:eastAsiaTheme="minorEastAsia"/>
+        </w:rPr>
+      </w:pPr>
+      <w:r>
+        <w:rPr>
+          <w:rFonts w:eastAsiaTheme="minorEastAsia"/>
+        </w:rPr>
+        <w:t>Formula:</w:t>
+      </w:r>
+    </w:p>
+    <w:p>
+      <w:pPr>
+        <w:rPr>
+          <w:rFonts w:eastAsiaTheme="minorEastAsia"/>
+        </w:rPr>
+      </w:pPr>
+      <m:oMathPara>
+        <m:oMath>
+          <m:r>
+            <w:rPr>
+              <w:rFonts w:ascii="Cambria Math" w:eastAsiaTheme="minorEastAsia" w:hAnsi="Cambria Math"/>
+            </w:rPr>
+            <m:t xml:space="preserve">Holding period return = </m:t>
+          </m:r>
+          <m:f>
+            <m:fPr>
+              <m:ctrlPr>
+                <w:rPr>
+                  <w:rFonts w:ascii="Cambria Math" w:eastAsiaTheme="minorEastAsia" w:hAnsi="Cambria Math"/>
+                  <w:i/>
+                </w:rPr>
+              </m:ctrlPr>
+            </m:fPr>
+            <m:num>
+              <m:sSub>
+                <m:sSubPr>
+                  <m:ctrlPr>
+                    <w:rPr>
+                      <w:rFonts w:ascii="Cambria Math" w:eastAsiaTheme="minorEastAsia" w:hAnsi="Cambria Math"/>
+                      <w:i/>
+                    </w:rPr>
+                  </m:ctrlPr>
+                </m:sSubPr>
+                <m:e>
+                  <m:r>
+                    <w:rPr>
+                      <w:rFonts w:ascii="Cambria Math" w:eastAsiaTheme="minorEastAsia" w:hAnsi="Cambria Math"/>
+                    </w:rPr>
+                    <m:t>D</m:t>
+                  </m:r>
+                </m:e>
+                <m:sub>
+                  <m:r>
+                    <w:rPr>
+                      <w:rFonts w:ascii="Cambria Math" w:eastAsiaTheme="minorEastAsia" w:hAnsi="Cambria Math"/>
+                    </w:rPr>
+                    <m:t>k</m:t>
+                  </m:r>
+                </m:sub>
+              </m:sSub>
+              <m:r>
+                <w:rPr>
+                  <w:rFonts w:ascii="Cambria Math" w:eastAsiaTheme="minorEastAsia" w:hAnsi="Cambria Math"/>
+                </w:rPr>
+                <m:t>+∆P</m:t>
+              </m:r>
+            </m:num>
+            <m:den>
+              <m:sSub>
+                <m:sSubPr>
+                  <m:ctrlPr>
+                    <w:rPr>
+                      <w:rFonts w:ascii="Cambria Math" w:eastAsiaTheme="minorEastAsia" w:hAnsi="Cambria Math"/>
+                      <w:i/>
+                    </w:rPr>
+                  </m:ctrlPr>
+                </m:sSubPr>
+                <m:e>
+                  <m:r>
+                    <w:rPr>
+                      <w:rFonts w:ascii="Cambria Math" w:eastAsiaTheme="minorEastAsia" w:hAnsi="Cambria Math"/>
+                    </w:rPr>
+                    <m:t>P</m:t>
+                  </m:r>
+                </m:e>
+                <m:sub>
+                  <m:r>
+                    <w:rPr>
+                      <w:rFonts w:ascii="Cambria Math" w:eastAsiaTheme="minorEastAsia" w:hAnsi="Cambria Math"/>
+                    </w:rPr>
+                    <m:t>1</m:t>
+                  </m:r>
+                </m:sub>
+              </m:sSub>
+            </m:den>
+          </m:f>
+        </m:oMath>
+      </m:oMathPara>
+    </w:p>
+    <w:p>
+      <w:pPr>
+        <w:rPr>
+          <w:rFonts w:eastAsiaTheme="minorEastAsia"/>
+        </w:rPr>
+      </w:pPr>
+      <m:oMathPara>
+        <m:oMathParaPr>
+          <m:jc m:val="left"/>
+        </m:oMathParaPr>
+        <m:oMath>
+          <m:sSub>
+            <m:sSubPr>
+              <m:ctrlPr>
+                <w:rPr>
+                  <w:rFonts w:ascii="Cambria Math" w:eastAsiaTheme="minorEastAsia" w:hAnsi="Cambria Math"/>
+                  <w:i/>
+                </w:rPr>
+              </m:ctrlPr>
+            </m:sSubPr>
+            <m:e>
+              <m:r>
+                <w:rPr>
+                  <w:rFonts w:ascii="Cambria Math" w:eastAsiaTheme="minorEastAsia" w:hAnsi="Cambria Math"/>
+                </w:rPr>
+                <m:t>D</m:t>
+              </m:r>
+            </m:e>
+            <m:sub>
+              <m:r>
+                <w:rPr>
+                  <w:rFonts w:ascii="Cambria Math" w:eastAsiaTheme="minorEastAsia" w:hAnsi="Cambria Math"/>
+                </w:rPr>
+                <m:t>t</m:t>
+              </m:r>
+            </m:sub>
+          </m:sSub>
+          <m:r>
+            <w:rPr>
+              <w:rFonts w:ascii="Cambria Math" w:eastAsiaTheme="minorEastAsia" w:hAnsi="Cambria Math"/>
+            </w:rPr>
+            <m:t xml:space="preserve"> = dividend to be paid during the planned investment period </m:t>
+          </m:r>
+        </m:oMath>
+      </m:oMathPara>
+    </w:p>
+    <w:p>
+      <w:pPr>
+        <w:rPr>
+          <w:rFonts w:eastAsiaTheme="minorEastAsia"/>
+        </w:rPr>
+      </w:pPr>
+      <m:oMathPara>
+        <m:oMathParaPr>
+          <m:jc m:val="left"/>
+        </m:oMathParaPr>
+        <m:oMath>
+          <m:sSub>
+            <m:sSubPr>
+              <m:ctrlPr>
+                <w:rPr>
+                  <w:rFonts w:ascii="Cambria Math" w:eastAsiaTheme="minorEastAsia" w:hAnsi="Cambria Math"/>
+                  <w:i/>
+                </w:rPr>
+              </m:ctrlPr>
+            </m:sSubPr>
+            <m:e>
+              <m:r>
+                <w:rPr>
+                  <w:rFonts w:ascii="Cambria Math" w:eastAsiaTheme="minorEastAsia" w:hAnsi="Cambria Math"/>
+                </w:rPr>
+                <m:t>P</m:t>
+              </m:r>
+            </m:e>
+            <m:sub>
+              <m:r>
+                <w:rPr>
+                  <w:rFonts w:ascii="Cambria Math" w:eastAsiaTheme="minorEastAsia" w:hAnsi="Cambria Math"/>
+                </w:rPr>
+                <m:t>1</m:t>
+              </m:r>
+            </m:sub>
+          </m:sSub>
+          <m:r>
+            <w:rPr>
+              <w:rFonts w:ascii="Cambria Math" w:eastAsiaTheme="minorEastAsia" w:hAnsi="Cambria Math"/>
+            </w:rPr>
+            <m:t>= initial price</m:t>
+          </m:r>
+        </m:oMath>
+      </m:oMathPara>
+    </w:p>
+    <w:p>
+      <w:pPr>
+        <w:rPr>
+          <w:rFonts w:eastAsiaTheme="minorEastAsia"/>
+        </w:rPr>
+      </w:pPr>
+      <m:oMathPara>
+        <m:oMathParaPr>
+          <m:jc m:val="left"/>
+        </m:oMathParaPr>
+        <m:oMath>
+          <m:sSub>
+            <m:sSubPr>
+              <m:ctrlPr>
+                <w:rPr>
+                  <w:rFonts w:ascii="Cambria Math" w:eastAsiaTheme="minorEastAsia" w:hAnsi="Cambria Math"/>
+                  <w:i/>
+                </w:rPr>
+              </m:ctrlPr>
+            </m:sSubPr>
+            <m:e>
+              <m:r>
+                <w:rPr>
+                  <w:rFonts w:ascii="Cambria Math" w:eastAsiaTheme="minorEastAsia" w:hAnsi="Cambria Math"/>
+                </w:rPr>
+                <m:t>P</m:t>
+              </m:r>
+            </m:e>
+            <m:sub>
+              <m:r>
+                <w:rPr>
+                  <w:rFonts w:ascii="Cambria Math" w:eastAsiaTheme="minorEastAsia" w:hAnsi="Cambria Math"/>
+                </w:rPr>
+                <m:t>t</m:t>
+              </m:r>
+            </m:sub>
+          </m:sSub>
+          <m:r>
+            <w:rPr>
+              <w:rFonts w:ascii="Cambria Math" w:eastAsiaTheme="minorEastAsia" w:hAnsi="Cambria Math"/>
+            </w:rPr>
+            <m:t>=terminal price</m:t>
+          </m:r>
+        </m:oMath>
+      </m:oMathPara>
+    </w:p>
+    <w:p>
+      <w:pPr>
+        <w:rPr>
+          <w:rFonts w:eastAsiaTheme="minorEastAsia"/>
+        </w:rPr>
+      </w:pPr>
+      <m:oMathPara>
+        <m:oMathParaPr>
+          <m:jc m:val="left"/>
+        </m:oMathParaPr>
+        <m:oMath>
+          <m:r>
+            <w:rPr>
+              <w:rFonts w:ascii="Cambria Math" w:eastAsiaTheme="minorEastAsia" w:hAnsi="Cambria Math"/>
+            </w:rPr>
+            <m:t>∆P=changeinpriceduringtheplannedinvestmentperiod</m:t>
+          </m:r>
+        </m:oMath>
+      </m:oMathPara>
+    </w:p>
+    <w:p>
+      <w:pPr>
+        <w:rPr>
+          <w:rFonts w:eastAsiaTheme="minorEastAsia"/>
+        </w:rPr>
+      </w:pPr>
+    </w:p>
+    <w:p>
+      <w:pPr>
+        <w:pStyle w:val="ListParagraph"/>
+        <w:numPr>
+          <w:ilvl w:val="0"/>
+          <w:numId w:val="36"/>
+        </w:numPr>
+        <w:rPr>
+          <w:rFonts w:eastAsiaTheme="minorEastAsia"/>
+        </w:rPr>
+      </w:pPr>
+      <w:r>
+        <w:rPr>
+          <w:rFonts w:eastAsiaTheme="minorEastAsia"/>
+        </w:rPr>
+        <w:t>Earnings yield</w:t>
+      </w:r>
+    </w:p>
+    <w:p>
+      <w:pPr>
+        <w:rPr>
+          <w:rFonts w:eastAsiaTheme="minorEastAsia"/>
+        </w:rPr>
+      </w:pPr>
+      <w:r>
+        <w:rPr>
+          <w:rFonts w:eastAsiaTheme="minorEastAsia"/>
+        </w:rPr>
+        <w:t>Earnings yield is the amount is adjustable as earnings to the shareholders of each shares in proportion to the market price of their share.</w:t>
+      </w:r>
+    </w:p>
+    <w:p>
+      <w:pPr>
+        <w:rPr>
+          <w:rFonts w:eastAsiaTheme="minorEastAsia"/>
+        </w:rPr>
+      </w:pPr>
+    </w:p>
+    <w:p>
+      <w:pPr>
+        <w:rPr>
+          <w:rFonts w:eastAsiaTheme="minorEastAsia"/>
+        </w:rPr>
+      </w:pPr>
+      <w:r>
+        <w:rPr>
+          <w:rFonts w:eastAsiaTheme="minorEastAsia"/>
+        </w:rPr>
+        <w:t>Two types of yield</w:t>
+      </w:r>
+    </w:p>
+    <w:p>
+      <w:pPr>
+        <w:pStyle w:val="ListParagraph"/>
+        <w:numPr>
+          <w:ilvl w:val="0"/>
+          <w:numId w:val="42"/>
+        </w:numPr>
+        <w:rPr>
+          <w:rFonts w:eastAsiaTheme="minorEastAsia"/>
+        </w:rPr>
+      </w:pPr>
+      <w:r>
+        <w:rPr>
+          <w:rFonts w:eastAsiaTheme="minorEastAsia"/>
+        </w:rPr>
+        <w:t>Gross yield: to calculate the cost of capital</w:t>
+      </w:r>
+    </w:p>
+    <w:p>
+      <w:pPr>
+        <w:pStyle w:val="ListParagraph"/>
+        <w:numPr>
+          <w:ilvl w:val="0"/>
+          <w:numId w:val="42"/>
+        </w:numPr>
+        <w:rPr>
+          <w:rFonts w:eastAsiaTheme="minorEastAsia"/>
+        </w:rPr>
+      </w:pPr>
+      <w:r>
+        <w:rPr>
+          <w:rFonts w:eastAsiaTheme="minorEastAsia"/>
+        </w:rPr>
+        <w:t xml:space="preserve">Net yield: is used to determine the effective rate of return of an investor </w:t>
+      </w:r>
+    </w:p>
+    <w:p>
+      <w:pPr>
+        <w:rPr>
+          <w:rFonts w:eastAsiaTheme="minorEastAsia"/>
+        </w:rPr>
+      </w:pPr>
+    </w:p>
+    <w:p>
+      <w:pPr>
+        <w:rPr>
+          <w:rFonts w:eastAsiaTheme="minorEastAsia"/>
+        </w:rPr>
+      </w:pPr>
+      <w:r>
+        <w:rPr>
+          <w:rFonts w:eastAsiaTheme="minorEastAsia"/>
+        </w:rPr>
+        <w:t>Valuation of Equity Shares</w:t>
+      </w:r>
+    </w:p>
+    <w:p>
+      <w:pPr>
+        <w:rPr>
+          <w:rFonts w:eastAsiaTheme="minorEastAsia"/>
+        </w:rPr>
+      </w:pPr>
+      <w:r>
+        <w:rPr>
+          <w:rFonts w:eastAsiaTheme="minorEastAsia"/>
+        </w:rPr>
+        <w:t xml:space="preserve">Methods of valuation of equity shares or approaches </w:t>
+      </w:r>
+    </w:p>
+    <w:p>
+      <w:pPr>
+        <w:pStyle w:val="ListParagraph"/>
+        <w:numPr>
+          <w:ilvl w:val="0"/>
+          <w:numId w:val="43"/>
+        </w:numPr>
+        <w:rPr>
+          <w:rFonts w:eastAsiaTheme="minorEastAsia"/>
+        </w:rPr>
+      </w:pPr>
+      <w:r>
+        <w:rPr>
+          <w:rFonts w:eastAsiaTheme="minorEastAsia"/>
+        </w:rPr>
+        <w:t>Valuation based on accounting information</w:t>
+      </w:r>
+    </w:p>
+    <w:p>
+      <w:pPr>
+        <w:pStyle w:val="ListParagraph"/>
+        <w:numPr>
+          <w:ilvl w:val="1"/>
+          <w:numId w:val="43"/>
+        </w:numPr>
+        <w:rPr>
+          <w:rFonts w:eastAsiaTheme="minorEastAsia"/>
+        </w:rPr>
+      </w:pPr>
+      <w:r>
+        <w:rPr>
+          <w:rFonts w:eastAsiaTheme="minorEastAsia"/>
+        </w:rPr>
+        <w:t>Book value or balance sheet value</w:t>
+      </w:r>
+    </w:p>
+    <w:p>
+      <w:pPr>
+        <w:pStyle w:val="ListParagraph"/>
+        <w:numPr>
+          <w:ilvl w:val="1"/>
+          <w:numId w:val="43"/>
+        </w:numPr>
+        <w:rPr>
+          <w:rFonts w:eastAsiaTheme="minorEastAsia"/>
+        </w:rPr>
+      </w:pPr>
+      <w:r>
+        <w:rPr>
+          <w:rFonts w:eastAsiaTheme="minorEastAsia"/>
+        </w:rPr>
+        <w:t>Liquidation or realisable value</w:t>
+      </w:r>
+    </w:p>
+    <w:p>
+      <w:pPr>
+        <w:pStyle w:val="ListParagraph"/>
+        <w:numPr>
+          <w:ilvl w:val="0"/>
+          <w:numId w:val="43"/>
+        </w:numPr>
+        <w:rPr>
+          <w:rFonts w:eastAsiaTheme="minorEastAsia"/>
+        </w:rPr>
+      </w:pPr>
+      <w:r>
+        <w:rPr>
+          <w:rFonts w:eastAsiaTheme="minorEastAsia"/>
+        </w:rPr>
+        <w:t>Valuation based on dividends</w:t>
+      </w:r>
+    </w:p>
+    <w:p>
+      <w:pPr>
+        <w:pStyle w:val="ListParagraph"/>
+        <w:numPr>
+          <w:ilvl w:val="0"/>
+          <w:numId w:val="43"/>
+        </w:numPr>
+        <w:rPr>
+          <w:rFonts w:eastAsiaTheme="minorEastAsia"/>
+        </w:rPr>
+      </w:pPr>
+      <w:r>
+        <w:rPr>
+          <w:rFonts w:eastAsiaTheme="minorEastAsia"/>
+        </w:rPr>
+        <w:t>Valuation based on discounted cash flows</w:t>
+      </w:r>
+    </w:p>
+    <w:p>
+      <w:pPr>
+        <w:pStyle w:val="ListParagraph"/>
+        <w:numPr>
+          <w:ilvl w:val="1"/>
+          <w:numId w:val="43"/>
+        </w:numPr>
+        <w:rPr>
+          <w:rFonts w:eastAsiaTheme="minorEastAsia"/>
+        </w:rPr>
+      </w:pPr>
+      <w:r>
+        <w:rPr>
+          <w:rFonts w:eastAsiaTheme="minorEastAsia"/>
+        </w:rPr>
+        <w:t>Valuation based on operating cashflows</w:t>
+      </w:r>
+    </w:p>
+    <w:p>
+      <w:pPr>
+        <w:pStyle w:val="ListParagraph"/>
+        <w:numPr>
+          <w:ilvl w:val="1"/>
+          <w:numId w:val="43"/>
+        </w:numPr>
+        <w:rPr>
+          <w:rFonts w:eastAsiaTheme="minorEastAsia"/>
+        </w:rPr>
+      </w:pPr>
+      <w:r>
+        <w:rPr>
+          <w:rFonts w:eastAsiaTheme="minorEastAsia"/>
+        </w:rPr>
+        <w:t xml:space="preserve">Valuation based on free cash flows for equity </w:t>
+      </w:r>
+    </w:p>
+    <w:p>
+      <w:pPr>
+        <w:pStyle w:val="ListParagraph"/>
+        <w:numPr>
+          <w:ilvl w:val="0"/>
+          <w:numId w:val="43"/>
+        </w:numPr>
+        <w:rPr>
+          <w:rFonts w:eastAsiaTheme="minorEastAsia"/>
+        </w:rPr>
+      </w:pPr>
+      <w:r>
+        <w:rPr>
+          <w:rFonts w:eastAsiaTheme="minorEastAsia"/>
+        </w:rPr>
+        <w:t>Specific valution models</w:t>
+      </w:r>
+    </w:p>
+    <w:p>
+      <w:pPr>
+        <w:pStyle w:val="ListParagraph"/>
+        <w:numPr>
+          <w:ilvl w:val="1"/>
+          <w:numId w:val="43"/>
+        </w:numPr>
+        <w:rPr>
+          <w:rFonts w:eastAsiaTheme="minorEastAsia"/>
+        </w:rPr>
+      </w:pPr>
+      <w:r>
+        <w:rPr>
+          <w:rFonts w:eastAsiaTheme="minorEastAsia"/>
+        </w:rPr>
+        <w:t>Gordon’s models</w:t>
+      </w:r>
+    </w:p>
+    <w:p>
+      <w:pPr>
+        <w:pStyle w:val="ListParagraph"/>
+        <w:numPr>
+          <w:ilvl w:val="1"/>
+          <w:numId w:val="43"/>
+        </w:numPr>
+        <w:rPr>
+          <w:rFonts w:eastAsiaTheme="minorEastAsia"/>
+        </w:rPr>
+      </w:pPr>
+      <w:r>
+        <w:rPr>
+          <w:rFonts w:eastAsiaTheme="minorEastAsia"/>
+        </w:rPr>
+        <w:t>Walter’s model</w:t>
+      </w:r>
+    </w:p>
+    <w:p>
+      <w:pPr>
+        <w:pStyle w:val="ListParagraph"/>
+        <w:numPr>
+          <w:ilvl w:val="1"/>
+          <w:numId w:val="43"/>
+        </w:numPr>
+        <w:rPr>
+          <w:rFonts w:eastAsiaTheme="minorEastAsia"/>
+        </w:rPr>
+      </w:pPr>
+      <w:r>
+        <w:rPr>
+          <w:rFonts w:eastAsiaTheme="minorEastAsia"/>
+        </w:rPr>
+        <w:t>Modigilani</w:t>
+      </w:r>
+      <w:r>
+        <w:rPr>
+          <w:rFonts w:eastAsiaTheme="minorEastAsia"/>
+        </w:rPr>
+        <w:t xml:space="preserve"> miller model</w:t>
+      </w:r>
+    </w:p>
+    <w:p>
+      <w:pPr>
+        <w:pStyle w:val="ListParagraph"/>
+        <w:numPr>
+          <w:ilvl w:val="0"/>
+          <w:numId w:val="43"/>
+        </w:numPr>
+        <w:rPr>
+          <w:rFonts w:eastAsiaTheme="minorEastAsia"/>
+        </w:rPr>
+      </w:pPr>
+      <w:r>
+        <w:rPr>
+          <w:rFonts w:eastAsiaTheme="minorEastAsia"/>
+        </w:rPr>
+        <w:t>Relative valuation methods</w:t>
+      </w:r>
+    </w:p>
+    <w:p>
+      <w:pPr>
+        <w:pStyle w:val="ListParagraph"/>
+        <w:numPr>
+          <w:ilvl w:val="1"/>
+          <w:numId w:val="43"/>
+        </w:numPr>
+        <w:rPr>
+          <w:rFonts w:eastAsiaTheme="minorEastAsia"/>
+        </w:rPr>
+      </w:pPr>
+      <w:r>
+        <w:rPr>
+          <w:rFonts w:eastAsiaTheme="minorEastAsia"/>
+        </w:rPr>
+        <w:t>Price-earning ratio (PE)</w:t>
+      </w:r>
+    </w:p>
+    <w:p>
+      <w:pPr>
+        <w:pStyle w:val="ListParagraph"/>
+        <w:numPr>
+          <w:ilvl w:val="1"/>
+          <w:numId w:val="43"/>
+        </w:numPr>
+        <w:rPr>
+          <w:rFonts w:eastAsiaTheme="minorEastAsia"/>
+        </w:rPr>
+      </w:pPr>
+      <w:r>
+        <w:rPr>
+          <w:rFonts w:eastAsiaTheme="minorEastAsia"/>
+        </w:rPr>
+        <w:t>Price to book value ratio</w:t>
+      </w:r>
+    </w:p>
+    <w:p>
+      <w:pPr>
+        <w:pStyle w:val="ListParagraph"/>
+        <w:numPr>
+          <w:ilvl w:val="1"/>
+          <w:numId w:val="43"/>
+        </w:numPr>
+        <w:rPr>
+          <w:rFonts w:eastAsiaTheme="minorEastAsia"/>
+        </w:rPr>
+      </w:pPr>
+      <w:r>
+        <w:rPr>
+          <w:rFonts w:eastAsiaTheme="minorEastAsia"/>
+        </w:rPr>
+        <w:t>Price to sales ratio</w:t>
+      </w:r>
+    </w:p>
+    <w:p>
+      <w:pPr>
+        <w:rPr>
+          <w:rFonts w:eastAsiaTheme="minorEastAsia"/>
+        </w:rPr>
+      </w:pPr>
+      <w:r>
+        <w:rPr>
+          <w:rFonts w:eastAsiaTheme="minorEastAsia"/>
+        </w:rPr>
+        <w:t>Assumptions:</w:t>
+      </w:r>
+    </w:p>
+    <w:p>
+      <w:pPr>
+        <w:pStyle w:val="ListParagraph"/>
+        <w:numPr>
+          <w:ilvl w:val="0"/>
+          <w:numId w:val="45"/>
+        </w:numPr>
+        <w:rPr>
+          <w:rFonts w:eastAsiaTheme="minorEastAsia"/>
+        </w:rPr>
+      </w:pPr>
+      <w:r>
+        <w:rPr>
+          <w:rFonts w:eastAsiaTheme="minorEastAsia"/>
+        </w:rPr>
+        <w:t>Dividends are paid annually</w:t>
+      </w:r>
+    </w:p>
+    <w:p>
+      <w:pPr>
+        <w:pStyle w:val="ListParagraph"/>
+        <w:numPr>
+          <w:ilvl w:val="0"/>
+          <w:numId w:val="45"/>
+        </w:numPr>
+        <w:rPr>
+          <w:rFonts w:eastAsiaTheme="minorEastAsia"/>
+        </w:rPr>
+      </w:pPr>
+      <w:r>
+        <w:rPr>
+          <w:rFonts w:eastAsiaTheme="minorEastAsia"/>
+        </w:rPr>
+        <w:t xml:space="preserve">The first dividend is received after one year from the date of purchase / acquisition </w:t>
+      </w:r>
+    </w:p>
+    <w:p>
+      <w:pPr>
+        <w:pStyle w:val="ListParagraph"/>
+        <w:numPr>
+          <w:ilvl w:val="0"/>
+          <w:numId w:val="45"/>
+        </w:numPr>
+        <w:rPr>
+          <w:rFonts w:eastAsiaTheme="minorEastAsia"/>
+        </w:rPr>
+      </w:pPr>
+      <w:r>
+        <w:rPr>
+          <w:rFonts w:eastAsiaTheme="minorEastAsia"/>
+        </w:rPr>
+        <w:t xml:space="preserve">The sale of equity share occurs at the end of a year and at the ‘x’ dividend terms </w:t>
+      </w:r>
+    </w:p>
+    <w:p>
+      <w:pPr>
+        <w:rPr>
+          <w:rFonts w:eastAsiaTheme="minorEastAsia"/>
+        </w:rPr>
+      </w:pPr>
+      <m:oMathPara>
+        <m:oMath>
+          <m:sSub>
+            <m:sSubPr>
+              <m:ctrlPr>
+                <w:rPr>
+                  <w:rFonts w:ascii="Cambria Math" w:eastAsiaTheme="minorEastAsia" w:hAnsi="Cambria Math"/>
+                  <w:i/>
+                </w:rPr>
+              </m:ctrlPr>
+            </m:sSubPr>
+            <m:e>
+              <m:r>
+                <w:rPr>
+                  <w:rFonts w:ascii="Cambria Math" w:eastAsiaTheme="minorEastAsia" w:hAnsi="Cambria Math"/>
+                </w:rPr>
+                <m:t>P</m:t>
+              </m:r>
+            </m:e>
+            <m:sub>
+              <m:r>
+                <w:rPr>
+                  <w:rFonts w:ascii="Cambria Math" w:eastAsiaTheme="minorEastAsia" w:hAnsi="Cambria Math"/>
+                </w:rPr>
+                <m:t>0</m:t>
+              </m:r>
+            </m:sub>
+          </m:sSub>
+          <m:r>
+            <w:rPr>
+              <w:rFonts w:ascii="Cambria Math" w:eastAsiaTheme="minorEastAsia" w:hAnsi="Cambria Math"/>
+            </w:rPr>
+            <m:t xml:space="preserve"> = </m:t>
+          </m:r>
+          <m:nary>
+            <m:naryPr>
+              <m:chr m:val="∑"/>
+              <m:limLoc m:val="undOvr"/>
+              <m:ctrlPr>
+                <w:rPr>
+                  <w:rFonts w:ascii="Cambria Math" w:eastAsiaTheme="minorEastAsia" w:hAnsi="Cambria Math"/>
+                  <w:i/>
+                </w:rPr>
+              </m:ctrlPr>
+            </m:naryPr>
+            <m:sub>
+              <m:r>
+                <w:rPr>
+                  <w:rFonts w:ascii="Cambria Math" w:eastAsiaTheme="minorEastAsia" w:hAnsi="Cambria Math"/>
+                </w:rPr>
+                <m:t>i = 1</m:t>
+              </m:r>
+            </m:sub>
+            <m:sup>
+              <m:r>
+                <w:rPr>
+                  <w:rFonts w:ascii="Cambria Math" w:eastAsiaTheme="minorEastAsia" w:hAnsi="Cambria Math"/>
+                </w:rPr>
+                <m:t>n</m:t>
+              </m:r>
+            </m:sup>
+            <m:e>
+              <m:f>
+                <m:fPr>
+                  <m:ctrlPr>
+                    <w:rPr>
+                      <w:rFonts w:ascii="Cambria Math" w:eastAsiaTheme="minorEastAsia" w:hAnsi="Cambria Math"/>
+                      <w:i/>
+                    </w:rPr>
+                  </m:ctrlPr>
+                </m:fPr>
+                <m:num>
+                  <m:sSub>
+                    <m:sSubPr>
+                      <m:ctrlPr>
+                        <w:rPr>
+                          <w:rFonts w:ascii="Cambria Math" w:eastAsiaTheme="minorEastAsia" w:hAnsi="Cambria Math"/>
+                          <w:i/>
+                        </w:rPr>
+                      </m:ctrlPr>
+                    </m:sSubPr>
+                    <m:e>
+                      <m:r>
+                        <w:rPr>
+                          <w:rFonts w:ascii="Cambria Math" w:eastAsiaTheme="minorEastAsia" w:hAnsi="Cambria Math"/>
+                        </w:rPr>
+                        <m:t>D</m:t>
+                      </m:r>
+                    </m:e>
+                    <m:sub>
+                      <m:r>
+                        <w:rPr>
+                          <w:rFonts w:ascii="Cambria Math" w:eastAsiaTheme="minorEastAsia" w:hAnsi="Cambria Math"/>
+                        </w:rPr>
+                        <m:t>n</m:t>
+                      </m:r>
+                    </m:sub>
+                  </m:sSub>
+                </m:num>
+                <m:den>
+                  <m:sSup>
+                    <m:sSupPr>
+                      <m:ctrlPr>
+                        <w:rPr>
+                          <w:rFonts w:ascii="Cambria Math" w:eastAsiaTheme="minorEastAsia" w:hAnsi="Cambria Math"/>
+                          <w:i/>
+                        </w:rPr>
+                      </m:ctrlPr>
+                    </m:sSupPr>
+                    <m:e>
+                      <m:d>
+                        <m:dPr>
+                          <m:ctrlPr>
+                            <w:rPr>
+                              <w:rFonts w:ascii="Cambria Math" w:eastAsiaTheme="minorEastAsia" w:hAnsi="Cambria Math"/>
+                              <w:i/>
+                            </w:rPr>
+                          </m:ctrlPr>
+                        </m:dPr>
+                        <m:e>
+                          <m:r>
+                            <w:rPr>
+                              <w:rFonts w:ascii="Cambria Math" w:eastAsiaTheme="minorEastAsia" w:hAnsi="Cambria Math"/>
+                            </w:rPr>
+                            <m:t>1+</m:t>
+                          </m:r>
+                          <m:sSub>
+                            <m:sSubPr>
+                              <m:ctrlPr>
+                                <w:rPr>
+                                  <w:rFonts w:ascii="Cambria Math" w:eastAsiaTheme="minorEastAsia" w:hAnsi="Cambria Math"/>
+                                  <w:i/>
+                                </w:rPr>
+                              </m:ctrlPr>
+                            </m:sSubPr>
+                            <m:e>
+                              <m:r>
+                                <w:rPr>
+                                  <w:rFonts w:ascii="Cambria Math" w:eastAsiaTheme="minorEastAsia" w:hAnsi="Cambria Math"/>
+                                </w:rPr>
+                                <m:t>K</m:t>
+                              </m:r>
+                            </m:e>
+                            <m:sub>
+                              <m:r>
+                                <w:rPr>
+                                  <w:rFonts w:ascii="Cambria Math" w:eastAsiaTheme="minorEastAsia" w:hAnsi="Cambria Math"/>
+                                </w:rPr>
+                                <m:t>e</m:t>
+                              </m:r>
+                            </m:sub>
+                          </m:sSub>
+                        </m:e>
+                      </m:d>
+                    </m:e>
+                    <m:sup>
+                      <m:r>
+                        <w:rPr>
+                          <w:rFonts w:ascii="Cambria Math" w:eastAsiaTheme="minorEastAsia" w:hAnsi="Cambria Math"/>
+                        </w:rPr>
+                        <m:t>n</m:t>
+                      </m:r>
+                    </m:sup>
+                  </m:sSup>
+                </m:den>
+              </m:f>
+            </m:e>
+          </m:nary>
+        </m:oMath>
+      </m:oMathPara>
+    </w:p>
+    <w:p>
+      <w:pPr>
+        <w:rPr>
+          <w:rFonts w:eastAsiaTheme="minorEastAsia"/>
+        </w:rPr>
+      </w:pPr>
+      <w:r>
+        <w:rPr>
+          <w:rFonts w:eastAsiaTheme="minorEastAsia"/>
+        </w:rPr>
+        <w:t>Where,</w:t>
+      </w:r>
+    </w:p>
+    <w:p>
+      <w:pPr>
+        <w:rPr>
+          <w:rFonts w:eastAsiaTheme="minorEastAsia"/>
+        </w:rPr>
+      </w:pPr>
+      <w:r>
+        <w:rPr>
+          <w:rFonts w:eastAsiaTheme="minorEastAsia"/>
+        </w:rPr>
+        <w:tab/>
+        <w:t>P</w:t>
+      </w:r>
+      <w:r>
+        <w:rPr>
+          <w:rFonts w:eastAsiaTheme="minorEastAsia"/>
+          <w:vertAlign w:val="subscript"/>
+        </w:rPr>
+        <w:t>0</w:t>
+      </w:r>
+      <w:r>
+        <w:rPr>
+          <w:rFonts w:eastAsiaTheme="minorEastAsia"/>
+          <w:vertAlign w:val="subscript"/>
         </w:rPr>
         <w:t xml:space="preserve"> </w:t>
       </w:r>
+      <w:r>
+        <w:rPr>
+          <w:rFonts w:eastAsiaTheme="minorEastAsia"/>
+        </w:rPr>
+        <w:t>= value of the equity share</w:t>
+      </w:r>
+    </w:p>
+    <w:p>
+      <w:pPr>
+        <w:rPr>
+          <w:rFonts w:eastAsiaTheme="minorEastAsia"/>
+        </w:rPr>
+      </w:pPr>
+      <w:r>
+        <w:rPr>
+          <w:rFonts w:eastAsiaTheme="minorEastAsia"/>
+        </w:rPr>
+        <w:tab/>
+        <w:t>D</w:t>
+      </w:r>
+      <w:r>
+        <w:rPr>
+          <w:rFonts w:eastAsiaTheme="minorEastAsia"/>
+          <w:vertAlign w:val="subscript"/>
+        </w:rPr>
+        <w:t xml:space="preserve">i </w:t>
+      </w:r>
+      <w:r>
+        <w:rPr>
+          <w:rFonts w:eastAsiaTheme="minorEastAsia"/>
+        </w:rPr>
+        <w:t>= expected dividends over the year</w:t>
+      </w:r>
+    </w:p>
+    <w:p>
+      <w:pPr>
+        <w:rPr>
+          <w:rFonts w:eastAsiaTheme="minorEastAsia"/>
+        </w:rPr>
+      </w:pPr>
+      <w:r>
+        <w:rPr>
+          <w:rFonts w:eastAsiaTheme="minorEastAsia"/>
+        </w:rPr>
+        <w:tab/>
+        <w:t>K</w:t>
+      </w:r>
+      <w:r>
+        <w:rPr>
+          <w:rFonts w:eastAsiaTheme="minorEastAsia"/>
+          <w:vertAlign w:val="subscript"/>
+        </w:rPr>
+        <w:t xml:space="preserve">e </w:t>
+      </w:r>
+      <w:r>
+        <w:rPr>
+          <w:rFonts w:eastAsiaTheme="minorEastAsia"/>
+        </w:rPr>
+        <w:t xml:space="preserve">= required rate of return of the equity investors </w:t>
+      </w:r>
+    </w:p>
+    <w:p>
+      <w:pPr>
+        <w:rPr>
+          <w:rFonts w:eastAsiaTheme="minorEastAsia"/>
+        </w:rPr>
+      </w:pPr>
+      <w:r>
+        <w:rPr>
+          <w:rFonts w:eastAsiaTheme="minorEastAsia"/>
+        </w:rPr>
+        <w:t>Above equations states that the price equals the present value of all expected future dividends into perpetuity (dividend discount model (DDM))</w:t>
+      </w:r>
+    </w:p>
+    <w:p>
+      <w:pPr>
+        <w:rPr>
+          <w:rFonts w:eastAsiaTheme="minorEastAsia"/>
+        </w:rPr>
+      </w:pPr>
+    </w:p>
+    <w:p>
+      <w:pPr>
+        <w:rPr>
+          <w:rFonts w:eastAsiaTheme="minorEastAsia"/>
+        </w:rPr>
+      </w:pPr>
+      <w:r>
+        <w:rPr>
+          <w:rFonts w:eastAsiaTheme="minorEastAsia"/>
+        </w:rPr>
+        <w:t>General valuation method (hold period 2 years)</w:t>
+      </w:r>
+    </w:p>
+    <w:p>
+      <w:pPr>
+        <w:rPr>
+          <w:rFonts w:eastAsiaTheme="minorEastAsia"/>
+        </w:rPr>
+      </w:pPr>
+      <m:oMathPara>
+        <m:oMath>
+          <m:sSub>
+            <m:sSubPr>
+              <m:ctrlPr>
+                <w:rPr>
+                  <w:rFonts w:ascii="Cambria Math" w:eastAsiaTheme="minorEastAsia" w:hAnsi="Cambria Math"/>
+                  <w:i/>
+                </w:rPr>
+              </m:ctrlPr>
+            </m:sSubPr>
+            <m:e>
+              <m:r>
+                <w:rPr>
+                  <w:rFonts w:ascii="Cambria Math" w:eastAsiaTheme="minorEastAsia" w:hAnsi="Cambria Math"/>
+                </w:rPr>
+                <m:t>P</m:t>
+              </m:r>
+            </m:e>
+            <m:sub>
+              <m:r>
+                <w:rPr>
+                  <w:rFonts w:ascii="Cambria Math" w:eastAsiaTheme="minorEastAsia" w:hAnsi="Cambria Math"/>
+                </w:rPr>
+                <m:t>0</m:t>
+              </m:r>
+            </m:sub>
+          </m:sSub>
+          <m:r>
+            <w:rPr>
+              <w:rFonts w:ascii="Cambria Math" w:eastAsiaTheme="minorEastAsia" w:hAnsi="Cambria Math"/>
+            </w:rPr>
+            <m:t xml:space="preserve"> = </m:t>
+          </m:r>
+          <m:nary>
+            <m:naryPr>
+              <m:chr m:val="∑"/>
+              <m:limLoc m:val="undOvr"/>
+              <m:ctrlPr>
+                <w:rPr>
+                  <w:rFonts w:ascii="Cambria Math" w:eastAsiaTheme="minorEastAsia" w:hAnsi="Cambria Math"/>
+                  <w:i/>
+                </w:rPr>
+              </m:ctrlPr>
+            </m:naryPr>
+            <m:sub>
+              <m:r>
+                <w:rPr>
+                  <w:rFonts w:ascii="Cambria Math" w:eastAsiaTheme="minorEastAsia" w:hAnsi="Cambria Math"/>
+                </w:rPr>
+                <m:t>i = 1</m:t>
+              </m:r>
+            </m:sub>
+            <m:sup>
+              <m:r>
+                <w:rPr>
+                  <w:rFonts w:ascii="Cambria Math" w:eastAsiaTheme="minorEastAsia" w:hAnsi="Cambria Math"/>
+                </w:rPr>
+                <m:t>n</m:t>
+              </m:r>
+            </m:sup>
+            <m:e>
+              <m:f>
+                <m:fPr>
+                  <m:ctrlPr>
+                    <w:rPr>
+                      <w:rFonts w:ascii="Cambria Math" w:eastAsiaTheme="minorEastAsia" w:hAnsi="Cambria Math"/>
+                      <w:i/>
+                    </w:rPr>
+                  </m:ctrlPr>
+                </m:fPr>
+                <m:num>
+                  <m:sSub>
+                    <m:sSubPr>
+                      <m:ctrlPr>
+                        <w:rPr>
+                          <w:rFonts w:ascii="Cambria Math" w:eastAsiaTheme="minorEastAsia" w:hAnsi="Cambria Math"/>
+                          <w:i/>
+                        </w:rPr>
+                      </m:ctrlPr>
+                    </m:sSubPr>
+                    <m:e>
+                      <m:r>
+                        <w:rPr>
+                          <w:rFonts w:ascii="Cambria Math" w:eastAsiaTheme="minorEastAsia" w:hAnsi="Cambria Math"/>
+                        </w:rPr>
+                        <m:t>D</m:t>
+                      </m:r>
+                    </m:e>
+                    <m:sub>
+                      <m:r>
+                        <w:rPr>
+                          <w:rFonts w:ascii="Cambria Math" w:eastAsiaTheme="minorEastAsia" w:hAnsi="Cambria Math"/>
+                        </w:rPr>
+                        <m:t>n</m:t>
+                      </m:r>
+                    </m:sub>
+                  </m:sSub>
+                </m:num>
+                <m:den>
+                  <m:sSup>
+                    <m:sSupPr>
+                      <m:ctrlPr>
+                        <w:rPr>
+                          <w:rFonts w:ascii="Cambria Math" w:eastAsiaTheme="minorEastAsia" w:hAnsi="Cambria Math"/>
+                          <w:i/>
+                        </w:rPr>
+                      </m:ctrlPr>
+                    </m:sSupPr>
+                    <m:e>
+                      <m:d>
+                        <m:dPr>
+                          <m:ctrlPr>
+                            <w:rPr>
+                              <w:rFonts w:ascii="Cambria Math" w:eastAsiaTheme="minorEastAsia" w:hAnsi="Cambria Math"/>
+                              <w:i/>
+                            </w:rPr>
+                          </m:ctrlPr>
+                        </m:dPr>
+                        <m:e>
+                          <m:r>
+                            <w:rPr>
+                              <w:rFonts w:ascii="Cambria Math" w:eastAsiaTheme="minorEastAsia" w:hAnsi="Cambria Math"/>
+                            </w:rPr>
+                            <m:t>1+</m:t>
+                          </m:r>
+                          <m:sSub>
+                            <m:sSubPr>
+                              <m:ctrlPr>
+                                <w:rPr>
+                                  <w:rFonts w:ascii="Cambria Math" w:eastAsiaTheme="minorEastAsia" w:hAnsi="Cambria Math"/>
+                                  <w:i/>
+                                </w:rPr>
+                              </m:ctrlPr>
+                            </m:sSubPr>
+                            <m:e>
+                              <m:r>
+                                <w:rPr>
+                                  <w:rFonts w:ascii="Cambria Math" w:eastAsiaTheme="minorEastAsia" w:hAnsi="Cambria Math"/>
+                                </w:rPr>
+                                <m:t>K</m:t>
+                              </m:r>
+                            </m:e>
+                            <m:sub>
+                              <m:r>
+                                <w:rPr>
+                                  <w:rFonts w:ascii="Cambria Math" w:eastAsiaTheme="minorEastAsia" w:hAnsi="Cambria Math"/>
+                                </w:rPr>
+                                <m:t>e</m:t>
+                              </m:r>
+                            </m:sub>
+                          </m:sSub>
+                        </m:e>
+                      </m:d>
+                    </m:e>
+                    <m:sup>
+                      <m:r>
+                        <w:rPr>
+                          <w:rFonts w:ascii="Cambria Math" w:eastAsiaTheme="minorEastAsia" w:hAnsi="Cambria Math"/>
+                        </w:rPr>
+                        <m:t>n</m:t>
+                      </m:r>
+                    </m:sup>
+                  </m:sSup>
+                </m:den>
+              </m:f>
+            </m:e>
+          </m:nary>
+        </m:oMath>
+      </m:oMathPara>
+    </w:p>
+    <w:p>
+      <w:pPr>
+        <w:rPr>
+          <w:rFonts w:eastAsiaTheme="minorEastAsia"/>
+        </w:rPr>
+      </w:pPr>
+      <m:oMathPara>
+        <m:oMath>
+          <m:sSub>
+            <m:sSubPr>
+              <m:ctrlPr>
+                <w:rPr>
+                  <w:rFonts w:ascii="Cambria Math" w:eastAsiaTheme="minorEastAsia" w:hAnsi="Cambria Math"/>
+                  <w:i/>
+                </w:rPr>
+              </m:ctrlPr>
+            </m:sSubPr>
+            <m:e>
+              <m:r>
+                <w:rPr>
+                  <w:rFonts w:ascii="Cambria Math" w:eastAsiaTheme="minorEastAsia" w:hAnsi="Cambria Math"/>
+                </w:rPr>
+                <m:t>P</m:t>
+              </m:r>
+            </m:e>
+            <m:sub>
+              <m:r>
+                <w:rPr>
+                  <w:rFonts w:ascii="Cambria Math" w:eastAsiaTheme="minorEastAsia" w:hAnsi="Cambria Math"/>
+                </w:rPr>
+                <m:t>2</m:t>
+              </m:r>
+            </m:sub>
+          </m:sSub>
+          <m:r>
+            <w:rPr>
+              <w:rFonts w:ascii="Cambria Math" w:eastAsiaTheme="minorEastAsia" w:hAnsi="Cambria Math"/>
+            </w:rPr>
+            <m:t xml:space="preserve"> = expected selling price at the end of year 2</m:t>
+          </m:r>
+        </m:oMath>
+      </m:oMathPara>
     </w:p>
     <w:sectPr>
       <w:pgSz w:w="11906" w:h="16838"/>
@@ -14896,6 +16266,232 @@
     </w:lvl>
   </w:abstractNum>
   <w:abstractNum w:abstractNumId="5" w15:restartNumberingAfterBreak="0">
+    <w:nsid w:val="08803F0F"/>
+    <w:multiLevelType w:val="hybridMultilevel"/>
+    <w:tmpl w:val="EA36B8C2"/>
+    <w:lvl w:ilvl="0" w:tplc="4009000B">
+      <w:start w:val="1"/>
+      <w:numFmt w:val="bullet"/>
+      <w:lvlText w:val=""/>
+      <w:lvlJc w:val="left"/>
+      <w:pPr>
+        <w:ind w:left="720" w:hanging="360"/>
+      </w:pPr>
+      <w:rPr>
+        <w:rFonts w:ascii="Wingdings" w:hAnsi="Wingdings" w:hint="default"/>
+      </w:rPr>
+    </w:lvl>
+    <w:lvl w:ilvl="1" w:tplc="40090003" w:tentative="1">
+      <w:start w:val="1"/>
+      <w:numFmt w:val="bullet"/>
+      <w:lvlText w:val="o"/>
+      <w:lvlJc w:val="left"/>
+      <w:pPr>
+        <w:ind w:left="1440" w:hanging="360"/>
+      </w:pPr>
+      <w:rPr>
+        <w:rFonts w:ascii="Courier New" w:hAnsi="Courier New" w:cs="Courier New" w:hint="default"/>
+      </w:rPr>
+    </w:lvl>
+    <w:lvl w:ilvl="2" w:tplc="40090005" w:tentative="1">
+      <w:start w:val="1"/>
+      <w:numFmt w:val="bullet"/>
+      <w:lvlText w:val=""/>
+      <w:lvlJc w:val="left"/>
+      <w:pPr>
+        <w:ind w:left="2160" w:hanging="360"/>
+      </w:pPr>
+      <w:rPr>
+        <w:rFonts w:ascii="Wingdings" w:hAnsi="Wingdings" w:hint="default"/>
+      </w:rPr>
+    </w:lvl>
+    <w:lvl w:ilvl="3" w:tplc="40090001" w:tentative="1">
+      <w:start w:val="1"/>
+      <w:numFmt w:val="bullet"/>
+      <w:lvlText w:val=""/>
+      <w:lvlJc w:val="left"/>
+      <w:pPr>
+        <w:ind w:left="2880" w:hanging="360"/>
+      </w:pPr>
+      <w:rPr>
+        <w:rFonts w:ascii="Symbol" w:hAnsi="Symbol" w:hint="default"/>
+      </w:rPr>
+    </w:lvl>
+    <w:lvl w:ilvl="4" w:tplc="40090003" w:tentative="1">
+      <w:start w:val="1"/>
+      <w:numFmt w:val="bullet"/>
+      <w:lvlText w:val="o"/>
+      <w:lvlJc w:val="left"/>
+      <w:pPr>
+        <w:ind w:left="3600" w:hanging="360"/>
+      </w:pPr>
+      <w:rPr>
+        <w:rFonts w:ascii="Courier New" w:hAnsi="Courier New" w:cs="Courier New" w:hint="default"/>
+      </w:rPr>
+    </w:lvl>
+    <w:lvl w:ilvl="5" w:tplc="40090005" w:tentative="1">
+      <w:start w:val="1"/>
+      <w:numFmt w:val="bullet"/>
+      <w:lvlText w:val=""/>
+      <w:lvlJc w:val="left"/>
+      <w:pPr>
+        <w:ind w:left="4320" w:hanging="360"/>
+      </w:pPr>
+      <w:rPr>
+        <w:rFonts w:ascii="Wingdings" w:hAnsi="Wingdings" w:hint="default"/>
+      </w:rPr>
+    </w:lvl>
+    <w:lvl w:ilvl="6" w:tplc="40090001" w:tentative="1">
+      <w:start w:val="1"/>
+      <w:numFmt w:val="bullet"/>
+      <w:lvlText w:val=""/>
+      <w:lvlJc w:val="left"/>
+      <w:pPr>
+        <w:ind w:left="5040" w:hanging="360"/>
+      </w:pPr>
+      <w:rPr>
+        <w:rFonts w:ascii="Symbol" w:hAnsi="Symbol" w:hint="default"/>
+      </w:rPr>
+    </w:lvl>
+    <w:lvl w:ilvl="7" w:tplc="40090003" w:tentative="1">
+      <w:start w:val="1"/>
+      <w:numFmt w:val="bullet"/>
+      <w:lvlText w:val="o"/>
+      <w:lvlJc w:val="left"/>
+      <w:pPr>
+        <w:ind w:left="5760" w:hanging="360"/>
+      </w:pPr>
+      <w:rPr>
+        <w:rFonts w:ascii="Courier New" w:hAnsi="Courier New" w:cs="Courier New" w:hint="default"/>
+      </w:rPr>
+    </w:lvl>
+    <w:lvl w:ilvl="8" w:tplc="40090005" w:tentative="1">
+      <w:start w:val="1"/>
+      <w:numFmt w:val="bullet"/>
+      <w:lvlText w:val=""/>
+      <w:lvlJc w:val="left"/>
+      <w:pPr>
+        <w:ind w:left="6480" w:hanging="360"/>
+      </w:pPr>
+      <w:rPr>
+        <w:rFonts w:ascii="Wingdings" w:hAnsi="Wingdings" w:hint="default"/>
+      </w:rPr>
+    </w:lvl>
+  </w:abstractNum>
+  <w:abstractNum w:abstractNumId="6" w15:restartNumberingAfterBreak="0">
+    <w:nsid w:val="16207B00"/>
+    <w:multiLevelType w:val="hybridMultilevel"/>
+    <w:tmpl w:val="F0849EE0"/>
+    <w:lvl w:ilvl="0" w:tplc="4009000B">
+      <w:start w:val="1"/>
+      <w:numFmt w:val="bullet"/>
+      <w:lvlText w:val=""/>
+      <w:lvlJc w:val="left"/>
+      <w:pPr>
+        <w:ind w:left="720" w:hanging="360"/>
+      </w:pPr>
+      <w:rPr>
+        <w:rFonts w:ascii="Wingdings" w:hAnsi="Wingdings" w:hint="default"/>
+      </w:rPr>
+    </w:lvl>
+    <w:lvl w:ilvl="1" w:tplc="40090003" w:tentative="1">
+      <w:start w:val="1"/>
+      <w:numFmt w:val="bullet"/>
+      <w:lvlText w:val="o"/>
+      <w:lvlJc w:val="left"/>
+      <w:pPr>
+        <w:ind w:left="1440" w:hanging="360"/>
+      </w:pPr>
+      <w:rPr>
+        <w:rFonts w:ascii="Courier New" w:hAnsi="Courier New" w:cs="Courier New" w:hint="default"/>
+      </w:rPr>
+    </w:lvl>
+    <w:lvl w:ilvl="2" w:tplc="40090005" w:tentative="1">
+      <w:start w:val="1"/>
+      <w:numFmt w:val="bullet"/>
+      <w:lvlText w:val=""/>
+      <w:lvlJc w:val="left"/>
+      <w:pPr>
+        <w:ind w:left="2160" w:hanging="360"/>
+      </w:pPr>
+      <w:rPr>
+        <w:rFonts w:ascii="Wingdings" w:hAnsi="Wingdings" w:hint="default"/>
+      </w:rPr>
+    </w:lvl>
+    <w:lvl w:ilvl="3" w:tplc="40090001" w:tentative="1">
+      <w:start w:val="1"/>
+      <w:numFmt w:val="bullet"/>
+      <w:lvlText w:val=""/>
+      <w:lvlJc w:val="left"/>
+      <w:pPr>
+        <w:ind w:left="2880" w:hanging="360"/>
+      </w:pPr>
+      <w:rPr>
+        <w:rFonts w:ascii="Symbol" w:hAnsi="Symbol" w:hint="default"/>
+      </w:rPr>
+    </w:lvl>
+    <w:lvl w:ilvl="4" w:tplc="40090003" w:tentative="1">
+      <w:start w:val="1"/>
+      <w:numFmt w:val="bullet"/>
+      <w:lvlText w:val="o"/>
+      <w:lvlJc w:val="left"/>
+      <w:pPr>
+        <w:ind w:left="3600" w:hanging="360"/>
+      </w:pPr>
+      <w:rPr>
+        <w:rFonts w:ascii="Courier New" w:hAnsi="Courier New" w:cs="Courier New" w:hint="default"/>
+      </w:rPr>
+    </w:lvl>
+    <w:lvl w:ilvl="5" w:tplc="40090005" w:tentative="1">
+      <w:start w:val="1"/>
+      <w:numFmt w:val="bullet"/>
+      <w:lvlText w:val=""/>
+      <w:lvlJc w:val="left"/>
+      <w:pPr>
+        <w:ind w:left="4320" w:hanging="360"/>
+      </w:pPr>
+      <w:rPr>
+        <w:rFonts w:ascii="Wingdings" w:hAnsi="Wingdings" w:hint="default"/>
+      </w:rPr>
+    </w:lvl>
+    <w:lvl w:ilvl="6" w:tplc="40090001" w:tentative="1">
+      <w:start w:val="1"/>
+      <w:numFmt w:val="bullet"/>
+      <w:lvlText w:val=""/>
+      <w:lvlJc w:val="left"/>
+      <w:pPr>
+        <w:ind w:left="5040" w:hanging="360"/>
+      </w:pPr>
+      <w:rPr>
+        <w:rFonts w:ascii="Symbol" w:hAnsi="Symbol" w:hint="default"/>
+      </w:rPr>
+    </w:lvl>
+    <w:lvl w:ilvl="7" w:tplc="40090003" w:tentative="1">
+      <w:start w:val="1"/>
+      <w:numFmt w:val="bullet"/>
+      <w:lvlText w:val="o"/>
+      <w:lvlJc w:val="left"/>
+      <w:pPr>
+        <w:ind w:left="5760" w:hanging="360"/>
+      </w:pPr>
+      <w:rPr>
+        <w:rFonts w:ascii="Courier New" w:hAnsi="Courier New" w:cs="Courier New" w:hint="default"/>
+      </w:rPr>
+    </w:lvl>
+    <w:lvl w:ilvl="8" w:tplc="40090005" w:tentative="1">
+      <w:start w:val="1"/>
+      <w:numFmt w:val="bullet"/>
+      <w:lvlText w:val=""/>
+      <w:lvlJc w:val="left"/>
+      <w:pPr>
+        <w:ind w:left="6480" w:hanging="360"/>
+      </w:pPr>
+      <w:rPr>
+        <w:rFonts w:ascii="Wingdings" w:hAnsi="Wingdings" w:hint="default"/>
+      </w:rPr>
+    </w:lvl>
+  </w:abstractNum>
+  <w:abstractNum w:abstractNumId="7" w15:restartNumberingAfterBreak="0">
     <w:nsid w:val="16821C01"/>
     <w:multiLevelType w:val="hybridMultilevel"/>
     <w:tmpl w:val="74C2BB6A"/>
@@ -14981,7 +16577,120 @@
       </w:pPr>
     </w:lvl>
   </w:abstractNum>
-  <w:abstractNum w:abstractNumId="6" w15:restartNumberingAfterBreak="0">
+  <w:abstractNum w:abstractNumId="8" w15:restartNumberingAfterBreak="0">
+    <w:nsid w:val="19131334"/>
+    <w:multiLevelType w:val="hybridMultilevel"/>
+    <w:tmpl w:val="DF904310"/>
+    <w:lvl w:ilvl="0" w:tplc="4009000B">
+      <w:start w:val="1"/>
+      <w:numFmt w:val="bullet"/>
+      <w:lvlText w:val=""/>
+      <w:lvlJc w:val="left"/>
+      <w:pPr>
+        <w:ind w:left="1440" w:hanging="360"/>
+      </w:pPr>
+      <w:rPr>
+        <w:rFonts w:ascii="Wingdings" w:hAnsi="Wingdings" w:hint="default"/>
+      </w:rPr>
+    </w:lvl>
+    <w:lvl w:ilvl="1" w:tplc="40090003" w:tentative="1">
+      <w:start w:val="1"/>
+      <w:numFmt w:val="bullet"/>
+      <w:lvlText w:val="o"/>
+      <w:lvlJc w:val="left"/>
+      <w:pPr>
+        <w:ind w:left="2160" w:hanging="360"/>
+      </w:pPr>
+      <w:rPr>
+        <w:rFonts w:ascii="Courier New" w:hAnsi="Courier New" w:cs="Courier New" w:hint="default"/>
+      </w:rPr>
+    </w:lvl>
+    <w:lvl w:ilvl="2" w:tplc="40090005" w:tentative="1">
+      <w:start w:val="1"/>
+      <w:numFmt w:val="bullet"/>
+      <w:lvlText w:val=""/>
+      <w:lvlJc w:val="left"/>
+      <w:pPr>
+        <w:ind w:left="2880" w:hanging="360"/>
+      </w:pPr>
+      <w:rPr>
+        <w:rFonts w:ascii="Wingdings" w:hAnsi="Wingdings" w:hint="default"/>
+      </w:rPr>
+    </w:lvl>
+    <w:lvl w:ilvl="3" w:tplc="40090001" w:tentative="1">
+      <w:start w:val="1"/>
+      <w:numFmt w:val="bullet"/>
+      <w:lvlText w:val=""/>
+      <w:lvlJc w:val="left"/>
+      <w:pPr>
+        <w:ind w:left="3600" w:hanging="360"/>
+      </w:pPr>
+      <w:rPr>
+        <w:rFonts w:ascii="Symbol" w:hAnsi="Symbol" w:hint="default"/>
+      </w:rPr>
+    </w:lvl>
+    <w:lvl w:ilvl="4" w:tplc="40090003" w:tentative="1">
+      <w:start w:val="1"/>
+      <w:numFmt w:val="bullet"/>
+      <w:lvlText w:val="o"/>
+      <w:lvlJc w:val="left"/>
+      <w:pPr>
+        <w:ind w:left="4320" w:hanging="360"/>
+      </w:pPr>
+      <w:rPr>
+        <w:rFonts w:ascii="Courier New" w:hAnsi="Courier New" w:cs="Courier New" w:hint="default"/>
+      </w:rPr>
+    </w:lvl>
+    <w:lvl w:ilvl="5" w:tplc="40090005" w:tentative="1">
+      <w:start w:val="1"/>
+      <w:numFmt w:val="bullet"/>
+      <w:lvlText w:val=""/>
+      <w:lvlJc w:val="left"/>
+      <w:pPr>
+        <w:ind w:left="5040" w:hanging="360"/>
+      </w:pPr>
+      <w:rPr>
+        <w:rFonts w:ascii="Wingdings" w:hAnsi="Wingdings" w:hint="default"/>
+      </w:rPr>
+    </w:lvl>
+    <w:lvl w:ilvl="6" w:tplc="40090001" w:tentative="1">
+      <w:start w:val="1"/>
+      <w:numFmt w:val="bullet"/>
+      <w:lvlText w:val=""/>
+      <w:lvlJc w:val="left"/>
+      <w:pPr>
+        <w:ind w:left="5760" w:hanging="360"/>
+      </w:pPr>
+      <w:rPr>
+        <w:rFonts w:ascii="Symbol" w:hAnsi="Symbol" w:hint="default"/>
+      </w:rPr>
+    </w:lvl>
+    <w:lvl w:ilvl="7" w:tplc="40090003" w:tentative="1">
+      <w:start w:val="1"/>
+      <w:numFmt w:val="bullet"/>
+      <w:lvlText w:val="o"/>
+      <w:lvlJc w:val="left"/>
+      <w:pPr>
+        <w:ind w:left="6480" w:hanging="360"/>
+      </w:pPr>
+      <w:rPr>
+        <w:rFonts w:ascii="Courier New" w:hAnsi="Courier New" w:cs="Courier New" w:hint="default"/>
+      </w:rPr>
+    </w:lvl>
+    <w:lvl w:ilvl="8" w:tplc="40090005" w:tentative="1">
+      <w:start w:val="1"/>
+      <w:numFmt w:val="bullet"/>
+      <w:lvlText w:val=""/>
+      <w:lvlJc w:val="left"/>
+      <w:pPr>
+        <w:ind w:left="7200" w:hanging="360"/>
+      </w:pPr>
+      <w:rPr>
+        <w:rFonts w:ascii="Wingdings" w:hAnsi="Wingdings" w:hint="default"/>
+      </w:rPr>
+    </w:lvl>
+  </w:abstractNum>
+  <w:abstractNum w:abstractNumId="9" w15:restartNumberingAfterBreak="0">
     <w:nsid w:val="1F552A06"/>
     <w:multiLevelType w:val="hybridMultilevel"/>
     <w:tmpl w:val="B5F29EA4"/>
@@ -15070,7 +16779,7 @@
       </w:pPr>
     </w:lvl>
   </w:abstractNum>
-  <w:abstractNum w:abstractNumId="7" w15:restartNumberingAfterBreak="0">
+  <w:abstractNum w:abstractNumId="10" w15:restartNumberingAfterBreak="0">
     <w:nsid w:val="1F6519B0"/>
     <w:multiLevelType w:val="hybridMultilevel"/>
     <w:tmpl w:val="C026FB9A"/>
@@ -15159,7 +16868,7 @@
       </w:pPr>
     </w:lvl>
   </w:abstractNum>
-  <w:abstractNum w:abstractNumId="8" w15:restartNumberingAfterBreak="0">
+  <w:abstractNum w:abstractNumId="11" w15:restartNumberingAfterBreak="0">
     <w:nsid w:val="1FF35255"/>
     <w:multiLevelType w:val="hybridMultilevel"/>
     <w:tmpl w:val="0F8E2182"/>
@@ -15245,7 +16954,7 @@
       </w:pPr>
     </w:lvl>
   </w:abstractNum>
-  <w:abstractNum w:abstractNumId="9" w15:restartNumberingAfterBreak="0">
+  <w:abstractNum w:abstractNumId="12" w15:restartNumberingAfterBreak="0">
     <w:nsid w:val="224D289E"/>
     <w:multiLevelType w:val="hybridMultilevel"/>
     <w:tmpl w:val="DFE2845A"/>
@@ -15331,7 +17040,7 @@
       </w:pPr>
     </w:lvl>
   </w:abstractNum>
-  <w:abstractNum w:abstractNumId="10" w15:restartNumberingAfterBreak="0">
+  <w:abstractNum w:abstractNumId="13" w15:restartNumberingAfterBreak="0">
     <w:nsid w:val="226E0771"/>
     <w:multiLevelType w:val="hybridMultilevel"/>
     <w:tmpl w:val="34785FDC"/>
@@ -15420,7 +17129,7 @@
       </w:pPr>
     </w:lvl>
   </w:abstractNum>
-  <w:abstractNum w:abstractNumId="11" w15:restartNumberingAfterBreak="0">
+  <w:abstractNum w:abstractNumId="14" w15:restartNumberingAfterBreak="0">
     <w:nsid w:val="25FE49C2"/>
     <w:multiLevelType w:val="multilevel"/>
     <w:tmpl w:val="B0183B58"/>
@@ -15569,7 +17278,7 @@
       </w:rPr>
     </w:lvl>
   </w:abstractNum>
-  <w:abstractNum w:abstractNumId="12" w15:restartNumberingAfterBreak="0">
+  <w:abstractNum w:abstractNumId="15" w15:restartNumberingAfterBreak="0">
     <w:nsid w:val="270E03D6"/>
     <w:multiLevelType w:val="hybridMultilevel"/>
     <w:tmpl w:val="21482B92"/>
@@ -15655,7 +17364,7 @@
       </w:pPr>
     </w:lvl>
   </w:abstractNum>
-  <w:abstractNum w:abstractNumId="13" w15:restartNumberingAfterBreak="0">
+  <w:abstractNum w:abstractNumId="16" w15:restartNumberingAfterBreak="0">
     <w:nsid w:val="277F6A7C"/>
     <w:multiLevelType w:val="hybridMultilevel"/>
     <w:tmpl w:val="A85C6510"/>
@@ -15744,7 +17453,7 @@
       </w:pPr>
     </w:lvl>
   </w:abstractNum>
-  <w:abstractNum w:abstractNumId="14" w15:restartNumberingAfterBreak="0">
+  <w:abstractNum w:abstractNumId="17" w15:restartNumberingAfterBreak="0">
     <w:nsid w:val="2B866818"/>
     <w:multiLevelType w:val="hybridMultilevel"/>
     <w:tmpl w:val="21482B92"/>
@@ -15830,7 +17539,7 @@
       </w:pPr>
     </w:lvl>
   </w:abstractNum>
-  <w:abstractNum w:abstractNumId="15" w15:restartNumberingAfterBreak="0">
+  <w:abstractNum w:abstractNumId="18" w15:restartNumberingAfterBreak="0">
     <w:nsid w:val="2E69236A"/>
     <w:multiLevelType w:val="hybridMultilevel"/>
     <w:tmpl w:val="5B2E57F4"/>
@@ -15916,7 +17625,7 @@
       </w:pPr>
     </w:lvl>
   </w:abstractNum>
-  <w:abstractNum w:abstractNumId="16" w15:restartNumberingAfterBreak="0">
+  <w:abstractNum w:abstractNumId="19" w15:restartNumberingAfterBreak="0">
     <w:nsid w:val="2F9B1447"/>
     <w:multiLevelType w:val="hybridMultilevel"/>
     <w:tmpl w:val="1D4EAFF8"/>
@@ -16002,10 +17711,10 @@
       </w:pPr>
     </w:lvl>
   </w:abstractNum>
-  <w:abstractNum w:abstractNumId="17" w15:restartNumberingAfterBreak="0">
+  <w:abstractNum w:abstractNumId="20" w15:restartNumberingAfterBreak="0">
     <w:nsid w:val="342643EF"/>
     <w:multiLevelType w:val="hybridMultilevel"/>
-    <w:tmpl w:val="8D0EE88E"/>
+    <w:tmpl w:val="BFEAEC32"/>
     <w:lvl w:ilvl="0" w:tplc="40090001">
       <w:start w:val="1"/>
       <w:numFmt w:val="bullet"/>
@@ -16115,7 +17824,7 @@
       </w:rPr>
     </w:lvl>
   </w:abstractNum>
-  <w:abstractNum w:abstractNumId="18" w15:restartNumberingAfterBreak="0">
+  <w:abstractNum w:abstractNumId="21" w15:restartNumberingAfterBreak="0">
     <w:nsid w:val="35D57A2E"/>
     <w:multiLevelType w:val="hybridMultilevel"/>
     <w:tmpl w:val="0FF6CBF2"/>
@@ -16204,7 +17913,7 @@
       </w:pPr>
     </w:lvl>
   </w:abstractNum>
-  <w:abstractNum w:abstractNumId="19" w15:restartNumberingAfterBreak="0">
+  <w:abstractNum w:abstractNumId="22" w15:restartNumberingAfterBreak="0">
     <w:nsid w:val="39662EC6"/>
     <w:multiLevelType w:val="hybridMultilevel"/>
     <w:tmpl w:val="59464B7A"/>
@@ -16290,7 +17999,7 @@
       </w:pPr>
     </w:lvl>
   </w:abstractNum>
-  <w:abstractNum w:abstractNumId="20" w15:restartNumberingAfterBreak="0">
+  <w:abstractNum w:abstractNumId="23" w15:restartNumberingAfterBreak="0">
     <w:nsid w:val="3CCA4F56"/>
     <w:multiLevelType w:val="hybridMultilevel"/>
     <w:tmpl w:val="BBD09A80"/>
@@ -16376,7 +18085,7 @@
       </w:pPr>
     </w:lvl>
   </w:abstractNum>
-  <w:abstractNum w:abstractNumId="21" w15:restartNumberingAfterBreak="0">
+  <w:abstractNum w:abstractNumId="24" w15:restartNumberingAfterBreak="0">
     <w:nsid w:val="3FA677EF"/>
     <w:multiLevelType w:val="hybridMultilevel"/>
     <w:tmpl w:val="F144535C"/>
@@ -16462,7 +18171,7 @@
       </w:pPr>
     </w:lvl>
   </w:abstractNum>
-  <w:abstractNum w:abstractNumId="22" w15:restartNumberingAfterBreak="0">
+  <w:abstractNum w:abstractNumId="25" w15:restartNumberingAfterBreak="0">
     <w:nsid w:val="41621598"/>
     <w:multiLevelType w:val="hybridMultilevel"/>
     <w:tmpl w:val="2E644174"/>
@@ -16551,7 +18260,7 @@
       </w:pPr>
     </w:lvl>
   </w:abstractNum>
-  <w:abstractNum w:abstractNumId="23" w15:restartNumberingAfterBreak="0">
+  <w:abstractNum w:abstractNumId="26" w15:restartNumberingAfterBreak="0">
     <w:nsid w:val="421F5061"/>
     <w:multiLevelType w:val="hybridMultilevel"/>
     <w:tmpl w:val="C55E3D5E"/>
@@ -16664,7 +18373,93 @@
       </w:rPr>
     </w:lvl>
   </w:abstractNum>
-  <w:abstractNum w:abstractNumId="24" w15:restartNumberingAfterBreak="0">
+  <w:abstractNum w:abstractNumId="27" w15:restartNumberingAfterBreak="0">
+    <w:nsid w:val="51EB6CAA"/>
+    <w:multiLevelType w:val="hybridMultilevel"/>
+    <w:tmpl w:val="AA3A1986"/>
+    <w:lvl w:ilvl="0" w:tplc="FFFFFFFF">
+      <w:start w:val="1"/>
+      <w:numFmt w:val="decimal"/>
+      <w:lvlText w:val="%1."/>
+      <w:lvlJc w:val="left"/>
+      <w:pPr>
+        <w:ind w:left="720" w:hanging="360"/>
+      </w:pPr>
+    </w:lvl>
+    <w:lvl w:ilvl="1" w:tplc="FFFFFFFF" w:tentative="1">
+      <w:start w:val="1"/>
+      <w:numFmt w:val="lowerLetter"/>
+      <w:lvlText w:val="%2."/>
+      <w:lvlJc w:val="left"/>
+      <w:pPr>
+        <w:ind w:left="1440" w:hanging="360"/>
+      </w:pPr>
+    </w:lvl>
+    <w:lvl w:ilvl="2" w:tplc="FFFFFFFF" w:tentative="1">
+      <w:start w:val="1"/>
+      <w:numFmt w:val="lowerRoman"/>
+      <w:lvlText w:val="%3."/>
+      <w:lvlJc w:val="right"/>
+      <w:pPr>
+        <w:ind w:left="2160" w:hanging="180"/>
+      </w:pPr>
+    </w:lvl>
+    <w:lvl w:ilvl="3" w:tplc="FFFFFFFF" w:tentative="1">
+      <w:start w:val="1"/>
+      <w:numFmt w:val="decimal"/>
+      <w:lvlText w:val="%4."/>
+      <w:lvlJc w:val="left"/>
+      <w:pPr>
+        <w:ind w:left="2880" w:hanging="360"/>
+      </w:pPr>
+    </w:lvl>
+    <w:lvl w:ilvl="4" w:tplc="FFFFFFFF" w:tentative="1">
+      <w:start w:val="1"/>
+      <w:numFmt w:val="lowerLetter"/>
+      <w:lvlText w:val="%5."/>
+      <w:lvlJc w:val="left"/>
+      <w:pPr>
+        <w:ind w:left="3600" w:hanging="360"/>
+      </w:pPr>
+    </w:lvl>
+    <w:lvl w:ilvl="5" w:tplc="FFFFFFFF" w:tentative="1">
+      <w:start w:val="1"/>
+      <w:numFmt w:val="lowerRoman"/>
+      <w:lvlText w:val="%6."/>
+      <w:lvlJc w:val="right"/>
+      <w:pPr>
+        <w:ind w:left="4320" w:hanging="180"/>
+      </w:pPr>
+    </w:lvl>
+    <w:lvl w:ilvl="6" w:tplc="FFFFFFFF" w:tentative="1">
+      <w:start w:val="1"/>
+      <w:numFmt w:val="decimal"/>
+      <w:lvlText w:val="%7."/>
+      <w:lvlJc w:val="left"/>
+      <w:pPr>
+        <w:ind w:left="5040" w:hanging="360"/>
+      </w:pPr>
+    </w:lvl>
+    <w:lvl w:ilvl="7" w:tplc="FFFFFFFF" w:tentative="1">
+      <w:start w:val="1"/>
+      <w:numFmt w:val="lowerLetter"/>
+      <w:lvlText w:val="%8."/>
+      <w:lvlJc w:val="left"/>
+      <w:pPr>
+        <w:ind w:left="5760" w:hanging="360"/>
+      </w:pPr>
+    </w:lvl>
+    <w:lvl w:ilvl="8" w:tplc="FFFFFFFF" w:tentative="1">
+      <w:start w:val="1"/>
+      <w:numFmt w:val="lowerRoman"/>
+      <w:lvlText w:val="%9."/>
+      <w:lvlJc w:val="right"/>
+      <w:pPr>
+        <w:ind w:left="6480" w:hanging="180"/>
+      </w:pPr>
+    </w:lvl>
+  </w:abstractNum>
+  <w:abstractNum w:abstractNumId="28" w15:restartNumberingAfterBreak="0">
     <w:nsid w:val="579956AE"/>
     <w:multiLevelType w:val="hybridMultilevel"/>
     <w:tmpl w:val="152C998C"/>
@@ -16753,7 +18548,93 @@
       </w:pPr>
     </w:lvl>
   </w:abstractNum>
-  <w:abstractNum w:abstractNumId="25" w15:restartNumberingAfterBreak="0">
+  <w:abstractNum w:abstractNumId="29" w15:restartNumberingAfterBreak="0">
+    <w:nsid w:val="57AA63E2"/>
+    <w:multiLevelType w:val="hybridMultilevel"/>
+    <w:tmpl w:val="4CD8648E"/>
+    <w:lvl w:ilvl="0" w:tplc="40090013">
+      <w:start w:val="1"/>
+      <w:numFmt w:val="upperRoman"/>
+      <w:lvlText w:val="%1."/>
+      <w:lvlJc w:val="right"/>
+      <w:pPr>
+        <w:ind w:left="720" w:hanging="360"/>
+      </w:pPr>
+    </w:lvl>
+    <w:lvl w:ilvl="1" w:tplc="40090019">
+      <w:start w:val="1"/>
+      <w:numFmt w:val="lowerLetter"/>
+      <w:lvlText w:val="%2."/>
+      <w:lvlJc w:val="left"/>
+      <w:pPr>
+        <w:ind w:left="1440" w:hanging="360"/>
+      </w:pPr>
+    </w:lvl>
+    <w:lvl w:ilvl="2" w:tplc="4009001B" w:tentative="1">
+      <w:start w:val="1"/>
+      <w:numFmt w:val="lowerRoman"/>
+      <w:lvlText w:val="%3."/>
+      <w:lvlJc w:val="right"/>
+      <w:pPr>
+        <w:ind w:left="2160" w:hanging="180"/>
+      </w:pPr>
+    </w:lvl>
+    <w:lvl w:ilvl="3" w:tplc="4009000F" w:tentative="1">
+      <w:start w:val="1"/>
+      <w:numFmt w:val="decimal"/>
+      <w:lvlText w:val="%4."/>
+      <w:lvlJc w:val="left"/>
+      <w:pPr>
+        <w:ind w:left="2880" w:hanging="360"/>
+      </w:pPr>
+    </w:lvl>
+    <w:lvl w:ilvl="4" w:tplc="40090019" w:tentative="1">
+      <w:start w:val="1"/>
+      <w:numFmt w:val="lowerLetter"/>
+      <w:lvlText w:val="%5."/>
+      <w:lvlJc w:val="left"/>
+      <w:pPr>
+        <w:ind w:left="3600" w:hanging="360"/>
+      </w:pPr>
+    </w:lvl>
+    <w:lvl w:ilvl="5" w:tplc="4009001B" w:tentative="1">
+      <w:start w:val="1"/>
+      <w:numFmt w:val="lowerRoman"/>
+      <w:lvlText w:val="%6."/>
+      <w:lvlJc w:val="right"/>
+      <w:pPr>
+        <w:ind w:left="4320" w:hanging="180"/>
+      </w:pPr>
+    </w:lvl>
+    <w:lvl w:ilvl="6" w:tplc="4009000F" w:tentative="1">
+      <w:start w:val="1"/>
+      <w:numFmt w:val="decimal"/>
+      <w:lvlText w:val="%7."/>
+      <w:lvlJc w:val="left"/>
+      <w:pPr>
+        <w:ind w:left="5040" w:hanging="360"/>
+      </w:pPr>
+    </w:lvl>
+    <w:lvl w:ilvl="7" w:tplc="40090019" w:tentative="1">
+      <w:start w:val="1"/>
+      <w:numFmt w:val="lowerLetter"/>
+      <w:lvlText w:val="%8."/>
+      <w:lvlJc w:val="left"/>
+      <w:pPr>
+        <w:ind w:left="5760" w:hanging="360"/>
+      </w:pPr>
+    </w:lvl>
+    <w:lvl w:ilvl="8" w:tplc="4009001B" w:tentative="1">
+      <w:start w:val="1"/>
+      <w:numFmt w:val="lowerRoman"/>
+      <w:lvlText w:val="%9."/>
+      <w:lvlJc w:val="right"/>
+      <w:pPr>
+        <w:ind w:left="6480" w:hanging="180"/>
+      </w:pPr>
+    </w:lvl>
+  </w:abstractNum>
+  <w:abstractNum w:abstractNumId="30" w15:restartNumberingAfterBreak="0">
     <w:nsid w:val="5AAF4307"/>
     <w:multiLevelType w:val="hybridMultilevel"/>
     <w:tmpl w:val="27147B98"/>
@@ -16839,7 +18720,7 @@
       </w:pPr>
     </w:lvl>
   </w:abstractNum>
-  <w:abstractNum w:abstractNumId="26" w15:restartNumberingAfterBreak="0">
+  <w:abstractNum w:abstractNumId="31" w15:restartNumberingAfterBreak="0">
     <w:nsid w:val="5B0B6E70"/>
     <w:multiLevelType w:val="hybridMultilevel"/>
     <w:tmpl w:val="639E1D92"/>
@@ -16925,10 +18806,10 @@
       </w:pPr>
     </w:lvl>
   </w:abstractNum>
-  <w:abstractNum w:abstractNumId="27" w15:restartNumberingAfterBreak="0">
+  <w:abstractNum w:abstractNumId="32" w15:restartNumberingAfterBreak="0">
     <w:nsid w:val="5B5059D4"/>
     <w:multiLevelType w:val="hybridMultilevel"/>
-    <w:tmpl w:val="2F70241E"/>
+    <w:tmpl w:val="4F5CD94C"/>
     <w:lvl w:ilvl="0" w:tplc="4009000F">
       <w:start w:val="1"/>
       <w:numFmt w:val="decimal"/>
@@ -17011,7 +18892,7 @@
       </w:pPr>
     </w:lvl>
   </w:abstractNum>
-  <w:abstractNum w:abstractNumId="28" w15:restartNumberingAfterBreak="0">
+  <w:abstractNum w:abstractNumId="33" w15:restartNumberingAfterBreak="0">
     <w:nsid w:val="5CF97DC3"/>
     <w:multiLevelType w:val="hybridMultilevel"/>
     <w:tmpl w:val="5B2C3BD8"/>
@@ -17097,7 +18978,7 @@
       </w:pPr>
     </w:lvl>
   </w:abstractNum>
-  <w:abstractNum w:abstractNumId="29" w15:restartNumberingAfterBreak="0">
+  <w:abstractNum w:abstractNumId="34" w15:restartNumberingAfterBreak="0">
     <w:nsid w:val="5ECF72A1"/>
     <w:multiLevelType w:val="hybridMultilevel"/>
     <w:tmpl w:val="1CF4107C"/>
@@ -17183,7 +19064,93 @@
       </w:pPr>
     </w:lvl>
   </w:abstractNum>
-  <w:abstractNum w:abstractNumId="30" w15:restartNumberingAfterBreak="0">
+  <w:abstractNum w:abstractNumId="35" w15:restartNumberingAfterBreak="0">
+    <w:nsid w:val="5F4655AF"/>
+    <w:multiLevelType w:val="hybridMultilevel"/>
+    <w:tmpl w:val="AFA26F68"/>
+    <w:lvl w:ilvl="0" w:tplc="40090013">
+      <w:start w:val="1"/>
+      <w:numFmt w:val="upperRoman"/>
+      <w:lvlText w:val="%1."/>
+      <w:lvlJc w:val="right"/>
+      <w:pPr>
+        <w:ind w:left="720" w:hanging="360"/>
+      </w:pPr>
+    </w:lvl>
+    <w:lvl w:ilvl="1" w:tplc="40090019" w:tentative="1">
+      <w:start w:val="1"/>
+      <w:numFmt w:val="lowerLetter"/>
+      <w:lvlText w:val="%2."/>
+      <w:lvlJc w:val="left"/>
+      <w:pPr>
+        <w:ind w:left="1440" w:hanging="360"/>
+      </w:pPr>
+    </w:lvl>
+    <w:lvl w:ilvl="2" w:tplc="4009001B" w:tentative="1">
+      <w:start w:val="1"/>
+      <w:numFmt w:val="lowerRoman"/>
+      <w:lvlText w:val="%3."/>
+      <w:lvlJc w:val="right"/>
+      <w:pPr>
+        <w:ind w:left="2160" w:hanging="180"/>
+      </w:pPr>
+    </w:lvl>
+    <w:lvl w:ilvl="3" w:tplc="4009000F" w:tentative="1">
+      <w:start w:val="1"/>
+      <w:numFmt w:val="decimal"/>
+      <w:lvlText w:val="%4."/>
+      <w:lvlJc w:val="left"/>
+      <w:pPr>
+        <w:ind w:left="2880" w:hanging="360"/>
+      </w:pPr>
+    </w:lvl>
+    <w:lvl w:ilvl="4" w:tplc="40090019" w:tentative="1">
+      <w:start w:val="1"/>
+      <w:numFmt w:val="lowerLetter"/>
+      <w:lvlText w:val="%5."/>
+      <w:lvlJc w:val="left"/>
+      <w:pPr>
+        <w:ind w:left="3600" w:hanging="360"/>
+      </w:pPr>
+    </w:lvl>
+    <w:lvl w:ilvl="5" w:tplc="4009001B" w:tentative="1">
+      <w:start w:val="1"/>
+      <w:numFmt w:val="lowerRoman"/>
+      <w:lvlText w:val="%6."/>
+      <w:lvlJc w:val="right"/>
+      <w:pPr>
+        <w:ind w:left="4320" w:hanging="180"/>
+      </w:pPr>
+    </w:lvl>
+    <w:lvl w:ilvl="6" w:tplc="4009000F" w:tentative="1">
+      <w:start w:val="1"/>
+      <w:numFmt w:val="decimal"/>
+      <w:lvlText w:val="%7."/>
+      <w:lvlJc w:val="left"/>
+      <w:pPr>
+        <w:ind w:left="5040" w:hanging="360"/>
+      </w:pPr>
+    </w:lvl>
+    <w:lvl w:ilvl="7" w:tplc="40090019" w:tentative="1">
+      <w:start w:val="1"/>
+      <w:numFmt w:val="lowerLetter"/>
+      <w:lvlText w:val="%8."/>
+      <w:lvlJc w:val="left"/>
+      <w:pPr>
+        <w:ind w:left="5760" w:hanging="360"/>
+      </w:pPr>
+    </w:lvl>
+    <w:lvl w:ilvl="8" w:tplc="4009001B" w:tentative="1">
+      <w:start w:val="1"/>
+      <w:numFmt w:val="lowerRoman"/>
+      <w:lvlText w:val="%9."/>
+      <w:lvlJc w:val="right"/>
+      <w:pPr>
+        <w:ind w:left="6480" w:hanging="180"/>
+      </w:pPr>
+    </w:lvl>
+  </w:abstractNum>
+  <w:abstractNum w:abstractNumId="36" w15:restartNumberingAfterBreak="0">
     <w:nsid w:val="5F5F17AC"/>
     <w:multiLevelType w:val="hybridMultilevel"/>
     <w:tmpl w:val="27485FD2"/>
@@ -17269,7 +19236,7 @@
       </w:pPr>
     </w:lvl>
   </w:abstractNum>
-  <w:abstractNum w:abstractNumId="31" w15:restartNumberingAfterBreak="0">
+  <w:abstractNum w:abstractNumId="37" w15:restartNumberingAfterBreak="0">
     <w:nsid w:val="5FAD400A"/>
     <w:multiLevelType w:val="hybridMultilevel"/>
     <w:tmpl w:val="59F4717E"/>
@@ -17355,7 +19322,7 @@
       </w:pPr>
     </w:lvl>
   </w:abstractNum>
-  <w:abstractNum w:abstractNumId="32" w15:restartNumberingAfterBreak="0">
+  <w:abstractNum w:abstractNumId="38" w15:restartNumberingAfterBreak="0">
     <w:nsid w:val="630F0C4E"/>
     <w:multiLevelType w:val="hybridMultilevel"/>
     <w:tmpl w:val="5802DB30"/>
@@ -17447,7 +19414,7 @@
       </w:pPr>
     </w:lvl>
   </w:abstractNum>
-  <w:abstractNum w:abstractNumId="33" w15:restartNumberingAfterBreak="0">
+  <w:abstractNum w:abstractNumId="39" w15:restartNumberingAfterBreak="0">
     <w:nsid w:val="6409798E"/>
     <w:multiLevelType w:val="hybridMultilevel"/>
     <w:tmpl w:val="F942E5A6"/>
@@ -17533,7 +19500,7 @@
       </w:pPr>
     </w:lvl>
   </w:abstractNum>
-  <w:abstractNum w:abstractNumId="34" w15:restartNumberingAfterBreak="0">
+  <w:abstractNum w:abstractNumId="40" w15:restartNumberingAfterBreak="0">
     <w:nsid w:val="6A825466"/>
     <w:multiLevelType w:val="hybridMultilevel"/>
     <w:tmpl w:val="D4123C9C"/>
@@ -17619,7 +19586,7 @@
       </w:pPr>
     </w:lvl>
   </w:abstractNum>
-  <w:abstractNum w:abstractNumId="35" w15:restartNumberingAfterBreak="0">
+  <w:abstractNum w:abstractNumId="41" w15:restartNumberingAfterBreak="0">
     <w:nsid w:val="72EA5DBF"/>
     <w:multiLevelType w:val="hybridMultilevel"/>
     <w:tmpl w:val="671AAB8E"/>
@@ -17705,7 +19672,7 @@
       </w:pPr>
     </w:lvl>
   </w:abstractNum>
-  <w:abstractNum w:abstractNumId="36" w15:restartNumberingAfterBreak="0">
+  <w:abstractNum w:abstractNumId="42" w15:restartNumberingAfterBreak="0">
     <w:nsid w:val="754B7DA2"/>
     <w:multiLevelType w:val="hybridMultilevel"/>
     <w:tmpl w:val="09E87C36"/>
@@ -17791,7 +19758,7 @@
       </w:pPr>
     </w:lvl>
   </w:abstractNum>
-  <w:abstractNum w:abstractNumId="37" w15:restartNumberingAfterBreak="0">
+  <w:abstractNum w:abstractNumId="43" w15:restartNumberingAfterBreak="0">
     <w:nsid w:val="75BC0870"/>
     <w:multiLevelType w:val="hybridMultilevel"/>
     <w:tmpl w:val="C186C898"/>
@@ -17880,7 +19847,7 @@
       </w:pPr>
     </w:lvl>
   </w:abstractNum>
-  <w:abstractNum w:abstractNumId="38" w15:restartNumberingAfterBreak="0">
+  <w:abstractNum w:abstractNumId="44" w15:restartNumberingAfterBreak="0">
     <w:nsid w:val="787D215D"/>
     <w:multiLevelType w:val="hybridMultilevel"/>
     <w:tmpl w:val="6E66E1B4"/>
@@ -17969,7 +19936,7 @@
       </w:pPr>
     </w:lvl>
   </w:abstractNum>
-  <w:abstractNum w:abstractNumId="39" w15:restartNumberingAfterBreak="0">
+  <w:abstractNum w:abstractNumId="45" w15:restartNumberingAfterBreak="0">
     <w:nsid w:val="7B8D34CF"/>
     <w:multiLevelType w:val="multilevel"/>
     <w:tmpl w:val="702834C8"/>
@@ -18119,124 +20086,142 @@
     </w:lvl>
   </w:abstractNum>
   <w:num w:numId="1" w16cid:durableId="738789515">
-    <w:abstractNumId w:val="25"/>
+    <w:abstractNumId w:val="30"/>
   </w:num>
   <w:num w:numId="2" w16cid:durableId="1235513339">
     <w:abstractNumId w:val="1"/>
   </w:num>
   <w:num w:numId="3" w16cid:durableId="288970933">
-    <w:abstractNumId w:val="29"/>
+    <w:abstractNumId w:val="34"/>
   </w:num>
   <w:num w:numId="4" w16cid:durableId="1934975148">
     <w:abstractNumId w:val="0"/>
   </w:num>
   <w:num w:numId="5" w16cid:durableId="284432453">
-    <w:abstractNumId w:val="11"/>
+    <w:abstractNumId w:val="14"/>
   </w:num>
   <w:num w:numId="6" w16cid:durableId="1475290958">
     <w:abstractNumId w:val="2"/>
   </w:num>
   <w:num w:numId="7" w16cid:durableId="674764127">
+    <w:abstractNumId w:val="45"/>
+  </w:num>
+  <w:num w:numId="8" w16cid:durableId="1366904678">
+    <w:abstractNumId w:val="26"/>
+  </w:num>
+  <w:num w:numId="9" w16cid:durableId="67462260">
+    <w:abstractNumId w:val="37"/>
+  </w:num>
+  <w:num w:numId="10" w16cid:durableId="364210400">
+    <w:abstractNumId w:val="19"/>
+  </w:num>
+  <w:num w:numId="11" w16cid:durableId="7296056">
+    <w:abstractNumId w:val="23"/>
+  </w:num>
+  <w:num w:numId="12" w16cid:durableId="1654406166">
     <w:abstractNumId w:val="39"/>
   </w:num>
-  <w:num w:numId="8" w16cid:durableId="1366904678">
-    <w:abstractNumId w:val="23"/>
+  <w:num w:numId="13" w16cid:durableId="1484928062">
+    <w:abstractNumId w:val="42"/>
   </w:num>
-  <w:num w:numId="9" w16cid:durableId="67462260">
+  <w:num w:numId="14" w16cid:durableId="504519595">
     <w:abstractNumId w:val="31"/>
   </w:num>
-  <w:num w:numId="10" w16cid:durableId="364210400">
+  <w:num w:numId="15" w16cid:durableId="1046217917">
+    <w:abstractNumId w:val="11"/>
+  </w:num>
+  <w:num w:numId="16" w16cid:durableId="2125348581">
+    <w:abstractNumId w:val="12"/>
+  </w:num>
+  <w:num w:numId="17" w16cid:durableId="1482194571">
+    <w:abstractNumId w:val="33"/>
+  </w:num>
+  <w:num w:numId="18" w16cid:durableId="1378116358">
+    <w:abstractNumId w:val="21"/>
+  </w:num>
+  <w:num w:numId="19" w16cid:durableId="1622763665">
+    <w:abstractNumId w:val="28"/>
+  </w:num>
+  <w:num w:numId="20" w16cid:durableId="512308396">
+    <w:abstractNumId w:val="43"/>
+  </w:num>
+  <w:num w:numId="21" w16cid:durableId="1400396216">
     <w:abstractNumId w:val="16"/>
   </w:num>
-  <w:num w:numId="11" w16cid:durableId="7296056">
-    <w:abstractNumId w:val="20"/>
+  <w:num w:numId="22" w16cid:durableId="1687050894">
+    <w:abstractNumId w:val="25"/>
   </w:num>
-  <w:num w:numId="12" w16cid:durableId="1654406166">
-    <w:abstractNumId w:val="33"/>
+  <w:num w:numId="23" w16cid:durableId="958221247">
+    <w:abstractNumId w:val="13"/>
   </w:num>
-  <w:num w:numId="13" w16cid:durableId="1484928062">
-    <w:abstractNumId w:val="36"/>
+  <w:num w:numId="24" w16cid:durableId="1303314634">
+    <w:abstractNumId w:val="38"/>
   </w:num>
-  <w:num w:numId="14" w16cid:durableId="504519595">
-    <w:abstractNumId w:val="26"/>
+  <w:num w:numId="25" w16cid:durableId="9142093">
+    <w:abstractNumId w:val="41"/>
   </w:num>
-  <w:num w:numId="15" w16cid:durableId="1046217917">
-    <w:abstractNumId w:val="8"/>
-  </w:num>
-  <w:num w:numId="16" w16cid:durableId="2125348581">
-    <w:abstractNumId w:val="9"/>
-  </w:num>
-  <w:num w:numId="17" w16cid:durableId="1482194571">
-    <w:abstractNumId w:val="28"/>
-  </w:num>
-  <w:num w:numId="18" w16cid:durableId="1378116358">
+  <w:num w:numId="26" w16cid:durableId="1458911845">
     <w:abstractNumId w:val="18"/>
   </w:num>
-  <w:num w:numId="19" w16cid:durableId="1622763665">
-    <w:abstractNumId w:val="24"/>
-  </w:num>
-  <w:num w:numId="20" w16cid:durableId="512308396">
-    <w:abstractNumId w:val="37"/>
-  </w:num>
-  <w:num w:numId="21" w16cid:durableId="1400396216">
-    <w:abstractNumId w:val="13"/>
-  </w:num>
-  <w:num w:numId="22" w16cid:durableId="1687050894">
-    <w:abstractNumId w:val="22"/>
-  </w:num>
-  <w:num w:numId="23" w16cid:durableId="958221247">
-    <w:abstractNumId w:val="10"/>
-  </w:num>
-  <w:num w:numId="24" w16cid:durableId="1303314634">
-    <w:abstractNumId w:val="32"/>
-  </w:num>
-  <w:num w:numId="25" w16cid:durableId="9142093">
-    <w:abstractNumId w:val="35"/>
-  </w:num>
-  <w:num w:numId="26" w16cid:durableId="1458911845">
-    <w:abstractNumId w:val="15"/>
-  </w:num>
   <w:num w:numId="27" w16cid:durableId="2118016731">
-    <w:abstractNumId w:val="5"/>
+    <w:abstractNumId w:val="7"/>
   </w:num>
   <w:num w:numId="28" w16cid:durableId="2138251279">
     <w:abstractNumId w:val="4"/>
   </w:num>
   <w:num w:numId="29" w16cid:durableId="2097509124">
-    <w:abstractNumId w:val="19"/>
+    <w:abstractNumId w:val="22"/>
   </w:num>
   <w:num w:numId="30" w16cid:durableId="2101440695">
-    <w:abstractNumId w:val="38"/>
+    <w:abstractNumId w:val="44"/>
   </w:num>
   <w:num w:numId="31" w16cid:durableId="109252585">
-    <w:abstractNumId w:val="7"/>
+    <w:abstractNumId w:val="10"/>
   </w:num>
   <w:num w:numId="32" w16cid:durableId="472599006">
-    <w:abstractNumId w:val="6"/>
+    <w:abstractNumId w:val="9"/>
   </w:num>
   <w:num w:numId="33" w16cid:durableId="1115103356">
-    <w:abstractNumId w:val="27"/>
+    <w:abstractNumId w:val="32"/>
   </w:num>
   <w:num w:numId="34" w16cid:durableId="220681117">
-    <w:abstractNumId w:val="34"/>
+    <w:abstractNumId w:val="40"/>
   </w:num>
   <w:num w:numId="35" w16cid:durableId="1176386353">
-    <w:abstractNumId w:val="30"/>
+    <w:abstractNumId w:val="36"/>
   </w:num>
   <w:num w:numId="36" w16cid:durableId="1049376175">
+    <w:abstractNumId w:val="20"/>
+  </w:num>
+  <w:num w:numId="37" w16cid:durableId="723523505">
     <w:abstractNumId w:val="17"/>
   </w:num>
-  <w:num w:numId="37" w16cid:durableId="723523505">
-    <w:abstractNumId w:val="14"/>
-  </w:num>
   <w:num w:numId="38" w16cid:durableId="1595165128">
-    <w:abstractNumId w:val="12"/>
+    <w:abstractNumId w:val="15"/>
   </w:num>
   <w:num w:numId="39" w16cid:durableId="1168903458">
     <w:abstractNumId w:val="3"/>
   </w:num>
   <w:num w:numId="40" w16cid:durableId="611862714">
-    <w:abstractNumId w:val="21"/>
+    <w:abstractNumId w:val="24"/>
+  </w:num>
+  <w:num w:numId="41" w16cid:durableId="340668397">
+    <w:abstractNumId w:val="27"/>
+  </w:num>
+  <w:num w:numId="42" w16cid:durableId="87584769">
+    <w:abstractNumId w:val="6"/>
+  </w:num>
+  <w:num w:numId="43" w16cid:durableId="1409889759">
+    <w:abstractNumId w:val="29"/>
+  </w:num>
+  <w:num w:numId="44" w16cid:durableId="250547155">
+    <w:abstractNumId w:val="35"/>
+  </w:num>
+  <w:num w:numId="45" w16cid:durableId="400836092">
+    <w:abstractNumId w:val="8"/>
+  </w:num>
+  <w:num w:numId="46" w16cid:durableId="964655118">
+    <w:abstractNumId w:val="5"/>
   </w:num>
 </w:numbering>
 </file>

</xml_diff>

<commit_message>
Update notes: 10-09-2026 20:36
</commit_message>
<xml_diff>
--- a/Financial Mathematics/notes.docx
+++ b/Financial Mathematics/notes.docx
@@ -222,11 +222,19 @@
           <w:lang w:val="en-US"/>
         </w:rPr>
       </w:pPr>
+      <w:proofErr w:type="spellStart"/>
       <w:r>
         <w:rPr>
           <w:lang w:val="en-US"/>
         </w:rPr>
-        <w:t>ans:</w:t>
+        <w:t>ans</w:t>
+      </w:r>
+      <w:proofErr w:type="spellEnd"/>
+      <w:r>
+        <w:rPr>
+          <w:lang w:val="en-US"/>
+        </w:rPr>
+        <w:t>:</w:t>
       </w:r>
     </w:p>
     <w:p>
@@ -369,8 +377,13 @@
       <w:pPr>
         <w:pStyle w:val="ListParagraph"/>
       </w:pPr>
-      <w:r>
-        <w:t>ans:</w:t>
+      <w:proofErr w:type="spellStart"/>
+      <w:r>
+        <w:t>ans</w:t>
+      </w:r>
+      <w:proofErr w:type="spellEnd"/>
+      <w:r>
+        <w:t>:</w:t>
       </w:r>
     </w:p>
     <w:p>
@@ -526,8 +539,13 @@
       <w:pPr>
         <w:pStyle w:val="ListParagraph"/>
       </w:pPr>
-      <w:r>
-        <w:t>ans:</w:t>
+      <w:proofErr w:type="spellStart"/>
+      <w:r>
+        <w:t>ans</w:t>
+      </w:r>
+      <w:proofErr w:type="spellEnd"/>
+      <w:r>
+        <w:t>:</w:t>
       </w:r>
     </w:p>
     <w:p>
@@ -775,8 +793,13 @@
       <w:pPr>
         <w:pStyle w:val="ListParagraph"/>
       </w:pPr>
-      <w:r>
-        <w:t>ans:</w:t>
+      <w:proofErr w:type="spellStart"/>
+      <w:r>
+        <w:t>ans</w:t>
+      </w:r>
+      <w:proofErr w:type="spellEnd"/>
+      <w:r>
+        <w:t>:</w:t>
       </w:r>
     </w:p>
     <w:p>
@@ -6769,11 +6792,19 @@
           <w:rFonts w:eastAsiaTheme="minorEastAsia"/>
         </w:rPr>
       </w:pPr>
-      <w:r>
-        <w:rPr>
-          <w:rFonts w:eastAsiaTheme="minorEastAsia"/>
-        </w:rPr>
-        <w:t>ans:</w:t>
+      <w:proofErr w:type="spellStart"/>
+      <w:r>
+        <w:rPr>
+          <w:rFonts w:eastAsiaTheme="minorEastAsia"/>
+        </w:rPr>
+        <w:t>ans</w:t>
+      </w:r>
+      <w:proofErr w:type="spellEnd"/>
+      <w:r>
+        <w:rPr>
+          <w:rFonts w:eastAsiaTheme="minorEastAsia"/>
+        </w:rPr>
+        <w:t>:</w:t>
       </w:r>
     </w:p>
     <w:p>
@@ -8403,7 +8434,21 @@
         <w:rPr>
           <w:rFonts w:eastAsiaTheme="minorEastAsia"/>
         </w:rPr>
-        <w:t xml:space="preserve">Bhuvanesh pays a monthly installment of rs2000 towards a recurring deposit with a financier. The rate of interest is 6% per annum compounded monthly. What is the maturity value of this recurring deposit after 10 months </w:t>
+        <w:t xml:space="preserve">Bhuvanesh pays a monthly </w:t>
+      </w:r>
+      <w:proofErr w:type="spellStart"/>
+      <w:r>
+        <w:rPr>
+          <w:rFonts w:eastAsiaTheme="minorEastAsia"/>
+        </w:rPr>
+        <w:t>installment</w:t>
+      </w:r>
+      <w:proofErr w:type="spellEnd"/>
+      <w:r>
+        <w:rPr>
+          <w:rFonts w:eastAsiaTheme="minorEastAsia"/>
+        </w:rPr>
+        <w:t xml:space="preserve"> of rs2000 towards a recurring deposit with a financier. The rate of interest is 6% per annum compounded monthly. What is the maturity value of this recurring deposit after 10 months </w:t>
       </w:r>
     </w:p>
     <w:p>
@@ -11093,7 +11138,23 @@
           <w:rFonts w:eastAsiaTheme="minorEastAsia"/>
           <w:lang w:val="en-US"/>
         </w:rPr>
-        <w:t>Mr. Thanay expects to receive Rs. 20,000 at the beginning of each year for 4 years. Calculate the present value of the annuity due assuming an interest of 9%</w:t>
+        <w:t xml:space="preserve">Mr. </w:t>
+      </w:r>
+      <w:proofErr w:type="spellStart"/>
+      <w:r>
+        <w:rPr>
+          <w:rFonts w:eastAsiaTheme="minorEastAsia"/>
+          <w:lang w:val="en-US"/>
+        </w:rPr>
+        <w:t>Thanay</w:t>
+      </w:r>
+      <w:proofErr w:type="spellEnd"/>
+      <w:r>
+        <w:rPr>
+          <w:rFonts w:eastAsiaTheme="minorEastAsia"/>
+          <w:lang w:val="en-US"/>
+        </w:rPr>
+        <w:t xml:space="preserve"> expects to receive Rs. 20,000 at the beginning of each year for 4 years. Calculate the present value of the annuity due assuming an interest of 9%</w:t>
       </w:r>
     </w:p>
     <w:p>
@@ -12025,7 +12086,21 @@
         <w:rPr>
           <w:rFonts w:eastAsiaTheme="minorEastAsia"/>
         </w:rPr>
-        <w:t xml:space="preserve">series of periodic cashflows which grow at a constant rate per peiod </w:t>
+        <w:t xml:space="preserve">series of periodic cashflows which grow at a constant rate per </w:t>
+      </w:r>
+      <w:proofErr w:type="spellStart"/>
+      <w:r>
+        <w:rPr>
+          <w:rFonts w:eastAsiaTheme="minorEastAsia"/>
+        </w:rPr>
+        <w:t>peiod</w:t>
+      </w:r>
+      <w:proofErr w:type="spellEnd"/>
+      <w:r>
+        <w:rPr>
+          <w:rFonts w:eastAsiaTheme="minorEastAsia"/>
+        </w:rPr>
+        <w:t xml:space="preserve"> </w:t>
       </w:r>
     </w:p>
     <w:p>
@@ -12101,7 +12176,21 @@
           <w:rFonts w:eastAsiaTheme="minorEastAsia"/>
         </w:rPr>
         <w:tab/>
-        <w:t>C = cashflow (ie interest, dividend per period)</w:t>
+        <w:t>C = cashflow (</w:t>
+      </w:r>
+      <w:proofErr w:type="spellStart"/>
+      <w:r>
+        <w:rPr>
+          <w:rFonts w:eastAsiaTheme="minorEastAsia"/>
+        </w:rPr>
+        <w:t>ie</w:t>
+      </w:r>
+      <w:proofErr w:type="spellEnd"/>
+      <w:r>
+        <w:rPr>
+          <w:rFonts w:eastAsiaTheme="minorEastAsia"/>
+        </w:rPr>
+        <w:t xml:space="preserve"> interest, dividend per period)</w:t>
       </w:r>
     </w:p>
     <w:p>
@@ -14071,7 +14160,21 @@
         <w:rPr>
           <w:rFonts w:eastAsiaTheme="minorEastAsia"/>
         </w:rPr>
-        <w:t xml:space="preserve">The annual amount paid to the share holders in proportion to the current price of the share </w:t>
+        <w:t xml:space="preserve">The annual amount paid to the </w:t>
+      </w:r>
+      <w:proofErr w:type="spellStart"/>
+      <w:r>
+        <w:rPr>
+          <w:rFonts w:eastAsiaTheme="minorEastAsia"/>
+        </w:rPr>
+        <w:t>share holders</w:t>
+      </w:r>
+      <w:proofErr w:type="spellEnd"/>
+      <w:r>
+        <w:rPr>
+          <w:rFonts w:eastAsiaTheme="minorEastAsia"/>
+        </w:rPr>
+        <w:t xml:space="preserve"> in proportion to the current price of the share </w:t>
       </w:r>
     </w:p>
     <w:p>
@@ -14144,7 +14247,21 @@
           <w:rFonts w:eastAsiaTheme="minorEastAsia"/>
         </w:rPr>
         <w:lastRenderedPageBreak/>
-        <w:t xml:space="preserve">The preference share of xyz ltd are selling for Rs. 50 per share and pays a dividend of Rs 3, what is your expected rate of return if you purchase the security at market price </w:t>
+        <w:t xml:space="preserve">The preference share of </w:t>
+      </w:r>
+      <w:proofErr w:type="spellStart"/>
+      <w:r>
+        <w:rPr>
+          <w:rFonts w:eastAsiaTheme="minorEastAsia"/>
+        </w:rPr>
+        <w:t>xyz</w:t>
+      </w:r>
+      <w:proofErr w:type="spellEnd"/>
+      <w:r>
+        <w:rPr>
+          <w:rFonts w:eastAsiaTheme="minorEastAsia"/>
+        </w:rPr>
+        <w:t xml:space="preserve"> ltd are selling for Rs. 50 per share and pays a dividend of Rs 3, what is your expected rate of return if you purchase the security at market price </w:t>
       </w:r>
     </w:p>
     <w:p>
@@ -14210,11 +14327,19 @@
           <w:rFonts w:eastAsiaTheme="minorEastAsia"/>
         </w:rPr>
       </w:pPr>
-      <w:r>
-        <w:rPr>
-          <w:rFonts w:eastAsiaTheme="minorEastAsia"/>
-        </w:rPr>
-        <w:t xml:space="preserve">Bhuvenesh own 200 preference shares of PQR ltd. Which currently sells at Rs 40 per share and pays an annual of Rs 7 per share. What is the expected return or dividend yield </w:t>
+      <w:proofErr w:type="spellStart"/>
+      <w:r>
+        <w:rPr>
+          <w:rFonts w:eastAsiaTheme="minorEastAsia"/>
+        </w:rPr>
+        <w:t>Bhuvenesh</w:t>
+      </w:r>
+      <w:proofErr w:type="spellEnd"/>
+      <w:r>
+        <w:rPr>
+          <w:rFonts w:eastAsiaTheme="minorEastAsia"/>
+        </w:rPr>
+        <w:t xml:space="preserve"> own 200 preference shares of PQR ltd. Which currently sells at Rs 40 per share and pays an annual of Rs 7 per share. What is the expected return or dividend yield </w:t>
       </w:r>
     </w:p>
     <w:p>
@@ -14268,7 +14393,21 @@
         <w:rPr>
           <w:rFonts w:eastAsiaTheme="minorEastAsia"/>
         </w:rPr>
-        <w:t xml:space="preserve">If bhuvanesh requires a 12% return, given the current price should he sell or buy more preference share </w:t>
+        <w:t xml:space="preserve">If </w:t>
+      </w:r>
+      <w:proofErr w:type="spellStart"/>
+      <w:r>
+        <w:rPr>
+          <w:rFonts w:eastAsiaTheme="minorEastAsia"/>
+        </w:rPr>
+        <w:t>bhuvanesh</w:t>
+      </w:r>
+      <w:proofErr w:type="spellEnd"/>
+      <w:r>
+        <w:rPr>
+          <w:rFonts w:eastAsiaTheme="minorEastAsia"/>
+        </w:rPr>
+        <w:t xml:space="preserve"> requires a 12% return, given the current price should he sell or buy more preference share </w:t>
       </w:r>
     </w:p>
     <w:p>
@@ -14318,7 +14457,35 @@
         <w:rPr>
           <w:rFonts w:eastAsiaTheme="minorEastAsia"/>
         </w:rPr>
-        <w:t>The expected return is 17.5% which greateer that the required rate of return (12%) also the current market price Rs. 40, which is less thatn 58.33which shows the stock is undervalued so it is worth buying.</w:t>
+        <w:t xml:space="preserve">The expected return is 17.5% which </w:t>
+      </w:r>
+      <w:proofErr w:type="spellStart"/>
+      <w:r>
+        <w:rPr>
+          <w:rFonts w:eastAsiaTheme="minorEastAsia"/>
+        </w:rPr>
+        <w:t>greateer</w:t>
+      </w:r>
+      <w:proofErr w:type="spellEnd"/>
+      <w:r>
+        <w:rPr>
+          <w:rFonts w:eastAsiaTheme="minorEastAsia"/>
+        </w:rPr>
+        <w:t xml:space="preserve"> that the required rate of return (12%) also the current market price Rs. 40, which is less </w:t>
+      </w:r>
+      <w:proofErr w:type="spellStart"/>
+      <w:r>
+        <w:rPr>
+          <w:rFonts w:eastAsiaTheme="minorEastAsia"/>
+        </w:rPr>
+        <w:t>thatn</w:t>
+      </w:r>
+      <w:proofErr w:type="spellEnd"/>
+      <w:r>
+        <w:rPr>
+          <w:rFonts w:eastAsiaTheme="minorEastAsia"/>
+        </w:rPr>
+        <w:t xml:space="preserve"> 58.33which shows the stock is undervalued so it is worth buying.</w:t>
       </w:r>
     </w:p>
     <w:p>
@@ -14495,7 +14662,7 @@
                     <w:rPr>
                       <w:rFonts w:ascii="Cambria Math" w:eastAsiaTheme="minorEastAsia" w:hAnsi="Cambria Math"/>
                     </w:rPr>
-                    <m:t>k</m:t>
+                    <m:t>t</m:t>
                   </m:r>
                 </m:sub>
               </m:sSub>
@@ -14591,9 +14758,6 @@
         </w:rPr>
       </w:pPr>
       <m:oMathPara>
-        <m:oMathParaPr>
-          <m:jc m:val="left"/>
-        </m:oMathParaPr>
         <m:oMath>
           <m:sSub>
             <m:sSubPr>
@@ -14964,7 +15128,21 @@
         <w:rPr>
           <w:rFonts w:eastAsiaTheme="minorEastAsia"/>
         </w:rPr>
-        <w:t>Specific valution models</w:t>
+        <w:t xml:space="preserve">Specific </w:t>
+      </w:r>
+      <w:proofErr w:type="spellStart"/>
+      <w:r>
+        <w:rPr>
+          <w:rFonts w:eastAsiaTheme="minorEastAsia"/>
+        </w:rPr>
+        <w:t>valution</w:t>
+      </w:r>
+      <w:proofErr w:type="spellEnd"/>
+      <w:r>
+        <w:rPr>
+          <w:rFonts w:eastAsiaTheme="minorEastAsia"/>
+        </w:rPr>
+        <w:t xml:space="preserve"> models</w:t>
       </w:r>
     </w:p>
     <w:p>
@@ -15014,12 +15192,14 @@
           <w:rFonts w:eastAsiaTheme="minorEastAsia"/>
         </w:rPr>
       </w:pPr>
+      <w:proofErr w:type="spellStart"/>
       <w:r>
         <w:rPr>
           <w:rFonts w:eastAsiaTheme="minorEastAsia"/>
         </w:rPr>
         <w:t>Modigilani</w:t>
       </w:r>
+      <w:proofErr w:type="spellEnd"/>
       <w:r>
         <w:rPr>
           <w:rFonts w:eastAsiaTheme="minorEastAsia"/>
@@ -15060,7 +15240,21 @@
         <w:rPr>
           <w:rFonts w:eastAsiaTheme="minorEastAsia"/>
         </w:rPr>
-        <w:t>Price-earning ratio (PE)</w:t>
+        <w:t>Price-</w:t>
+      </w:r>
+      <w:proofErr w:type="spellStart"/>
+      <w:r>
+        <w:rPr>
+          <w:rFonts w:eastAsiaTheme="minorEastAsia"/>
+        </w:rPr>
+        <w:t>earning</w:t>
+      </w:r>
+      <w:proofErr w:type="spellEnd"/>
+      <w:r>
+        <w:rPr>
+          <w:rFonts w:eastAsiaTheme="minorEastAsia"/>
+        </w:rPr>
+        <w:t xml:space="preserve"> ratio (PE)</w:t>
       </w:r>
     </w:p>
     <w:p>
@@ -15164,6 +15358,317 @@
           <w:rFonts w:eastAsiaTheme="minorEastAsia"/>
         </w:rPr>
         <w:t xml:space="preserve">The sale of equity share occurs at the end of a year and at the ‘x’ dividend terms </w:t>
+      </w:r>
+    </w:p>
+    <w:p>
+      <w:pPr>
+        <w:rPr>
+          <w:rFonts w:eastAsiaTheme="minorEastAsia"/>
+        </w:rPr>
+      </w:pPr>
+      <m:oMathPara>
+        <m:oMath>
+          <m:sSub>
+            <m:sSubPr>
+              <m:ctrlPr>
+                <w:rPr>
+                  <w:rFonts w:ascii="Cambria Math" w:eastAsiaTheme="minorEastAsia" w:hAnsi="Cambria Math"/>
+                  <w:i/>
+                </w:rPr>
+              </m:ctrlPr>
+            </m:sSubPr>
+            <m:e>
+              <m:r>
+                <w:rPr>
+                  <w:rFonts w:ascii="Cambria Math" w:eastAsiaTheme="minorEastAsia" w:hAnsi="Cambria Math"/>
+                </w:rPr>
+                <m:t>P</m:t>
+              </m:r>
+            </m:e>
+            <m:sub>
+              <m:r>
+                <w:rPr>
+                  <w:rFonts w:ascii="Cambria Math" w:eastAsiaTheme="minorEastAsia" w:hAnsi="Cambria Math"/>
+                </w:rPr>
+                <m:t>0</m:t>
+              </m:r>
+            </m:sub>
+          </m:sSub>
+          <m:r>
+            <w:rPr>
+              <w:rFonts w:ascii="Cambria Math" w:eastAsiaTheme="minorEastAsia" w:hAnsi="Cambria Math"/>
+            </w:rPr>
+            <m:t xml:space="preserve"> = </m:t>
+          </m:r>
+          <m:nary>
+            <m:naryPr>
+              <m:chr m:val="∑"/>
+              <m:limLoc m:val="undOvr"/>
+              <m:ctrlPr>
+                <w:rPr>
+                  <w:rFonts w:ascii="Cambria Math" w:eastAsiaTheme="minorEastAsia" w:hAnsi="Cambria Math"/>
+                  <w:i/>
+                </w:rPr>
+              </m:ctrlPr>
+            </m:naryPr>
+            <m:sub>
+              <m:r>
+                <w:rPr>
+                  <w:rFonts w:ascii="Cambria Math" w:eastAsiaTheme="minorEastAsia" w:hAnsi="Cambria Math"/>
+                </w:rPr>
+                <m:t>i = 1</m:t>
+              </m:r>
+            </m:sub>
+            <m:sup>
+              <m:r>
+                <w:rPr>
+                  <w:rFonts w:ascii="Cambria Math" w:eastAsiaTheme="minorEastAsia" w:hAnsi="Cambria Math"/>
+                </w:rPr>
+                <m:t>n</m:t>
+              </m:r>
+            </m:sup>
+            <m:e>
+              <m:f>
+                <m:fPr>
+                  <m:ctrlPr>
+                    <w:rPr>
+                      <w:rFonts w:ascii="Cambria Math" w:eastAsiaTheme="minorEastAsia" w:hAnsi="Cambria Math"/>
+                      <w:i/>
+                    </w:rPr>
+                  </m:ctrlPr>
+                </m:fPr>
+                <m:num>
+                  <m:sSub>
+                    <m:sSubPr>
+                      <m:ctrlPr>
+                        <w:rPr>
+                          <w:rFonts w:ascii="Cambria Math" w:eastAsiaTheme="minorEastAsia" w:hAnsi="Cambria Math"/>
+                          <w:i/>
+                        </w:rPr>
+                      </m:ctrlPr>
+                    </m:sSubPr>
+                    <m:e>
+                      <m:r>
+                        <w:rPr>
+                          <w:rFonts w:ascii="Cambria Math" w:eastAsiaTheme="minorEastAsia" w:hAnsi="Cambria Math"/>
+                        </w:rPr>
+                        <m:t>D</m:t>
+                      </m:r>
+                    </m:e>
+                    <m:sub>
+                      <m:r>
+                        <w:rPr>
+                          <w:rFonts w:ascii="Cambria Math" w:eastAsiaTheme="minorEastAsia" w:hAnsi="Cambria Math"/>
+                        </w:rPr>
+                        <m:t>i</m:t>
+                      </m:r>
+                    </m:sub>
+                  </m:sSub>
+                </m:num>
+                <m:den>
+                  <m:sSup>
+                    <m:sSupPr>
+                      <m:ctrlPr>
+                        <w:rPr>
+                          <w:rFonts w:ascii="Cambria Math" w:eastAsiaTheme="minorEastAsia" w:hAnsi="Cambria Math"/>
+                          <w:i/>
+                        </w:rPr>
+                      </m:ctrlPr>
+                    </m:sSupPr>
+                    <m:e>
+                      <m:d>
+                        <m:dPr>
+                          <m:ctrlPr>
+                            <w:rPr>
+                              <w:rFonts w:ascii="Cambria Math" w:eastAsiaTheme="minorEastAsia" w:hAnsi="Cambria Math"/>
+                              <w:i/>
+                            </w:rPr>
+                          </m:ctrlPr>
+                        </m:dPr>
+                        <m:e>
+                          <m:r>
+                            <w:rPr>
+                              <w:rFonts w:ascii="Cambria Math" w:eastAsiaTheme="minorEastAsia" w:hAnsi="Cambria Math"/>
+                            </w:rPr>
+                            <m:t>1+</m:t>
+                          </m:r>
+                          <m:sSub>
+                            <m:sSubPr>
+                              <m:ctrlPr>
+                                <w:rPr>
+                                  <w:rFonts w:ascii="Cambria Math" w:eastAsiaTheme="minorEastAsia" w:hAnsi="Cambria Math"/>
+                                  <w:i/>
+                                </w:rPr>
+                              </m:ctrlPr>
+                            </m:sSubPr>
+                            <m:e>
+                              <m:r>
+                                <w:rPr>
+                                  <w:rFonts w:ascii="Cambria Math" w:eastAsiaTheme="minorEastAsia" w:hAnsi="Cambria Math"/>
+                                </w:rPr>
+                                <m:t>K</m:t>
+                              </m:r>
+                            </m:e>
+                            <m:sub>
+                              <m:r>
+                                <w:rPr>
+                                  <w:rFonts w:ascii="Cambria Math" w:eastAsiaTheme="minorEastAsia" w:hAnsi="Cambria Math"/>
+                                </w:rPr>
+                                <m:t>e</m:t>
+                              </m:r>
+                            </m:sub>
+                          </m:sSub>
+                        </m:e>
+                      </m:d>
+                    </m:e>
+                    <m:sup>
+                      <m:r>
+                        <w:rPr>
+                          <w:rFonts w:ascii="Cambria Math" w:eastAsiaTheme="minorEastAsia" w:hAnsi="Cambria Math"/>
+                        </w:rPr>
+                        <m:t>n</m:t>
+                      </m:r>
+                    </m:sup>
+                  </m:sSup>
+                </m:den>
+              </m:f>
+            </m:e>
+          </m:nary>
+        </m:oMath>
+      </m:oMathPara>
+    </w:p>
+    <w:p>
+      <w:pPr>
+        <w:rPr>
+          <w:rFonts w:eastAsiaTheme="minorEastAsia"/>
+        </w:rPr>
+      </w:pPr>
+      <w:r>
+        <w:rPr>
+          <w:rFonts w:eastAsiaTheme="minorEastAsia"/>
+        </w:rPr>
+        <w:t>Where,</w:t>
+      </w:r>
+    </w:p>
+    <w:p>
+      <w:pPr>
+        <w:rPr>
+          <w:rFonts w:eastAsiaTheme="minorEastAsia"/>
+        </w:rPr>
+      </w:pPr>
+      <w:r>
+        <w:rPr>
+          <w:rFonts w:eastAsiaTheme="minorEastAsia"/>
+        </w:rPr>
+        <w:tab/>
+        <w:t>P</w:t>
+      </w:r>
+      <w:r>
+        <w:rPr>
+          <w:rFonts w:eastAsiaTheme="minorEastAsia"/>
+          <w:vertAlign w:val="subscript"/>
+        </w:rPr>
+        <w:t>0</w:t>
+      </w:r>
+      <w:r>
+        <w:rPr>
+          <w:rFonts w:eastAsiaTheme="minorEastAsia"/>
+          <w:vertAlign w:val="subscript"/>
+        </w:rPr>
+        <w:t xml:space="preserve"> </w:t>
+      </w:r>
+      <w:r>
+        <w:rPr>
+          <w:rFonts w:eastAsiaTheme="minorEastAsia"/>
+        </w:rPr>
+        <w:t>= value of the equity share</w:t>
+      </w:r>
+    </w:p>
+    <w:p>
+      <w:pPr>
+        <w:rPr>
+          <w:rFonts w:eastAsiaTheme="minorEastAsia"/>
+        </w:rPr>
+      </w:pPr>
+      <w:r>
+        <w:rPr>
+          <w:rFonts w:eastAsiaTheme="minorEastAsia"/>
+        </w:rPr>
+        <w:tab/>
+        <w:t>D</w:t>
+      </w:r>
+      <w:r>
+        <w:rPr>
+          <w:rFonts w:eastAsiaTheme="minorEastAsia"/>
+          <w:vertAlign w:val="subscript"/>
+        </w:rPr>
+        <w:t xml:space="preserve">i </w:t>
+      </w:r>
+      <w:r>
+        <w:rPr>
+          <w:rFonts w:eastAsiaTheme="minorEastAsia"/>
+        </w:rPr>
+        <w:t>= expected dividends over the year</w:t>
+      </w:r>
+    </w:p>
+    <w:p>
+      <w:pPr>
+        <w:rPr>
+          <w:rFonts w:eastAsiaTheme="minorEastAsia"/>
+        </w:rPr>
+      </w:pPr>
+      <w:r>
+        <w:rPr>
+          <w:rFonts w:eastAsiaTheme="minorEastAsia"/>
+        </w:rPr>
+        <w:tab/>
+        <w:t>K</w:t>
+      </w:r>
+      <w:r>
+        <w:rPr>
+          <w:rFonts w:eastAsiaTheme="minorEastAsia"/>
+          <w:vertAlign w:val="subscript"/>
+        </w:rPr>
+        <w:t xml:space="preserve">e </w:t>
+      </w:r>
+      <w:r>
+        <w:rPr>
+          <w:rFonts w:eastAsiaTheme="minorEastAsia"/>
+        </w:rPr>
+        <w:t xml:space="preserve">= required rate of return of the equity investors </w:t>
+      </w:r>
+    </w:p>
+    <w:p>
+      <w:pPr>
+        <w:rPr>
+          <w:rFonts w:eastAsiaTheme="minorEastAsia"/>
+        </w:rPr>
+      </w:pPr>
+      <w:r>
+        <w:rPr>
+          <w:rFonts w:eastAsiaTheme="minorEastAsia"/>
+        </w:rPr>
+        <w:t>Above equations states that the price equals the present value of all expected future dividends into perpetuity (dividend discount model (DDM))</w:t>
+      </w:r>
+    </w:p>
+    <w:p>
+      <w:pPr>
+        <w:rPr>
+          <w:rFonts w:eastAsiaTheme="minorEastAsia"/>
+        </w:rPr>
+      </w:pPr>
+    </w:p>
+    <w:p>
+      <w:pPr>
+        <w:rPr>
+          <w:rFonts w:eastAsiaTheme="minorEastAsia"/>
+        </w:rPr>
+      </w:pPr>
+      <w:r>
+        <w:rPr>
+          <w:rFonts w:eastAsiaTheme="minorEastAsia"/>
+        </w:rPr>
+        <w:t>General valuation method (hold period 2 years)</w:t>
       </w:r>
     </w:p>
     <w:p>
@@ -15349,132 +15854,105 @@
           <w:rFonts w:eastAsiaTheme="minorEastAsia"/>
         </w:rPr>
       </w:pPr>
-      <w:r>
-        <w:rPr>
-          <w:rFonts w:eastAsiaTheme="minorEastAsia"/>
-        </w:rPr>
-        <w:t>Where,</w:t>
-      </w:r>
-    </w:p>
-    <w:p>
-      <w:pPr>
-        <w:rPr>
-          <w:rFonts w:eastAsiaTheme="minorEastAsia"/>
-        </w:rPr>
-      </w:pPr>
-      <w:r>
-        <w:rPr>
-          <w:rFonts w:eastAsiaTheme="minorEastAsia"/>
-        </w:rPr>
-        <w:tab/>
-        <w:t>P</w:t>
-      </w:r>
-      <w:r>
-        <w:rPr>
-          <w:rFonts w:eastAsiaTheme="minorEastAsia"/>
-          <w:vertAlign w:val="subscript"/>
-        </w:rPr>
-        <w:t>0</w:t>
-      </w:r>
-      <w:r>
-        <w:rPr>
-          <w:rFonts w:eastAsiaTheme="minorEastAsia"/>
-          <w:vertAlign w:val="subscript"/>
+      <m:oMath>
+        <m:sSub>
+          <m:sSubPr>
+            <m:ctrlPr>
+              <w:rPr>
+                <w:rFonts w:ascii="Cambria Math" w:eastAsiaTheme="minorEastAsia" w:hAnsi="Cambria Math"/>
+                <w:i/>
+              </w:rPr>
+            </m:ctrlPr>
+          </m:sSubPr>
+          <m:e>
+            <m:r>
+              <w:rPr>
+                <w:rFonts w:ascii="Cambria Math" w:eastAsiaTheme="minorEastAsia" w:hAnsi="Cambria Math"/>
+              </w:rPr>
+              <m:t>P</m:t>
+            </m:r>
+          </m:e>
+          <m:sub>
+            <m:r>
+              <w:rPr>
+                <w:rFonts w:ascii="Cambria Math" w:eastAsiaTheme="minorEastAsia" w:hAnsi="Cambria Math"/>
+              </w:rPr>
+              <m:t>2</m:t>
+            </m:r>
+          </m:sub>
+        </m:sSub>
+        <m:r>
+          <w:rPr>
+            <w:rFonts w:ascii="Cambria Math" w:eastAsiaTheme="minorEastAsia" w:hAnsi="Cambria Math"/>
+          </w:rPr>
+          <m:t xml:space="preserve"> = expected selling price at the end of year 2</m:t>
+        </m:r>
+      </m:oMath>
+      <w:r>
+        <w:rPr>
+          <w:rFonts w:eastAsiaTheme="minorEastAsia"/>
         </w:rPr>
         <w:t xml:space="preserve"> </w:t>
       </w:r>
-      <w:r>
-        <w:rPr>
-          <w:rFonts w:eastAsiaTheme="minorEastAsia"/>
-        </w:rPr>
-        <w:t>= value of the equity share</w:t>
-      </w:r>
-    </w:p>
-    <w:p>
-      <w:pPr>
-        <w:rPr>
-          <w:rFonts w:eastAsiaTheme="minorEastAsia"/>
-        </w:rPr>
-      </w:pPr>
-      <w:r>
-        <w:rPr>
-          <w:rFonts w:eastAsiaTheme="minorEastAsia"/>
-        </w:rPr>
-        <w:tab/>
-        <w:t>D</w:t>
-      </w:r>
-      <w:r>
-        <w:rPr>
-          <w:rFonts w:eastAsiaTheme="minorEastAsia"/>
-          <w:vertAlign w:val="subscript"/>
-        </w:rPr>
-        <w:t xml:space="preserve">i </w:t>
-      </w:r>
-      <w:r>
-        <w:rPr>
-          <w:rFonts w:eastAsiaTheme="minorEastAsia"/>
-        </w:rPr>
-        <w:t>= expected dividends over the year</w:t>
-      </w:r>
-    </w:p>
-    <w:p>
-      <w:pPr>
-        <w:rPr>
-          <w:rFonts w:eastAsiaTheme="minorEastAsia"/>
-        </w:rPr>
-      </w:pPr>
-      <w:r>
-        <w:rPr>
-          <w:rFonts w:eastAsiaTheme="minorEastAsia"/>
-        </w:rPr>
-        <w:tab/>
-        <w:t>K</w:t>
-      </w:r>
-      <w:r>
-        <w:rPr>
-          <w:rFonts w:eastAsiaTheme="minorEastAsia"/>
-          <w:vertAlign w:val="subscript"/>
-        </w:rPr>
-        <w:t xml:space="preserve">e </w:t>
-      </w:r>
-      <w:r>
-        <w:rPr>
-          <w:rFonts w:eastAsiaTheme="minorEastAsia"/>
-        </w:rPr>
-        <w:t xml:space="preserve">= required rate of return of the equity investors </w:t>
-      </w:r>
-    </w:p>
-    <w:p>
-      <w:pPr>
-        <w:rPr>
-          <w:rFonts w:eastAsiaTheme="minorEastAsia"/>
-        </w:rPr>
-      </w:pPr>
-      <w:r>
-        <w:rPr>
-          <w:rFonts w:eastAsiaTheme="minorEastAsia"/>
-        </w:rPr>
-        <w:t>Above equations states that the price equals the present value of all expected future dividends into perpetuity (dividend discount model (DDM))</w:t>
-      </w:r>
-    </w:p>
-    <w:p>
-      <w:pPr>
-        <w:rPr>
-          <w:rFonts w:eastAsiaTheme="minorEastAsia"/>
-        </w:rPr>
-      </w:pPr>
-    </w:p>
-    <w:p>
-      <w:pPr>
-        <w:rPr>
-          <w:rFonts w:eastAsiaTheme="minorEastAsia"/>
-        </w:rPr>
-      </w:pPr>
-      <w:r>
-        <w:rPr>
-          <w:rFonts w:eastAsiaTheme="minorEastAsia"/>
-        </w:rPr>
-        <w:t>General valuation method (hold period 2 years)</w:t>
+    </w:p>
+    <w:p>
+      <w:pPr>
+        <w:rPr>
+          <w:rFonts w:eastAsiaTheme="minorEastAsia"/>
+        </w:rPr>
+      </w:pPr>
+    </w:p>
+    <w:p>
+      <w:pPr>
+        <w:rPr>
+          <w:rFonts w:eastAsiaTheme="minorEastAsia"/>
+        </w:rPr>
+      </w:pPr>
+    </w:p>
+    <w:p>
+      <w:pPr>
+        <w:rPr>
+          <w:rFonts w:eastAsiaTheme="minorEastAsia"/>
+        </w:rPr>
+      </w:pPr>
+      <w:r>
+        <w:rPr>
+          <w:rFonts w:eastAsiaTheme="minorEastAsia"/>
+        </w:rPr>
+        <w:t>10/09/2026</w:t>
+      </w:r>
+    </w:p>
+    <w:p>
+      <w:pPr>
+        <w:rPr>
+          <w:rFonts w:eastAsiaTheme="minorEastAsia"/>
+        </w:rPr>
+      </w:pPr>
+    </w:p>
+    <w:p>
+      <w:pPr>
+        <w:rPr>
+          <w:rFonts w:eastAsiaTheme="minorEastAsia"/>
+        </w:rPr>
+      </w:pPr>
+      <w:r>
+        <w:rPr>
+          <w:rFonts w:eastAsiaTheme="minorEastAsia"/>
+        </w:rPr>
+        <w:t>Constant Dividend</w:t>
+      </w:r>
+    </w:p>
+    <w:p>
+      <w:pPr>
+        <w:rPr>
+          <w:rFonts w:eastAsiaTheme="minorEastAsia"/>
+        </w:rPr>
+      </w:pPr>
+      <w:r>
+        <w:rPr>
+          <w:rFonts w:eastAsiaTheme="minorEastAsia"/>
+        </w:rPr>
+        <w:t>The dividend amount remains constant over years</w:t>
       </w:r>
     </w:p>
     <w:p>
@@ -15484,6 +15962,98 @@
         </w:rPr>
       </w:pPr>
       <m:oMathPara>
+        <m:oMath>
+          <m:sSub>
+            <m:sSubPr>
+              <m:ctrlPr>
+                <w:rPr>
+                  <w:rFonts w:ascii="Cambria Math" w:eastAsiaTheme="minorEastAsia" w:hAnsi="Cambria Math"/>
+                  <w:i/>
+                </w:rPr>
+              </m:ctrlPr>
+            </m:sSubPr>
+            <m:e>
+              <m:r>
+                <w:rPr>
+                  <w:rFonts w:ascii="Cambria Math" w:eastAsiaTheme="minorEastAsia" w:hAnsi="Cambria Math"/>
+                </w:rPr>
+                <m:t>p</m:t>
+              </m:r>
+            </m:e>
+            <m:sub>
+              <m:r>
+                <w:rPr>
+                  <w:rFonts w:ascii="Cambria Math" w:eastAsiaTheme="minorEastAsia" w:hAnsi="Cambria Math"/>
+                </w:rPr>
+                <m:t>0</m:t>
+              </m:r>
+            </m:sub>
+          </m:sSub>
+          <m:r>
+            <w:rPr>
+              <w:rFonts w:ascii="Cambria Math" w:eastAsiaTheme="minorEastAsia" w:hAnsi="Cambria Math"/>
+            </w:rPr>
+            <m:t>=</m:t>
+          </m:r>
+          <m:f>
+            <m:fPr>
+              <m:ctrlPr>
+                <w:rPr>
+                  <w:rFonts w:ascii="Cambria Math" w:eastAsiaTheme="minorEastAsia" w:hAnsi="Cambria Math"/>
+                  <w:i/>
+                </w:rPr>
+              </m:ctrlPr>
+            </m:fPr>
+            <m:num>
+              <m:r>
+                <w:rPr>
+                  <w:rFonts w:ascii="Cambria Math" w:eastAsiaTheme="minorEastAsia" w:hAnsi="Cambria Math"/>
+                </w:rPr>
+                <m:t>D</m:t>
+              </m:r>
+            </m:num>
+            <m:den>
+              <m:sSub>
+                <m:sSubPr>
+                  <m:ctrlPr>
+                    <w:rPr>
+                      <w:rFonts w:ascii="Cambria Math" w:eastAsiaTheme="minorEastAsia" w:hAnsi="Cambria Math"/>
+                      <w:i/>
+                    </w:rPr>
+                  </m:ctrlPr>
+                </m:sSubPr>
+                <m:e>
+                  <m:r>
+                    <w:rPr>
+                      <w:rFonts w:ascii="Cambria Math" w:eastAsiaTheme="minorEastAsia" w:hAnsi="Cambria Math"/>
+                    </w:rPr>
+                    <m:t>K</m:t>
+                  </m:r>
+                </m:e>
+                <m:sub>
+                  <m:r>
+                    <w:rPr>
+                      <w:rFonts w:ascii="Cambria Math" w:eastAsiaTheme="minorEastAsia" w:hAnsi="Cambria Math"/>
+                    </w:rPr>
+                    <m:t>e</m:t>
+                  </m:r>
+                </m:sub>
+              </m:sSub>
+            </m:den>
+          </m:f>
+        </m:oMath>
+      </m:oMathPara>
+    </w:p>
+    <w:p>
+      <w:pPr>
+        <w:rPr>
+          <w:rFonts w:eastAsiaTheme="minorEastAsia"/>
+        </w:rPr>
+      </w:pPr>
+      <m:oMathPara>
+        <m:oMathParaPr>
+          <m:jc m:val="left"/>
+        </m:oMathParaPr>
         <m:oMath>
           <m:sSub>
             <m:sSubPr>
@@ -15515,144 +16085,687 @@
             <w:rPr>
               <w:rFonts w:ascii="Cambria Math" w:eastAsiaTheme="minorEastAsia" w:hAnsi="Cambria Math"/>
             </w:rPr>
-            <m:t xml:space="preserve"> = </m:t>
+            <m:t xml:space="preserve"> = value of equity shar</m:t>
           </m:r>
-          <m:nary>
-            <m:naryPr>
-              <m:chr m:val="∑"/>
-              <m:limLoc m:val="undOvr"/>
+          <m:r>
+            <w:rPr>
+              <w:rFonts w:ascii="Cambria Math" w:eastAsiaTheme="minorEastAsia" w:hAnsi="Cambria Math"/>
+            </w:rPr>
+            <m:t>e</m:t>
+          </m:r>
+        </m:oMath>
+      </m:oMathPara>
+    </w:p>
+    <w:p>
+      <w:pPr>
+        <w:rPr>
+          <w:rFonts w:eastAsiaTheme="minorEastAsia"/>
+        </w:rPr>
+      </w:pPr>
+      <m:oMathPara>
+        <m:oMathParaPr>
+          <m:jc m:val="left"/>
+        </m:oMathParaPr>
+        <m:oMath>
+          <m:r>
+            <w:rPr>
+              <w:rFonts w:ascii="Cambria Math" w:eastAsiaTheme="minorEastAsia" w:hAnsi="Cambria Math"/>
+            </w:rPr>
+            <m:t>D = annual dividen</m:t>
+          </m:r>
+          <m:r>
+            <w:rPr>
+              <w:rFonts w:ascii="Cambria Math" w:eastAsiaTheme="minorEastAsia" w:hAnsi="Cambria Math"/>
+            </w:rPr>
+            <m:t>d</m:t>
+          </m:r>
+        </m:oMath>
+      </m:oMathPara>
+    </w:p>
+    <w:p>
+      <w:pPr>
+        <w:rPr>
+          <w:rFonts w:eastAsiaTheme="minorEastAsia"/>
+        </w:rPr>
+      </w:pPr>
+      <m:oMathPara>
+        <m:oMathParaPr>
+          <m:jc m:val="left"/>
+        </m:oMathParaPr>
+        <m:oMath>
+          <m:sSub>
+            <m:sSubPr>
               <m:ctrlPr>
                 <w:rPr>
                   <w:rFonts w:ascii="Cambria Math" w:eastAsiaTheme="minorEastAsia" w:hAnsi="Cambria Math"/>
                   <w:i/>
                 </w:rPr>
               </m:ctrlPr>
-            </m:naryPr>
+            </m:sSubPr>
+            <m:e>
+              <m:r>
+                <w:rPr>
+                  <w:rFonts w:ascii="Cambria Math" w:eastAsiaTheme="minorEastAsia" w:hAnsi="Cambria Math"/>
+                </w:rPr>
+                <m:t>K</m:t>
+              </m:r>
+            </m:e>
             <m:sub>
               <m:r>
                 <w:rPr>
                   <w:rFonts w:ascii="Cambria Math" w:eastAsiaTheme="minorEastAsia" w:hAnsi="Cambria Math"/>
                 </w:rPr>
-                <m:t>i = 1</m:t>
+                <m:t>e</m:t>
               </m:r>
             </m:sub>
-            <m:sup>
+          </m:sSub>
+          <m:r>
+            <w:rPr>
+              <w:rFonts w:ascii="Cambria Math" w:eastAsiaTheme="minorEastAsia" w:hAnsi="Cambria Math"/>
+            </w:rPr>
+            <m:t xml:space="preserve"> = required rate of return of equity investors</m:t>
+          </m:r>
+        </m:oMath>
+      </m:oMathPara>
+    </w:p>
+    <w:p>
+      <w:pPr>
+        <w:rPr>
+          <w:rFonts w:eastAsiaTheme="minorEastAsia"/>
+        </w:rPr>
+      </w:pPr>
+      <w:r>
+        <w:rPr>
+          <w:rFonts w:eastAsiaTheme="minorEastAsia"/>
+        </w:rPr>
+        <w:t xml:space="preserve">Q. a </w:t>
+      </w:r>
+      <w:proofErr w:type="spellStart"/>
+      <w:r>
+        <w:rPr>
+          <w:rFonts w:eastAsiaTheme="minorEastAsia"/>
+        </w:rPr>
+        <w:t>frim</w:t>
+      </w:r>
+      <w:proofErr w:type="spellEnd"/>
+      <w:r>
+        <w:rPr>
+          <w:rFonts w:eastAsiaTheme="minorEastAsia"/>
+        </w:rPr>
+        <w:t xml:space="preserve"> pays a dividend of 20%on the equity shares of face value of </w:t>
+      </w:r>
+      <w:proofErr w:type="spellStart"/>
+      <w:r>
+        <w:rPr>
+          <w:rFonts w:eastAsiaTheme="minorEastAsia"/>
+        </w:rPr>
+        <w:t>rs</w:t>
+      </w:r>
+      <w:proofErr w:type="spellEnd"/>
+      <w:r>
+        <w:rPr>
+          <w:rFonts w:eastAsiaTheme="minorEastAsia"/>
+        </w:rPr>
+        <w:t xml:space="preserve"> 100 each, find out the value of the equity share given that the dividend rate is expected to remain same and the required rate of return </w:t>
+      </w:r>
+      <w:proofErr w:type="spellStart"/>
+      <w:r>
+        <w:rPr>
+          <w:rFonts w:eastAsiaTheme="minorEastAsia"/>
+        </w:rPr>
+        <w:t>fo</w:t>
+      </w:r>
+      <w:proofErr w:type="spellEnd"/>
+      <w:r>
+        <w:rPr>
+          <w:rFonts w:eastAsiaTheme="minorEastAsia"/>
+        </w:rPr>
+        <w:t xml:space="preserve"> the investor is 15%.</w:t>
+      </w:r>
+    </w:p>
+    <w:p>
+      <w:pPr>
+        <w:rPr>
+          <w:rFonts w:eastAsiaTheme="minorEastAsia"/>
+        </w:rPr>
+      </w:pPr>
+    </w:p>
+    <w:p>
+      <w:pPr>
+        <w:rPr>
+          <w:rFonts w:eastAsiaTheme="minorEastAsia"/>
+        </w:rPr>
+      </w:pPr>
+      <w:r>
+        <w:rPr>
+          <w:rFonts w:eastAsiaTheme="minorEastAsia"/>
+        </w:rPr>
+        <w:t xml:space="preserve">Ans: </w:t>
+      </w:r>
+    </w:p>
+    <w:p>
+      <w:pPr>
+        <w:rPr>
+          <w:lang w:val="en-US"/>
+        </w:rPr>
+      </w:pPr>
+      <w:r>
+        <w:rPr>
+          <w:lang w:val="en-US"/>
+        </w:rPr>
+        <w:lastRenderedPageBreak/>
+        <w:t>(100*20%)/0.15 = 133.33</w:t>
+      </w:r>
+    </w:p>
+    <w:p>
+      <w:pPr>
+        <w:rPr>
+          <w:lang w:val="en-US"/>
+        </w:rPr>
+      </w:pPr>
+    </w:p>
+    <w:p>
+      <w:pPr>
+        <w:rPr>
+          <w:lang w:val="en-US"/>
+        </w:rPr>
+      </w:pPr>
+      <w:r>
+        <w:rPr>
+          <w:lang w:val="en-US"/>
+        </w:rPr>
+        <w:t xml:space="preserve">Constant growth in dividends (the most common valuation model) </w:t>
+      </w:r>
+    </w:p>
+    <w:p>
+      <w:pPr>
+        <w:rPr>
+          <w:lang w:val="en-US"/>
+        </w:rPr>
+      </w:pPr>
+      <w:r>
+        <w:rPr>
+          <w:lang w:val="en-US"/>
+        </w:rPr>
+        <w:t>Assumptions:</w:t>
+      </w:r>
+    </w:p>
+    <w:p>
+      <w:pPr>
+        <w:pStyle w:val="ListParagraph"/>
+        <w:numPr>
+          <w:ilvl w:val="0"/>
+          <w:numId w:val="47"/>
+        </w:numPr>
+        <w:rPr>
+          <w:lang w:val="en-US"/>
+        </w:rPr>
+      </w:pPr>
+      <w:r>
+        <w:rPr>
+          <w:lang w:val="en-US"/>
+        </w:rPr>
+        <w:t xml:space="preserve">Dividend will grow constantly </w:t>
+      </w:r>
+    </w:p>
+    <w:p>
+      <w:pPr>
+        <w:pStyle w:val="ListParagraph"/>
+        <w:numPr>
+          <w:ilvl w:val="0"/>
+          <w:numId w:val="47"/>
+        </w:numPr>
+        <w:rPr>
+          <w:lang w:val="en-US"/>
+        </w:rPr>
+      </w:pPr>
+      <w:r>
+        <w:rPr>
+          <w:lang w:val="en-US"/>
+        </w:rPr>
+        <w:t xml:space="preserve">It will grow every year </w:t>
+      </w:r>
+    </w:p>
+    <w:p>
+      <w:pPr>
+        <w:rPr>
+          <w:rFonts w:eastAsiaTheme="minorEastAsia"/>
+          <w:lang w:val="en-US"/>
+        </w:rPr>
+      </w:pPr>
+      <m:oMathPara>
+        <m:oMath>
+          <m:sSub>
+            <m:sSubPr>
+              <m:ctrlPr>
+                <w:rPr>
+                  <w:rFonts w:ascii="Cambria Math" w:hAnsi="Cambria Math"/>
+                  <w:i/>
+                  <w:lang w:val="en-US"/>
+                </w:rPr>
+              </m:ctrlPr>
+            </m:sSubPr>
+            <m:e>
               <m:r>
                 <w:rPr>
-                  <w:rFonts w:ascii="Cambria Math" w:eastAsiaTheme="minorEastAsia" w:hAnsi="Cambria Math"/>
+                  <w:rFonts w:ascii="Cambria Math" w:hAnsi="Cambria Math"/>
+                  <w:lang w:val="en-US"/>
                 </w:rPr>
-                <m:t>n</m:t>
+                <m:t>P</m:t>
               </m:r>
-            </m:sup>
-            <m:e>
-              <m:f>
-                <m:fPr>
+            </m:e>
+            <m:sub>
+              <m:r>
+                <w:rPr>
+                  <w:rFonts w:ascii="Cambria Math" w:hAnsi="Cambria Math"/>
+                  <w:lang w:val="en-US"/>
+                </w:rPr>
+                <m:t>0</m:t>
+              </m:r>
+            </m:sub>
+          </m:sSub>
+          <m:r>
+            <w:rPr>
+              <w:rFonts w:ascii="Cambria Math" w:hAnsi="Cambria Math"/>
+              <w:lang w:val="en-US"/>
+            </w:rPr>
+            <m:t>=</m:t>
+          </m:r>
+          <m:f>
+            <m:fPr>
+              <m:ctrlPr>
+                <w:rPr>
+                  <w:rFonts w:ascii="Cambria Math" w:hAnsi="Cambria Math"/>
+                  <w:i/>
+                  <w:lang w:val="en-US"/>
+                </w:rPr>
+              </m:ctrlPr>
+            </m:fPr>
+            <m:num>
+              <m:sSub>
+                <m:sSubPr>
                   <m:ctrlPr>
                     <w:rPr>
-                      <w:rFonts w:ascii="Cambria Math" w:eastAsiaTheme="minorEastAsia" w:hAnsi="Cambria Math"/>
+                      <w:rFonts w:ascii="Cambria Math" w:hAnsi="Cambria Math"/>
                       <w:i/>
+                      <w:lang w:val="en-US"/>
                     </w:rPr>
                   </m:ctrlPr>
-                </m:fPr>
-                <m:num>
-                  <m:sSub>
-                    <m:sSubPr>
-                      <m:ctrlPr>
-                        <w:rPr>
-                          <w:rFonts w:ascii="Cambria Math" w:eastAsiaTheme="minorEastAsia" w:hAnsi="Cambria Math"/>
-                          <w:i/>
-                        </w:rPr>
-                      </m:ctrlPr>
-                    </m:sSubPr>
-                    <m:e>
-                      <m:r>
-                        <w:rPr>
-                          <w:rFonts w:ascii="Cambria Math" w:eastAsiaTheme="minorEastAsia" w:hAnsi="Cambria Math"/>
-                        </w:rPr>
-                        <m:t>D</m:t>
-                      </m:r>
-                    </m:e>
-                    <m:sub>
-                      <m:r>
-                        <w:rPr>
-                          <w:rFonts w:ascii="Cambria Math" w:eastAsiaTheme="minorEastAsia" w:hAnsi="Cambria Math"/>
-                        </w:rPr>
-                        <m:t>n</m:t>
-                      </m:r>
-                    </m:sub>
-                  </m:sSub>
-                </m:num>
-                <m:den>
-                  <m:sSup>
-                    <m:sSupPr>
-                      <m:ctrlPr>
-                        <w:rPr>
-                          <w:rFonts w:ascii="Cambria Math" w:eastAsiaTheme="minorEastAsia" w:hAnsi="Cambria Math"/>
-                          <w:i/>
-                        </w:rPr>
-                      </m:ctrlPr>
-                    </m:sSupPr>
-                    <m:e>
-                      <m:d>
-                        <m:dPr>
-                          <m:ctrlPr>
-                            <w:rPr>
-                              <w:rFonts w:ascii="Cambria Math" w:eastAsiaTheme="minorEastAsia" w:hAnsi="Cambria Math"/>
-                              <w:i/>
-                            </w:rPr>
-                          </m:ctrlPr>
-                        </m:dPr>
-                        <m:e>
-                          <m:r>
-                            <w:rPr>
-                              <w:rFonts w:ascii="Cambria Math" w:eastAsiaTheme="minorEastAsia" w:hAnsi="Cambria Math"/>
-                            </w:rPr>
-                            <m:t>1+</m:t>
-                          </m:r>
-                          <m:sSub>
-                            <m:sSubPr>
-                              <m:ctrlPr>
-                                <w:rPr>
-                                  <w:rFonts w:ascii="Cambria Math" w:eastAsiaTheme="minorEastAsia" w:hAnsi="Cambria Math"/>
-                                  <w:i/>
-                                </w:rPr>
-                              </m:ctrlPr>
-                            </m:sSubPr>
-                            <m:e>
-                              <m:r>
-                                <w:rPr>
-                                  <w:rFonts w:ascii="Cambria Math" w:eastAsiaTheme="minorEastAsia" w:hAnsi="Cambria Math"/>
-                                </w:rPr>
-                                <m:t>K</m:t>
-                              </m:r>
-                            </m:e>
-                            <m:sub>
-                              <m:r>
-                                <w:rPr>
-                                  <w:rFonts w:ascii="Cambria Math" w:eastAsiaTheme="minorEastAsia" w:hAnsi="Cambria Math"/>
-                                </w:rPr>
-                                <m:t>e</m:t>
-                              </m:r>
-                            </m:sub>
-                          </m:sSub>
-                        </m:e>
-                      </m:d>
-                    </m:e>
-                    <m:sup>
-                      <m:r>
-                        <w:rPr>
-                          <w:rFonts w:ascii="Cambria Math" w:eastAsiaTheme="minorEastAsia" w:hAnsi="Cambria Math"/>
-                        </w:rPr>
-                        <m:t>n</m:t>
-                      </m:r>
-                    </m:sup>
-                  </m:sSup>
-                </m:den>
-              </m:f>
-            </m:e>
-          </m:nary>
+                </m:sSubPr>
+                <m:e>
+                  <m:r>
+                    <w:rPr>
+                      <w:rFonts w:ascii="Cambria Math" w:hAnsi="Cambria Math"/>
+                      <w:lang w:val="en-US"/>
+                    </w:rPr>
+                    <m:t>D</m:t>
+                  </m:r>
+                </m:e>
+                <m:sub>
+                  <m:r>
+                    <w:rPr>
+                      <w:rFonts w:ascii="Cambria Math" w:hAnsi="Cambria Math"/>
+                      <w:lang w:val="en-US"/>
+                    </w:rPr>
+                    <m:t>1</m:t>
+                  </m:r>
+                </m:sub>
+              </m:sSub>
+            </m:num>
+            <m:den>
+              <m:sSub>
+                <m:sSubPr>
+                  <m:ctrlPr>
+                    <w:rPr>
+                      <w:rFonts w:ascii="Cambria Math" w:hAnsi="Cambria Math"/>
+                      <w:i/>
+                      <w:lang w:val="en-US"/>
+                    </w:rPr>
+                  </m:ctrlPr>
+                </m:sSubPr>
+                <m:e>
+                  <m:r>
+                    <w:rPr>
+                      <w:rFonts w:ascii="Cambria Math" w:hAnsi="Cambria Math"/>
+                      <w:lang w:val="en-US"/>
+                    </w:rPr>
+                    <m:t>K</m:t>
+                  </m:r>
+                </m:e>
+                <m:sub>
+                  <m:r>
+                    <w:rPr>
+                      <w:rFonts w:ascii="Cambria Math" w:hAnsi="Cambria Math"/>
+                      <w:lang w:val="en-US"/>
+                    </w:rPr>
+                    <m:t>e</m:t>
+                  </m:r>
+                </m:sub>
+              </m:sSub>
+              <m:r>
+                <w:rPr>
+                  <w:rFonts w:ascii="Cambria Math" w:hAnsi="Cambria Math"/>
+                  <w:lang w:val="en-US"/>
+                </w:rPr>
+                <m:t>-g</m:t>
+              </m:r>
+            </m:den>
+          </m:f>
         </m:oMath>
       </m:oMathPara>
+    </w:p>
+    <w:p>
+      <w:pPr>
+        <w:rPr>
+          <w:rFonts w:eastAsiaTheme="minorEastAsia"/>
+          <w:lang w:val="en-US"/>
+        </w:rPr>
+      </w:pPr>
+      <w:r>
+        <w:rPr>
+          <w:rFonts w:eastAsiaTheme="minorEastAsia"/>
+          <w:lang w:val="en-US"/>
+        </w:rPr>
+        <w:t xml:space="preserve">Q. a share having a face value of </w:t>
+      </w:r>
+      <w:proofErr w:type="spellStart"/>
+      <w:r>
+        <w:rPr>
+          <w:rFonts w:eastAsiaTheme="minorEastAsia"/>
+          <w:lang w:val="en-US"/>
+        </w:rPr>
+        <w:t>rs</w:t>
+      </w:r>
+      <w:proofErr w:type="spellEnd"/>
+      <w:r>
+        <w:rPr>
+          <w:rFonts w:eastAsiaTheme="minorEastAsia"/>
+          <w:lang w:val="en-US"/>
+        </w:rPr>
+        <w:t xml:space="preserve"> 100 is expected to pay a dividend of 12% at the end of the year 1 and the growth rate in dividends is estimated is to be 3%. If the investor has a required rate of return of 16%, calculate the value of equity share. </w:t>
+      </w:r>
+    </w:p>
+    <w:p>
+      <w:pPr>
+        <w:rPr>
+          <w:rFonts w:eastAsiaTheme="minorEastAsia"/>
+          <w:lang w:val="en-US"/>
+        </w:rPr>
+      </w:pPr>
+    </w:p>
+    <w:p>
+      <w:pPr>
+        <w:rPr>
+          <w:rFonts w:eastAsiaTheme="minorEastAsia"/>
+          <w:lang w:val="en-US"/>
+        </w:rPr>
+      </w:pPr>
+      <w:r>
+        <w:rPr>
+          <w:rFonts w:eastAsiaTheme="minorEastAsia"/>
+          <w:lang w:val="en-US"/>
+        </w:rPr>
+        <w:t>= 12/(0.16-0.03) = 92.30</w:t>
+      </w:r>
+    </w:p>
+    <w:p>
+      <w:pPr>
+        <w:rPr>
+          <w:rFonts w:eastAsiaTheme="minorEastAsia"/>
+          <w:lang w:val="en-US"/>
+        </w:rPr>
+      </w:pPr>
+    </w:p>
+    <w:p>
+      <w:pPr>
+        <w:rPr>
+          <w:rFonts w:eastAsiaTheme="minorEastAsia"/>
+          <w:lang w:val="en-US"/>
+        </w:rPr>
+      </w:pPr>
+      <w:r>
+        <w:rPr>
+          <w:rFonts w:eastAsiaTheme="minorEastAsia"/>
+          <w:lang w:val="en-US"/>
+        </w:rPr>
+        <w:t xml:space="preserve">Specific value models </w:t>
+      </w:r>
+    </w:p>
+    <w:p>
+      <w:pPr>
+        <w:pStyle w:val="ListParagraph"/>
+        <w:numPr>
+          <w:ilvl w:val="0"/>
+          <w:numId w:val="48"/>
+        </w:numPr>
+        <w:rPr>
+          <w:rFonts w:eastAsiaTheme="minorEastAsia"/>
+          <w:lang w:val="en-US"/>
+        </w:rPr>
+      </w:pPr>
+      <w:r>
+        <w:rPr>
+          <w:rFonts w:eastAsiaTheme="minorEastAsia"/>
+          <w:lang w:val="en-US"/>
+        </w:rPr>
+        <w:t>Gordon’s model</w:t>
+      </w:r>
+    </w:p>
+    <w:p>
+      <w:pPr>
+        <w:pStyle w:val="ListParagraph"/>
+        <w:numPr>
+          <w:ilvl w:val="0"/>
+          <w:numId w:val="48"/>
+        </w:numPr>
+        <w:rPr>
+          <w:rFonts w:eastAsiaTheme="minorEastAsia"/>
+          <w:lang w:val="en-US"/>
+        </w:rPr>
+      </w:pPr>
+      <w:r>
+        <w:rPr>
+          <w:rFonts w:eastAsiaTheme="minorEastAsia"/>
+          <w:lang w:val="en-US"/>
+        </w:rPr>
+        <w:t>Walter’s model</w:t>
+      </w:r>
+    </w:p>
+    <w:p>
+      <w:pPr>
+        <w:pStyle w:val="ListParagraph"/>
+        <w:numPr>
+          <w:ilvl w:val="0"/>
+          <w:numId w:val="48"/>
+        </w:numPr>
+        <w:rPr>
+          <w:rFonts w:eastAsiaTheme="minorEastAsia"/>
+          <w:lang w:val="en-US"/>
+        </w:rPr>
+      </w:pPr>
+      <w:proofErr w:type="spellStart"/>
+      <w:r>
+        <w:rPr>
+          <w:rFonts w:eastAsiaTheme="minorEastAsia"/>
+          <w:lang w:val="en-US"/>
+        </w:rPr>
+        <w:t>Modigilani</w:t>
+      </w:r>
+      <w:proofErr w:type="spellEnd"/>
+      <w:r>
+        <w:rPr>
+          <w:rFonts w:eastAsiaTheme="minorEastAsia"/>
+          <w:lang w:val="en-US"/>
+        </w:rPr>
+        <w:t xml:space="preserve"> miller model (mmm)</w:t>
+      </w:r>
+    </w:p>
+    <w:p>
+      <w:pPr>
+        <w:rPr>
+          <w:rFonts w:eastAsiaTheme="minorEastAsia"/>
+          <w:lang w:val="en-US"/>
+        </w:rPr>
+      </w:pPr>
+    </w:p>
+    <w:p>
+      <w:pPr>
+        <w:rPr>
+          <w:rFonts w:eastAsiaTheme="minorEastAsia"/>
+          <w:lang w:val="en-US"/>
+        </w:rPr>
+      </w:pPr>
+      <w:r>
+        <w:rPr>
+          <w:rFonts w:eastAsiaTheme="minorEastAsia"/>
+          <w:lang w:val="en-US"/>
+        </w:rPr>
+        <w:t xml:space="preserve">1. </w:t>
+      </w:r>
+      <w:proofErr w:type="spellStart"/>
+      <w:r>
+        <w:rPr>
+          <w:rFonts w:eastAsiaTheme="minorEastAsia"/>
+          <w:lang w:val="en-US"/>
+        </w:rPr>
+        <w:t>gordon’s</w:t>
+      </w:r>
+      <w:proofErr w:type="spellEnd"/>
+      <w:r>
+        <w:rPr>
+          <w:rFonts w:eastAsiaTheme="minorEastAsia"/>
+          <w:lang w:val="en-US"/>
+        </w:rPr>
+        <w:t xml:space="preserve"> model</w:t>
+      </w:r>
+    </w:p>
+    <w:p>
+      <w:pPr>
+        <w:pStyle w:val="ListParagraph"/>
+        <w:numPr>
+          <w:ilvl w:val="0"/>
+          <w:numId w:val="49"/>
+        </w:numPr>
+        <w:rPr>
+          <w:rFonts w:eastAsiaTheme="minorEastAsia"/>
+          <w:lang w:val="en-US"/>
+        </w:rPr>
+      </w:pPr>
+      <w:r>
+        <w:rPr>
+          <w:rFonts w:eastAsiaTheme="minorEastAsia"/>
+          <w:lang w:val="en-US"/>
+        </w:rPr>
+        <w:t>Earning of the firm are either distributed among the shareholders or reinvested within the business</w:t>
+      </w:r>
+    </w:p>
+    <w:p>
+      <w:pPr>
+        <w:pStyle w:val="ListParagraph"/>
+        <w:numPr>
+          <w:ilvl w:val="0"/>
+          <w:numId w:val="49"/>
+        </w:numPr>
+        <w:rPr>
+          <w:rFonts w:eastAsiaTheme="minorEastAsia"/>
+          <w:lang w:val="en-US"/>
+        </w:rPr>
+      </w:pPr>
+      <w:r>
+        <w:rPr>
+          <w:rFonts w:eastAsiaTheme="minorEastAsia"/>
+          <w:lang w:val="en-US"/>
+        </w:rPr>
+        <w:t xml:space="preserve">Growth in dividends in future depends upon the profit retained and the </w:t>
+      </w:r>
+      <w:proofErr w:type="spellStart"/>
+      <w:r>
+        <w:rPr>
+          <w:rFonts w:eastAsiaTheme="minorEastAsia"/>
+          <w:lang w:val="en-US"/>
+        </w:rPr>
+        <w:t>reate</w:t>
+      </w:r>
+      <w:proofErr w:type="spellEnd"/>
+      <w:r>
+        <w:rPr>
+          <w:rFonts w:eastAsiaTheme="minorEastAsia"/>
+          <w:lang w:val="en-US"/>
+        </w:rPr>
+        <w:t xml:space="preserve"> of return one retained profit </w:t>
+      </w:r>
+    </w:p>
+    <w:p>
+      <w:pPr>
+        <w:rPr>
+          <w:rFonts w:eastAsiaTheme="minorEastAsia"/>
+          <w:lang w:val="en-US"/>
+        </w:rPr>
+      </w:pPr>
+      <w:r>
+        <w:rPr>
+          <w:rFonts w:eastAsiaTheme="minorEastAsia"/>
+          <w:lang w:val="en-US"/>
+        </w:rPr>
+        <w:t>Assumptions</w:t>
+      </w:r>
+    </w:p>
+    <w:p>
+      <w:pPr>
+        <w:pStyle w:val="ListParagraph"/>
+        <w:numPr>
+          <w:ilvl w:val="0"/>
+          <w:numId w:val="50"/>
+        </w:numPr>
+        <w:rPr>
+          <w:rFonts w:eastAsiaTheme="minorEastAsia"/>
+          <w:lang w:val="en-US"/>
+        </w:rPr>
+      </w:pPr>
+      <w:r>
+        <w:rPr>
+          <w:rFonts w:eastAsiaTheme="minorEastAsia"/>
+          <w:lang w:val="en-US"/>
+        </w:rPr>
+        <w:t>The retention ratio is constant</w:t>
+      </w:r>
+    </w:p>
+    <w:p>
+      <w:pPr>
+        <w:pStyle w:val="ListParagraph"/>
+        <w:numPr>
+          <w:ilvl w:val="0"/>
+          <w:numId w:val="50"/>
+        </w:numPr>
+        <w:rPr>
+          <w:rFonts w:eastAsiaTheme="minorEastAsia"/>
+          <w:lang w:val="en-US"/>
+        </w:rPr>
+      </w:pPr>
+      <w:r>
+        <w:rPr>
+          <w:rFonts w:eastAsiaTheme="minorEastAsia"/>
+          <w:lang w:val="en-US"/>
+        </w:rPr>
+        <w:t xml:space="preserve">The rate of return on reinvestment profit is </w:t>
+      </w:r>
+      <w:proofErr w:type="spellStart"/>
+      <w:r>
+        <w:rPr>
+          <w:rFonts w:eastAsiaTheme="minorEastAsia"/>
+          <w:lang w:val="en-US"/>
+        </w:rPr>
+        <w:t>contant</w:t>
+      </w:r>
+      <w:proofErr w:type="spellEnd"/>
+    </w:p>
+    <w:p>
+      <w:pPr>
+        <w:rPr>
+          <w:rFonts w:eastAsiaTheme="minorEastAsia"/>
+          <w:lang w:val="en-US"/>
+        </w:rPr>
+      </w:pPr>
     </w:p>
     <w:p>
       <w:pPr>
@@ -15667,7 +16780,6 @@
               <m:ctrlPr>
                 <w:rPr>
                   <w:rFonts w:ascii="Cambria Math" w:eastAsiaTheme="minorEastAsia" w:hAnsi="Cambria Math"/>
-                  <w:i/>
                 </w:rPr>
               </m:ctrlPr>
             </m:sSubPr>
@@ -15684,7 +16796,7 @@
                 <w:rPr>
                   <w:rFonts w:ascii="Cambria Math" w:eastAsiaTheme="minorEastAsia" w:hAnsi="Cambria Math"/>
                 </w:rPr>
-                <m:t>2</m:t>
+                <m:t>0</m:t>
               </m:r>
             </m:sub>
           </m:sSub>
@@ -15692,10 +16804,567 @@
             <w:rPr>
               <w:rFonts w:ascii="Cambria Math" w:eastAsiaTheme="minorEastAsia" w:hAnsi="Cambria Math"/>
             </w:rPr>
-            <m:t xml:space="preserve"> = expected selling price at the end of year 2</m:t>
+            <m:t>=</m:t>
+          </m:r>
+          <m:d>
+            <m:dPr>
+              <m:ctrlPr>
+                <w:rPr>
+                  <w:rFonts w:ascii="Cambria Math" w:eastAsiaTheme="minorEastAsia" w:hAnsi="Cambria Math"/>
+                </w:rPr>
+              </m:ctrlPr>
+            </m:dPr>
+            <m:e>
+              <m:r>
+                <w:rPr>
+                  <w:rFonts w:ascii="Cambria Math" w:eastAsiaTheme="minorEastAsia" w:hAnsi="Cambria Math"/>
+                </w:rPr>
+                <m:t>EP</m:t>
+              </m:r>
+              <m:sSub>
+                <m:sSubPr>
+                  <m:ctrlPr>
+                    <w:rPr>
+                      <w:rFonts w:ascii="Cambria Math" w:eastAsiaTheme="minorEastAsia" w:hAnsi="Cambria Math"/>
+                    </w:rPr>
+                  </m:ctrlPr>
+                </m:sSubPr>
+                <m:e>
+                  <m:r>
+                    <w:rPr>
+                      <w:rFonts w:ascii="Cambria Math" w:eastAsiaTheme="minorEastAsia" w:hAnsi="Cambria Math"/>
+                    </w:rPr>
+                    <m:t>S</m:t>
+                  </m:r>
+                </m:e>
+                <m:sub>
+                  <m:r>
+                    <w:rPr>
+                      <w:rFonts w:ascii="Cambria Math" w:eastAsiaTheme="minorEastAsia" w:hAnsi="Cambria Math"/>
+                    </w:rPr>
+                    <m:t>1</m:t>
+                  </m:r>
+                </m:sub>
+              </m:sSub>
+              <m:d>
+                <m:dPr>
+                  <m:ctrlPr>
+                    <w:rPr>
+                      <w:rFonts w:ascii="Cambria Math" w:eastAsiaTheme="minorEastAsia" w:hAnsi="Cambria Math"/>
+                    </w:rPr>
+                  </m:ctrlPr>
+                </m:dPr>
+                <m:e>
+                  <m:r>
+                    <w:rPr>
+                      <w:rFonts w:ascii="Cambria Math" w:eastAsiaTheme="minorEastAsia" w:hAnsi="Cambria Math"/>
+                    </w:rPr>
+                    <m:t>1-b</m:t>
+                  </m:r>
+                </m:e>
+              </m:d>
+            </m:e>
+          </m:d>
+          <m:r>
+            <w:rPr>
+              <w:rFonts w:ascii="Cambria Math" w:eastAsiaTheme="minorEastAsia" w:hAnsi="Cambria Math"/>
+            </w:rPr>
+            <m:t>/</m:t>
+          </m:r>
+          <m:d>
+            <m:dPr>
+              <m:ctrlPr>
+                <w:rPr>
+                  <w:rFonts w:ascii="Cambria Math" w:eastAsiaTheme="minorEastAsia" w:hAnsi="Cambria Math"/>
+                </w:rPr>
+              </m:ctrlPr>
+            </m:dPr>
+            <m:e>
+              <m:sSub>
+                <m:sSubPr>
+                  <m:ctrlPr>
+                    <w:rPr>
+                      <w:rFonts w:ascii="Cambria Math" w:eastAsiaTheme="minorEastAsia" w:hAnsi="Cambria Math"/>
+                    </w:rPr>
+                  </m:ctrlPr>
+                </m:sSubPr>
+                <m:e>
+                  <m:r>
+                    <w:rPr>
+                      <w:rFonts w:ascii="Cambria Math" w:eastAsiaTheme="minorEastAsia" w:hAnsi="Cambria Math"/>
+                    </w:rPr>
+                    <m:t>K</m:t>
+                  </m:r>
+                </m:e>
+                <m:sub>
+                  <m:r>
+                    <w:rPr>
+                      <w:rFonts w:ascii="Cambria Math" w:eastAsiaTheme="minorEastAsia" w:hAnsi="Cambria Math"/>
+                    </w:rPr>
+                    <m:t>e</m:t>
+                  </m:r>
+                </m:sub>
+              </m:sSub>
+              <m:r>
+                <w:rPr>
+                  <w:rFonts w:ascii="Cambria Math" w:eastAsiaTheme="minorEastAsia" w:hAnsi="Cambria Math"/>
+                </w:rPr>
+                <m:t>-br</m:t>
+              </m:r>
+            </m:e>
+          </m:d>
+        </m:oMath>
+      </m:oMathPara>
+    </w:p>
+    <w:p>
+      <w:pPr>
+        <w:rPr>
+          <w:rFonts w:eastAsiaTheme="minorEastAsia"/>
+        </w:rPr>
+      </w:pPr>
+      <m:oMathPara>
+        <m:oMath>
+          <m:r>
+            <w:rPr>
+              <w:rFonts w:ascii="Cambria Math" w:eastAsiaTheme="minorEastAsia" w:hAnsi="Cambria Math"/>
+            </w:rPr>
+            <m:t>EP</m:t>
+          </m:r>
+          <m:sSub>
+            <m:sSubPr>
+              <m:ctrlPr>
+                <w:rPr>
+                  <w:rFonts w:ascii="Cambria Math" w:eastAsiaTheme="minorEastAsia" w:hAnsi="Cambria Math"/>
+                </w:rPr>
+              </m:ctrlPr>
+            </m:sSubPr>
+            <m:e>
+              <m:r>
+                <w:rPr>
+                  <w:rFonts w:ascii="Cambria Math" w:eastAsiaTheme="minorEastAsia" w:hAnsi="Cambria Math"/>
+                </w:rPr>
+                <m:t>S</m:t>
+              </m:r>
+            </m:e>
+            <m:sub>
+              <m:r>
+                <w:rPr>
+                  <w:rFonts w:ascii="Cambria Math" w:eastAsiaTheme="minorEastAsia" w:hAnsi="Cambria Math"/>
+                </w:rPr>
+                <m:t>1</m:t>
+              </m:r>
+            </m:sub>
+          </m:sSub>
+          <m:r>
+            <w:rPr>
+              <w:rFonts w:ascii="Cambria Math" w:eastAsiaTheme="minorEastAsia" w:hAnsi="Cambria Math"/>
+            </w:rPr>
+            <m:t>=Earningspershareexpectednextyear</m:t>
           </m:r>
         </m:oMath>
       </m:oMathPara>
+    </w:p>
+    <w:p>
+      <w:pPr>
+        <w:rPr>
+          <w:rFonts w:eastAsiaTheme="minorEastAsia"/>
+        </w:rPr>
+      </w:pPr>
+      <m:oMathPara>
+        <m:oMath>
+          <m:r>
+            <w:rPr>
+              <w:rFonts w:ascii="Cambria Math" w:eastAsiaTheme="minorEastAsia" w:hAnsi="Cambria Math"/>
+            </w:rPr>
+            <m:t>b=Retentionratio</m:t>
+          </m:r>
+        </m:oMath>
+      </m:oMathPara>
+    </w:p>
+    <w:p>
+      <w:pPr>
+        <w:rPr>
+          <w:rFonts w:eastAsiaTheme="minorEastAsia"/>
+        </w:rPr>
+      </w:pPr>
+      <m:oMathPara>
+        <m:oMath>
+          <m:r>
+            <w:rPr>
+              <w:rFonts w:ascii="Cambria Math" w:eastAsiaTheme="minorEastAsia" w:hAnsi="Cambria Math"/>
+            </w:rPr>
+            <w:lastRenderedPageBreak/>
+            <m:t>1-b=Dividendpayoutratio</m:t>
+          </m:r>
+        </m:oMath>
+      </m:oMathPara>
+    </w:p>
+    <w:p>
+      <w:pPr>
+        <w:rPr>
+          <w:rFonts w:eastAsiaTheme="minorEastAsia"/>
+        </w:rPr>
+      </w:pPr>
+      <m:oMathPara>
+        <m:oMath>
+          <m:sSub>
+            <m:sSubPr>
+              <m:ctrlPr>
+                <w:rPr>
+                  <w:rFonts w:ascii="Cambria Math" w:eastAsiaTheme="minorEastAsia" w:hAnsi="Cambria Math"/>
+                </w:rPr>
+              </m:ctrlPr>
+            </m:sSubPr>
+            <m:e>
+              <m:r>
+                <w:rPr>
+                  <w:rFonts w:ascii="Cambria Math" w:eastAsiaTheme="minorEastAsia" w:hAnsi="Cambria Math"/>
+                </w:rPr>
+                <m:t>K</m:t>
+              </m:r>
+            </m:e>
+            <m:sub>
+              <m:r>
+                <w:rPr>
+                  <w:rFonts w:ascii="Cambria Math" w:eastAsiaTheme="minorEastAsia" w:hAnsi="Cambria Math"/>
+                </w:rPr>
+                <m:t>e</m:t>
+              </m:r>
+            </m:sub>
+          </m:sSub>
+          <m:r>
+            <w:rPr>
+              <w:rFonts w:ascii="Cambria Math" w:eastAsiaTheme="minorEastAsia" w:hAnsi="Cambria Math"/>
+            </w:rPr>
+            <m:t>=Costofequity</m:t>
+          </m:r>
+        </m:oMath>
+      </m:oMathPara>
+    </w:p>
+    <w:p>
+      <w:pPr>
+        <w:rPr>
+          <w:rFonts w:eastAsiaTheme="minorEastAsia"/>
+        </w:rPr>
+      </w:pPr>
+      <m:oMathPara>
+        <m:oMath>
+          <m:r>
+            <w:rPr>
+              <w:rFonts w:ascii="Cambria Math" w:eastAsiaTheme="minorEastAsia" w:hAnsi="Cambria Math"/>
+            </w:rPr>
+            <m:t>br=Growthrate</m:t>
+          </m:r>
+          <m:d>
+            <m:dPr>
+              <m:ctrlPr>
+                <w:rPr>
+                  <w:rFonts w:ascii="Cambria Math" w:eastAsiaTheme="minorEastAsia" w:hAnsi="Cambria Math"/>
+                </w:rPr>
+              </m:ctrlPr>
+            </m:dPr>
+            <m:e>
+              <m:r>
+                <w:rPr>
+                  <w:rFonts w:ascii="Cambria Math" w:eastAsiaTheme="minorEastAsia" w:hAnsi="Cambria Math"/>
+                </w:rPr>
+                <m:t>b×r</m:t>
+              </m:r>
+            </m:e>
+          </m:d>
+        </m:oMath>
+      </m:oMathPara>
+    </w:p>
+    <w:p>
+      <w:pPr>
+        <w:rPr>
+          <w:rFonts w:eastAsiaTheme="minorEastAsia"/>
+        </w:rPr>
+      </w:pPr>
+      <m:oMathPara>
+        <m:oMath>
+          <m:r>
+            <w:rPr>
+              <w:rFonts w:ascii="Cambria Math" w:eastAsiaTheme="minorEastAsia" w:hAnsi="Cambria Math"/>
+            </w:rPr>
+            <m:t>r=Returnonequity</m:t>
+          </m:r>
+          <m:d>
+            <m:dPr>
+              <m:ctrlPr>
+                <w:rPr>
+                  <w:rFonts w:ascii="Cambria Math" w:eastAsiaTheme="minorEastAsia" w:hAnsi="Cambria Math"/>
+                </w:rPr>
+              </m:ctrlPr>
+            </m:dPr>
+            <m:e>
+              <m:r>
+                <w:rPr>
+                  <w:rFonts w:ascii="Cambria Math" w:eastAsiaTheme="minorEastAsia" w:hAnsi="Cambria Math"/>
+                </w:rPr>
+                <m:t>ROE</m:t>
+              </m:r>
+            </m:e>
+          </m:d>
+        </m:oMath>
+      </m:oMathPara>
+    </w:p>
+    <w:p>
+      <w:pPr>
+        <w:rPr>
+          <w:rFonts w:eastAsiaTheme="minorEastAsia"/>
+          <w:lang w:val="en-US"/>
+        </w:rPr>
+      </w:pPr>
+      <w:r>
+        <w:rPr>
+          <w:rFonts w:eastAsiaTheme="minorEastAsia"/>
+          <w:lang w:val="en-US"/>
+        </w:rPr>
+        <w:t xml:space="preserve">Q. a firm has an earning of </w:t>
+      </w:r>
+      <w:proofErr w:type="spellStart"/>
+      <w:r>
+        <w:rPr>
+          <w:rFonts w:eastAsiaTheme="minorEastAsia"/>
+          <w:lang w:val="en-US"/>
+        </w:rPr>
+        <w:t>rs</w:t>
+      </w:r>
+      <w:proofErr w:type="spellEnd"/>
+      <w:r>
+        <w:rPr>
+          <w:rFonts w:eastAsiaTheme="minorEastAsia"/>
+          <w:lang w:val="en-US"/>
+        </w:rPr>
+        <w:t xml:space="preserve"> 9 per share, it has 0 retention </w:t>
+      </w:r>
+      <w:proofErr w:type="spellStart"/>
+      <w:r>
+        <w:rPr>
+          <w:rFonts w:eastAsiaTheme="minorEastAsia"/>
+          <w:lang w:val="en-US"/>
+        </w:rPr>
+        <w:t>raitio</w:t>
+      </w:r>
+      <w:proofErr w:type="spellEnd"/>
+      <w:r>
+        <w:rPr>
+          <w:rFonts w:eastAsiaTheme="minorEastAsia"/>
+          <w:lang w:val="en-US"/>
+        </w:rPr>
+        <w:t xml:space="preserve"> and distributes the entire earnings as dividend. Case 2 the firm </w:t>
+      </w:r>
+      <w:proofErr w:type="spellStart"/>
+      <w:r>
+        <w:rPr>
+          <w:rFonts w:eastAsiaTheme="minorEastAsia"/>
+          <w:lang w:val="en-US"/>
+        </w:rPr>
+        <w:t>decideds</w:t>
+      </w:r>
+      <w:proofErr w:type="spellEnd"/>
+      <w:r>
+        <w:rPr>
+          <w:rFonts w:eastAsiaTheme="minorEastAsia"/>
+          <w:lang w:val="en-US"/>
+        </w:rPr>
+        <w:t xml:space="preserve"> to distribute 60% its earning and to retain to reinvest the remaining 40% of the earnings.&amp;#x20;</w:t>
+      </w:r>
+    </w:p>
+    <w:p>
+      <w:pPr>
+        <w:rPr>
+          <w:rFonts w:eastAsiaTheme="minorEastAsia"/>
+          <w:lang w:val="en-US"/>
+        </w:rPr>
+      </w:pPr>
+      <w:r>
+        <w:rPr>
+          <w:rFonts w:eastAsiaTheme="minorEastAsia"/>
+          <w:lang w:val="en-US"/>
+        </w:rPr>
+        <w:t xml:space="preserve">The dividend per share is expected at end of year 1 will be 60% of 9 </w:t>
+      </w:r>
+      <w:proofErr w:type="spellStart"/>
+      <w:r>
+        <w:rPr>
+          <w:rFonts w:eastAsiaTheme="minorEastAsia"/>
+          <w:lang w:val="en-US"/>
+        </w:rPr>
+        <w:t>rs</w:t>
+      </w:r>
+      <w:proofErr w:type="spellEnd"/>
+      <w:r>
+        <w:rPr>
+          <w:rFonts w:eastAsiaTheme="minorEastAsia"/>
+          <w:lang w:val="en-US"/>
+        </w:rPr>
+        <w:t xml:space="preserve"> that is 5.4 and growth rate in dividends (</w:t>
+      </w:r>
+      <w:proofErr w:type="spellStart"/>
+      <w:r>
+        <w:rPr>
+          <w:rFonts w:eastAsiaTheme="minorEastAsia"/>
+          <w:lang w:val="en-US"/>
+        </w:rPr>
+        <w:t>br</w:t>
+      </w:r>
+      <w:proofErr w:type="spellEnd"/>
+      <w:r>
+        <w:rPr>
+          <w:rFonts w:eastAsiaTheme="minorEastAsia"/>
+          <w:lang w:val="en-US"/>
+        </w:rPr>
+        <w:t>) will be 40%</w:t>
+      </w:r>
+    </w:p>
+    <w:p>
+      <w:pPr>
+        <w:rPr>
+          <w:rFonts w:eastAsiaTheme="minorEastAsia"/>
+          <w:lang w:val="en-US"/>
+        </w:rPr>
+      </w:pPr>
+      <w:proofErr w:type="spellStart"/>
+      <w:r>
+        <w:rPr>
+          <w:rFonts w:eastAsiaTheme="minorEastAsia"/>
+          <w:lang w:val="en-US"/>
+        </w:rPr>
+        <w:t>ke</w:t>
+      </w:r>
+      <w:proofErr w:type="spellEnd"/>
+      <w:r>
+        <w:rPr>
+          <w:rFonts w:eastAsiaTheme="minorEastAsia"/>
+          <w:lang w:val="en-US"/>
+        </w:rPr>
+        <w:t xml:space="preserve"> = 15%</w:t>
+      </w:r>
+    </w:p>
+    <w:p>
+      <w:pPr>
+        <w:rPr>
+          <w:rFonts w:eastAsiaTheme="minorEastAsia"/>
+          <w:lang w:val="en-US"/>
+        </w:rPr>
+      </w:pPr>
+    </w:p>
+    <w:p>
+      <w:pPr>
+        <w:rPr>
+          <w:rFonts w:eastAsiaTheme="minorEastAsia"/>
+        </w:rPr>
+      </w:pPr>
+      <m:oMathPara>
+        <m:oMath>
+          <m:r>
+            <w:rPr>
+              <w:rFonts w:ascii="Cambria Math" w:eastAsiaTheme="minorEastAsia" w:hAnsi="Cambria Math"/>
+            </w:rPr>
+            <m:t>EP</m:t>
+          </m:r>
+          <m:sSub>
+            <m:sSubPr>
+              <m:ctrlPr>
+                <w:rPr>
+                  <w:rFonts w:ascii="Cambria Math" w:eastAsiaTheme="minorEastAsia" w:hAnsi="Cambria Math"/>
+                </w:rPr>
+              </m:ctrlPr>
+            </m:sSubPr>
+            <m:e>
+              <m:r>
+                <w:rPr>
+                  <w:rFonts w:ascii="Cambria Math" w:eastAsiaTheme="minorEastAsia" w:hAnsi="Cambria Math"/>
+                </w:rPr>
+                <m:t>S</m:t>
+              </m:r>
+            </m:e>
+            <m:sub>
+              <m:r>
+                <w:rPr>
+                  <w:rFonts w:ascii="Cambria Math" w:eastAsiaTheme="minorEastAsia" w:hAnsi="Cambria Math"/>
+                </w:rPr>
+                <m:t>1</m:t>
+              </m:r>
+            </m:sub>
+          </m:sSub>
+          <m:r>
+            <w:rPr>
+              <w:rFonts w:ascii="Cambria Math" w:eastAsiaTheme="minorEastAsia" w:hAnsi="Cambria Math"/>
+            </w:rPr>
+            <m:t>=Rs.9</m:t>
+          </m:r>
+        </m:oMath>
+      </m:oMathPara>
+    </w:p>
+    <w:p>
+      <w:pPr>
+        <w:rPr>
+          <w:rFonts w:eastAsiaTheme="minorEastAsia"/>
+        </w:rPr>
+      </w:pPr>
+      <m:oMathPara>
+        <m:oMath>
+          <m:r>
+            <w:rPr>
+              <w:rFonts w:ascii="Cambria Math" w:eastAsiaTheme="minorEastAsia" w:hAnsi="Cambria Math"/>
+            </w:rPr>
+            <m:t>b=0</m:t>
+          </m:r>
+        </m:oMath>
+      </m:oMathPara>
+    </w:p>
+    <w:p>
+      <w:pPr>
+        <w:rPr>
+          <w:rFonts w:eastAsiaTheme="minorEastAsia"/>
+        </w:rPr>
+      </w:pPr>
+      <m:oMathPara>
+        <m:oMath>
+          <m:r>
+            <w:rPr>
+              <w:rFonts w:ascii="Cambria Math" w:eastAsiaTheme="minorEastAsia" w:hAnsi="Cambria Math"/>
+            </w:rPr>
+            <m:t>1-b=1</m:t>
+          </m:r>
+        </m:oMath>
+      </m:oMathPara>
+    </w:p>
+    <w:p>
+      <w:pPr>
+        <w:rPr>
+          <w:rFonts w:eastAsiaTheme="minorEastAsia"/>
+          <w:lang w:val="en-US"/>
+        </w:rPr>
+      </w:pPr>
+      <m:oMathPara>
+        <m:oMath>
+          <m:r>
+            <w:rPr>
+              <w:rFonts w:ascii="Cambria Math" w:eastAsiaTheme="minorEastAsia" w:hAnsi="Cambria Math"/>
+              <w:lang w:val="en-US"/>
+            </w:rPr>
+            <m:t>D_1 = EPS_1(1-b) = 9(1-0) = Rs.9</m:t>
+          </m:r>
+        </m:oMath>
+      </m:oMathPara>
+    </w:p>
+    <w:p>
+      <w:pPr>
+        <w:rPr>
+          <w:rFonts w:eastAsiaTheme="minorEastAsia"/>
+        </w:rPr>
+      </w:pPr>
+    </w:p>
+    <w:p>
+      <w:pPr>
+        <w:rPr>
+          <w:rFonts w:eastAsiaTheme="minorEastAsia"/>
+        </w:rPr>
+      </w:pPr>
     </w:p>
     <w:sectPr>
       <w:pgSz w:w="11906" w:h="16838"/>
@@ -18374,6 +20043,205 @@
     </w:lvl>
   </w:abstractNum>
   <w:abstractNum w:abstractNumId="27" w15:restartNumberingAfterBreak="0">
+    <w:nsid w:val="471E0E82"/>
+    <w:multiLevelType w:val="hybridMultilevel"/>
+    <w:tmpl w:val="A0C2BED4"/>
+    <w:lvl w:ilvl="0" w:tplc="40090001">
+      <w:start w:val="1"/>
+      <w:numFmt w:val="bullet"/>
+      <w:lvlText w:val=""/>
+      <w:lvlJc w:val="left"/>
+      <w:pPr>
+        <w:ind w:left="720" w:hanging="360"/>
+      </w:pPr>
+      <w:rPr>
+        <w:rFonts w:ascii="Symbol" w:hAnsi="Symbol" w:hint="default"/>
+      </w:rPr>
+    </w:lvl>
+    <w:lvl w:ilvl="1" w:tplc="40090003" w:tentative="1">
+      <w:start w:val="1"/>
+      <w:numFmt w:val="bullet"/>
+      <w:lvlText w:val="o"/>
+      <w:lvlJc w:val="left"/>
+      <w:pPr>
+        <w:ind w:left="1440" w:hanging="360"/>
+      </w:pPr>
+      <w:rPr>
+        <w:rFonts w:ascii="Courier New" w:hAnsi="Courier New" w:cs="Courier New" w:hint="default"/>
+      </w:rPr>
+    </w:lvl>
+    <w:lvl w:ilvl="2" w:tplc="40090005" w:tentative="1">
+      <w:start w:val="1"/>
+      <w:numFmt w:val="bullet"/>
+      <w:lvlText w:val=""/>
+      <w:lvlJc w:val="left"/>
+      <w:pPr>
+        <w:ind w:left="2160" w:hanging="360"/>
+      </w:pPr>
+      <w:rPr>
+        <w:rFonts w:ascii="Wingdings" w:hAnsi="Wingdings" w:hint="default"/>
+      </w:rPr>
+    </w:lvl>
+    <w:lvl w:ilvl="3" w:tplc="40090001" w:tentative="1">
+      <w:start w:val="1"/>
+      <w:numFmt w:val="bullet"/>
+      <w:lvlText w:val=""/>
+      <w:lvlJc w:val="left"/>
+      <w:pPr>
+        <w:ind w:left="2880" w:hanging="360"/>
+      </w:pPr>
+      <w:rPr>
+        <w:rFonts w:ascii="Symbol" w:hAnsi="Symbol" w:hint="default"/>
+      </w:rPr>
+    </w:lvl>
+    <w:lvl w:ilvl="4" w:tplc="40090003" w:tentative="1">
+      <w:start w:val="1"/>
+      <w:numFmt w:val="bullet"/>
+      <w:lvlText w:val="o"/>
+      <w:lvlJc w:val="left"/>
+      <w:pPr>
+        <w:ind w:left="3600" w:hanging="360"/>
+      </w:pPr>
+      <w:rPr>
+        <w:rFonts w:ascii="Courier New" w:hAnsi="Courier New" w:cs="Courier New" w:hint="default"/>
+      </w:rPr>
+    </w:lvl>
+    <w:lvl w:ilvl="5" w:tplc="40090005" w:tentative="1">
+      <w:start w:val="1"/>
+      <w:numFmt w:val="bullet"/>
+      <w:lvlText w:val=""/>
+      <w:lvlJc w:val="left"/>
+      <w:pPr>
+        <w:ind w:left="4320" w:hanging="360"/>
+      </w:pPr>
+      <w:rPr>
+        <w:rFonts w:ascii="Wingdings" w:hAnsi="Wingdings" w:hint="default"/>
+      </w:rPr>
+    </w:lvl>
+    <w:lvl w:ilvl="6" w:tplc="40090001" w:tentative="1">
+      <w:start w:val="1"/>
+      <w:numFmt w:val="bullet"/>
+      <w:lvlText w:val=""/>
+      <w:lvlJc w:val="left"/>
+      <w:pPr>
+        <w:ind w:left="5040" w:hanging="360"/>
+      </w:pPr>
+      <w:rPr>
+        <w:rFonts w:ascii="Symbol" w:hAnsi="Symbol" w:hint="default"/>
+      </w:rPr>
+    </w:lvl>
+    <w:lvl w:ilvl="7" w:tplc="40090003" w:tentative="1">
+      <w:start w:val="1"/>
+      <w:numFmt w:val="bullet"/>
+      <w:lvlText w:val="o"/>
+      <w:lvlJc w:val="left"/>
+      <w:pPr>
+        <w:ind w:left="5760" w:hanging="360"/>
+      </w:pPr>
+      <w:rPr>
+        <w:rFonts w:ascii="Courier New" w:hAnsi="Courier New" w:cs="Courier New" w:hint="default"/>
+      </w:rPr>
+    </w:lvl>
+    <w:lvl w:ilvl="8" w:tplc="40090005" w:tentative="1">
+      <w:start w:val="1"/>
+      <w:numFmt w:val="bullet"/>
+      <w:lvlText w:val=""/>
+      <w:lvlJc w:val="left"/>
+      <w:pPr>
+        <w:ind w:left="6480" w:hanging="360"/>
+      </w:pPr>
+      <w:rPr>
+        <w:rFonts w:ascii="Wingdings" w:hAnsi="Wingdings" w:hint="default"/>
+      </w:rPr>
+    </w:lvl>
+  </w:abstractNum>
+  <w:abstractNum w:abstractNumId="28" w15:restartNumberingAfterBreak="0">
+    <w:nsid w:val="51600570"/>
+    <w:multiLevelType w:val="hybridMultilevel"/>
+    <w:tmpl w:val="7B98FFEE"/>
+    <w:lvl w:ilvl="0" w:tplc="4009000F">
+      <w:start w:val="1"/>
+      <w:numFmt w:val="decimal"/>
+      <w:lvlText w:val="%1."/>
+      <w:lvlJc w:val="left"/>
+      <w:pPr>
+        <w:ind w:left="720" w:hanging="360"/>
+      </w:pPr>
+    </w:lvl>
+    <w:lvl w:ilvl="1" w:tplc="40090019" w:tentative="1">
+      <w:start w:val="1"/>
+      <w:numFmt w:val="lowerLetter"/>
+      <w:lvlText w:val="%2."/>
+      <w:lvlJc w:val="left"/>
+      <w:pPr>
+        <w:ind w:left="1440" w:hanging="360"/>
+      </w:pPr>
+    </w:lvl>
+    <w:lvl w:ilvl="2" w:tplc="4009001B" w:tentative="1">
+      <w:start w:val="1"/>
+      <w:numFmt w:val="lowerRoman"/>
+      <w:lvlText w:val="%3."/>
+      <w:lvlJc w:val="right"/>
+      <w:pPr>
+        <w:ind w:left="2160" w:hanging="180"/>
+      </w:pPr>
+    </w:lvl>
+    <w:lvl w:ilvl="3" w:tplc="4009000F" w:tentative="1">
+      <w:start w:val="1"/>
+      <w:numFmt w:val="decimal"/>
+      <w:lvlText w:val="%4."/>
+      <w:lvlJc w:val="left"/>
+      <w:pPr>
+        <w:ind w:left="2880" w:hanging="360"/>
+      </w:pPr>
+    </w:lvl>
+    <w:lvl w:ilvl="4" w:tplc="40090019" w:tentative="1">
+      <w:start w:val="1"/>
+      <w:numFmt w:val="lowerLetter"/>
+      <w:lvlText w:val="%5."/>
+      <w:lvlJc w:val="left"/>
+      <w:pPr>
+        <w:ind w:left="3600" w:hanging="360"/>
+      </w:pPr>
+    </w:lvl>
+    <w:lvl w:ilvl="5" w:tplc="4009001B" w:tentative="1">
+      <w:start w:val="1"/>
+      <w:numFmt w:val="lowerRoman"/>
+      <w:lvlText w:val="%6."/>
+      <w:lvlJc w:val="right"/>
+      <w:pPr>
+        <w:ind w:left="4320" w:hanging="180"/>
+      </w:pPr>
+    </w:lvl>
+    <w:lvl w:ilvl="6" w:tplc="4009000F" w:tentative="1">
+      <w:start w:val="1"/>
+      <w:numFmt w:val="decimal"/>
+      <w:lvlText w:val="%7."/>
+      <w:lvlJc w:val="left"/>
+      <w:pPr>
+        <w:ind w:left="5040" w:hanging="360"/>
+      </w:pPr>
+    </w:lvl>
+    <w:lvl w:ilvl="7" w:tplc="40090019" w:tentative="1">
+      <w:start w:val="1"/>
+      <w:numFmt w:val="lowerLetter"/>
+      <w:lvlText w:val="%8."/>
+      <w:lvlJc w:val="left"/>
+      <w:pPr>
+        <w:ind w:left="5760" w:hanging="360"/>
+      </w:pPr>
+    </w:lvl>
+    <w:lvl w:ilvl="8" w:tplc="4009001B" w:tentative="1">
+      <w:start w:val="1"/>
+      <w:numFmt w:val="lowerRoman"/>
+      <w:lvlText w:val="%9."/>
+      <w:lvlJc w:val="right"/>
+      <w:pPr>
+        <w:ind w:left="6480" w:hanging="180"/>
+      </w:pPr>
+    </w:lvl>
+  </w:abstractNum>
+  <w:abstractNum w:abstractNumId="29" w15:restartNumberingAfterBreak="0">
     <w:nsid w:val="51EB6CAA"/>
     <w:multiLevelType w:val="hybridMultilevel"/>
     <w:tmpl w:val="AA3A1986"/>
@@ -18459,7 +20327,7 @@
       </w:pPr>
     </w:lvl>
   </w:abstractNum>
-  <w:abstractNum w:abstractNumId="28" w15:restartNumberingAfterBreak="0">
+  <w:abstractNum w:abstractNumId="30" w15:restartNumberingAfterBreak="0">
     <w:nsid w:val="579956AE"/>
     <w:multiLevelType w:val="hybridMultilevel"/>
     <w:tmpl w:val="152C998C"/>
@@ -18548,7 +20416,7 @@
       </w:pPr>
     </w:lvl>
   </w:abstractNum>
-  <w:abstractNum w:abstractNumId="29" w15:restartNumberingAfterBreak="0">
+  <w:abstractNum w:abstractNumId="31" w15:restartNumberingAfterBreak="0">
     <w:nsid w:val="57AA63E2"/>
     <w:multiLevelType w:val="hybridMultilevel"/>
     <w:tmpl w:val="4CD8648E"/>
@@ -18634,7 +20502,7 @@
       </w:pPr>
     </w:lvl>
   </w:abstractNum>
-  <w:abstractNum w:abstractNumId="30" w15:restartNumberingAfterBreak="0">
+  <w:abstractNum w:abstractNumId="32" w15:restartNumberingAfterBreak="0">
     <w:nsid w:val="5AAF4307"/>
     <w:multiLevelType w:val="hybridMultilevel"/>
     <w:tmpl w:val="27147B98"/>
@@ -18720,7 +20588,7 @@
       </w:pPr>
     </w:lvl>
   </w:abstractNum>
-  <w:abstractNum w:abstractNumId="31" w15:restartNumberingAfterBreak="0">
+  <w:abstractNum w:abstractNumId="33" w15:restartNumberingAfterBreak="0">
     <w:nsid w:val="5B0B6E70"/>
     <w:multiLevelType w:val="hybridMultilevel"/>
     <w:tmpl w:val="639E1D92"/>
@@ -18806,7 +20674,7 @@
       </w:pPr>
     </w:lvl>
   </w:abstractNum>
-  <w:abstractNum w:abstractNumId="32" w15:restartNumberingAfterBreak="0">
+  <w:abstractNum w:abstractNumId="34" w15:restartNumberingAfterBreak="0">
     <w:nsid w:val="5B5059D4"/>
     <w:multiLevelType w:val="hybridMultilevel"/>
     <w:tmpl w:val="4F5CD94C"/>
@@ -18892,7 +20760,7 @@
       </w:pPr>
     </w:lvl>
   </w:abstractNum>
-  <w:abstractNum w:abstractNumId="33" w15:restartNumberingAfterBreak="0">
+  <w:abstractNum w:abstractNumId="35" w15:restartNumberingAfterBreak="0">
     <w:nsid w:val="5CF97DC3"/>
     <w:multiLevelType w:val="hybridMultilevel"/>
     <w:tmpl w:val="5B2C3BD8"/>
@@ -18978,7 +20846,7 @@
       </w:pPr>
     </w:lvl>
   </w:abstractNum>
-  <w:abstractNum w:abstractNumId="34" w15:restartNumberingAfterBreak="0">
+  <w:abstractNum w:abstractNumId="36" w15:restartNumberingAfterBreak="0">
     <w:nsid w:val="5ECF72A1"/>
     <w:multiLevelType w:val="hybridMultilevel"/>
     <w:tmpl w:val="1CF4107C"/>
@@ -19064,7 +20932,7 @@
       </w:pPr>
     </w:lvl>
   </w:abstractNum>
-  <w:abstractNum w:abstractNumId="35" w15:restartNumberingAfterBreak="0">
+  <w:abstractNum w:abstractNumId="37" w15:restartNumberingAfterBreak="0">
     <w:nsid w:val="5F4655AF"/>
     <w:multiLevelType w:val="hybridMultilevel"/>
     <w:tmpl w:val="AFA26F68"/>
@@ -19150,7 +21018,7 @@
       </w:pPr>
     </w:lvl>
   </w:abstractNum>
-  <w:abstractNum w:abstractNumId="36" w15:restartNumberingAfterBreak="0">
+  <w:abstractNum w:abstractNumId="38" w15:restartNumberingAfterBreak="0">
     <w:nsid w:val="5F5F17AC"/>
     <w:multiLevelType w:val="hybridMultilevel"/>
     <w:tmpl w:val="27485FD2"/>
@@ -19236,7 +21104,7 @@
       </w:pPr>
     </w:lvl>
   </w:abstractNum>
-  <w:abstractNum w:abstractNumId="37" w15:restartNumberingAfterBreak="0">
+  <w:abstractNum w:abstractNumId="39" w15:restartNumberingAfterBreak="0">
     <w:nsid w:val="5FAD400A"/>
     <w:multiLevelType w:val="hybridMultilevel"/>
     <w:tmpl w:val="59F4717E"/>
@@ -19322,7 +21190,7 @@
       </w:pPr>
     </w:lvl>
   </w:abstractNum>
-  <w:abstractNum w:abstractNumId="38" w15:restartNumberingAfterBreak="0">
+  <w:abstractNum w:abstractNumId="40" w15:restartNumberingAfterBreak="0">
     <w:nsid w:val="630F0C4E"/>
     <w:multiLevelType w:val="hybridMultilevel"/>
     <w:tmpl w:val="5802DB30"/>
@@ -19414,7 +21282,7 @@
       </w:pPr>
     </w:lvl>
   </w:abstractNum>
-  <w:abstractNum w:abstractNumId="39" w15:restartNumberingAfterBreak="0">
+  <w:abstractNum w:abstractNumId="41" w15:restartNumberingAfterBreak="0">
     <w:nsid w:val="6409798E"/>
     <w:multiLevelType w:val="hybridMultilevel"/>
     <w:tmpl w:val="F942E5A6"/>
@@ -19500,7 +21368,7 @@
       </w:pPr>
     </w:lvl>
   </w:abstractNum>
-  <w:abstractNum w:abstractNumId="40" w15:restartNumberingAfterBreak="0">
+  <w:abstractNum w:abstractNumId="42" w15:restartNumberingAfterBreak="0">
     <w:nsid w:val="6A825466"/>
     <w:multiLevelType w:val="hybridMultilevel"/>
     <w:tmpl w:val="D4123C9C"/>
@@ -19586,7 +21454,7 @@
       </w:pPr>
     </w:lvl>
   </w:abstractNum>
-  <w:abstractNum w:abstractNumId="41" w15:restartNumberingAfterBreak="0">
+  <w:abstractNum w:abstractNumId="43" w15:restartNumberingAfterBreak="0">
     <w:nsid w:val="72EA5DBF"/>
     <w:multiLevelType w:val="hybridMultilevel"/>
     <w:tmpl w:val="671AAB8E"/>
@@ -19672,7 +21540,120 @@
       </w:pPr>
     </w:lvl>
   </w:abstractNum>
-  <w:abstractNum w:abstractNumId="42" w15:restartNumberingAfterBreak="0">
+  <w:abstractNum w:abstractNumId="44" w15:restartNumberingAfterBreak="0">
+    <w:nsid w:val="72F854A2"/>
+    <w:multiLevelType w:val="hybridMultilevel"/>
+    <w:tmpl w:val="349CAAFA"/>
+    <w:lvl w:ilvl="0" w:tplc="40090001">
+      <w:start w:val="1"/>
+      <w:numFmt w:val="bullet"/>
+      <w:lvlText w:val=""/>
+      <w:lvlJc w:val="left"/>
+      <w:pPr>
+        <w:ind w:left="720" w:hanging="360"/>
+      </w:pPr>
+      <w:rPr>
+        <w:rFonts w:ascii="Symbol" w:hAnsi="Symbol" w:hint="default"/>
+      </w:rPr>
+    </w:lvl>
+    <w:lvl w:ilvl="1" w:tplc="40090003" w:tentative="1">
+      <w:start w:val="1"/>
+      <w:numFmt w:val="bullet"/>
+      <w:lvlText w:val="o"/>
+      <w:lvlJc w:val="left"/>
+      <w:pPr>
+        <w:ind w:left="1440" w:hanging="360"/>
+      </w:pPr>
+      <w:rPr>
+        <w:rFonts w:ascii="Courier New" w:hAnsi="Courier New" w:cs="Courier New" w:hint="default"/>
+      </w:rPr>
+    </w:lvl>
+    <w:lvl w:ilvl="2" w:tplc="40090005" w:tentative="1">
+      <w:start w:val="1"/>
+      <w:numFmt w:val="bullet"/>
+      <w:lvlText w:val=""/>
+      <w:lvlJc w:val="left"/>
+      <w:pPr>
+        <w:ind w:left="2160" w:hanging="360"/>
+      </w:pPr>
+      <w:rPr>
+        <w:rFonts w:ascii="Wingdings" w:hAnsi="Wingdings" w:hint="default"/>
+      </w:rPr>
+    </w:lvl>
+    <w:lvl w:ilvl="3" w:tplc="40090001" w:tentative="1">
+      <w:start w:val="1"/>
+      <w:numFmt w:val="bullet"/>
+      <w:lvlText w:val=""/>
+      <w:lvlJc w:val="left"/>
+      <w:pPr>
+        <w:ind w:left="2880" w:hanging="360"/>
+      </w:pPr>
+      <w:rPr>
+        <w:rFonts w:ascii="Symbol" w:hAnsi="Symbol" w:hint="default"/>
+      </w:rPr>
+    </w:lvl>
+    <w:lvl w:ilvl="4" w:tplc="40090003" w:tentative="1">
+      <w:start w:val="1"/>
+      <w:numFmt w:val="bullet"/>
+      <w:lvlText w:val="o"/>
+      <w:lvlJc w:val="left"/>
+      <w:pPr>
+        <w:ind w:left="3600" w:hanging="360"/>
+      </w:pPr>
+      <w:rPr>
+        <w:rFonts w:ascii="Courier New" w:hAnsi="Courier New" w:cs="Courier New" w:hint="default"/>
+      </w:rPr>
+    </w:lvl>
+    <w:lvl w:ilvl="5" w:tplc="40090005" w:tentative="1">
+      <w:start w:val="1"/>
+      <w:numFmt w:val="bullet"/>
+      <w:lvlText w:val=""/>
+      <w:lvlJc w:val="left"/>
+      <w:pPr>
+        <w:ind w:left="4320" w:hanging="360"/>
+      </w:pPr>
+      <w:rPr>
+        <w:rFonts w:ascii="Wingdings" w:hAnsi="Wingdings" w:hint="default"/>
+      </w:rPr>
+    </w:lvl>
+    <w:lvl w:ilvl="6" w:tplc="40090001" w:tentative="1">
+      <w:start w:val="1"/>
+      <w:numFmt w:val="bullet"/>
+      <w:lvlText w:val=""/>
+      <w:lvlJc w:val="left"/>
+      <w:pPr>
+        <w:ind w:left="5040" w:hanging="360"/>
+      </w:pPr>
+      <w:rPr>
+        <w:rFonts w:ascii="Symbol" w:hAnsi="Symbol" w:hint="default"/>
+      </w:rPr>
+    </w:lvl>
+    <w:lvl w:ilvl="7" w:tplc="40090003" w:tentative="1">
+      <w:start w:val="1"/>
+      <w:numFmt w:val="bullet"/>
+      <w:lvlText w:val="o"/>
+      <w:lvlJc w:val="left"/>
+      <w:pPr>
+        <w:ind w:left="5760" w:hanging="360"/>
+      </w:pPr>
+      <w:rPr>
+        <w:rFonts w:ascii="Courier New" w:hAnsi="Courier New" w:cs="Courier New" w:hint="default"/>
+      </w:rPr>
+    </w:lvl>
+    <w:lvl w:ilvl="8" w:tplc="40090005" w:tentative="1">
+      <w:start w:val="1"/>
+      <w:numFmt w:val="bullet"/>
+      <w:lvlText w:val=""/>
+      <w:lvlJc w:val="left"/>
+      <w:pPr>
+        <w:ind w:left="6480" w:hanging="360"/>
+      </w:pPr>
+      <w:rPr>
+        <w:rFonts w:ascii="Wingdings" w:hAnsi="Wingdings" w:hint="default"/>
+      </w:rPr>
+    </w:lvl>
+  </w:abstractNum>
+  <w:abstractNum w:abstractNumId="45" w15:restartNumberingAfterBreak="0">
     <w:nsid w:val="754B7DA2"/>
     <w:multiLevelType w:val="hybridMultilevel"/>
     <w:tmpl w:val="09E87C36"/>
@@ -19758,7 +21739,7 @@
       </w:pPr>
     </w:lvl>
   </w:abstractNum>
-  <w:abstractNum w:abstractNumId="43" w15:restartNumberingAfterBreak="0">
+  <w:abstractNum w:abstractNumId="46" w15:restartNumberingAfterBreak="0">
     <w:nsid w:val="75BC0870"/>
     <w:multiLevelType w:val="hybridMultilevel"/>
     <w:tmpl w:val="C186C898"/>
@@ -19847,7 +21828,93 @@
       </w:pPr>
     </w:lvl>
   </w:abstractNum>
-  <w:abstractNum w:abstractNumId="44" w15:restartNumberingAfterBreak="0">
+  <w:abstractNum w:abstractNumId="47" w15:restartNumberingAfterBreak="0">
+    <w:nsid w:val="768D4843"/>
+    <w:multiLevelType w:val="hybridMultilevel"/>
+    <w:tmpl w:val="F39A25A6"/>
+    <w:lvl w:ilvl="0" w:tplc="4009000F">
+      <w:start w:val="1"/>
+      <w:numFmt w:val="decimal"/>
+      <w:lvlText w:val="%1."/>
+      <w:lvlJc w:val="left"/>
+      <w:pPr>
+        <w:ind w:left="720" w:hanging="360"/>
+      </w:pPr>
+    </w:lvl>
+    <w:lvl w:ilvl="1" w:tplc="40090019" w:tentative="1">
+      <w:start w:val="1"/>
+      <w:numFmt w:val="lowerLetter"/>
+      <w:lvlText w:val="%2."/>
+      <w:lvlJc w:val="left"/>
+      <w:pPr>
+        <w:ind w:left="1440" w:hanging="360"/>
+      </w:pPr>
+    </w:lvl>
+    <w:lvl w:ilvl="2" w:tplc="4009001B" w:tentative="1">
+      <w:start w:val="1"/>
+      <w:numFmt w:val="lowerRoman"/>
+      <w:lvlText w:val="%3."/>
+      <w:lvlJc w:val="right"/>
+      <w:pPr>
+        <w:ind w:left="2160" w:hanging="180"/>
+      </w:pPr>
+    </w:lvl>
+    <w:lvl w:ilvl="3" w:tplc="4009000F" w:tentative="1">
+      <w:start w:val="1"/>
+      <w:numFmt w:val="decimal"/>
+      <w:lvlText w:val="%4."/>
+      <w:lvlJc w:val="left"/>
+      <w:pPr>
+        <w:ind w:left="2880" w:hanging="360"/>
+      </w:pPr>
+    </w:lvl>
+    <w:lvl w:ilvl="4" w:tplc="40090019" w:tentative="1">
+      <w:start w:val="1"/>
+      <w:numFmt w:val="lowerLetter"/>
+      <w:lvlText w:val="%5."/>
+      <w:lvlJc w:val="left"/>
+      <w:pPr>
+        <w:ind w:left="3600" w:hanging="360"/>
+      </w:pPr>
+    </w:lvl>
+    <w:lvl w:ilvl="5" w:tplc="4009001B" w:tentative="1">
+      <w:start w:val="1"/>
+      <w:numFmt w:val="lowerRoman"/>
+      <w:lvlText w:val="%6."/>
+      <w:lvlJc w:val="right"/>
+      <w:pPr>
+        <w:ind w:left="4320" w:hanging="180"/>
+      </w:pPr>
+    </w:lvl>
+    <w:lvl w:ilvl="6" w:tplc="4009000F" w:tentative="1">
+      <w:start w:val="1"/>
+      <w:numFmt w:val="decimal"/>
+      <w:lvlText w:val="%7."/>
+      <w:lvlJc w:val="left"/>
+      <w:pPr>
+        <w:ind w:left="5040" w:hanging="360"/>
+      </w:pPr>
+    </w:lvl>
+    <w:lvl w:ilvl="7" w:tplc="40090019" w:tentative="1">
+      <w:start w:val="1"/>
+      <w:numFmt w:val="lowerLetter"/>
+      <w:lvlText w:val="%8."/>
+      <w:lvlJc w:val="left"/>
+      <w:pPr>
+        <w:ind w:left="5760" w:hanging="360"/>
+      </w:pPr>
+    </w:lvl>
+    <w:lvl w:ilvl="8" w:tplc="4009001B" w:tentative="1">
+      <w:start w:val="1"/>
+      <w:numFmt w:val="lowerRoman"/>
+      <w:lvlText w:val="%9."/>
+      <w:lvlJc w:val="right"/>
+      <w:pPr>
+        <w:ind w:left="6480" w:hanging="180"/>
+      </w:pPr>
+    </w:lvl>
+  </w:abstractNum>
+  <w:abstractNum w:abstractNumId="48" w15:restartNumberingAfterBreak="0">
     <w:nsid w:val="787D215D"/>
     <w:multiLevelType w:val="hybridMultilevel"/>
     <w:tmpl w:val="6E66E1B4"/>
@@ -19936,7 +22003,7 @@
       </w:pPr>
     </w:lvl>
   </w:abstractNum>
-  <w:abstractNum w:abstractNumId="45" w15:restartNumberingAfterBreak="0">
+  <w:abstractNum w:abstractNumId="49" w15:restartNumberingAfterBreak="0">
     <w:nsid w:val="7B8D34CF"/>
     <w:multiLevelType w:val="multilevel"/>
     <w:tmpl w:val="702834C8"/>
@@ -20086,13 +22153,13 @@
     </w:lvl>
   </w:abstractNum>
   <w:num w:numId="1" w16cid:durableId="738789515">
-    <w:abstractNumId w:val="30"/>
+    <w:abstractNumId w:val="32"/>
   </w:num>
   <w:num w:numId="2" w16cid:durableId="1235513339">
     <w:abstractNumId w:val="1"/>
   </w:num>
   <w:num w:numId="3" w16cid:durableId="288970933">
-    <w:abstractNumId w:val="34"/>
+    <w:abstractNumId w:val="36"/>
   </w:num>
   <w:num w:numId="4" w16cid:durableId="1934975148">
     <w:abstractNumId w:val="0"/>
@@ -20104,13 +22171,13 @@
     <w:abstractNumId w:val="2"/>
   </w:num>
   <w:num w:numId="7" w16cid:durableId="674764127">
-    <w:abstractNumId w:val="45"/>
+    <w:abstractNumId w:val="49"/>
   </w:num>
   <w:num w:numId="8" w16cid:durableId="1366904678">
     <w:abstractNumId w:val="26"/>
   </w:num>
   <w:num w:numId="9" w16cid:durableId="67462260">
-    <w:abstractNumId w:val="37"/>
+    <w:abstractNumId w:val="39"/>
   </w:num>
   <w:num w:numId="10" w16cid:durableId="364210400">
     <w:abstractNumId w:val="19"/>
@@ -20119,13 +22186,13 @@
     <w:abstractNumId w:val="23"/>
   </w:num>
   <w:num w:numId="12" w16cid:durableId="1654406166">
-    <w:abstractNumId w:val="39"/>
+    <w:abstractNumId w:val="41"/>
   </w:num>
   <w:num w:numId="13" w16cid:durableId="1484928062">
-    <w:abstractNumId w:val="42"/>
+    <w:abstractNumId w:val="45"/>
   </w:num>
   <w:num w:numId="14" w16cid:durableId="504519595">
-    <w:abstractNumId w:val="31"/>
+    <w:abstractNumId w:val="33"/>
   </w:num>
   <w:num w:numId="15" w16cid:durableId="1046217917">
     <w:abstractNumId w:val="11"/>
@@ -20134,16 +22201,16 @@
     <w:abstractNumId w:val="12"/>
   </w:num>
   <w:num w:numId="17" w16cid:durableId="1482194571">
-    <w:abstractNumId w:val="33"/>
+    <w:abstractNumId w:val="35"/>
   </w:num>
   <w:num w:numId="18" w16cid:durableId="1378116358">
     <w:abstractNumId w:val="21"/>
   </w:num>
   <w:num w:numId="19" w16cid:durableId="1622763665">
-    <w:abstractNumId w:val="28"/>
+    <w:abstractNumId w:val="30"/>
   </w:num>
   <w:num w:numId="20" w16cid:durableId="512308396">
-    <w:abstractNumId w:val="43"/>
+    <w:abstractNumId w:val="46"/>
   </w:num>
   <w:num w:numId="21" w16cid:durableId="1400396216">
     <w:abstractNumId w:val="16"/>
@@ -20155,10 +22222,10 @@
     <w:abstractNumId w:val="13"/>
   </w:num>
   <w:num w:numId="24" w16cid:durableId="1303314634">
-    <w:abstractNumId w:val="38"/>
+    <w:abstractNumId w:val="40"/>
   </w:num>
   <w:num w:numId="25" w16cid:durableId="9142093">
-    <w:abstractNumId w:val="41"/>
+    <w:abstractNumId w:val="43"/>
   </w:num>
   <w:num w:numId="26" w16cid:durableId="1458911845">
     <w:abstractNumId w:val="18"/>
@@ -20173,7 +22240,7 @@
     <w:abstractNumId w:val="22"/>
   </w:num>
   <w:num w:numId="30" w16cid:durableId="2101440695">
-    <w:abstractNumId w:val="44"/>
+    <w:abstractNumId w:val="48"/>
   </w:num>
   <w:num w:numId="31" w16cid:durableId="109252585">
     <w:abstractNumId w:val="10"/>
@@ -20182,13 +22249,13 @@
     <w:abstractNumId w:val="9"/>
   </w:num>
   <w:num w:numId="33" w16cid:durableId="1115103356">
-    <w:abstractNumId w:val="32"/>
+    <w:abstractNumId w:val="34"/>
   </w:num>
   <w:num w:numId="34" w16cid:durableId="220681117">
-    <w:abstractNumId w:val="40"/>
+    <w:abstractNumId w:val="42"/>
   </w:num>
   <w:num w:numId="35" w16cid:durableId="1176386353">
-    <w:abstractNumId w:val="36"/>
+    <w:abstractNumId w:val="38"/>
   </w:num>
   <w:num w:numId="36" w16cid:durableId="1049376175">
     <w:abstractNumId w:val="20"/>
@@ -20206,22 +22273,34 @@
     <w:abstractNumId w:val="24"/>
   </w:num>
   <w:num w:numId="41" w16cid:durableId="340668397">
-    <w:abstractNumId w:val="27"/>
+    <w:abstractNumId w:val="29"/>
   </w:num>
   <w:num w:numId="42" w16cid:durableId="87584769">
     <w:abstractNumId w:val="6"/>
   </w:num>
   <w:num w:numId="43" w16cid:durableId="1409889759">
-    <w:abstractNumId w:val="29"/>
+    <w:abstractNumId w:val="31"/>
   </w:num>
   <w:num w:numId="44" w16cid:durableId="250547155">
-    <w:abstractNumId w:val="35"/>
+    <w:abstractNumId w:val="37"/>
   </w:num>
   <w:num w:numId="45" w16cid:durableId="400836092">
     <w:abstractNumId w:val="8"/>
   </w:num>
   <w:num w:numId="46" w16cid:durableId="964655118">
     <w:abstractNumId w:val="5"/>
+  </w:num>
+  <w:num w:numId="47" w16cid:durableId="1819607792">
+    <w:abstractNumId w:val="28"/>
+  </w:num>
+  <w:num w:numId="48" w16cid:durableId="1637417472">
+    <w:abstractNumId w:val="47"/>
+  </w:num>
+  <w:num w:numId="49" w16cid:durableId="871116235">
+    <w:abstractNumId w:val="44"/>
+  </w:num>
+  <w:num w:numId="50" w16cid:durableId="2009362747">
+    <w:abstractNumId w:val="27"/>
   </w:num>
 </w:numbering>
 </file>

</xml_diff>